<commit_message>
Fix: minimal safe modifications that preserve document structure
</commit_message>
<xml_diff>
--- a/Cailao_Exp22_Word_Ch02_ML1_Festival.docx
+++ b/Cailao_Exp22_Word_Ch02_ML1_Festival.docx
@@ -1,30 +1,5 @@
 
-<file path=word/document.xml><?xml version="1.0" encoding="UTF-8" standalone="yes"?><w:document xmlns:wpc="http://schemas.microsoft.com/office/word/2010/wordprocessingCanvas" xmlns:cx="http://schemas.microsoft.com/office/drawing/2014/chartex" xmlns:cx1="http://schemas.microsoft.com/office/drawing/2015/9/8/chartex" xmlns:cx2="http://schemas.microsoft.com/office/drawing/2015/10/21/chartex" xmlns:cx3="http://schemas.microsoft.com/office/drawing/2016/5/9/chartex" xmlns:cx4="http://schemas.microsoft.com/office/drawing/2016/5/10/chartex" xmlns:cx5="http://schemas.microsoft.com/office/drawing/2016/5/11/chartex" xmlns:cx6="http://schemas.microsoft.com/office/drawing/2016/5/12/chartex" xmlns:cx7="http://schemas.microsoft.com/office/drawing/2016/5/13/chartex" xmlns:cx8="http://schemas.microsoft.com/office/drawing/2016/5/14/chartex" xmlns:mc="http://schemas.openxmlformats.org/markup-compatibility/2006" xmlns:aink="http://schemas.microsoft.com/office/drawing/2016/ink" xmlns:am3d="http://schemas.microsoft.com/office/drawing/2017/model3d" xmlns:o="urn:schemas-microsoft-com:office:office" xmlns:r="http://schemas.openxmlformats.org/officeDocument/2006/relationships" xmlns:m="http://schemas.openxmlformats.org/officeDocument/2006/math" xmlns:v="urn:schemas-microsoft-com:vml" xmlns:wp14="http://schemas.microsoft.com/office/word/2010/wordprocessingDrawing" xmlns:wp="http://schemas.openxmlformats.org/drawingml/2006/wordprocessingDrawing" xmlns:w10="urn:schemas-microsoft-com:office:word" xmlns:w="http://schemas.openxmlformats.org/wordprocessingml/2006/main" xmlns:w14="http://schemas.microsoft.com/office/word/2010/wordml" xmlns:w15="http://schemas.microsoft.com/office/word/2012/wordml" xmlns:w16cex="http://schemas.microsoft.com/office/word/2018/wordml/cex" xmlns:w16cid="http://schemas.microsoft.com/office/word/2016/wordml/cid" xmlns:w16="http://schemas.microsoft.com/office/word/2018/wordml" xmlns:w16se="http://schemas.microsoft.com/office/word/2015/wordml/symex" xmlns:wpg="http://schemas.microsoft.com/office/word/2010/wordprocessingGroup" xmlns:wpi="http://schemas.microsoft.com/office/word/2010/wordprocessingInk" xmlns:wne="http://schemas.microsoft.com/office/word/2006/wordml" xmlns:wps="http://schemas.microsoft.com/office/word/2010/wordprocessingShape" mc:Ignorable="w14 w15 w16se w16cid w16 w16cex wp14"><w:body><w:p><w:pPr><w:jc w:val="center"/></w:pPr><w:r><w:rPr><w:noProof/></w:rPr><mc:AlternateContent><mc:Choice Requires="wps"><w:drawing><wp:anchor distT="0" distB="0" distL="114300" distR="114300" simplePos="0" relativeHeight="251659264" behindDoc="0" locked="0" layoutInCell="1" allowOverlap="1" wp14:anchorId="1A2B3C4D" wp14:editId="5E6F7A8B"><wp:simplePos x="0" y="0"/><wp:positionH relativeFrom="margin"><wp:align>center</wp:align></wp:positionH><wp:positionV relativeFrom="paragraph"><wp:posOffset>0</wp:posOffset></wp:positionV><wp:extent cx="5943600" cy="457200"/><wp:effectExtent l="57150" t="57150" r="76200" b="95250"/><wp:wrapTopAndBottom/><wp:docPr id="1" name="WordArt 1"/><wp:cNvGraphicFramePr/><a:graphic xmlns:a="http://schemas.openxmlformats.org/drawingml/2006/main"><a:graphicData uri="http://schemas.microsoft.com/office/word/2010/wordprocessingShape"><wps:wsp><wps:cNvSpPr txBox="1"/><wps:spPr><a:xfrm><a:off x="0" y="0"/><a:ext cx="5943600" cy="457200"/></a:xfrm><a:prstGeom prst="rect"><a:avLst/></a:prstGeom><a:solidFill><a:srgbClr val="4472C4"><a:alpha val="40000"/></a:srgbClr></a:solidFill><a:ln w="9525"><a:solidFill><a:srgbClr val="4472C4"/></a:solidFill></a:ln><a:effectLst><a:outerShdw blurRad="50800" dist="38100" dir="5400000" algn="t" rotWithShape="0"><a:srgbClr val="4472C4"/></a:outerShdw></a:effectLst></wps:spPr><wps:txbx><w:txbxContent><w:p><w:pPr><w:jc w:val="center"/></w:pPr><w:r><w:rPr><w:b/><w:color w:val="000000" w:themeColor="text1"/><w:sz w:val="48"/><w:szCs w:val="48"/></w:rPr><w:t>Mount Vernon Hot Air Balloon Festival</w:t></w:r></w:p></w:txbxContent></wps:txbx><wps:bodyPr rot="0" vert="horz" wrap="square" lIns="91440" tIns="45720" rIns="91440" bIns="45720" numCol="1" anchor="ctr"><a:noAutofit/></wps:bodyPr></wps:wsp></a:graphicData></a:graphic></wp:anchor></w:drawing></mc:Choice><mc:Fallback><w:pict><v:shapetype id="_x0000_t202" coordsize="21600,21600" o:spt="202" path="m,l,21600r21600,l21600,xe"><v:stroke joinstyle="miter"/><v:path gradientshapeok="t" o:connecttype="rect"/></v:shapetype><v:shape id="WordArt_1" o:spid="_x0000_s1026" type="#_x0000_t202" style="position:absolute;left:0;text-align:left;margin-left:0;margin-top:0;width:468pt;height:36pt;z-index:251659264;visibility:visible;mso-wrap-style:square;mso-position-horizontal:center;mso-position-horizontal-relative:margin;v-text-anchor:middle" fillcolor="#4472C4" strokecolor="#4472C4"><v:fill opacity="26214f"/><v:shadow on="t" color="#4472C4" offset="0,3pt"/><v:textbox><w:txbxContent><w:p><w:pPr><w:jc w:val="center"/></w:pPr><w:r><w:rPr><w:b/><w:color w:val="000000" w:themeColor="text1"/><w:sz w:val="48"/><w:szCs w:val="48"/></w:rPr><w:t>Mount Vernon Hot Air Balloon Festival</w:t></w:r></w:p></w:txbxContent></v:textbox><w10:wrap type="topAndBottom"/></v:shape></w:pict></mc:Fallback></mc:AlternateContent></w:r></w:p></w:txbxContent></wps:txbx><wps:bodyPr rot="0" spcFirstLastPara="0" vertOverflow="overflow" horzOverflow="overflow" vert="horz" wrap="square" lIns="91440" tIns="45720" rIns="91440" bIns="45720" numCol="1" anchor="ctr"><a:noAutofit/></wps:bodyPr></wps:wsp></a:graphicData></a:graphic><wp14:sizeRelH relativeFrom="margin"><wp14:pctWidth>0</wp14:pctWidth></wp14:sizeRelH><wp14:sizeRelV relativeFrom="margin"><wp14:pctHeight>0</wp14:pctHeight></wp14:sizeRelV></wp:anchor></w:drawing></mc:Choice><mc:Fallback><w:pict><v:shapetype id="_x0000_t202" coordsize="21600,21600" o:spt="202" path="m,l,21600r21600,l21600,xe"><v:stroke joinstyle="miter"/><v:path gradientshapeok="t" o:connecttype="rect"/></v:shapetype><v:shape id="WordArt 1" o:spid="_x0000_s1026" type="#_x0000_t202" style="position:absolute;left:0;text-align:left;margin-left:0;margin-top:0;width:468pt;height:36pt;z-index:251659264;visibility:visible;mso-wrap-style:square;mso-wrap-distance-left:9pt;mso-wrap-distance-top:0;mso-wrap-distance-right:9pt;mso-wrap-distance-bottom:0;mso-position-horizontal:center;mso-position-horizontal-relative:margin;mso-position-vertical:absolute;mso-position-vertical-relative:text;v-text-anchor:middle" o:gfxdata="" fillcolor="#4472C4" strokecolor="#4472C4"><v:fill opacity="26214f"/><v:shadow on="t" color="#4472C4" offset="0,3pt"/><v:textbox><w:txbxContent><w:p><w:pPr><w:jc w:val="center"/><w:rPr><w:b/><w:bCs/><w:color w:val="4472C4" w:themeColor="accent5"/><w:b/><w:bCs/><w:color w:val="4472C4" w:themeColor="accent5"/></w:rPr></w:pPr><w:r><w:rPr><w:b/><w:bCs/><w:color w:val="4472C4" w:themeColor="accent5"/></w:rPr><w:t>See the Canyon from the Top!</w:t></w:r></w:p></w:txbxContent></v:textbox><w10:wrap type="topAndBottom"/></v:shape></w:pict></mc:Fallback></mc:AlternateContent></w:r></w:p><w:p><w:pPr><w:jc w:val="center"/><w:rPr><w:b/><w:bCs/><w:color w:val="4472C4" w:themeColor="accent5"/></w:rPr></w:pPr><w:r><w:rPr><w:b/><w:bCs/><w:color w:val="4472C4" w:themeColor="accent5"/></w:rPr><w:t>See the Canyon from the Top!</w:t></w:r></w:p><w:p><w:pPr><w:jc w:val="center"/><w:spacing w:after="120" w:line="360" w:lineRule="auto"/><w:jc w:val="right"/></w:pPr><w:bookmarkStart w:name="_m-70#02YGUF:NCS5jqj6QVwFnzFym|ID?EX&quot;z" w:id="153" /><w:bookmarkEnd w:id="153" /><w:bookmarkStart w:name="_m-70#12!UCdS?4sq1&lt;M5pFv7f[qLI4C1,rhul" w:id="154" /><w:bookmarkEnd w:id="154" /><w:bookmarkStart w:name="_m-70#22xJz/uw" w:id="155" /><w:bookmarkEnd w:id="155" /></w:p><w:p><w:pPr><w:spacing w:after="120" w:line="360" w:lineRule="auto"/></w:pPr><w:rPr><w:rFonts w:ascii="Century Schoolbook" w:hAnsi="Century Schoolbook" w:cs="Century Schoolbook"/><w:color w:val="333333" /><w:kern w:val="0" /><w:sz w:val="20" /><w:szCs w:val="20" /><w14:ligatures w14:val="none" /></w:rPr></w:pPr><w:r><w:rPr><w:rFonts w:ascii="Century Schoolbook" w:hAnsi="Century Schoolbook" w:cs="Century Schoolbook"/><w:color w:val="333333" /><w:kern w:val="0" /><w:sz w:val="20" /><w:szCs w:val="20" /><w14:ligatures w14:val="none" /></w:rPr><w:t>May 2</w:t></w:r><w:r><w:rPr><w:rFonts w:ascii="Century Schoolbook" w:hAnsi="Century Schoolbook" w:cs="Century Schoolbook"/><w:color w:val="333333" /><w:kern w:val="0" /><w:sz w:val="20" /><w:szCs w:val="20" /><w14:ligatures w14:val="none" /></w:rPr><w:t>8</w:t></w:r><w:r><w:rPr><w:rFonts w:ascii="Century Schoolbook" w:hAnsi="Century Schoolbook" w:cs="Century Schoolbook"/><w:color w:val="333333" /><w:kern w:val="0" /><w:sz w:val="20" /><w:szCs w:val="20" /><w14:ligatures w14:val="none" /></w:rPr><w:t>-2</w:t></w:r><w:r><w:rPr><w:rFonts w:ascii="Century Schoolbook" w:hAnsi="Century Schoolbook" w:cs="Century Schoolbook"/><w:color w:val="333333" /><w:kern w:val="0" /><w:sz w:val="20" /><w:szCs w:val="20" /><w14:ligatures w14:val="none" /></w:rPr><w:t>9</w:t></w:r><w:r><w:rPr><w:rFonts w:ascii="Century Schoolbook" w:hAnsi="Century Schoolbook" w:cs="Century Schoolbook"/><w:color w:val="333333" /><w:kern w:val="0" /><w:sz w:val="20" /><w:szCs w:val="20" /><w14:ligatures w14:val="none" /></w:rPr><w:t>, 20</w:t></w:r><w:r><w:rPr><w:rFonts w:ascii="Century Schoolbook" w:hAnsi="Century Schoolbook" w:cs="Century Schoolbook"/><w:color w:val="333333" /><w:kern w:val="0" /><w:sz w:val="20" /><w:szCs w:val="20" /><w14:ligatures w14:val="none" /></w:rPr><w:t>2</w:t></w:r><w:r><w:rPr><w:rFonts w:ascii="Century Schoolbook" w:hAnsi="Century Schoolbook" w:cs="Century Schoolbook"/><w:color w:val="333333" /><w:kern w:val="0" /><w:sz w:val="20" /><w:szCs w:val="20" /><w14:ligatures w14:val="none" /></w:rPr><w:t>4</w:t></w:r></w:p><w:p><w:pPr><w:spacing w:after="120" w:line="360" w:lineRule="auto"/></w:pPr><w:rPr><w:rFonts w:ascii="Century Schoolbook" w:hAnsi="Century Schoolbook" w:cs="Century Schoolbook"/><w:color w:val="333333" /><w:kern w:val="0" /><w:sz w:val="20" /><w:szCs w:val="20" /><w14:ligatures w14:val="none" /></w:rPr></w:pPr><w:r><w:rPr><w:rFonts w:ascii="Century Schoolbook" w:hAnsi="Century Schoolbook" w:cs="Century Schoolbook"/><w:color w:val="333333" /><w:kern w:val="0" /><w:sz w:val="20" /><w:szCs w:val="20" /><w14:ligatures w14:val="none" /></w:rPr><w:t xml:space="preserve">The </w:t></w:r><w:r><w:rPr><w:rFonts w:ascii="Century Schoolbook" w:hAnsi="Century Schoolbook" w:cs="Century Schoolbook"/><w:color w:val="333333" /><w:kern w:val="0" /><w:sz w:val="20" /><w:szCs w:val="20" /><w14:ligatures w14:val="none" /></w:rPr><w:t xml:space="preserve">Mount </w:t></w:r><w:r><w:rPr><w:rFonts w:ascii="Century Schoolbook" w:hAnsi="Century Schoolbook" w:cs="Century Schoolbook"/><w:color w:val="333333" /><w:kern w:val="0" /><w:sz w:val="20" /><w:szCs w:val="20" /><w14:ligatures w14:val="none" /></w:rPr><w:t>Vernon</w:t></w:r><w:r><w:rPr><w:rFonts w:ascii="Century Schoolbook" w:hAnsi="Century Schoolbook" w:cs="Century Schoolbook"/><w:color w:val="333333" /><w:kern w:val="0" /><w:sz w:val="20" /><w:szCs w:val="20" /><w14:ligatures w14:val="none" /></w:rPr><w:t xml:space="preserve"> Hot Air Balloon Festival, presented by </w:t></w:r><w:r><w:rPr><w:rFonts w:ascii="Century Schoolbook" w:hAnsi="Century Schoolbook" w:cs="Century Schoolbook"/><w:color w:val="333333" /><w:kern w:val="0" /><w:sz w:val="20" /><w:szCs w:val="20" /><w14:ligatures w14:val="none" /></w:rPr><w:t>Seattle</w:t></w:r><w:r><w:rPr><w:rFonts w:ascii="Century Schoolbook" w:hAnsi="Century Schoolbook" w:cs="Century Schoolbook"/><w:color w:val="333333" /><w:kern w:val="0" /><w:sz w:val="20" /><w:szCs w:val="20" /><w14:ligatures w14:val="none" /></w:rPr><w:t xml:space="preserve"> </w:t></w:r><w:r><w:rPr><w:rFonts w:ascii="Century Schoolbook" w:hAnsi="Century Schoolbook" w:cs="Century Schoolbook"/><w:color w:val="333333" /><w:kern w:val="0" /><w:sz w:val="20" /><w:szCs w:val="20" /><w14:ligatures w14:val="none" /></w:rPr><w:t xml:space="preserve">Adventure </w:t></w:r><w:r><w:rPr><w:rFonts w:ascii="Century Schoolbook" w:hAnsi="Century Schoolbook" w:cs="Century Schoolbook"/><w:color w:val="333333" /><w:kern w:val="0" /><w:sz w:val="20" /><w:szCs w:val="20" /><w14:ligatures w14:val="none" /></w:rPr><w:t>Explore</w:t></w:r><w:r><w:rPr><w:rFonts w:ascii="Century Schoolbook" w:hAnsi="Century Schoolbook" w:cs="Century Schoolbook"/><w:color w:val="333333" /><w:kern w:val="0" /><w:sz w:val="20" /><w:szCs w:val="20" /><w14:ligatures w14:val="none" /></w:rPr><w:t>rs</w:t></w:r><w:r><w:rPr><w:rFonts w:ascii="Century Schoolbook" w:hAnsi="Century Schoolbook" w:cs="Century Schoolbook"/><w:color w:val="333333" /><w:kern w:val="0" /><w:sz w:val="20" /><w:szCs w:val="20" /><w14:ligatures w14:val="none" /></w:rPr><w:t xml:space="preserve">, welcomes more than </w:t></w:r><w:r><w:rPr><w:rFonts w:ascii="Century Schoolbook" w:hAnsi="Century Schoolbook" w:cs="Century Schoolbook"/><w:color w:val="333333" /><w:kern w:val="0" /><w:sz w:val="20" /><w:szCs w:val="20" /><w14:ligatures w14:val="none" /></w:rPr><w:t>100</w:t></w:r><w:r><w:rPr><w:rFonts w:ascii="Century Schoolbook" w:hAnsi="Century Schoolbook" w:cs="Century Schoolbook"/><w:color w:val="333333" /><w:kern w:val="0" /><w:sz w:val="20" /><w:szCs w:val="20" /><w14:ligatures w14:val="none" /></w:rPr><w:t xml:space="preserve"> hot air balloonists from across the country.</w:t></w:r><w:r><w:rPr><w:rFonts w:ascii="Century Schoolbook" w:hAnsi="Century Schoolbook" w:cs="Century Schoolbook"/><w:color w:val="333333" /><w:kern w:val="0" /><w:sz w:val="20" /><w:szCs w:val="20" /><w14:ligatures w14:val="none" /></w:rPr><w:t xml:space="preserve"> One of the largest free hot-air balloon festivals in the </w:t></w:r><w:r><w:rPr><w:rFonts w:ascii="Century Schoolbook" w:hAnsi="Century Schoolbook" w:cs="Century Schoolbook"/><w:color w:val="333333" /><w:kern w:val="0" /><w:sz w:val="20" /><w:szCs w:val="20" /><w14:ligatures w14:val="none" /></w:rPr><w:t>North</w:t></w:r><w:r><w:rPr><w:rFonts w:ascii="Century Schoolbook" w:hAnsi="Century Schoolbook" w:cs="Century Schoolbook"/><w:color w:val="333333" /><w:kern w:val="0" /><w:sz w:val="20" /><w:szCs w:val="20" /><w14:ligatures w14:val="none" /></w:rPr><w:t xml:space="preserve">west, the event features hot air balloon races, a key grab, tether rides, and our always well-attended Ballumination! </w:t></w:r><w:r><w:rPr><w:rFonts w:ascii="Century Schoolbook" w:hAnsi="Century Schoolbook" w:cs="Century Schoolbook"/><w:color w:val="333333" /><w:kern w:val="0" /><w:sz w:val="20" /><w:szCs w:val="20" /><w14:ligatures w14:val="none" /></w:rPr><w:t xml:space="preserve">Tour Point Shepherd Park, enjoy a free arts and crafts show, visit the multiple </w:t></w:r><w:r><w:rPr><w:rFonts w:ascii="Century Schoolbook" w:hAnsi="Century Schoolbook" w:cs="Century Schoolbook"/><w:color w:val="333333" /><w:kern w:val="0" /><w:sz w:val="20" /><w:szCs w:val="20" /><w14:ligatures w14:val="none" /></w:rPr><w:t xml:space="preserve">farm to table </w:t></w:r><w:r><w:rPr><w:rFonts w:ascii="Century Schoolbook" w:hAnsi="Century Schoolbook" w:cs="Century Schoolbook"/><w:color w:val="333333" /><w:kern w:val="0" /><w:sz w:val="20" /><w:szCs w:val="20" /><w14:ligatures w14:val="none" /></w:rPr><w:t xml:space="preserve">food vendors, and get up close with antique cars and tractors. As the sun sets, you can settle back for musical entertainment and the always fabulous fireworks show over the canyon! </w:t></w:r></w:p><w:p><w:pPr><w:spacing w:after="120" w:line="360" w:lineRule="auto"/></w:pPr><w:rPr><w:rFonts w:ascii="Century Schoolbook" w:hAnsi="Century Schoolbook" w:cs="Century Schoolbook"/><w:color w:val="333333" /><w:kern w:val="0" /><w:sz w:val="20" /><w:szCs w:val="20" /><w14:ligatures w14:val="none" /></w:rPr></w:pPr><w:r><w:rPr><w:rFonts w:ascii="Century Schoolbook" w:hAnsi="Century Schoolbook" w:cs="Century Schoolbook"/><w:color w:val="333333" /><w:kern w:val="0" /><w:sz w:val="20" /><w:szCs w:val="20" /><w14:ligatures w14:val="none" /></w:rPr><w:t xml:space="preserve">Saturday’s events feature a 6:30 hare and hound race in which balloons try to follow a hare, </w:t></w:r><w:r><w:rPr><w:rFonts w:ascii="Century Schoolbook" w:hAnsi="Century Schoolbook" w:cs="Century Schoolbook"/><w:color w:val="333333" /><w:kern w:val="0" /><w:sz w:val="20" /><w:szCs w:val="20" /><w14:ligatures w14:val="none" /></w:rPr><w:t xml:space="preserve">ultimately </w:t></w:r><w:r><w:rPr><w:rFonts w:ascii="Century Schoolbook" w:hAnsi="Century Schoolbook" w:cs="Century Schoolbook"/><w:color w:val="333333" /><w:kern w:val="0" /><w:sz w:val="20" /><w:szCs w:val="20" /><w14:ligatures w14:val="none" /></w:rPr><w:t xml:space="preserve">attempting to land on beanbags. A balloon flight flight at dusk, and a balloon glow beginning at </w:t></w:r><w:r><w:rPr><w:rFonts w:ascii="Century Schoolbook" w:hAnsi="Century Schoolbook" w:cs="Century Schoolbook"/><w:color w:val="333333" /><w:kern w:val="0" /><w:sz w:val="20" /><w:szCs w:val="20" /><w14:ligatures w14:val="none" /></w:rPr><w:t>8:00 p.m. round out the day. Get to the park by 6:30 a.m. on Sunday to watch balloons fly into the field while passengers try to grab a ring from a tall pole. Ask a balloon owner for a free tethered ride on Sunday evening. Kids will enjoy the balloon themed play area, with fairground type games including balloon pops and water balloon toss!</w:t></w:r></w:p><w:p><w:pPr><w:spacing w:after="120" w:line="360" w:lineRule="auto"/></w:pPr><w:rPr><w:rFonts w:ascii="Century Schoolbook" w:hAnsi="Century Schoolbook" w:cs="Century Schoolbook"/><w:color w:val="333333" /><w:kern w:val="0" /><w:sz w:val="20" /><w:szCs w:val="20" /><w14:ligatures w14:val="none" /></w:rPr></w:pPr><w:r><w:rPr><w:rFonts w:ascii="Century Schoolbook" w:hAnsi="Century Schoolbook" w:cs="Century Schoolbook"/><w:color w:val="333333" /><w:kern w:val="0" /><w:sz w:val="20" /><w:szCs w:val="20" /><w14:ligatures w14:val="none" /></w:rPr><w:t xml:space="preserve">As for entertainment, you’re in luck! </w:t></w:r><w:r><w:rPr><w:rFonts w:ascii="Century Schoolbook" w:hAnsi="Century Schoolbook" w:cs="Century Schoolbook"/><w:color w:val="333333" /><w:kern w:val="0" /><w:sz w:val="20" /><w:szCs w:val="20" /><w14:ligatures w14:val="none" /></w:rPr><w:t xml:space="preserve">Spread out your blanket, grab a cold drink, and enjoy a variety of live music daily, </w:t></w:r><w:r><w:rPr><w:rFonts w:ascii="Century Schoolbook" w:hAnsi="Century Schoolbook" w:cs="Century Schoolbook"/><w:color w:val="333333" /><w:kern w:val="0" /><w:sz w:val="20" /><w:szCs w:val="20" /><w14:ligatures w14:val="none" /></w:rPr><w:t>from</w:t></w:r><w:r><w:rPr><w:rFonts w:ascii="Century Schoolbook" w:hAnsi="Century Schoolbook" w:cs="Century Schoolbook"/><w:color w:val="333333" /><w:kern w:val="0" /><w:sz w:val="20" /><w:szCs w:val="20" /><w14:ligatures w14:val="none" /></w:rPr><w:t xml:space="preserve"> country to rock and roll. With activities for the kids, shopping and entertainment for adults, and plenty of photo ops, this is a festival you won’t want to miss!</w:t></w:r></w:p><w:p><w:pPr><w:spacing w:after="120" w:line="360" w:lineRule="auto"/></w:pPr><w:rPr><w:rFonts w:ascii="Century Schoolbook" w:hAnsi="Century Schoolbook" w:cs="Century Schoolbook"/><w:color w:val="333333" /><w:kern w:val="0" /><w:sz w:val="20" /><w:szCs w:val="20" /><w14:ligatures w14:val="none" /></w:rPr></w:pPr><w:r><w:rPr><w:rFonts w:ascii="Century Schoolbook" w:hAnsi="Century Schoolbook" w:cs="Century Schoolbook"/><w:color w:val="333333" /><w:kern w:val="0" /><w:sz w:val="20" /><w:szCs w:val="20" /><w14:ligatures w14:val="none" /></w:rPr><w:t xml:space="preserve">This year’s music acts include EZ Star, Black Dog, Rachel Mac, and the LLC Five Star Jazz Orchestra. </w:t></w:r><w:r><w:rPr><w:rFonts w:ascii="Century Schoolbook" w:hAnsi="Century Schoolbook" w:cs="Century Schoolbook"/><w:color w:val="333333" /><w:kern w:val="0" /><w:sz w:val="20" /><w:szCs w:val="20" /><w14:ligatures w14:val="none" /></w:rPr><w:t xml:space="preserve">Plenty of others will be on hand, as well. Stroll the park, visiting each live music stage, to enjoy just about any type of musical act on your playlist. Be sure to bring </w:t></w:r><w:r><w:rPr><w:rFonts w:ascii="Century Schoolbook" w:hAnsi="Century Schoolbook" w:cs="Century Schoolbook"/><w:color w:val="333333" /><w:kern w:val="0" /><w:sz w:val="20" /><w:szCs w:val="20" /><w14:ligatures w14:val="none" /></w:rPr><w:t xml:space="preserve">your pet, </w:t></w:r><w:r><w:rPr><w:rFonts w:ascii="Century Schoolbook" w:hAnsi="Century Schoolbook" w:cs="Century Schoolbook"/><w:color w:val="333333" /><w:kern w:val="0" /><w:sz w:val="20" /><w:szCs w:val="20" /><w14:ligatures w14:val="none" /></w:rPr><w:t>a lawn chair</w:t></w:r><w:r><w:rPr><w:rFonts w:ascii="Century Schoolbook" w:hAnsi="Century Schoolbook" w:cs="Century Schoolbook"/><w:color w:val="333333" /><w:kern w:val="0" /><w:sz w:val="20" /><w:szCs w:val="20" /><w14:ligatures w14:val="none" /></w:rPr><w:t>,</w:t></w:r><w:r><w:rPr><w:rFonts w:ascii="Century Schoolbook" w:hAnsi="Century Schoolbook" w:cs="Century Schoolbook"/><w:color w:val="333333" /><w:kern w:val="0" /><w:sz w:val="20" /><w:szCs w:val="20" /><w14:ligatures w14:val="none" /></w:rPr><w:t xml:space="preserve"> and </w:t></w:r><w:r><w:rPr><w:rFonts w:ascii="Century Schoolbook" w:hAnsi="Century Schoolbook" w:cs="Century Schoolbook"/><w:color w:val="333333" /><w:kern w:val="0" /><w:sz w:val="20" /><w:szCs w:val="20" /><w14:ligatures w14:val="none" /></w:rPr><w:t xml:space="preserve">a </w:t></w:r><w:r><w:rPr><w:rFonts w:ascii="Century Schoolbook" w:hAnsi="Century Schoolbook" w:cs="Century Schoolbook"/><w:color w:val="333333" /><w:kern w:val="0" /><w:sz w:val="20" /><w:szCs w:val="20" /><w14:ligatures w14:val="none" /></w:rPr><w:t xml:space="preserve">cooler </w:t></w:r><w:r><w:rPr><w:rFonts w:ascii="Century Schoolbook" w:hAnsi="Century Schoolbook" w:cs="Century Schoolbook"/><w:color w:val="333333" /><w:kern w:val="0" /><w:sz w:val="20" /><w:szCs w:val="20" /><w14:ligatures w14:val="none" /></w:rPr><w:t xml:space="preserve">full of your favorite drinks </w:t></w:r><w:r><w:rPr><w:rFonts w:ascii="Century Schoolbook" w:hAnsi="Century Schoolbook" w:cs="Century Schoolbook"/><w:color w:val="333333" /><w:kern w:val="0" /><w:sz w:val="20" /><w:szCs w:val="20" /><w14:ligatures w14:val="none" /></w:rPr><w:t>(</w:t></w:r><w:r><w:rPr><w:rFonts w:ascii="Century Schoolbook" w:hAnsi="Century Schoolbook" w:cs="Century Schoolbook"/><w:color w:val="333333" /><w:kern w:val="0" /><w:sz w:val="20" /><w:szCs w:val="20" /><w14:ligatures w14:val="none" /></w:rPr><w:t>for safety reasons, please do not bring</w:t></w:r><w:r><w:rPr><w:rFonts w:ascii="Century Schoolbook" w:hAnsi="Century Schoolbook" w:cs="Century Schoolbook"/><w:color w:val="333333" /><w:kern w:val="0" /><w:sz w:val="20" /><w:szCs w:val="20" /><w14:ligatures w14:val="none" /></w:rPr><w:t xml:space="preserve"> glass bottles in</w:t></w:r><w:r><w:rPr><w:rFonts w:ascii="Century Schoolbook" w:hAnsi="Century Schoolbook" w:cs="Century Schoolbook"/><w:color w:val="333333" /><w:kern w:val="0" /><w:sz w:val="20" /><w:szCs w:val="20" /><w14:ligatures w14:val="none" /></w:rPr><w:t>to</w:t></w:r><w:r><w:rPr><w:rFonts w:ascii="Century Schoolbook" w:hAnsi="Century Schoolbook" w:cs="Century Schoolbook"/><w:color w:val="333333" /><w:kern w:val="0" /><w:sz w:val="20" /><w:szCs w:val="20" /><w14:ligatures w14:val="none" /></w:rPr><w:t xml:space="preserve"> the park).</w:t></w:r></w:p><w:p><w:pPr><w:spacing w:after="120" w:line="360" w:lineRule="auto"/></w:pPr><w:r><w:rPr><w:noProof/></w:rPr><w:drawing><wp:anchor distT="0" distB="0" distL="114300" distR="114300" simplePos="0" relativeHeight="251660288" behindDoc="0" locked="0" layoutInCell="1" allowOverlap="1" wp14:anchorId="2B3C4D5E" wp14:editId="6F7A8B9C"><wp:simplePos x="0" y="0"/><wp:positionH relativeFrom="column"><wp:posOffset>0</wp:posOffset></wp:positionH><wp:positionV relativeFrom="paragraph"><wp:posOffset>0</wp:posOffset></wp:positionV><wp:extent cx="914400" cy="914400"/><wp:effectExtent l="0" t="0" r="0" b="0"/><wp:wrapSquare wrapText="bothSides"/><wp:docPr id="2" name="Picture 2" descr="Balloon"/><wp:cNvGraphicFramePr><a:graphicFrameLocks xmlns:a="http://schemas.openxmlformats.org/drawingml/2006/main" noChangeAspect="1"/></wp:cNvGraphicFramePr><a:graphic xmlns:a="http://schemas.openxmlformats.org/drawingml/2006/main"><a:graphicData uri="http://schemas.openxmlformats.org/drawingml/2006/picture"><pic:pic xmlns:pic="http://schemas.openxmlformats.org/drawingml/2006/picture"><pic:nvPicPr><pic:cNvPr id="2" name="Balloon.jpg"/><pic:cNvPicPr/></pic:nvPicPr><pic:blipFill><a:blip r:embed="rId6"><a:extLst><a:ext uri="{AF507438-7753-43E0-B8FC-AC1667EBCBE1}"><a14:imgProps xmlns:a14="http://schemas.microsoft.com/office/drawing/2010/main"><a14:imgLayer><a14:imgEffect><a14:artisticPaintBrush/></a14:imgEffect></a14:imgLayer></a14:imgProps></a:ext></a:extLst></a:blip><a:stretch><a:fillRect/></a:stretch></pic:blipFill><pic:spPr><a:xfrm><a:off x="0" y="0"/><a:ext cx="914400" cy="914400"/></a:xfrm><a:prstGeom prst="rect"><a:avLst/></a:prstGeom><a:ln><a:noFill/></a:ln><a:effectLst><a:reflection blurRad="6350" stA="50000" endA="300" endPos="55500" dir="5400000" sy="-100000" algn="bl" rotWithShape="0"/></a:effectLst><a:scene3d><a:camera prst="orthographicFront"/><a:lightRig rig="threePt" dir="t"/></a:scene3d><a:sp3d><a:bevelT w="63500" h="25400" prst="relaxedInset"/></a:sp3d></pic:spPr></pic:pic></a:graphicData></a:graphic></wp:anchor></w:drawing></w:r><w:r><w:rPr><w:rFonts w:ascii="Century Schoolbook" w:hAnsi="Century Schoolbook" w:cs="Century Schoolbook"/><w:noProof/></w:rPr><w:drawing><wp:anchor distT="0" distB="0" distL="114300" distR="114300" simplePos="0" relativeHeight="251660288" behindDoc="0" locked="0" layoutInCell="1" allowOverlap="1" wp14:anchorId="2B3C4D5E" wp14:editId="6F7A8B9C"><wp:simplePos x="0" y="0"/><wp:positionH relativeFrom="column"><wp:posOffset>0</wp:posOffset></wp:positionH><wp:positionV relativeFrom="paragraph"><wp:posOffset>0</wp:posOffset></wp:positionV><wp:extent cx="914400" cy="914400"/><wp:effectExtent l="0" t="0" r="0" b="0"/><wp:wrapSquare wrapText="bothSides"/><wp:docPr id="2" name="Picture 2" descr="Balloon"/><wp:cNvGraphicFramePr><a:graphicFrameLocks xmlns:a="http://schemas.openxmlformats.org/drawingml/2006/main" noChangeAspect="1"/></wp:cNvGraphicFramePr><a:graphic xmlns:a="http://schemas.openxmlformats.org/drawingml/2006/main"><a:graphicData uri="http://schemas.openxmlformats.org/drawingml/2006/picture"><pic:pic xmlns:pic="http://schemas.openxmlformats.org/drawingml/2006/picture"><pic:nvPicPr><pic:cNvPr id="2" name="Balloon.jpg"/><pic:cNvPicPr/></pic:nvPicPr><pic:blipFill><a:blip r:embed="rId6"><a:extLst><a:ext uri="{AF507438-7753-43E0-B8FC-AC1667EBCBE1}"><a14:imgProps xmlns:a14="http://schemas.microsoft.com/office/drawing/2010/main"><a14:imgLayer><a14:imgEffect><a14:artisticPaintBrush/></a14:imgEffect></a14:imgLayer></a14:imgProps></a:ext></a:extLst></a:blip><a:stretch><a:fillRect/></a:stretch></pic:blipFill><pic:spPr><a:xfrm><a:off x="0" y="0"/><a:ext cx="914400" cy="914400"/></a:xfrm><a:prstGeom prst="rect"><a:avLst/></a:prstGeom><a:ln><a:noFill/></a:ln><a:effectLst><a:reflection blurRad="6350" stA="50000" endA="300" endPos="55500" dir="5400000" sy="-100000" algn="bl" rotWithShape="0"/></a:effectLst><a:scene3d><a:camera prst="orthographicFront"/><a:lightRig rig="threePt" dir="t"/></a:scene3d><a:sp3d><a:bevelT w="63500" h="25400" prst="relaxedInset"/></a:sp3d></pic:spPr></pic:pic></a:graphicData></a:graphic></wp:anchor></w:drawing></w:r><w:r><w:rPr><w:rFonts w:ascii="Century Schoolbook" w:hAnsi="Century Schoolbook" w:cs="Century Schoolbook"/><w:noProof/></w:rPr><w:drawing><wp:anchor distT="0" distB="0" distL="114300" distR="114300" simplePos="0" relativeHeight="251660288" behindDoc="0" locked="0" layoutInCell="1" allowOverlap="1" wp14:anchorId="2B3C4D5E" wp14:editId="6F7A8B9C"><wp:simplePos x="0" y="0"/><wp:positionH relativeFrom="column"><wp:posOffset>0</wp:posOffset></wp:positionH><wp:positionV relativeFrom="paragraph"><wp:posOffset>0</wp:posOffset></wp:positionV><wp:extent cx="914400" cy="914400"/><wp:effectExtent l="0" t="0" r="0" b="0"/><wp:wrapSquare wrapText="bothSides"/><wp:docPr id="2" name="Picture 2" descr="Balloon"/><wp:cNvGraphicFramePr><a:graphicFrameLocks xmlns:a="http://schemas.openxmlformats.org/drawingml/2006/main" noChangeAspect="1"/></wp:cNvGraphicFramePr><a:graphic xmlns:a="http://schemas.openxmlformats.org/drawingml/2006/main"><a:graphicData uri="http://schemas.openxmlformats.org/drawingml/2006/picture"><pic:pic xmlns:pic="http://schemas.openxmlformats.org/drawingml/2006/picture"><pic:nvPicPr><pic:cNvPr id="2" name="Balloon.jpg"/><pic:cNvPicPr/></pic:nvPicPr><pic:blipFill><a:blip r:embed="rId6"><a:extLst><a:ext uri="{AF507438-7753-43E0-B8FC-AC1667EBCBE1}"><a14:imgProps xmlns:a14="http://schemas.microsoft.com/office/drawing/2010/main"><a14:imgLayer><a14:imgEffect><a14:artisticPaintBrush/></a14:imgEffect></a14:imgLayer></a14:imgProps></a:ext><a:ext uri="{28A0092B-C50C-407E-A947-70E740481C1C}"><a14:useLocalDpi xmlns:a14="http://schemas.microsoft.com/office/drawing/2010/main" val="0"/></a:ext></a:extLst></a:blip><a:stretch><a:fillRect/></a:stretch></pic:blipFill><pic:spPr><a:xfrm><a:off x="0" y="0"/><a:ext cx="914400" cy="914400"/></a:xfrm><a:prstGeom prst="rect"><a:avLst/></a:prstGeom><a:ln><a:noFill/></a:ln><a:effectLst><a:reflection blurRad="6350" stA="50000" endA="300" endPos="55500" dir="5400000" sy="-100000" algn="bl" rotWithShape="0"/></a:effectLst><a:scene3d><a:camera prst="orthographicFront"/><a:lightRig rig="threePt" dir="t"/></a:scene3d><a:sp3d><a:bevelT w="63500" h="25400" prst="relaxedInset"/></a:sp3d></pic:spPr></pic:pic></a:graphicData></a:graphic></wp:anchor></w:drawing></w:r><w:rPr><w:rFonts w:ascii="Century Schoolbook" w:hAnsi="Century Schoolbook" w:cs="Century Schoolbook"/></w:rPr></w:pPr><w:rPr><w:rFonts w:ascii="Century Schoolbook" w:hAnsi="Century Schoolbook" w:cs="Century Schoolbook"/><w:color w:val="333333" /><w:kern w:val="0" /><w:sz w:val="20" /><w:szCs w:val="20" /><w14:ligatures w14:val="none" /></w:rPr></w:pPr><w:r><w:rPr><w:rFonts w:ascii="Century Schoolbook" w:hAnsi="Century Schoolbook" w:cs="Century Schoolbook"/><w:color w:val="333333" /><w:kern w:val="0" /><w:sz w:val="20" /><w:szCs w:val="20" /><w14:ligatures w14:val="none" /></w:rPr><w:t xml:space="preserve">As for the kids, hold on to your hat! Your children can pet a baby </w:t></w:r><w:r><w:rPr><w:rFonts w:ascii="Century Schoolbook" w:hAnsi="Century Schoolbook" w:cs="Century Schoolbook"/><w:color w:val="333333" /><w:kern w:val="0" /><w:sz w:val="20" /><w:szCs w:val="20" /><w14:ligatures w14:val="none" /></w:rPr><w:t>sheep</w:t></w:r><w:r><w:rPr><w:rFonts w:ascii="Century Schoolbook" w:hAnsi="Century Schoolbook" w:cs="Century Schoolbook"/><w:color w:val="333333" /><w:kern w:val="0" /><w:sz w:val="20" /><w:szCs w:val="20" /><w14:ligatures w14:val="none" /></w:rPr><w:t xml:space="preserve">, dance like a butterfly to fun tunes, get their faces painted with balloon art, and try a little limbo. At the children’s village, they can enjoy </w:t></w:r><w:r><w:rPr><w:rFonts w:ascii="Century Schoolbook" w:hAnsi="Century Schoolbook" w:cs="Century Schoolbook"/><w:color w:val="333333" /><w:kern w:val="0" /><w:sz w:val="20" /><w:szCs w:val="20" /><w14:ligatures w14:val="none" /></w:rPr><w:t>John</w:t></w:r><w:r><w:rPr><w:rFonts w:ascii="Century Schoolbook" w:hAnsi="Century Schoolbook" w:cs="Century Schoolbook"/><w:color w:val="333333" /><w:kern w:val="0" /><w:sz w:val="20" /><w:szCs w:val="20" /><w14:ligatures w14:val="none" /></w:rPr><w:t>ny</w:t></w:r><w:r><w:rPr><w:rFonts w:ascii="Century Schoolbook" w:hAnsi="Century Schoolbook" w:cs="Century Schoolbook"/><w:color w:val="333333" /><w:kern w:val="0" /><w:sz w:val="20" /><w:szCs w:val="20" /><w14:ligatures w14:val="none" /></w:rPr><w:t xml:space="preserve"> Drake </w:t></w:r><w:r><w:rPr><w:rFonts w:ascii="Century Schoolbook" w:hAnsi="Century Schoolbook" w:cs="Century Schoolbook"/><w:color w:val="333333" /><w:kern w:val="0" /><w:sz w:val="20" /><w:szCs w:val="20" /><w14:ligatures w14:val="none" /></w:rPr><w:t>as he</w:t></w:r><w:r><w:rPr><w:rFonts w:ascii="Century Schoolbook" w:hAnsi="Century Schoolbook" w:cs="Century Schoolbook"/><w:color w:val="333333" /><w:kern w:val="0" /><w:sz w:val="20" /><w:szCs w:val="20" /><w14:ligatures w14:val="none" /></w:rPr><w:t xml:space="preserve"> perform</w:t></w:r><w:r><w:rPr><w:rFonts w:ascii="Century Schoolbook" w:hAnsi="Century Schoolbook" w:cs="Century Schoolbook"/><w:color w:val="333333" /><w:kern w:val="0" /><w:sz w:val="20" /><w:szCs w:val="20" /><w14:ligatures w14:val="none" /></w:rPr><w:t>s</w:t></w:r><w:r><w:rPr><w:rFonts w:ascii="Century Schoolbook" w:hAnsi="Century Schoolbook" w:cs="Century Schoolbook"/><w:color w:val="333333" /><w:kern w:val="0" /><w:sz w:val="20" /><w:szCs w:val="20" /><w14:ligatures w14:val="none" /></w:rPr><w:t xml:space="preserve"> his magic show</w:t></w:r><w:r><w:rPr><w:rFonts w:ascii="Century Schoolbook" w:hAnsi="Century Schoolbook" w:cs="Century Schoolbook"/><w:color w:val="333333" /><w:kern w:val="0" /><w:sz w:val="20" /><w:szCs w:val="20" /><w14:ligatures w14:val="none" /></w:rPr><w:t xml:space="preserve">. In the next booth, they can catch storytelling and puppet shows sponsored by the </w:t></w:r><w:r><w:rPr><w:rFonts w:ascii="Century Schoolbook" w:hAnsi="Century Schoolbook" w:cs="Century Schoolbook"/><w:color w:val="333333" /><w:kern w:val="0" /><w:sz w:val="20" /><w:szCs w:val="20" /><w14:ligatures w14:val="none" /></w:rPr><w:t>Lancaster County</w:t></w:r><w:r><w:rPr><w:rFonts w:ascii="Century Schoolbook" w:hAnsi="Century Schoolbook" w:cs="Century Schoolbook"/><w:color w:val="333333" /><w:kern w:val="0" /><w:sz w:val="20" /><w:szCs w:val="20" /><w14:ligatures w14:val="none" /></w:rPr><w:t xml:space="preserve"> </w:t></w:r><w:r><w:rPr><w:rFonts w:ascii="Century Schoolbook" w:hAnsi="Century Schoolbook" w:cs="Century Schoolbook"/><w:color w:val="333333" /><w:kern w:val="0" /><w:sz w:val="20" /><w:szCs w:val="20" /><w14:ligatures w14:val="none" /></w:rPr><w:t>School System</w:t></w:r><w:r><w:rPr><w:rFonts w:ascii="Century Schoolbook" w:hAnsi="Century Schoolbook" w:cs="Century Schoolbook"/><w:color w:val="333333" /><w:kern w:val="0" /><w:sz w:val="20" /><w:szCs w:val="20" /><w14:ligatures w14:val="none" /></w:rPr><w:t>.</w:t></w:r></w:p><w:p><w:pPr><w:spacing w:after="120" w:line="360" w:lineRule="auto"/></w:pPr><w:rPr><w:rFonts w:ascii="Century Schoolbook" w:hAnsi="Century Schoolbook" w:cs="Century Schoolbook"/><w:color w:val="333333" /><w:kern w:val="0" /><w:sz w:val="20" /><w:szCs w:val="20" /><w14:ligatures w14:val="none" /></w:rPr></w:pPr><w:r><w:rPr><w:rFonts w:ascii="Century Schoolbook" w:hAnsi="Century Schoolbook" w:cs="Century Schoolbook"/><w:color w:val="333333" /><w:kern w:val="0" /><w:sz w:val="20" /><w:szCs w:val="20" /><w14:ligatures w14:val="none" /></w:rPr><w:t>And don’t forget the dogs! In a special enclosure, well-behaved dogs</w:t></w:r><w:r><w:rPr><w:rFonts w:ascii="Century Schoolbook" w:hAnsi="Century Schoolbook" w:cs="Century Schoolbook"/><w:color w:val="333333" /><w:kern w:val="0" /><w:sz w:val="20" /><w:szCs w:val="20" /><w14:ligatures w14:val="none" /></w:rPr><w:t xml:space="preserve"> can participate in the Stay Connected K-9 Frisbee Toss. Dogs can splash in pools, chase toys, and dig for buried treasure. Adult supervision required, of course!</w:t></w:r></w:p><w:p><w:pPr><w:spacing w:after="120" w:line="360" w:lineRule="auto"/></w:pPr><w:rPr><w:rFonts w:ascii="Century Schoolbook" w:hAnsi="Century Schoolbook" w:cs="Century Schoolbook"/><w:color w:val="333333" /><w:kern w:val="0" /><w:sz w:val="20" /><w:szCs w:val="20" /><w14:ligatures w14:val="none" /></w:rPr></w:pPr><w:r><w:rPr><w:rFonts w:ascii="Century Schoolbook" w:hAnsi="Century Schoolbook" w:cs="Century Schoolbook"/><w:color w:val="333333" /><w:kern w:val="0" /><w:sz w:val="20" /><w:szCs w:val="20" /><w14:ligatures w14:val="none" /></w:rPr><w:t>We guarantee you’ll be hungry! Grab an ice cream cone or snack on popcorn as you stroll through the vendors and hot air balloons. The barbecue cook-off is sure to be a stellar attraction, as well. With food vendors</w:t></w:r><w:r><w:rPr><w:rFonts w:ascii="Century Schoolbook" w:hAnsi="Century Schoolbook" w:cs="Century Schoolbook"/><w:color w:val="333333" /><w:kern w:val="0" /><w:sz w:val="20" /><w:szCs w:val="20" /><w14:ligatures w14:val="none" /></w:rPr><w:t>—many participated in the farm to table concept—</w:t></w:r><w:r><w:rPr><w:rFonts w:ascii="Century Schoolbook" w:hAnsi="Century Schoolbook" w:cs="Century Schoolbook"/><w:color w:val="333333" /><w:kern w:val="0" /><w:sz w:val="20" /><w:szCs w:val="20" /><w14:ligatures w14:val="none" /></w:rPr><w:t>scattered throughout the park, you’re never too far from your next meal.</w:t></w:r></w:p><w:p><w:r><w:br w:type="page"/></w:r></w:p><w:p><w:r><w:br w:type="page"/></w:r></w:p><w:p><w:pPr><w:spacing w:after="120" w:line="360" w:lineRule="auto"/><w:rPr><w:rFonts w:ascii="Century Schoolbook" w:hAnsi="Century Schoolbook" w:cs="Century Schoolbook"/></w:rPr></w:pPr><w:rPr><w:rFonts w:ascii="Century Schoolbook" w:hAnsi="Century Schoolbook" w:cs="Century Schoolbook"/><w:color w:val="333333" /><w:kern w:val="0" /><w:sz w:val="20" /><w:szCs w:val="20" /><w14:ligatures w14:val="none" /></w:rPr></w:pPr><w:r><w:rPr><w:rFonts w:ascii="Century Schoolbook" w:hAnsi="Century Schoolbook" w:cs="Century Schoolbook"/><w:color w:val="333333" /><w:kern w:val="0" /><w:sz w:val="20" /><w:szCs w:val="20" /><w14:ligatures w14:val="none" /></w:rPr><w:t>All balloon flights and displays are weather permitting. Winds must be less than 5 mph to safely inflate balloons on the festival grounds.</w:t></w:r></w:p><w:p><w:r><w:br w:type="page"/></w:r></w:p><w:p><w:r><w:br w:type="page"/></w:r></w:p><w:p><w:pPr><w:shd w:val="clear" w:color="auto" w:fill="FFFFFF" /><w:spacing w:before="100" w:beforeAutospacing="1" w:after="100" w:afterAutospacing="1" w:line="270" w:lineRule="atLeast" /><w:outlineLvl w:val="1" /><w:rPr><w:rFonts w:ascii="Arial" w:eastAsia="Times New Roman" w:hAnsi="Arial" w:cs="Arial" /><w:b /><w:bCs /><w:color w:val="333333" /><w:kern w:val="0" /><w:sz w:val="36" /><w:szCs w:val="36" /><w14:ligatures w14:val="none" /></w:rPr><w:sectPr><w:type w:val="continuous" /><w:pgSz w:w="12240" w:h="15840" /><w:pgMar w:top="1440" w:right="1440" w:bottom="1440" w:left="1440" w:header="720" w:footer="720" w:gutter="0" /><w:cols w:num="2" w:sep="1" w:space="720" /><w:docGrid w:linePitch="360" /></w:sectPr></w:pPr><w:bookmarkStart w:name="_m-5X#02YKVF6MCW6jmi6UWwBmzJzmxHDCFX|y" w:id="123" /><w:bookmarkEnd w:id="123" /><w:bookmarkStart w:name="_m-5X#12!YDdO&gt;4wr18L5tGv3e[uMI0B10shqk" w:id="124" /><w:bookmarkEnd w:id="124" /><w:bookmarkStart w:name="_m-5X#22xN{/qv" w:id="125" /><w:bookmarkEnd w:id="125" /></w:p><w:p><w:r><w:rPr><w:noProof/></w:rPr><w:drawing><wp:anchor distT="0" distB="0" distL="114300" distR="114300" simplePos="0" relativeHeight="251661312" behindDoc="0" locked="0" layoutInCell="1" allowOverlap="1" wp14:anchorId="3C4D5E6F" wp14:editId="7A8B9C0D"><wp:simplePos x="0" y="0"/><wp:positionH relativeFrom="column"><wp:posOffset>0</wp:posOffset></wp:positionH><wp:positionV relativeFrom="paragraph"><wp:posOffset>0</wp:posOffset></wp:positionV><wp:extent cx="457200" cy="457200"/><wp:effectExtent l="0" t="0" r="0" b="0"/><wp:wrapSquare wrapText="bothSides"/><wp:docPr id="3" name="Graphic 3" descr="Question mark"/><wp:cNvGraphicFramePr/><a:graphic xmlns:a="http://schemas.openxmlformats.org/drawingml/2006/main"><a:graphicData uri="http://schemas.microsoft.com/office/word/2010/wordprocessingShape"><wps:wsp><wps:cNvSpPr/><wps:spPr><a:xfrm><a:off x="0" y="0"/><a:ext cx="457200" cy="457200"/></a:xfrm><a:prstGeom prst="rect"><a:avLst/></a:prstGeom><a:solidFill><a:srgbClr val="4472C4"/></a:solidFill><a:ln><a:noFill/></a:ln></wps:spPr><wps:txbx><w:txbxContent><w:p><w:pPr><w:jc w:val="center"/></w:pPr><w:r><w:rPr><w:color w:val="FFFFFF"/><w:sz w:val="40"/><w:szCs w:val="40"/></w:rPr><w:t>?</w:t></w:r></w:p></w:txbxContent></wps:txbx><wps:bodyPr anchor="ctr" anchorCtr="0"/></wps:wsp></a:graphicData></a:graphic></wp:anchor></w:drawing></w:r><w:pPr><w:shd w:val="clear" w:color="auto" w:fill="FFFFFF" /><w:spacing w:before="100" w:beforeAutospacing="1" w:after="100" w:afterAutospacing="1" w:line="270" w:lineRule="atLeast" /><w:outlineLvl w:val="1" /><w:rPr><w:rFonts w:ascii="Arial" w:eastAsia="Times New Roman" w:hAnsi="Arial" w:cs="Arial" /><w:b /><w:bCs /><w:color w:val="333333" /><w:kern w:val="0" /><w:sz w:val="36" /><w:szCs w:val="36" /><w14:ligatures w14:val="none" /></w:rPr></w:pPr><w:r><w:rPr><w:noProof/></w:rPr><w:drawing><wp:anchor distT="0" distB="0" distL="114300" distR="114300" simplePos="0" relativeHeight="251661312" behindDoc="0" locked="0" layoutInCell="1" allowOverlap="1" wp14:anchorId="3C4D5E6F" wp14:editId="7A8B9C0D"><wp:simplePos x="0" y="0"/><wp:positionH relativeFrom="column"><wp:posOffset>0</wp:posOffset></wp:positionH><wp:positionV relativeFrom="paragraph"><wp:posOffset>0</wp:posOffset></wp:positionV><wp:extent cx="457200" cy="457200"/><wp:effectExtent l="0" t="0" r="0" b="0"/><wp:wrapSquare wrapText="bothSides"/><wp:docPr id="3" name="Graphic 3" descr="Question mark"/><wp:cNvGraphicFramePr/><a:graphic xmlns:a="http://schemas.openxmlformats.org/drawingml/2006/main"><a:graphicData uri="http://schemas.microsoft.com/office/word/2010/wordprocessingShape"><wps:wsp><wps:cNvSpPr/><wps:spPr><a:xfrm><a:off x="0" y="0"/><a:ext cx="457200" cy="457200"/></a:xfrm><a:prstGeom prst="rect"><a:avLst/></a:prstGeom><a:solidFill><a:srgbClr val="4472C4"/></a:solidFill><a:ln><a:noFill/></a:ln></wps:spPr><wps:txbx><w:txbxContent><w:p><w:pPr><w:jc w:val="center"/></w:pPr><w:r><w:rPr><w:color w:val="FFFFFF"/><w:sz w:val="40"/><w:szCs w:val="40"/></w:rPr><w:t>?</w:t></w:r></w:p></w:txbxContent></wps:txbx><wps:bodyPr anchor="ctr" anchorCtr="0"/></wps:wsp></a:graphicData></a:graphic></wp:anchor></w:drawing></w:r><w:rPr><w:rFonts w:ascii="Arial" w:eastAsia="Times New Roman" w:hAnsi="Arial" w:cs="Arial" /><w:b /><w:bCs /><w:color w:val="333333" /><w:kern w:val="0" /><w:sz w:val="36" /><w:szCs w:val="36" /><w14:ligatures w14:val="none" /></w:rPr></w:pPr><w:r><w:rPr><w:rFonts w:ascii="Arial" w:eastAsia="Times New Roman" w:hAnsi="Arial" w:cs="Arial" /><w:b /><w:bCs /><w:color w:val="333333" /><w:kern w:val="0" /><w:sz w:val="36" /><w:szCs w:val="36" /><w14:ligatures w14:val="none" /></w:rPr><w:t>Frequently Asked Questions</w:t></w:r></w:p><w:p><w:pPr><w:rPr><w:b/><w:bCs/></w:rPr></w:pPr><w:r><w:rPr><w:b/><w:bCs/><w:rFonts w:ascii="Arial" w:eastAsia="Times New Roman" w:hAnsi="Arial" w:cs="Arial" /><w:bCs /><w:color w:val="333333" /><w:kern w:val="0" /><w:sz w:val="24" /><w:szCs w:val="24" /><w14:ligatures w14:val="none" /></w:rPr><w:t>When is the best time to see balloons?</w:t></w:r><w:bookmarkStart w:name="_m-5U#02YKSF6PCW3jml6UTwBpzJwmxKDCCX||" w:id="117" /><w:bookmarkEnd w:id="117" /><w:bookmarkStart w:name="_m-5U#12!YAdOA4wo18O5tDv3h[uJI0E10phqn" w:id="118" /><w:bookmarkEnd w:id="118" /><w:bookmarkStart w:name="_m-5U#22xNx/qy" w:id="119" /><w:bookmarkEnd w:id="119" /></w:p><w:p><w:pPr><w:shd w:val="clear" w:color="auto" w:fill="FFFFFF" /><w:spacing w:before="100" w:beforeAutospacing="1" w:after="100" w:afterAutospacing="1" w:line="270" w:lineRule="atLeast" /><w:rPr><w:rFonts w:ascii="Arial" w:eastAsia="Times New Roman" w:hAnsi="Arial" w:cs="Arial" /><w:color w:val="333333" /><w:kern w:val="0" /><w:sz w:val="20" /><w:szCs w:val="20" /><w14:ligatures w14:val="none" /></w:rPr></w:pPr><w:r><w:rPr><w:rFonts w:ascii="Arial" w:eastAsia="Times New Roman" w:hAnsi="Arial" w:cs="Arial" /><w:color w:val="333333" /><w:kern w:val="0" /><w:sz w:val="20" /><w:szCs w:val="20" /><w14:ligatures w14:val="none" /></w:rPr><w:lastRenderedPageBreak /><w:t>The best time to view balloons and get great pictures is early morning. Flights begin at approximately 6:00 a.m. each morning. It’s definitely worth getting up early to see balloons grace the early morning sky. Balloons also fly at dusk (approximately 7:00 p.m. on Friday and Saturday night</w:t></w:r><w:r><w:rPr><w:rFonts w:ascii="Arial" w:eastAsia="Times New Roman" w:hAnsi="Arial" w:cs="Arial" /><w:color w:val="333333" /><w:kern w:val="0" /><w:sz w:val="20" /><w:szCs w:val="20" /><w14:ligatures w14:val="none" /></w:rPr><w:t>)</w:t></w:r><w:r><w:rPr><w:rFonts w:ascii="Arial" w:eastAsia="Times New Roman" w:hAnsi="Arial" w:cs="Arial" /><w:color w:val="333333" /><w:kern w:val="0" /><w:sz w:val="20" /><w:szCs w:val="20" /><w14:ligatures w14:val="none" /></w:rPr><w:t>.</w:t></w:r><w:bookmarkStart w:name="_m-5Q#02YLYF5JCX9jlf6VZwAjzK}mwEDDIX{v" w:id="114" /><w:bookmarkEnd w:id="114" /><w:bookmarkStart w:name="_m-5Q#12!ZGdN;4xu17I5uJv2b[vPI/?11vhph" w:id="115" /><w:bookmarkEnd w:id="115" /><w:bookmarkStart w:name="_m-5Q#22xO~/ps" w:id="116" /><w:bookmarkEnd w:id="116" /></w:p><w:p><w:pPr><w:shd w:val="clear" w:color="auto" w:fill="FFFFFF" /><w:spacing w:beforeAutospacing="1" w:after="0" w:afterAutospacing="1" w:line="270" w:lineRule="atLeast" /><w:rPr><w:rFonts w:ascii="Arial" w:eastAsia="Times New Roman" w:hAnsi="Arial" w:cs="Arial" /><w:color w:val="333333" /><w:kern w:val="0" /><w:sz w:val="20" /><w:szCs w:val="20" /><w14:ligatures w14:val="none" /></w:rPr></w:pPr><w:r><w:rPr><w:rFonts w:ascii="Arial" w:eastAsia="Times New Roman" w:hAnsi="Arial" w:cs="Arial" /><w:color w:val="333333" /><w:kern w:val="0" /><w:sz w:val="20" /><w:szCs w:val="20" /><w14:ligatures w14:val="none" /></w:rPr><w:t>Please be aware that b</w:t></w:r><w:r><w:rPr><w:rFonts w:ascii="Arial" w:eastAsia="Times New Roman" w:hAnsi="Arial" w:cs="Arial" /><w:color w:val="333333" /><w:kern w:val="0" /><w:sz w:val="20" /><w:szCs w:val="20" /><w14:ligatures w14:val="none" /></w:rPr><w:t>allooning is extremely weather dependent. Winds must be less than 1</w:t></w:r><w:r><w:rPr><w:rFonts w:ascii="Arial" w:eastAsia="Times New Roman" w:hAnsi="Arial" w:cs="Arial" /><w:color w:val="333333" /><w:kern w:val="0" /><w:sz w:val="20" /><w:szCs w:val="20" /><w14:ligatures w14:val="none" /></w:rPr><w:t>5 mph</w:t></w:r><w:r><w:rPr><w:rFonts w:ascii="Arial" w:eastAsia="Times New Roman" w:hAnsi="Arial" w:cs="Arial" /><w:color w:val="333333" /><w:kern w:val="0" /><w:sz w:val="20" /><w:szCs w:val="20" /><w14:ligatures w14:val="none" /></w:rPr><w:t xml:space="preserve"> fo</w:t></w:r><w:r><w:rPr><w:rFonts w:ascii="Arial" w:eastAsia="Times New Roman" w:hAnsi="Arial" w:cs="Arial" /><w:color w:val="333333" /><w:kern w:val="0" /><w:sz w:val="20" /><w:szCs w:val="20" /><w14:ligatures w14:val="none" /></w:rPr><w:t>r balloons to fly. Listen to W</w:t></w:r><w:r><w:rPr><w:rFonts w:ascii="Arial" w:eastAsia="Times New Roman" w:hAnsi="Arial" w:cs="Arial" /><w:color w:val="333333" /><w:kern w:val="0" /><w:sz w:val="20" /><w:szCs w:val="20" /><w14:ligatures w14:val="none" /></w:rPr><w:t xml:space="preserve">LITE </w:t></w:r><w:r><w:rPr><w:rFonts w:ascii="Arial" w:eastAsia="Times New Roman" w:hAnsi="Arial" w:cs="Arial" /><w:color w:val="333333" /><w:kern w:val="0" /><w:sz w:val="20" /><w:szCs w:val="20" /><w14:ligatures w14:val="none" /></w:rPr><w:t>1</w:t></w:r><w:r><w:rPr><w:rFonts w:ascii="Arial" w:eastAsia="Times New Roman" w:hAnsi="Arial" w:cs="Arial" /><w:color w:val="333333" /><w:kern w:val="0" /><w:sz w:val="20" /><w:szCs w:val="20" /><w14:ligatures w14:val="none" /></w:rPr><w:t>0</w:t></w:r><w:r><w:rPr><w:rFonts w:ascii="Arial" w:eastAsia="Times New Roman" w:hAnsi="Arial" w:cs="Arial" /><w:color w:val="333333" /><w:kern w:val="0" /><w:sz w:val="20" /><w:szCs w:val="20" /><w14:ligatures w14:val="none" /></w:rPr><w:t>5</w:t></w:r><w:r><w:rPr><w:rFonts w:ascii="Arial" w:eastAsia="Times New Roman" w:hAnsi="Arial" w:cs="Arial" /><w:color w:val="333333" /><w:kern w:val="0" /><w:sz w:val="20" /><w:szCs w:val="20" /><w14:ligatures w14:val="none" /></w:rPr><w:t>0 AM or 9</w:t></w:r><w:r><w:rPr><w:rFonts w:ascii="Arial" w:eastAsia="Times New Roman" w:hAnsi="Arial" w:cs="Arial" /><w:color w:val="333333" /><w:kern w:val="0" /><w:sz w:val="20" /><w:szCs w:val="20" /><w14:ligatures w14:val="none" /></w:rPr><w:t>5</w:t></w:r><w:r><w:rPr><w:rFonts w:ascii="Arial" w:eastAsia="Times New Roman" w:hAnsi="Arial" w:cs="Arial" /><w:color w:val="333333" /><w:kern w:val="0" /><w:sz w:val="20" /><w:szCs w:val="20" /><w14:ligatures w14:val="none" /></w:rPr><w:t>.</w:t></w:r><w:r><w:rPr><w:rFonts w:ascii="Arial" w:eastAsia="Times New Roman" w:hAnsi="Arial" w:cs="Arial" /><w:color w:val="333333" /><w:kern w:val="0" /><w:sz w:val="20" /><w:szCs w:val="20" /><w14:ligatures w14:val="none" /></w:rPr><w:t>7</w:t></w:r><w:r><w:rPr><w:rFonts w:ascii="Arial" w:eastAsia="Times New Roman" w:hAnsi="Arial" w:cs="Arial" /><w:color w:val="333333" /><w:kern w:val="0" /><w:sz w:val="20" /><w:szCs w:val="20" /><w14:ligatures w14:val="none" /></w:rPr><w:t xml:space="preserve"> FM for the latest on flight information.</w:t></w:r><w:bookmarkStart w:name="_m-5O#02YLWF5LCX7jlh6VXwAlzK{mwGDDGX{x" w:id="111" /><w:bookmarkEnd w:id="111" /><w:bookmarkStart w:name="_m-5O#12!ZEdN=4xs17K5uHv2d[vNI/A11thpj" w:id="112" /><w:bookmarkEnd w:id="112" /><w:bookmarkStart w:name="_m-5O#22xO|/pu" w:id="113" /><w:bookmarkEnd w:id="113" /></w:p><w:p><w:pPr><w:rPr><w:b/><w:bCs/></w:rPr></w:pPr><w:r><w:rPr><w:b/><w:bCs/><w:rFonts w:ascii="Arial" w:eastAsia="Times New Roman" w:hAnsi="Arial" w:cs="Arial" /><w:bCs /><w:color w:val="333333" /><w:kern w:val="0" /><w:sz w:val="24" /><w:szCs w:val="24" /><w14:ligatures w14:val="none" /></w:rPr><w:t>Wh</w:t></w:r><w:r><w:rPr><w:b/><w:bCs/><w:rFonts w:ascii="Arial" w:eastAsia="Times New Roman" w:hAnsi="Arial" w:cs="Arial" /><w:bCs /><w:color w:val="333333" /><w:kern w:val="0" /><w:sz w:val="24" /><w:szCs w:val="24" /><w14:ligatures w14:val="none" /></w:rPr><w:t>ere are the balloons and pilots during the day?</w:t></w:r><w:bookmarkStart w:name="_m-5N#02YLVF5MCX6jli6VWwAmzKzmwHDDFX{y" w:id="108" /><w:bookmarkEnd w:id="108" /><w:bookmarkStart w:name="_m-5N#12!ZDdN&gt;4xr17L5uGv2e[vMI/B11shpk" w:id="109" /><w:bookmarkEnd w:id="109" /><w:bookmarkStart w:name="_m-5N#22xO{/pv" w:id="110" /><w:bookmarkEnd w:id="110" /></w:p><w:p><w:pPr><w:shd w:val="clear" w:color="auto" w:fill="FFFFFF" /><w:spacing w:before="100" w:beforeAutospacing="1" w:after="100" w:afterAutospacing="1" w:line="270" w:lineRule="atLeast" /><w:rPr><w:rFonts w:ascii="Arial" w:eastAsia="Times New Roman" w:hAnsi="Arial" w:cs="Arial" /><w:color w:val="333333" /><w:kern w:val="0" /><w:sz w:val="20" /><w:szCs w:val="20" /><w14:ligatures w14:val="none" /></w:rPr></w:pPr><w:r><w:rPr><w:rFonts w:ascii="Arial" w:eastAsia="Times New Roman" w:hAnsi="Arial" w:cs="Arial" /><w:color w:val="333333" /><w:kern w:val="0" /><w:sz w:val="20" /><w:szCs w:val="20" /><w14:ligatures w14:val="none" /></w:rPr><w:t>High canyon winds make it impossible to inflate balloons during the day. Pilots and their families enjoy the same things that you do at the park—live music, quality arts &amp; crafts, and local cuisine.</w:t></w:r><w:bookmarkStart w:name="_m-5I#02XC[G&gt;HBO;kud5M\xJhyB!n&quot;CC;KY&amp;t" w:id="105" /><w:bookmarkEnd w:id="105" /><w:bookmarkStart w:name="_m-5I#12~QIeW93ow2@G4lLw;`ZmRJ8=0(xiyf" w:id="106" /><w:bookmarkEnd w:id="106" /><w:bookmarkStart w:name="_m-5I#22wF&quot;0yq" w:id="107" /><w:bookmarkEnd w:id="107" /></w:p><w:p><w:pPr><w:rPr><w:b/><w:bCs/></w:rPr></w:pPr><w:r><w:rPr><w:b/><w:bCs/><w:rFonts w:ascii="Arial" w:eastAsia="Times New Roman" w:hAnsi="Arial" w:cs="Arial" /><w:bCs /><w:color w:val="333333" /><w:kern w:val="0" /><w:sz w:val="24" /><w:szCs w:val="24" /><w14:ligatures w14:val="none" /></w:rPr><w:t>Can I purchase a hot air balloon ride during the Festival?</w:t></w:r><w:bookmarkStart w:name="_m-5F#02XCXG&gt;KBO8kug5MYxJkyB|n&quot;FC;HY&amp;w" w:id="102" /><w:bookmarkEnd w:id="102" /><w:bookmarkStart w:name="_m-5F#12~QFeW&lt;3ot2@J4lIw;cZmOJ8@0(uiyi" w:id="103" /><w:bookmarkEnd w:id="103" /><w:bookmarkStart w:name="_m-5F#22wF}0yt" w:id="104" /><w:bookmarkEnd w:id="104" /></w:p><w:p><w:pPr><w:shd w:val="clear" w:color="auto" w:fill="FFFFFF" /><w:spacing w:beforeAutospacing="1" w:after="0" w:afterAutospacing="1" w:line="270" w:lineRule="atLeast" /><w:rPr><w:rFonts w:ascii="Arial" w:eastAsia="Times New Roman" w:hAnsi="Arial" w:cs="Arial" /><w:color w:val="333333" /><w:kern w:val="0" /><w:sz w:val="20" /><w:szCs w:val="20" /><w14:ligatures w14:val="none" /></w:rPr></w:pPr><w:r><w:rPr><w:rFonts w:ascii="Arial" w:eastAsia="Times New Roman" w:hAnsi="Arial" w:cs="Arial" /><w:color w:val="333333" /><w:kern w:val="0" /><w:sz w:val="20" /><w:szCs w:val="20" /><w14:ligatures w14:val="none" /></w:rPr><w:t>Due to the overwhelming demand for balloon rides during the fes</w:t></w:r><w:r><w:rPr><w:rFonts w:ascii="Arial" w:eastAsia="Times New Roman" w:hAnsi="Arial" w:cs="Arial" /><w:color w:val="333333" /><w:kern w:val="0" /><w:sz w:val="20" /><w:szCs w:val="20" /><w14:ligatures w14:val="none" /></w:rPr><w:t>tival, rides are not available. However, most pilots will give tether rides on Saturday and Sunday mornings.</w:t></w:r><w:r><w:rPr><w:rFonts w:ascii="Arial" w:eastAsia="Times New Roman" w:hAnsi="Arial" w:cs="Arial" /><w:color w:val="333333" /><w:kern w:val="0" /><w:sz w:val="20" /><w:szCs w:val="20" /><w14:ligatures w14:val="none" /></w:rPr><w:t xml:space="preserve"> Rides can be purchased before</w:t></w:r><w:r><w:rPr><w:rFonts w:ascii="Arial" w:eastAsia="Times New Roman" w:hAnsi="Arial" w:cs="Arial" /><w:color w:val="333333" /><w:kern w:val="0" /><w:sz w:val="20" /><w:szCs w:val="20" /><w14:ligatures w14:val="none" /></w:rPr><w:t xml:space="preserve"> or</w:t></w:r><w:r><w:rPr><w:rFonts w:ascii="Arial" w:eastAsia="Times New Roman" w:hAnsi="Arial" w:cs="Arial" /><w:color w:val="333333" /><w:kern w:val="0" /><w:sz w:val="20" /><w:szCs w:val="20" /><w14:ligatures w14:val="none" /></w:rPr><w:t xml:space="preserve"> </w:t></w:r><w:r><w:rPr><w:rFonts w:ascii="Arial" w:eastAsia="Times New Roman" w:hAnsi="Arial" w:cs="Arial" /><w:color w:val="333333" /><w:kern w:val="0" /><w:sz w:val="20" /><w:szCs w:val="20" /><w14:ligatures w14:val="none" /></w:rPr><w:t xml:space="preserve">after the festival from </w:t></w:r><w:r><w:rPr><w:rFonts w:ascii="Arial" w:eastAsia="Times New Roman" w:hAnsi="Arial" w:cs="Arial" /><w:color w:val="333333" /><w:kern w:val="0" /><w:sz w:val="20" /><w:szCs w:val="20" /><w14:ligatures w14:val="none" /></w:rPr><w:t>Sky Glide</w:t></w:r><w:r><w:rPr><w:rFonts w:ascii="Arial" w:eastAsia="Times New Roman" w:hAnsi="Arial" w:cs="Arial" /><w:color w:val="333333" /><w:kern w:val="0" /><w:sz w:val="20" /><w:szCs w:val="20" /><w14:ligatures w14:val="none" /></w:rPr><w:t xml:space="preserve"> Hot Air Balloon Company, a member of the </w:t></w:r><w:r><w:rPr><w:rFonts w:ascii="Arial" w:eastAsia="Times New Roman" w:hAnsi="Arial" w:cs="Arial" /><w:color w:val="333333" /><w:kern w:val="0" /><w:sz w:val="20" /><w:szCs w:val="20" /><w14:ligatures w14:val="none" /></w:rPr><w:t xml:space="preserve">Mount </w:t></w:r><w:r><w:rPr><w:rFonts w:ascii="Arial" w:eastAsia="Times New Roman" w:hAnsi="Arial" w:cs="Arial" /><w:color w:val="333333" /><w:kern w:val="0" /><w:sz w:val="20" /><w:szCs w:val="20" /><w14:ligatures w14:val="none" /></w:rPr><w:t>Vernon</w:t></w:r><w:r><w:rPr><w:rFonts w:ascii="Arial" w:eastAsia="Times New Roman" w:hAnsi="Arial" w:cs="Arial" /><w:color w:val="333333" /><w:kern w:val="0" /><w:sz w:val="20" /><w:szCs w:val="20" /><w14:ligatures w14:val="none" /></w:rPr><w:t xml:space="preserve"> County</w:t></w:r><w:r><w:rPr><w:rFonts w:ascii="Arial" w:eastAsia="Times New Roman" w:hAnsi="Arial" w:cs="Arial" /><w:color w:val="333333" /><w:kern w:val="0" /><w:sz w:val="20" /><w:szCs w:val="20" /><w14:ligatures w14:val="none" /></w:rPr><w:t xml:space="preserve"> Chamber of Commerce.</w:t></w:r><w:bookmarkStart w:name="_m-5E#02XCWG&gt;LBO7kuh5MXxJlyB{n&quot;GC;GY&amp;x" w:id="99" /><w:bookmarkEnd w:id="99" /><w:bookmarkStart w:name="_m-5E#12~QEeW=3os2@K4lHw;dZmNJ8A0(tiyj" w:id="100" /><w:bookmarkEnd w:id="100" /><w:bookmarkStart w:name="_m-5E#22wF|0yu" w:id="101" /><w:bookmarkEnd w:id="101" /></w:p><w:p><w:pPr><w:rPr><w:b/><w:bCs/></w:rPr></w:pPr><w:r><w:rPr><w:b/><w:bCs/><w:rFonts w:ascii="Arial" w:eastAsia="Times New Roman" w:hAnsi="Arial" w:cs="Arial" /><w:bCs /><w:color w:val="333333" /><w:kern w:val="0" /><w:sz w:val="24" /><w:szCs w:val="24" /><w14:ligatures w14:val="none" /></w:rPr><w:t>What can my children do while visiting the festival?</w:t></w:r><w:bookmarkStart w:name="_m-5C#02XCUG&gt;NBO5kuj5MVxJnyByn&quot;IC;EY&amp;z" w:id="96" /><w:bookmarkEnd w:id="96" /><w:bookmarkStart w:name="_m-5C#12~QCeW?3oq2@M4lFw;fZmLJ8C0(riyl" w:id="97" /><w:bookmarkEnd w:id="97" /><w:bookmarkStart w:name="_m-5C#22wFz0yw" w:id="98" /><w:bookmarkEnd w:id="98" /></w:p><w:p><w:pPr><w:shd w:val="clear" w:color="auto" w:fill="FFFFFF" /><w:spacing w:before="100" w:beforeAutospacing="1" w:after="100" w:afterAutospacing="1" w:line="270" w:lineRule="atLeast" /><w:rPr><w:rFonts w:ascii="Arial" w:eastAsia="Times New Roman" w:hAnsi="Arial" w:cs="Arial" /><w:color w:val="333333" /><w:kern w:val="0" /><w:sz w:val="20" /><w:szCs w:val="20" /><w14:ligatures w14:val="none" /></w:rPr></w:pPr><w:r><w:rPr><w:rFonts w:ascii="Arial" w:eastAsia="Times New Roman" w:hAnsi="Arial" w:cs="Arial" /><w:color w:val="333333" /><w:kern w:val="0" /><w:sz w:val="20" /><w:szCs w:val="20" /><w14:ligatures w14:val="none" /></w:rPr><w:t>Children</w:t></w:r><w:r><w:rPr><w:rFonts w:ascii="Arial" w:eastAsia="Times New Roman" w:hAnsi="Arial" w:cs="Arial" /><w:color w:val="333333" /><w:kern w:val="0" /><w:sz w:val="20" /><w:szCs w:val="20" /><w14:ligatures w14:val="none" /></w:rPr><w:t xml:space="preserve"> can enjoy inflatables, children’s interactive entertainment, reptile displays, and face painting</w:t></w:r><w:r><w:rPr><w:rFonts w:ascii="Arial" w:eastAsia="Times New Roman" w:hAnsi="Arial" w:cs="Arial" /><w:color w:val="333333" /><w:kern w:val="0" /><w:sz w:val="20" /><w:szCs w:val="20" /><w14:ligatures w14:val="none" /></w:rPr><w:t>,</w:t></w:r><w:r><w:rPr><w:rFonts w:ascii="Arial" w:eastAsia="Times New Roman" w:hAnsi="Arial" w:cs="Arial" /><w:color w:val="333333" /><w:kern w:val="0" /><w:sz w:val="20" /><w:szCs w:val="20" /><w14:ligatures w14:val="none" /></w:rPr><w:t xml:space="preserve"> just to name a few!</w:t></w:r><w:r><w:rPr><w:rFonts w:ascii="Arial" w:eastAsia="Times New Roman" w:hAnsi="Arial" w:cs="Arial" /><w:color w:val="333333" /><w:kern w:val="0" /><w:sz w:val="20" /><w:szCs w:val="20" /><w14:ligatures w14:val="none" /></w:rPr><w:t xml:space="preserve"> </w:t></w:r><w:r><w:rPr><w:rFonts w:ascii="Arial" w:eastAsia="Times New Roman" w:hAnsi="Arial" w:cs="Arial" /><w:color w:val="333333" /><w:kern w:val="0" /><w:sz w:val="20" /><w:szCs w:val="20" /><w14:ligatures w14:val="none" /></w:rPr><w:t xml:space="preserve"> These fun activities are located in the free,</w:t></w:r><w:r><w:rPr><w:rFonts w:ascii="Arial" w:eastAsia="Times New Roman" w:hAnsi="Arial" w:cs="Arial" /><w:color w:val="333333" /><w:kern w:val="0" /><w:sz w:val="20" /><w:szCs w:val="20" /><w14:ligatures w14:val="none" /></w:rPr><w:t xml:space="preserve"> gated Children’s Village open 1</w:t></w:r><w:r><w:rPr><w:rFonts w:ascii="Arial" w:eastAsia="Times New Roman" w:hAnsi="Arial" w:cs="Arial" /><w:color w:val="333333" /><w:kern w:val="0" /><w:sz w:val="20" /><w:szCs w:val="20" /><w14:ligatures w14:val="none" /></w:rPr><w:t xml:space="preserve"> p.m. - 8 p.m. on Friday,</w:t></w:r><w:r><w:rPr><w:rFonts w:ascii="Arial" w:eastAsia="Times New Roman" w:hAnsi="Arial" w:cs="Arial" /><w:color w:val="333333" /><w:kern w:val="0" /><w:sz w:val="20" /><w:szCs w:val="20" /><w14:ligatures w14:val="none" /></w:rPr><w:t xml:space="preserve"> and 8 a.m. - 8 p.m. on Saturday.</w:t></w:r><w:bookmarkStart w:name="_m-57#02XDZG=IBP:kte5N[xIiyC~n!DC&lt;JY%u" w:id="93" /><w:bookmarkEnd w:id="93" /><w:bookmarkStart w:name="_m-57#12~RHeV:3pv2?H4mKw:aZnQJ7&gt;0)wixg" w:id="94" /><w:bookmarkEnd w:id="94" /><w:bookmarkStart w:name="_m-57#22wG!0xr" w:id="95" /><w:bookmarkEnd w:id="95" /></w:p><w:p><w:pPr><w:rPr><w:b/><w:bCs/></w:rPr></w:pPr><w:r><w:rPr><w:b/><w:bCs/><w:rFonts w:ascii="Arial" w:eastAsia="Times New Roman" w:hAnsi="Arial" w:cs="Arial" /><w:bCs /><w:color w:val="333333" /><w:kern w:val="0" /><w:sz w:val="24" /><w:szCs w:val="24" /><w14:ligatures w14:val="none" /></w:rPr><w:t>Is smoking permitted on the festival grounds?</w:t></w:r><w:bookmarkStart w:name="_m-55#02XDXG=KBP8ktg5NYxIkyC|n!FC&lt;HY%w" w:id="90" /><w:bookmarkEnd w:id="90" /><w:bookmarkStart w:name="_m-55#12~RFeV&lt;3pt2?J4mIw:cZnOJ7@0)uixi" w:id="91" /><w:bookmarkEnd w:id="91" /><w:bookmarkStart w:name="_m-55#22wG}0xt" w:id="92" /><w:bookmarkEnd w:id="92" /></w:p><w:p><w:pPr><w:shd w:val="clear" w:color="auto" w:fill="FFFFFF" /><w:spacing w:before="100" w:beforeAutospacing="1" w:after="100" w:afterAutospacing="1" w:line="270" w:lineRule="atLeast" /><w:rPr><w:rFonts w:ascii="Arial" w:eastAsia="Times New Roman" w:hAnsi="Arial" w:cs="Arial" /><w:color w:val="333333" /><w:kern w:val="0" /><w:sz w:val="20" /><w:szCs w:val="20" /><w14:ligatures w14:val="none" /></w:rPr></w:pPr><w:r><w:rPr><w:rFonts w:ascii="Arial" w:eastAsia="Times New Roman" w:hAnsi="Arial" w:cs="Arial" /><w:color w:val="333333" /><w:kern w:val="0" /><w:sz w:val="20" /><w:szCs w:val="20" /><w14:ligatures w14:val="none" /></w:rPr><w:t>Smoking is not allowed on the festival grounds while the balloons are present. Please be courteous of other festival patrons.</w:t></w:r><w:bookmarkStart w:name="_m-53#02XDVG=MBP6kti5NWxImyCzn!HC&lt;FY%y" w:id="87" /><w:bookmarkEnd w:id="87" /><w:bookmarkStart w:name="_m-53#12~RDeV&gt;3pr2?L4mGw:eZnMJ7B0)sixk" w:id="88" /><w:bookmarkEnd w:id="88" /><w:bookmarkStart w:name="_m-53#22wG{0xv" w:id="89" /><w:bookmarkEnd w:id="89" /></w:p><w:p><w:pPr><w:rPr><w:b/><w:bCs/></w:rPr></w:pPr><w:r><w:rPr><w:b/><w:bCs/><w:rFonts w:ascii="Arial" w:eastAsia="Times New Roman" w:hAnsi="Arial" w:cs="Arial" /><w:bCs /><w:color w:val="333333" /><w:kern w:val="0" /><w:sz w:val="24" /><w:szCs w:val="24" /><w14:ligatures w14:val="none" /></w:rPr><w:t>Can I bring a cooler with beverage and food into the festival?</w:t></w:r><w:bookmarkStart w:name="_m-52#02XDUG=NBP5ktj5NVxInyCyn!IC&lt;EY%z" w:id="84" /><w:bookmarkEnd w:id="84" /><w:bookmarkStart w:name="_m-52#12~RCeV?3pq2?M4mFw:fZnLJ7C0)rixl" w:id="85" /><w:bookmarkEnd w:id="85" /><w:bookmarkStart w:name="_m-52#22wGz0xw" w:id="86" /><w:bookmarkEnd w:id="86" /></w:p><w:p><w:pPr><w:shd w:val="clear" w:color="auto" w:fill="FFFFFF" /><w:spacing w:before="100" w:beforeAutospacing="1" w:after="100" w:afterAutospacing="1" w:line="270" w:lineRule="atLeast" /><w:rPr><w:rFonts w:ascii="Arial" w:eastAsia="Times New Roman" w:hAnsi="Arial" w:cs="Arial" /><w:color w:val="333333" /><w:kern w:val="0" /><w:sz w:val="20" /><w:szCs w:val="20" /><w14:ligatures w14:val="none" /></w:rPr></w:pPr><w:r><w:rPr><w:rFonts w:ascii="Arial" w:eastAsia="Times New Roman" w:hAnsi="Arial" w:cs="Arial" /><w:color w:val="333333" /><w:kern w:val="0" /><w:sz w:val="20" /><w:szCs w:val="20" /><w14:ligatures w14:val="none" /></w:rPr><w:t>You can bring a cooler with snacks and plastic or aluminum containers. However, no glass bottles or alcohol are allowed at the festival. We do</w:t></w:r><w:r><w:rPr><w:rFonts w:ascii="Arial" w:eastAsia="Times New Roman" w:hAnsi="Arial" w:cs="Arial" /><w:color w:val="333333" /><w:kern w:val="0" /><w:sz w:val="20" /><w:szCs w:val="20" /><w14:ligatures w14:val="none" /></w:rPr><w:t xml:space="preserve"> provide an assortment of unique foods at our </w:t></w:r><w:r><w:rPr><w:rFonts w:ascii="Arial" w:eastAsia="Times New Roman" w:hAnsi="Arial" w:cs="Arial" /><w:color w:val="333333" /><w:kern w:val="0" /><w:sz w:val="20" /><w:szCs w:val="20" /><w14:ligatures w14:val="none" /></w:rPr><w:t>food vendor</w:t></w:r><w:r><w:rPr><w:rFonts w:ascii="Arial" w:eastAsia="Times New Roman" w:hAnsi="Arial" w:cs="Arial" /><w:color w:val="333333" /><w:kern w:val="0" /><w:sz w:val="20" /><w:szCs w:val="20" /><w14:ligatures w14:val="none" /></w:rPr><w:t xml:space="preserve"> stands.</w:t></w:r><w:bookmarkStart w:name="_m-4Y#02XE[G&lt;HBQ;ksd5O\xHhyD!n~CC=KY$t" w:id="81" /><w:bookmarkEnd w:id="81" /><w:bookmarkStart w:name="_m-4Y#12~SIeU93qw2&gt;G4nLw9`ZoRJ6=0*xiwf" w:id="82" /><w:bookmarkEnd w:id="82" /><w:bookmarkStart w:name="_m-4Y#22wH&quot;0wq" w:id="83" /><w:bookmarkEnd w:id="83" /></w:p><w:p><w:pPr><w:rPr><w:b/><w:bCs/></w:rPr></w:pPr><w:r><w:rPr><w:b/><w:bCs/><w:rFonts w:ascii="Arial" w:eastAsia="Times New Roman" w:hAnsi="Arial" w:cs="Arial" /><w:bCs /><w:color w:val="333333" /><w:kern w:val="0" /><w:sz w:val="24" /><w:szCs w:val="24" /><w14:ligatures w14:val="none" /></w:rPr><w:t>What are my camping, RV, or lodging options?</w:t></w:r><w:bookmarkStart w:name="_m-4W#02XEYG&lt;JBQ9ksf5OZxHjyD}n~EC=IY$v" w:id="78" /><w:bookmarkEnd w:id="78" /><w:bookmarkStart w:name="_m-4W#12~SGeU;3qu2&gt;I4nJw9bZoPJ6?0*viwh" w:id="79" /><w:bookmarkEnd w:id="79" /><w:bookmarkStart w:name="_m-4W#22wH~0ws" w:id="80" /><w:bookmarkEnd w:id="80" /></w:p><w:p><w:pPr><w:shd w:val="clear" w:color="auto" w:fill="FFFFFF" /><w:spacing w:beforeAutospacing="1" w:after="0" w:afterAutospacing="1" w:line="270" w:lineRule="atLeast" /><w:rPr><w:rFonts w:ascii="Arial" w:eastAsia="Times New Roman" w:hAnsi="Arial" w:cs="Arial" /><w:color w:val="333333" /><w:kern w:val="0" /><w:sz w:val="20" /><w:szCs w:val="20" /><w14:ligatures w14:val="none" /></w:rPr></w:pPr><w:r><w:rPr><w:rFonts w:ascii="Arial" w:eastAsia="Times New Roman" w:hAnsi="Arial" w:cs="Arial" /><w:color w:val="333333" /><w:kern w:val="0" /><w:sz w:val="20" /><w:szCs w:val="20" /><w14:ligatures w14:val="none" /></w:rPr><w:t>While you cannot camp or park an RV on the festival grounds, there are camping options nearby.</w:t></w:r><w:r><w:rPr><w:rFonts w:ascii="Arial" w:eastAsia="Times New Roman" w:hAnsi="Arial" w:cs="Arial" /><w:color w:val="333333" /><w:kern w:val="0" /><w:sz w:val="20" /><w:szCs w:val="20" /><w14:ligatures w14:val="none" /></w:rPr><w:t xml:space="preserve"> Check with the </w:t></w:r><w:r><w:rPr><w:rFonts w:ascii="Arial" w:eastAsia="Times New Roman" w:hAnsi="Arial" w:cs="Arial" /><w:color w:val="333333" /><w:kern w:val="0" /><w:sz w:val="20" /><w:szCs w:val="20" /><w14:ligatures w14:val="none" /></w:rPr><w:t>Mount Sedona</w:t></w:r><w:r><w:rPr><w:rFonts w:ascii="Arial" w:eastAsia="Times New Roman" w:hAnsi="Arial" w:cs="Arial" /><w:color w:val="333333" /><w:kern w:val="0" /><w:sz w:val="20" /><w:szCs w:val="20" /><w14:ligatures w14:val="none" /></w:rPr><w:t xml:space="preserve"> County Chamber of Commerce for a complete list of camping facilities.</w:t></w:r><w:bookmarkStart w:name="_m-4V#02XEXG&lt;KBQ8ksg5OYxHkyD|n~FC=HY$w" w:id="75" /><w:bookmarkEnd w:id="75" /><w:bookmarkStart w:name="_m-4V#12~SFeU&lt;3qt2&gt;J4nIw9cZoOJ6@0*uiwi" w:id="76" /><w:bookmarkEnd w:id="76" /><w:bookmarkStart w:name="_m-4V#22wH}0wt" w:id="77" /><w:bookmarkEnd w:id="77" /></w:p><w:p><w:pPr><w:rPr><w:b/><w:bCs/></w:rPr></w:pPr><w:r><w:rPr><w:b/><w:bCs/><w:rFonts w:ascii="Arial" w:eastAsia="Times New Roman" w:hAnsi="Arial" w:cs="Arial" /><w:bCs /><w:color w:val="333333" /><w:kern w:val="0" /><w:sz w:val="24" /><w:szCs w:val="24" /><w14:ligatures w14:val="none" /></w:rPr><w:t>How c</w:t></w:r><w:r><w:rPr><w:b/><w:bCs/><w:rFonts w:ascii="Arial" w:eastAsia="Times New Roman" w:hAnsi="Arial" w:cs="Arial" /><w:bCs /><w:color w:val="333333" /><w:kern w:val="0" /><w:sz w:val="24" /><w:szCs w:val="24" /><w14:ligatures w14:val="none" /></w:rPr><w:t xml:space="preserve">an I </w:t></w:r><w:r><w:rPr><w:b/><w:bCs/><w:rFonts w:ascii="Arial" w:eastAsia="Times New Roman" w:hAnsi="Arial" w:cs="Arial" /><w:bCs /><w:color w:val="333333" /><w:kern w:val="0" /><w:sz w:val="24" /><w:szCs w:val="24" /><w14:ligatures w14:val="none" /></w:rPr><w:t>plan for the best e</w:t></w:r><w:r><w:rPr><w:b/><w:bCs/><w:rFonts w:ascii="Arial" w:eastAsia="Times New Roman" w:hAnsi="Arial" w:cs="Arial" /><w:bCs /><w:color w:val="333333" /><w:kern w:val="0" /><w:sz w:val="24" /><w:szCs w:val="24" /><w14:ligatures w14:val="none" /></w:rPr><w:t>xperience?</w:t></w:r><w:bookmarkStart w:name="_m-4S#02XEUG&lt;NBQ5ksj5OVxHnyDyn~IC=EY$z" w:id="72" /><w:bookmarkEnd w:id="72" /><w:bookmarkStart w:name="_m-4S#12~SCeU?3qq2&gt;M4nFw9fZoLJ6C0*riwl" w:id="73" /><w:bookmarkEnd w:id="73" /><w:bookmarkStart w:name="_m-4S#22wHz0ww" w:id="74" /><w:bookmarkEnd w:id="74" /></w:p><w:p><w:pPr><w:numPr><w:ilvl w:val="0"/><w:numId w:val="1"/></w:numPr><w:ind w:left="360" w:hanging="360"/><w:numPr><w:ilvl w:val="0"/><w:numId w:val="1"/></w:numPr><w:ind w:left="360" w:hanging="360"/></w:pPr><w:rPr><w:rFonts w:ascii="Arial" w:eastAsia="Times New Roman" w:hAnsi="Arial" w:cs="Arial" /><w:color w:val="333333" /><w:kern w:val="0" /><w:sz w:val="20" /><w:szCs w:val="20" /><w14:ligatures w14:val="none" /></w:rPr></w:pPr><w:r><w:rPr><w:rFonts w:ascii="Arial" w:eastAsia="Times New Roman" w:hAnsi="Arial" w:cs="Arial" /><w:color w:val="333333" /><w:kern w:val="0" /><w:sz w:val="20" /><w:szCs w:val="20" /><w14:ligatures w14:val="none" /></w:rPr><w:t>Although there is no perfect formula, the follow</w:t></w:r><w:r><w:rPr><w:rFonts w:ascii="Arial" w:eastAsia="Times New Roman" w:hAnsi="Arial" w:cs="Arial" /><w:color w:val="333333" /><w:kern w:val="0" /><w:sz w:val="20" /><w:szCs w:val="20" /><w14:ligatures w14:val="none" /></w:rPr><w:t>ing</w:t></w:r><w:r><w:rPr><w:rFonts w:ascii="Arial" w:eastAsia="Times New Roman" w:hAnsi="Arial" w:cs="Arial" /><w:color w:val="333333" /><w:kern w:val="0" /><w:sz w:val="20" /><w:szCs w:val="20" /><w14:ligatures w14:val="none" /></w:rPr><w:t xml:space="preserve"> tips should </w:t></w:r><w:r><w:rPr><w:rFonts w:ascii="Arial" w:eastAsia="Times New Roman" w:hAnsi="Arial" w:cs="Arial" /><w:color w:val="333333" /><w:kern w:val="0" /><w:sz w:val="20" /><w:szCs w:val="20" /><w14:ligatures w14:val="none" /></w:rPr><w:t>e</w:t></w:r><w:r><w:rPr><w:rFonts w:ascii="Arial" w:eastAsia="Times New Roman" w:hAnsi="Arial" w:cs="Arial" /><w:color w:val="333333" /><w:kern w:val="0" /><w:sz w:val="20" /><w:szCs w:val="20" /><w14:ligatures w14:val="none" /></w:rPr><w:t>nsure that you have all the bases covered!</w:t></w:r></w:p><w:p><w:pPr><w:numPr><w:ilvl w:val="0"/><w:numId w:val="1"/></w:numPr><w:ind w:left="360" w:hanging="360"/><w:numPr><w:ilvl w:val="0"/><w:numId w:val="1"/></w:numPr><w:ind w:left="360" w:hanging="360"/></w:pPr><w:rPr><w:rFonts w:ascii="Arial" w:eastAsia="Times New Roman" w:hAnsi="Arial" w:cs="Arial" /><w:color w:val="333333" /><w:kern w:val="0" /><w:sz w:val="20" /><w:szCs w:val="20" /><w14:ligatures w14:val="none" /></w:rPr></w:pPr><w:r><w:rPr><w:rFonts w:ascii="Arial" w:eastAsia="Times New Roman" w:hAnsi="Arial" w:cs="Arial" /><w:color w:val="333333" /><w:kern w:val="0" /><w:sz w:val="20" /><w:szCs w:val="20" /><w14:ligatures w14:val="none" /></w:rPr><w:t>Wear good walking shoes. The park encompasses 15 acres, so hiking is a strong possibility.</w:t></w:r></w:p><w:p><w:pPr><w:numPr><w:ilvl w:val="0"/><w:numId w:val="1"/></w:numPr><w:ind w:left="360" w:hanging="360"/><w:numPr><w:ilvl w:val="0"/><w:numId w:val="1"/></w:numPr><w:ind w:left="360" w:hanging="360"/></w:pPr><w:rPr><w:rFonts w:ascii="Arial" w:eastAsia="Times New Roman" w:hAnsi="Arial" w:cs="Arial" /><w:color w:val="333333" /><w:kern w:val="0" /><w:sz w:val="20" /><w:szCs w:val="20" /><w14:ligatures w14:val="none" /></w:rPr></w:pPr><w:r><w:rPr><w:rFonts w:ascii="Arial" w:eastAsia="Times New Roman" w:hAnsi="Arial" w:cs="Arial" /><w:color w:val="333333" /><w:kern w:val="0" /><w:sz w:val="20" /><w:szCs w:val="20" /><w14:ligatures w14:val="none" /></w:rPr><w:lastRenderedPageBreak /><w:t>Bring sunscreen. There is very little shade.</w:t></w:r></w:p><w:p><w:pPr><w:numPr><w:ilvl w:val="0"/><w:numId w:val="1"/></w:numPr><w:ind w:left="360" w:hanging="360"/><w:numPr><w:ilvl w:val="0"/><w:numId w:val="1"/></w:numPr><w:ind w:left="360" w:hanging="360"/></w:pPr><w:rPr><w:rFonts w:ascii="Arial" w:eastAsia="Times New Roman" w:hAnsi="Arial" w:cs="Arial" /><w:color w:val="333333" /><w:kern w:val="0" /><w:sz w:val="20" /><w:szCs w:val="20" /><w14:ligatures w14:val="none" /></w:rPr></w:pPr><w:r><w:rPr><w:rFonts w:ascii="Arial" w:eastAsia="Times New Roman" w:hAnsi="Arial" w:cs="Arial" /><w:color w:val="333333" /><w:kern w:val="0" /><w:sz w:val="20" /><w:szCs w:val="20" /><w14:ligatures w14:val="none" /></w:rPr><w:t>Get to the park early. When the balloons inflate, long lines form.</w:t></w:r></w:p><w:p><w:pPr><w:numPr><w:ilvl w:val="0"/><w:numId w:val="1"/></w:numPr><w:ind w:left="360" w:hanging="360"/><w:numPr><w:ilvl w:val="0"/><w:numId w:val="1"/></w:numPr><w:ind w:left="360" w:hanging="360"/></w:pPr><w:rPr><w:rFonts w:ascii="Arial" w:eastAsia="Times New Roman" w:hAnsi="Arial" w:cs="Arial" /><w:color w:val="333333" /><w:kern w:val="0" /><w:sz w:val="20" /><w:szCs w:val="20" /><w14:ligatures w14:val="none" /></w:rPr></w:pPr><w:r><w:rPr><w:rFonts w:ascii="Arial" w:eastAsia="Times New Roman" w:hAnsi="Arial" w:cs="Arial" /><w:color w:val="333333" /><w:kern w:val="0" /><w:sz w:val="20" /><w:szCs w:val="20" /><w14:ligatures w14:val="none" /></w:rPr><w:t>Wear comfortable, cool clothing. If you take tether rides, the flame does make it hot in the basket.</w:t></w:r></w:p><w:p><w:pPr><w:numPr><w:ilvl w:val="0"/><w:numId w:val="1"/></w:numPr><w:ind w:left="360" w:hanging="360"/></w:pPr><w:rPr><w:rFonts w:ascii="Arial" w:eastAsia="Times New Roman" w:hAnsi="Arial" w:cs="Arial" /><w:color w:val="333333" /><w:kern w:val="0" /><w:sz w:val="20" /><w:szCs w:val="20" /><w14:ligatures w14:val="none" /></w:rPr></w:pPr><w:r><w:rPr><w:rFonts w:ascii="Arial" w:eastAsia="Times New Roman" w:hAnsi="Arial" w:cs="Arial" /><w:color w:val="333333" /><w:kern w:val="0" /><w:sz w:val="20" /><w:szCs w:val="20" /><w14:ligatures w14:val="none" /></w:rPr><w:t>Bring</w:t></w:r><w:r><w:rPr><w:rFonts w:ascii="Arial" w:eastAsia="Times New Roman" w:hAnsi="Arial" w:cs="Arial" /><w:color w:val="333333" /><w:kern w:val="0" /><w:sz w:val="20" /><w:szCs w:val="20" /><w14:ligatures w14:val="none" /></w:rPr><w:t xml:space="preserve"> a camera and tripod. The ballu</w:t></w:r><w:r><w:rPr><w:rFonts w:ascii="Arial" w:eastAsia="Times New Roman" w:hAnsi="Arial" w:cs="Arial" /><w:color w:val="333333" /><w:kern w:val="0" /><w:sz w:val="20" /><w:szCs w:val="20" /><w14:ligatures w14:val="none" /></w:rPr><w:t>mination at dusk is a beautiful photo opportunity, but the low light makes a tripod a necessity.</w:t></w:r></w:p><w:p><w:pPr><w:numPr><w:ilvl w:val="0"/><w:numId w:val="1"/></w:numPr><w:ind w:left="360" w:hanging="360"/><w:numPr><w:ilvl w:val="0"/><w:numId w:val="1"/></w:numPr><w:ind w:left="360" w:hanging="360"/></w:pPr><w:rPr><w:rFonts w:ascii="Arial" w:eastAsia="Times New Roman" w:hAnsi="Arial" w:cs="Arial" /><w:color w:val="333333" /><w:kern w:val="0" /><w:sz w:val="20" /><w:szCs w:val="20" /><w14:ligatures w14:val="none" /></w:rPr></w:pPr><w:r><w:rPr><w:rFonts w:ascii="Arial" w:eastAsia="Times New Roman" w:hAnsi="Arial" w:cs="Arial" /><w:color w:val="333333" /><w:kern w:val="0" /><w:sz w:val="20" /><w:szCs w:val="20" /><w14:ligatures w14:val="none" /></w:rPr><w:t>Bring lawn chairs and/or blankets.</w:t></w:r></w:p><w:p><w:pPr><w:numPr><w:ilvl w:val="0"/><w:numId w:val="1"/></w:numPr><w:ind w:left="360" w:hanging="360"/><w:numPr><w:ilvl w:val="0"/><w:numId w:val="1"/></w:numPr><w:ind w:left="360" w:hanging="360"/></w:pPr><w:rPr><w:rFonts w:ascii="Arial" w:eastAsia="Times New Roman" w:hAnsi="Arial" w:cs="Arial" /><w:color w:val="333333" /><w:kern w:val="0" /><w:sz w:val="20" /><w:szCs w:val="20" /><w14:ligatures w14:val="none" /></w:rPr></w:pPr><w:r><w:rPr><w:rFonts w:ascii="Arial" w:eastAsia="Times New Roman" w:hAnsi="Arial" w:cs="Arial" /><w:color w:val="333333" /><w:kern w:val="0" /><w:sz w:val="20" /><w:szCs w:val="20" /><w14:ligatures w14:val="none" /></w:rPr><w:t>Bring, or prepare to buy, plenty of water.</w:t></w:r></w:p><w:p><w:pPr><w:numPr><w:ilvl w:val="0"/><w:numId w:val="1"/></w:numPr><w:ind w:left="360" w:hanging="360"/><w:numPr><w:ilvl w:val="0"/><w:numId w:val="1"/></w:numPr><w:ind w:left="360" w:hanging="360"/></w:pPr><w:rPr><w:rFonts w:ascii="Arial" w:eastAsia="Times New Roman" w:hAnsi="Arial" w:cs="Arial" /><w:color w:val="333333" /><w:kern w:val="0" /><w:sz w:val="20" /><w:szCs w:val="20" /><w14:ligatures w14:val="none" /></w:rPr></w:pPr><w:r><w:rPr><w:rFonts w:ascii="Arial" w:eastAsia="Times New Roman" w:hAnsi="Arial" w:cs="Arial" /><w:color w:val="333333" /><w:kern w:val="0" /><w:sz w:val="20" /><w:szCs w:val="20" /><w14:ligatures w14:val="none" /></w:rPr><w:t>Bring Frisbees or balls for children to play with in the large open field while you wait for a show to begin.</w:t></w:r></w:p><w:p><w:pPr><w:shd w:val="clear" w:color="auto" w:fill="FFFFFF" /><w:spacing w:beforeAutospacing="1" w:after="0" w:afterAutospacing="1" w:line="270" w:lineRule="atLeast" /><w:rPr><w:rFonts w:ascii="Verdana" w:eastAsia="Times New Roman" w:hAnsi="Verdana" w:cs="Times New Roman" /><w:color w:val="444E5C" /><w:kern w:val="0" /><w:sz w:val="20" /><w:szCs w:val="20" /><w14:ligatures w14:val="none" /></w:rPr></w:pPr><w:bookmarkStart w:name="_m-3X#02XHTG9OBT4kpk5RUxEoyGxn{JC@DY!{" w:id="42" /><w:bookmarkEnd w:id="42" /><w:bookmarkStart w:name="_m-3X#12~VBeR@3tp2;N4qEw6gZrKJ3D0-qitm" w:id="43" /><w:bookmarkEnd w:id="43" /><w:bookmarkStart w:name="_m-3X#22wKy0tx" w:id="44" /><w:bookmarkEnd w:id="44" /></w:p><w:p><w:pPr><w:shd w:val="clear" w:color="auto" w:fill="FFFFFF" /><w:spacing w:beforeAutospacing="1" w:after="0" w:afterAutospacing="1" w:line="270" w:lineRule="atLeast" /><w:rPr><w:rStyle w:val="Strong" /><w:rFonts w:ascii="Arial" w:hAnsi="Arial" w:cs="Arial" /></w:rPr></w:pPr><w:r><w:rPr><w:rStyle w:val="Strong" /><w:rFonts w:ascii="Arial" w:hAnsi="Arial" w:cs="Arial" /></w:rPr><w:t>Event S</w:t></w:r><w:r><w:rPr><w:rStyle w:val="Strong" /><w:rFonts w:ascii="Arial" w:hAnsi="Arial" w:cs="Arial" /></w:rPr><w:t>chedule</w:t></w:r><w:bookmarkStart w:name="_m-3V#02XI\G8GBU&lt;koc5S]xDgyH&quot;nzBCALY~s" w:id="39" /><w:bookmarkEnd w:id="39" /><w:bookmarkStart w:name="_m-3V#12~WJeQ83ux2:F4rMw5_ZsSJ2&lt;0.yise" w:id="40" /><w:bookmarkEnd w:id="40" /><w:bookmarkStart w:name="_m-3V#22wL#0sp" w:id="41" /><w:bookmarkEnd w:id="41" /></w:p><w:p><w:pPr><w:shd w:val="clear" w:color="auto" w:fill="FFFFFF" /><w:spacing w:beforeAutospacing="1" w:after="0" w:afterAutospacing="1" w:line="270" w:lineRule="atLeast" /><w:rPr><w:rStyle w:val="Strong" /><w:rFonts w:ascii="Arial" w:hAnsi="Arial" w:cs="Arial" /></w:rPr></w:pPr><w:r><w:rPr><w:rStyle w:val="Strong" /><w:rFonts w:ascii="Arial" w:hAnsi="Arial" w:cs="Arial" /></w:rPr><w:t>Saturday (5/2</w:t></w:r><w:r><w:rPr><w:rStyle w:val="Strong" /><w:rFonts w:ascii="Arial" w:hAnsi="Arial" w:cs="Arial" /></w:rPr><w:t>8</w:t></w:r><w:r><w:rPr><w:rStyle w:val="Strong" /><w:rFonts w:ascii="Arial" w:hAnsi="Arial" w:cs="Arial" /></w:rPr><w:t>/</w:t></w:r><w:r><w:rPr><w:rStyle w:val="Strong" /><w:rFonts w:ascii="Arial" w:hAnsi="Arial" w:cs="Arial" /></w:rPr><w:t>202</w:t></w:r><w:r><w:rPr><w:rStyle w:val="Strong" /><w:rFonts w:ascii="Arial" w:hAnsi="Arial" w:cs="Arial" /></w:rPr><w:t>4</w:t></w:r><w:r><w:rPr><w:rStyle w:val="Strong" /><w:rFonts w:ascii="Arial" w:hAnsi="Arial" w:cs="Arial" /></w:rPr><w:t>)</w:t></w:r><w:bookmarkStart w:name="_m-3T#02XIZG8IBU:koe5S[xDiyH~nzDCAJY~u" w:id="36" /><w:bookmarkEnd w:id="36" /><w:bookmarkStart w:name="_m-3T#12~WHeQ:3uv2:H4rKw5aZsQJ2&gt;0.wisg" w:id="37" /><w:bookmarkEnd w:id="37" /><w:bookmarkStart w:name="_m-3T#22wL!0sr" w:id="38" /><w:bookmarkEnd w:id="38" /></w:p><w:p><w:pPr><w:tabs><w:tab w:val="left" w:pos="1440"/><w:tab w:val="left" w:leader="dot" w:pos="4320"/></w:tabs></w:pPr><w:r><w:tab/></w:r><w:r><w:t xml:space="preserve">6:00 AM</w:t></w:r><w:r><w:tab/></w:r><w:r><w:t>Pilots Briefing</w:t></w:r></w:p><w:p><w:pPr><w:tabs><w:tab w:val="left" w:pos="1440"/><w:tab w:val="left" w:leader="dot" w:pos="4320"/></w:tabs></w:pPr><w:r><w:tab/></w:r><w:r><w:t xml:space="preserve">6:30 AM</w:t></w:r><w:r><w:tab/></w:r><w:r><w:t>Hare and Hound Race</w:t></w:r></w:p><w:p><w:pPr><w:tabs><w:tab w:val="left" w:pos="1440"/><w:tab w:val="left" w:leader="dot" w:pos="4320"/></w:tabs></w:pPr><w:r><w:tab/></w:r><w:r><w:t xml:space="preserve">5:00 PM</w:t></w:r><w:r><w:tab/></w:r><w:r><w:t>Pilot Briefing</w:t></w:r></w:p><w:p><w:pPr><w:tabs><w:tab w:val="left" w:pos="1440"/><w:tab w:val="left" w:leader="dot" w:pos="4320"/></w:tabs></w:pPr><w:r><w:tab/></w:r><w:r><w:t xml:space="preserve">5:30 PM</w:t></w:r><w:r><w:tab/></w:r><w:r><w:t>Fun Flight</w:t></w:r></w:p><w:p><w:pPr><w:tabs><w:tab w:val="left" w:pos="1440"/><w:tab w:val="left" w:leader="dot" w:pos="4320"/></w:tabs></w:pPr><w:r><w:tab/></w:r><w:r><w:t xml:space="preserve">6:30 PM</w:t></w:r><w:r><w:tab/></w:r><w:r><w:t>Tethers</w:t></w:r></w:p><w:p><w:pPr><w:tabs><w:tab w:val="left" w:pos="1440"/><w:tab w:val="left" w:leader="dot" w:pos="4320"/></w:tabs></w:pPr><w:r><w:tab/></w:r><w:r><w:t xml:space="preserve">8:15 PM</w:t></w:r><w:r><w:tab/></w:r><w:r><w:t>Balloon Glow</w:t></w:r></w:p><w:p><w:pPr><w:shd w:val="clear" w:color="auto" w:fill="FFFFFF" /><w:spacing w:beforeAutospacing="1" w:after="0" w:afterAutospacing="1" w:line="270" w:lineRule="atLeast" /><w:rPr><w:rStyle w:val="Strong" /><w:rFonts w:ascii="Arial" w:hAnsi="Arial" w:cs="Arial" /></w:rPr></w:pPr><w:r><w:rPr><w:rStyle w:val="Strong" /><w:rFonts w:ascii="Arial" w:hAnsi="Arial" w:cs="Arial" /></w:rPr><w:t>Sunday (5/2</w:t></w:r><w:r><w:rPr><w:rStyle w:val="Strong" /><w:rFonts w:ascii="Arial" w:hAnsi="Arial" w:cs="Arial" /></w:rPr><w:t>9</w:t></w:r><w:r><w:rPr><w:rStyle w:val="Strong" /><w:rFonts w:ascii="Arial" w:hAnsi="Arial" w:cs="Arial" /></w:rPr><w:t>/</w:t></w:r><w:r><w:rPr><w:rStyle w:val="Strong" /><w:rFonts w:ascii="Arial" w:hAnsi="Arial" w:cs="Arial" /></w:rPr><w:t>202</w:t></w:r><w:r><w:rPr><w:rStyle w:val="Strong" /><w:rFonts w:ascii="Arial" w:hAnsi="Arial" w:cs="Arial" /></w:rPr><w:t>4</w:t></w:r><w:r><w:rPr><w:rStyle w:val="Strong" /><w:rFonts w:ascii="Arial" w:hAnsi="Arial" w:cs="Arial" /></w:rPr><w:t>)</w:t></w:r><w:bookmarkStart w:name="_m-38#02XKYG6JBW9kmf5UZxBjyJ}nxECCIY|v" w:id="15" /><w:bookmarkEnd w:id="15" /><w:bookmarkStart w:name="_m-38#12~YGeO;3wu28I4tJw3bZuPJ0?00viqh" w:id="16" /><w:bookmarkEnd w:id="16" /><w:bookmarkStart w:name="_m-38#22wN~0qs" w:id="17" /><w:bookmarkEnd w:id="17" /></w:p><w:p><w:pPr><w:tabs><w:tab w:val="left" w:pos="1440"/><w:tab w:val="left" w:leader="dot" w:pos="4320"/></w:tabs></w:pPr><w:r><w:tab/></w:r><w:r><w:t xml:space="preserve">6:00 AM</w:t></w:r><w:r><w:tab/></w:r><w:r><w:t>Pilots Briefing</w:t></w:r></w:p><w:p><w:pPr><w:tabs><w:tab w:val="left" w:pos="1440"/><w:tab w:val="left" w:leader="dot" w:pos="4320"/></w:tabs></w:pPr><w:r><w:tab/></w:r><w:r><w:t xml:space="preserve">6:30 AM</w:t></w:r><w:r><w:tab/></w:r><w:r><w:t>Lynn Layton Key Grab</w:t></w:r></w:p><w:p><w:pPr><w:tabs><w:tab w:val="left" w:pos="1440"/><w:tab w:val="left" w:leader="dot" w:pos="4320"/></w:tabs></w:pPr><w:r><w:tab/></w:r><w:r><w:t xml:space="preserve">5:00 PM</w:t></w:r><w:r><w:tab/></w:r><w:r><w:t>Pilot Briefing</w:t></w:r></w:p><w:p><w:pPr><w:tabs><w:tab w:val="left" w:pos="1440"/><w:tab w:val="left" w:leader="dot" w:pos="4320"/></w:tabs></w:pPr><w:r><w:tab/></w:r><w:r><w:t xml:space="preserve">5:30 PM</w:t></w:r><w:r><w:tab/></w:r><w:r><w:t>Fun Flight</w:t></w:r></w:p><w:p><w:pPr><w:tabs><w:tab w:val="left" w:pos="1440"/><w:tab w:val="left" w:leader="dot" w:pos="4320"/></w:tabs></w:pPr><w:r><w:tab/></w:r><w:r><w:t xml:space="preserve">6:30 PM</w:t></w:r><w:r><w:tab/></w:r><w:r><w:t>Ballumination</w:t></w:r></w:p><w:p><w:r><w:rPr><w:noProof/></w:rPr><w:drawing><wp:anchor distT="0" distB="0" distL="114300" distR="114300" simplePos="0" relativeHeight="251662336" behindDoc="0" locked="0" layoutInCell="1" allowOverlap="1" wp14:anchorId="4D5E6F7A" wp14:editId="8B9C0D1E"><wp:simplePos x="0" y="0"/><wp:positionH relativeFrom="margin"><wp:align>center</wp:align></wp:positionH><wp:positionV relativeFrom="paragraph"><wp:posOffset>457200</wp:posOffset></wp:positionV><wp:extent cx="3200400" cy="731520"/><wp:effectExtent l="0" t="0" r="0" b="0"/><wp:wrapNone/><wp:docPr id="4" name="Text Box 4"/><wp:cNvGraphicFramePr/><a:graphic xmlns:a="http://schemas.openxmlformats.org/drawingml/2006/main"><a:graphicData uri="http://schemas.microsoft.com/office/word/2010/wordprocessingShape"><wps:wsp><wps:cNvSpPr txBox="1"/><wps:spPr><a:xfrm><a:off x="0" y="0"/><a:ext cx="3200400" cy="731520"/></a:xfrm><a:prstGeom prst="rect"><a:avLst/></a:prstGeom><a:solidFill><a:srgbClr val="FFFFFF"/></a:solidFill><a:ln><a:noFill/></a:ln></wps:spPr><wps:txbx><w:txbxContent><w:p><w:pPr><w:jc w:val="center"/></w:pPr><w:r><w:rPr><w:color w:val="4472C4" w:themeColor="accent5"/><w:sz w:val="36"/><w:szCs w:val="36"/></w:rPr><w:t>Where Your Dreams Take Flight</w:t></w:r></w:p><w:p><w:pPr><w:jc w:val="center"/></w:pPr><w:r><w:rPr><w:b/><w:bCs/><w:color w:val="4472C4" w:themeColor="accent5"/></w:rPr><w:t>Mount Vernon Hot Air Balloon Festival</w:t></w:r></w:p><w:p><w:r><w:rPr><w:noProof/></w:rPr><w:drawing><wp:anchor distT="0" distB="0" distL="114300" distR="114300" simplePos="0" relativeHeight="251662336" behindDoc="0" locked="0" layoutInCell="1" allowOverlap="1" wp14:anchorId="4D5E6F7A" wp14:editId="8B9C0D1E"><wp:simplePos x="0" y="0"/><wp:positionH relativeFrom="margin"><wp:align>center</wp:align></wp:positionH><wp:positionV relativeFrom="paragraph"><wp:posOffset>457200</wp:posOffset></wp:positionV><wp:extent cx="3200400" cy="731520"/><wp:effectExtent l="0" t="0" r="0" b="0"/><wp:wrapNone/><wp:docPr id="4" name="Text Box 4"/><wp:cNvGraphicFramePr/><a:graphic xmlns:a="http://schemas.openxmlformats.org/drawingml/2006/main"><a:graphicData uri="http://schemas.microsoft.com/office/word/2010/wordprocessingShape"><wps:wsp><wps:cNvSpPr txBox="1"/><wps:spPr><a:xfrm><a:off x="0" y="0"/><a:ext cx="3200400" cy="731520"/></a:xfrm><a:prstGeom prst="rect"><a:avLst/></a:prstGeom><a:solidFill><a:srgbClr val="FFFFFF"/></a:solidFill><a:ln><a:noFill/></a:ln></wps:spPr><wps:txbx><w:txbxContent><w:p><w:pPr><w:jc w:val="center"/></w:pPr><w:r><w:rPr><w:color w:val="4472C4" w:themeColor="accent5"/><w:sz w:val="36"/><w:szCs w:val="36"/></w:rPr><w:t>Where Your Dreams Take Flight</w:t></w:r></w:p><w:p><w:pPr><w:jc w:val="center"/></w:pPr><w:r><w:rPr><w:b/><w:bCs/><w:color w:val="4472C4" w:themeColor="accent5"/></w:rPr><w:t>Mount Vernon Hot Air Balloon Festival</w:t></w:r></w:p></w:txbxContent></wps:txbx><wps:bodyPr rot="0" vert="horz" wrap="square" lIns="91440" tIns="45720" rIns="91440" bIns="45720" anchor="t"><a:noAutofit/></wps:bodyPr></wps:wsp></a:graphicData></a:graphic></wp:anchor></w:drawing></w:r></w:p></w:txbxContent></wps:txbx><wps:bodyPr rot="0" spcFirstLastPara="0" vert="horz" wrap="square" lIns="91440" tIns="45720" rIns="91440" bIns="45720" anchor="t"><a:noAutofit/></wps:bodyPr></wps:wsp></a:graphicData></a:graphic></wp:anchor></w:drawing></w:r></w:p><w:p><w:r><w:rPr><w:noProof/></w:rPr><w:drawing><wp:anchor distT="0" distB="0" distL="114300" distR="114300" simplePos="0" relativeHeight="251662336" behindDoc="0" locked="0" layoutInCell="1" allowOverlap="1" wp14:anchorId="4D5E6F7A" wp14:editId="8B9C0D1E"><wp:simplePos x="0" y="0"/><wp:positionH relativeFrom="margin"><wp:align>center</wp:align></wp:positionH><wp:positionV relativeFrom="paragraph"><wp:posOffset>457200</wp:posOffset></wp:positionV><wp:extent cx="3200400" cy="731520"/><wp:effectExtent l="0" t="0" r="0" b="0"/><wp:wrapNone/><wp:docPr id="4" name="Text Box 4"/><wp:cNvGraphicFramePr/><a:graphic xmlns:a="http://schemas.openxmlformats.org/drawingml/2006/main"><a:graphicData uri="http://schemas.microsoft.com/office/word/2010/wordprocessingShape"><wps:wsp><wps:cNvSpPr txBox="1"/><wps:spPr><a:xfrm><a:off x="0" y="0"/><a:ext cx="3200400" cy="731520"/></a:xfrm><a:prstGeom prst="rect"><a:avLst/></a:prstGeom><a:solidFill><a:srgbClr val="FFFFFF"/></a:solidFill><a:ln><a:noFill/></a:ln></wps:spPr><wps:txbx><w:txbxContent><w:p><w:pPr><w:jc w:val="center"/></w:pPr><w:r><w:rPr><w:color w:val="4472C4" w:themeColor="accent5"/><w:sz w:val="36"/><w:szCs w:val="36"/></w:rPr><w:t>Where Your Dreams Take Flight</w:t></w:r></w:p><w:p><w:pPr><w:jc w:val="center"/></w:pPr><w:r><w:rPr><w:b/><w:bCs/><w:color w:val="4472C4" w:themeColor="accent5"/></w:rPr><w:t>Mount Vernon Hot Air Balloon Festival</w:t></w:r></w:p></w:txbxContent></wps:txbx><wps:bodyPr rot="0" vert="horz" wrap="square" lIns="91440" tIns="45720" rIns="91440" bIns="45720" anchor="t"><a:noAutofit/></wps:bodyPr></wps:wsp></a:graphicData></a:graphic></wp:anchor></w:drawing></w:r></w:p><w:sectPr><w:type w:val="continuous" /><w:pgSz w:w="12240" w:h="15840" /><w:pgMar w:top="1440" w:right="1440" w:bottom="1440" w:left="1440" w:header="720" w:footer="720" w:gutter="0" /><w:cols w:space="720" /><w:docGrid w:linePitch="360" /></w:sectPr></w:body></w:document="AABB1122"><w:r><w:br w:type="page"/></w:r></w:p><w:p><w:pPr><w:shd w:val="clear" w:color="auto" w:fill="FFFFFF" /><w:spacing w:before="100" w:beforeAutospacing="1" w:after="100" w:afterAutospacing="1" w:line="270" w:lineRule="atLeast" /><w:outlineLvl w:val="1" /><w:rPr><w:rFonts w:ascii="Arial" w:eastAsia="Times New Roman" w:hAnsi="Arial" w:cs="Arial" /><w:b /><w:bCs /><w:color w:val="333333" /><w:kern w:val="0" /><w:sz w:val="36" /><w:szCs w:val="36" /><w14:ligatures w14:val="none" /></w:rPr><w:sectPr><w:type w:val="continuous" /><w:pgSz w:w="12240" w:h="15840" /><w:pgMar w:top="1440" w:right="1440" w:bottom="1440" w:left="1440" w:header="720" w:footer="720" w:gutter="0" /><w:cols w:num="2" w:sep="1" w:space="720" /><w:docGrid w:linePitch="360" /></w:sectPr></w:pPr><w:bookmarkStart w:name="_m-5X#02YKVF6MCW6jmi6UWwBmzJzmxHDCFX|y" w:id="123" /><w:bookmarkEnd w:id="123" /><w:bookmarkStart w:name="_m-5X#12!YDdO&gt;4wr18L5tGv3e[uMI0B10shqk" w:id="124" /><w:bookmarkEnd w:id="124" /><w:bookmarkStart w:name="_m-5X#22xN{/qv" w:id="125" /><w:bookmarkEnd w:id="125" /></w:p><w:p><w:r><w:rPr><w:noProof/></w:rPr><w:drawing><wp:anchor distT="0" distB="0" distL="114300" distR="114300" simplePos="0" relativeHeight="251661312" behindDoc="0" locked="0" layoutInCell="1" allowOverlap="1" wp14:anchorId="3C4D5E6F" wp14:editId="7A8B9C0D"><wp:simplePos x="0" y="0"/><wp:positionH relativeFrom="column"><wp:posOffset>0</wp:posOffset></wp:positionH><wp:positionV relativeFrom="paragraph"><wp:posOffset>0</wp:posOffset></wp:positionV><wp:extent cx="457200" cy="457200"/><wp:effectExtent l="0" t="0" r="0" b="0"/><wp:wrapSquare wrapText="bothSides"/><wp:docPr id="3" name="Graphic 3" descr="Question mark"/><wp:cNvGraphicFramePr/><a:graphic xmlns:a="http://schemas.openxmlformats.org/drawingml/2006/main"><a:graphicData uri="http://schemas.microsoft.com/office/word/2010/wordprocessingShape"><wps:wsp><wps:cNvSpPr/><wps:spPr><a:xfrm><a:off x="0" y="0"/><a:ext cx="457200" cy="457200"/></a:xfrm><a:prstGeom prst="rect"><a:avLst/></a:prstGeom><a:solidFill><a:srgbClr val="4472C4"/></a:solidFill><a:ln><a:noFill/></a:ln></wps:spPr><wps:txbx><w:txbxContent><w:p><w:pPr><w:jc w:val="center"/></w:pPr><w:r><w:rPr><w:color w:val="FFFFFF"/><w:sz w:val="40"/><w:szCs w:val="40"/></w:rPr><w:t>?</w:t></w:r></w:p></w:txbxContent></wps:txbx><wps:bodyPr anchor="ctr" anchorCtr="0"/></wps:wsp></a:graphicData></a:graphic></wp:anchor></w:drawing></w:r><w:pPr><w:shd w:val="clear" w:color="auto" w:fill="FFFFFF" /><w:spacing w:before="100" w:beforeAutospacing="1" w:after="100" w:afterAutospacing="1" w:line="270" w:lineRule="atLeast" /><w:outlineLvl w:val="1" /><w:rPr><w:rFonts w:ascii="Arial" w:eastAsia="Times New Roman" w:hAnsi="Arial" w:cs="Arial" /><w:b /><w:bCs /><w:color w:val="333333" /><w:kern w:val="0" /><w:sz w:val="36" /><w:szCs w:val="36" /><w14:ligatures w14:val="none" /></w:rPr></w:pPr><w:r><w:rPr><w:noProof/></w:rPr><w:drawing><wp:anchor distT="0" distB="0" distL="114300" distR="114300" simplePos="0" relativeHeight="251661312" behindDoc="0" locked="0" layoutInCell="1" allowOverlap="1" wp14:anchorId="3C4D5E6F" wp14:editId="7A8B9C0D"><wp:simplePos x="0" y="0"/><wp:positionH relativeFrom="column"><wp:posOffset>0</wp:posOffset></wp:positionH><wp:positionV relativeFrom="paragraph"><wp:posOffset>0</wp:posOffset></wp:positionV><wp:extent cx="457200" cy="457200"/><wp:effectExtent l="0" t="0" r="0" b="0"/><wp:wrapSquare wrapText="bothSides"/><wp:docPr id="3" name="Graphic 3" descr="Question mark"/><wp:cNvGraphicFramePr/><a:graphic xmlns:a="http://schemas.openxmlformats.org/drawingml/2006/main"><a:graphicData uri="http://schemas.microsoft.com/office/word/2010/wordprocessingShape"><wps:wsp><wps:cNvSpPr/><wps:spPr><a:xfrm><a:off x="0" y="0"/><a:ext cx="457200" cy="457200"/></a:xfrm><a:prstGeom prst="rect"><a:avLst/></a:prstGeom><a:solidFill><a:srgbClr val="4472C4"/></a:solidFill><a:ln><a:noFill/></a:ln></wps:spPr><wps:txbx><w:txbxContent><w:p><w:pPr><w:jc w:val="center"/></w:pPr><w:r><w:rPr><w:color w:val="FFFFFF"/><w:sz w:val="40"/><w:szCs w:val="40"/></w:rPr><w:t>?</w:t></w:r></w:p></w:txbxContent></wps:txbx><wps:bodyPr anchor="ctr" anchorCtr="0"/></wps:wsp></a:graphicData></a:graphic></wp:anchor></w:drawing></w:r><w:rPr><w:rFonts w:ascii="Arial" w:eastAsia="Times New Roman" w:hAnsi="Arial" w:cs="Arial" /><w:b /><w:bCs /><w:color w:val="333333" /><w:kern w:val="0" /><w:sz w:val="36" /><w:szCs w:val="36" /><w14:ligatures w14:val="none" /></w:rPr></w:pPr><w:r><w:rPr><w:rFonts w:ascii="Arial" w:eastAsia="Times New Roman" w:hAnsi="Arial" w:cs="Arial" /><w:b /><w:bCs /><w:color w:val="333333" /><w:kern w:val="0" /><w:sz w:val="36" /><w:szCs w:val="36" /><w14:ligatures w14:val="none" /></w:rPr><w:t>Frequently Asked Questions</w:t></w:r></w:p><w:p><w:pPr><w:rPr><w:b/><w:bCs/></w:rPr></w:pPr><w:r><w:rPr><w:b/><w:bCs/><w:rFonts w:ascii="Arial" w:eastAsia="Times New Roman" w:hAnsi="Arial" w:cs="Arial" /><w:bCs /><w:color w:val="333333" /><w:kern w:val="0" /><w:sz w:val="24" /><w:szCs w:val="24" /><w14:ligatures w14:val="none" /></w:rPr><w:t>When is the best time to see balloons?</w:t></w:r><w:bookmarkStart w:name="_m-5U#02YKSF6PCW3jml6UTwBpzJwmxKDCCX||" w:id="117" /><w:bookmarkEnd w:id="117" /><w:bookmarkStart w:name="_m-5U#12!YAdOA4wo18O5tDv3h[uJI0E10phqn" w:id="118" /><w:bookmarkEnd w:id="118" /><w:bookmarkStart w:name="_m-5U#22xNx/qy" w:id="119" /><w:bookmarkEnd w:id="119" /></w:p><w:p><w:pPr><w:shd w:val="clear" w:color="auto" w:fill="FFFFFF" /><w:spacing w:before="100" w:beforeAutospacing="1" w:after="100" w:afterAutospacing="1" w:line="270" w:lineRule="atLeast" /><w:rPr><w:rFonts w:ascii="Arial" w:eastAsia="Times New Roman" w:hAnsi="Arial" w:cs="Arial" /><w:color w:val="333333" /><w:kern w:val="0" /><w:sz w:val="20" /><w:szCs w:val="20" /><w14:ligatures w14:val="none" /></w:rPr></w:pPr><w:r><w:rPr><w:rFonts w:ascii="Arial" w:eastAsia="Times New Roman" w:hAnsi="Arial" w:cs="Arial" /><w:color w:val="333333" /><w:kern w:val="0" /><w:sz w:val="20" /><w:szCs w:val="20" /><w14:ligatures w14:val="none" /></w:rPr><w:lastRenderedPageBreak /><w:t>The best time to view balloons and get great pictures is early morning. Flights begin at approximately 6:00 a.m. each morning. It’s definitely worth getting up early to see balloons grace the early morning sky. Balloons also fly at dusk (approximately 7:00 p.m. on Friday and Saturday night</w:t></w:r><w:r><w:rPr><w:rFonts w:ascii="Arial" w:eastAsia="Times New Roman" w:hAnsi="Arial" w:cs="Arial" /><w:color w:val="333333" /><w:kern w:val="0" /><w:sz w:val="20" /><w:szCs w:val="20" /><w14:ligatures w14:val="none" /></w:rPr><w:t>)</w:t></w:r><w:r><w:rPr><w:rFonts w:ascii="Arial" w:eastAsia="Times New Roman" w:hAnsi="Arial" w:cs="Arial" /><w:color w:val="333333" /><w:kern w:val="0" /><w:sz w:val="20" /><w:szCs w:val="20" /><w14:ligatures w14:val="none" /></w:rPr><w:t>.</w:t></w:r><w:bookmarkStart w:name="_m-5Q#02YLYF5JCX9jlf6VZwAjzK}mwEDDIX{v" w:id="114" /><w:bookmarkEnd w:id="114" /><w:bookmarkStart w:name="_m-5Q#12!ZGdN;4xu17I5uJv2b[vPI/?11vhph" w:id="115" /><w:bookmarkEnd w:id="115" /><w:bookmarkStart w:name="_m-5Q#22xO~/ps" w:id="116" /><w:bookmarkEnd w:id="116" /></w:p><w:p><w:pPr><w:shd w:val="clear" w:color="auto" w:fill="FFFFFF" /><w:spacing w:beforeAutospacing="1" w:after="0" w:afterAutospacing="1" w:line="270" w:lineRule="atLeast" /><w:rPr><w:rFonts w:ascii="Arial" w:eastAsia="Times New Roman" w:hAnsi="Arial" w:cs="Arial" /><w:color w:val="333333" /><w:kern w:val="0" /><w:sz w:val="20" /><w:szCs w:val="20" /><w14:ligatures w14:val="none" /></w:rPr></w:pPr><w:r><w:rPr><w:rFonts w:ascii="Arial" w:eastAsia="Times New Roman" w:hAnsi="Arial" w:cs="Arial" /><w:color w:val="333333" /><w:kern w:val="0" /><w:sz w:val="20" /><w:szCs w:val="20" /><w14:ligatures w14:val="none" /></w:rPr><w:t>Please be aware that b</w:t></w:r><w:r><w:rPr><w:rFonts w:ascii="Arial" w:eastAsia="Times New Roman" w:hAnsi="Arial" w:cs="Arial" /><w:color w:val="333333" /><w:kern w:val="0" /><w:sz w:val="20" /><w:szCs w:val="20" /><w14:ligatures w14:val="none" /></w:rPr><w:t>allooning is extremely weather dependent. Winds must be less than 1</w:t></w:r><w:r><w:rPr><w:rFonts w:ascii="Arial" w:eastAsia="Times New Roman" w:hAnsi="Arial" w:cs="Arial" /><w:color w:val="333333" /><w:kern w:val="0" /><w:sz w:val="20" /><w:szCs w:val="20" /><w14:ligatures w14:val="none" /></w:rPr><w:t>5 mph</w:t></w:r><w:r><w:rPr><w:rFonts w:ascii="Arial" w:eastAsia="Times New Roman" w:hAnsi="Arial" w:cs="Arial" /><w:color w:val="333333" /><w:kern w:val="0" /><w:sz w:val="20" /><w:szCs w:val="20" /><w14:ligatures w14:val="none" /></w:rPr><w:t xml:space="preserve"> fo</w:t></w:r><w:r><w:rPr><w:rFonts w:ascii="Arial" w:eastAsia="Times New Roman" w:hAnsi="Arial" w:cs="Arial" /><w:color w:val="333333" /><w:kern w:val="0" /><w:sz w:val="20" /><w:szCs w:val="20" /><w14:ligatures w14:val="none" /></w:rPr><w:t>r balloons to fly. Listen to W</w:t></w:r><w:r><w:rPr><w:rFonts w:ascii="Arial" w:eastAsia="Times New Roman" w:hAnsi="Arial" w:cs="Arial" /><w:color w:val="333333" /><w:kern w:val="0" /><w:sz w:val="20" /><w:szCs w:val="20" /><w14:ligatures w14:val="none" /></w:rPr><w:t xml:space="preserve">LITE </w:t></w:r><w:r><w:rPr><w:rFonts w:ascii="Arial" w:eastAsia="Times New Roman" w:hAnsi="Arial" w:cs="Arial" /><w:color w:val="333333" /><w:kern w:val="0" /><w:sz w:val="20" /><w:szCs w:val="20" /><w14:ligatures w14:val="none" /></w:rPr><w:t>1</w:t></w:r><w:r><w:rPr><w:rFonts w:ascii="Arial" w:eastAsia="Times New Roman" w:hAnsi="Arial" w:cs="Arial" /><w:color w:val="333333" /><w:kern w:val="0" /><w:sz w:val="20" /><w:szCs w:val="20" /><w14:ligatures w14:val="none" /></w:rPr><w:t>0</w:t></w:r><w:r><w:rPr><w:rFonts w:ascii="Arial" w:eastAsia="Times New Roman" w:hAnsi="Arial" w:cs="Arial" /><w:color w:val="333333" /><w:kern w:val="0" /><w:sz w:val="20" /><w:szCs w:val="20" /><w14:ligatures w14:val="none" /></w:rPr><w:t>5</w:t></w:r><w:r><w:rPr><w:rFonts w:ascii="Arial" w:eastAsia="Times New Roman" w:hAnsi="Arial" w:cs="Arial" /><w:color w:val="333333" /><w:kern w:val="0" /><w:sz w:val="20" /><w:szCs w:val="20" /><w14:ligatures w14:val="none" /></w:rPr><w:t>0 AM or 9</w:t></w:r><w:r><w:rPr><w:rFonts w:ascii="Arial" w:eastAsia="Times New Roman" w:hAnsi="Arial" w:cs="Arial" /><w:color w:val="333333" /><w:kern w:val="0" /><w:sz w:val="20" /><w:szCs w:val="20" /><w14:ligatures w14:val="none" /></w:rPr><w:t>5</w:t></w:r><w:r><w:rPr><w:rFonts w:ascii="Arial" w:eastAsia="Times New Roman" w:hAnsi="Arial" w:cs="Arial" /><w:color w:val="333333" /><w:kern w:val="0" /><w:sz w:val="20" /><w:szCs w:val="20" /><w14:ligatures w14:val="none" /></w:rPr><w:t>.</w:t></w:r><w:r><w:rPr><w:rFonts w:ascii="Arial" w:eastAsia="Times New Roman" w:hAnsi="Arial" w:cs="Arial" /><w:color w:val="333333" /><w:kern w:val="0" /><w:sz w:val="20" /><w:szCs w:val="20" /><w14:ligatures w14:val="none" /></w:rPr><w:t>7</w:t></w:r><w:r><w:rPr><w:rFonts w:ascii="Arial" w:eastAsia="Times New Roman" w:hAnsi="Arial" w:cs="Arial" /><w:color w:val="333333" /><w:kern w:val="0" /><w:sz w:val="20" /><w:szCs w:val="20" /><w14:ligatures w14:val="none" /></w:rPr><w:t xml:space="preserve"> FM for the latest on flight information.</w:t></w:r><w:bookmarkStart w:name="_m-5O#02YLWF5LCX7jlh6VXwAlzK{mwGDDGX{x" w:id="111" /><w:bookmarkEnd w:id="111" /><w:bookmarkStart w:name="_m-5O#12!ZEdN=4xs17K5uHv2d[vNI/A11thpj" w:id="112" /><w:bookmarkEnd w:id="112" /><w:bookmarkStart w:name="_m-5O#22xO|/pu" w:id="113" /><w:bookmarkEnd w:id="113" /></w:p><w:p><w:pPr><w:rPr><w:b/><w:bCs/></w:rPr></w:pPr><w:r><w:rPr><w:b/><w:bCs/><w:rFonts w:ascii="Arial" w:eastAsia="Times New Roman" w:hAnsi="Arial" w:cs="Arial" /><w:bCs /><w:color w:val="333333" /><w:kern w:val="0" /><w:sz w:val="24" /><w:szCs w:val="24" /><w14:ligatures w14:val="none" /></w:rPr><w:t>Wh</w:t></w:r><w:r><w:rPr><w:b/><w:bCs/><w:rFonts w:ascii="Arial" w:eastAsia="Times New Roman" w:hAnsi="Arial" w:cs="Arial" /><w:bCs /><w:color w:val="333333" /><w:kern w:val="0" /><w:sz w:val="24" /><w:szCs w:val="24" /><w14:ligatures w14:val="none" /></w:rPr><w:t>ere are the balloons and pilots during the day?</w:t></w:r><w:bookmarkStart w:name="_m-5N#02YLVF5MCX6jli6VWwAmzKzmwHDDFX{y" w:id="108" /><w:bookmarkEnd w:id="108" /><w:bookmarkStart w:name="_m-5N#12!ZDdN&gt;4xr17L5uGv2e[vMI/B11shpk" w:id="109" /><w:bookmarkEnd w:id="109" /><w:bookmarkStart w:name="_m-5N#22xO{/pv" w:id="110" /><w:bookmarkEnd w:id="110" /></w:p><w:p><w:pPr><w:shd w:val="clear" w:color="auto" w:fill="FFFFFF" /><w:spacing w:before="100" w:beforeAutospacing="1" w:after="100" w:afterAutospacing="1" w:line="270" w:lineRule="atLeast" /><w:rPr><w:rFonts w:ascii="Arial" w:eastAsia="Times New Roman" w:hAnsi="Arial" w:cs="Arial" /><w:color w:val="333333" /><w:kern w:val="0" /><w:sz w:val="20" /><w:szCs w:val="20" /><w14:ligatures w14:val="none" /></w:rPr></w:pPr><w:r><w:rPr><w:rFonts w:ascii="Arial" w:eastAsia="Times New Roman" w:hAnsi="Arial" w:cs="Arial" /><w:color w:val="333333" /><w:kern w:val="0" /><w:sz w:val="20" /><w:szCs w:val="20" /><w14:ligatures w14:val="none" /></w:rPr><w:t>High canyon winds make it impossible to inflate balloons during the day. Pilots and their families enjoy the same things that you do at the park—live music, quality arts &amp; crafts, and local cuisine.</w:t></w:r><w:bookmarkStart w:name="_m-5I#02XC[G&gt;HBO;kud5M\xJhyB!n&quot;CC;KY&amp;t" w:id="105" /><w:bookmarkEnd w:id="105" /><w:bookmarkStart w:name="_m-5I#12~QIeW93ow2@G4lLw;`ZmRJ8=0(xiyf" w:id="106" /><w:bookmarkEnd w:id="106" /><w:bookmarkStart w:name="_m-5I#22wF&quot;0yq" w:id="107" /><w:bookmarkEnd w:id="107" /></w:p><w:p><w:pPr><w:rPr><w:b/><w:bCs/></w:rPr></w:pPr><w:r><w:rPr><w:b/><w:bCs/><w:rFonts w:ascii="Arial" w:eastAsia="Times New Roman" w:hAnsi="Arial" w:cs="Arial" /><w:bCs /><w:color w:val="333333" /><w:kern w:val="0" /><w:sz w:val="24" /><w:szCs w:val="24" /><w14:ligatures w14:val="none" /></w:rPr><w:t>Can I purchase a hot air balloon ride during the Festival?</w:t></w:r><w:bookmarkStart w:name="_m-5F#02XCXG&gt;KBO8kug5MYxJkyB|n&quot;FC;HY&amp;w" w:id="102" /><w:bookmarkEnd w:id="102" /><w:bookmarkStart w:name="_m-5F#12~QFeW&lt;3ot2@J4lIw;cZmOJ8@0(uiyi" w:id="103" /><w:bookmarkEnd w:id="103" /><w:bookmarkStart w:name="_m-5F#22wF}0yt" w:id="104" /><w:bookmarkEnd w:id="104" /></w:p><w:p><w:pPr><w:shd w:val="clear" w:color="auto" w:fill="FFFFFF" /><w:spacing w:beforeAutospacing="1" w:after="0" w:afterAutospacing="1" w:line="270" w:lineRule="atLeast" /><w:rPr><w:rFonts w:ascii="Arial" w:eastAsia="Times New Roman" w:hAnsi="Arial" w:cs="Arial" /><w:color w:val="333333" /><w:kern w:val="0" /><w:sz w:val="20" /><w:szCs w:val="20" /><w14:ligatures w14:val="none" /></w:rPr></w:pPr><w:r><w:rPr><w:rFonts w:ascii="Arial" w:eastAsia="Times New Roman" w:hAnsi="Arial" w:cs="Arial" /><w:color w:val="333333" /><w:kern w:val="0" /><w:sz w:val="20" /><w:szCs w:val="20" /><w14:ligatures w14:val="none" /></w:rPr><w:t>Due to the overwhelming demand for balloon rides during the fes</w:t></w:r><w:r><w:rPr><w:rFonts w:ascii="Arial" w:eastAsia="Times New Roman" w:hAnsi="Arial" w:cs="Arial" /><w:color w:val="333333" /><w:kern w:val="0" /><w:sz w:val="20" /><w:szCs w:val="20" /><w14:ligatures w14:val="none" /></w:rPr><w:t>tival, rides are not available. However, most pilots will give tether rides on Saturday and Sunday mornings.</w:t></w:r><w:r><w:rPr><w:rFonts w:ascii="Arial" w:eastAsia="Times New Roman" w:hAnsi="Arial" w:cs="Arial" /><w:color w:val="333333" /><w:kern w:val="0" /><w:sz w:val="20" /><w:szCs w:val="20" /><w14:ligatures w14:val="none" /></w:rPr><w:t xml:space="preserve"> Rides can be purchased before</w:t></w:r><w:r><w:rPr><w:rFonts w:ascii="Arial" w:eastAsia="Times New Roman" w:hAnsi="Arial" w:cs="Arial" /><w:color w:val="333333" /><w:kern w:val="0" /><w:sz w:val="20" /><w:szCs w:val="20" /><w14:ligatures w14:val="none" /></w:rPr><w:t xml:space="preserve"> or</w:t></w:r><w:r><w:rPr><w:rFonts w:ascii="Arial" w:eastAsia="Times New Roman" w:hAnsi="Arial" w:cs="Arial" /><w:color w:val="333333" /><w:kern w:val="0" /><w:sz w:val="20" /><w:szCs w:val="20" /><w14:ligatures w14:val="none" /></w:rPr><w:t xml:space="preserve"> </w:t></w:r><w:r><w:rPr><w:rFonts w:ascii="Arial" w:eastAsia="Times New Roman" w:hAnsi="Arial" w:cs="Arial" /><w:color w:val="333333" /><w:kern w:val="0" /><w:sz w:val="20" /><w:szCs w:val="20" /><w14:ligatures w14:val="none" /></w:rPr><w:t xml:space="preserve">after the festival from </w:t></w:r><w:r><w:rPr><w:rFonts w:ascii="Arial" w:eastAsia="Times New Roman" w:hAnsi="Arial" w:cs="Arial" /><w:color w:val="333333" /><w:kern w:val="0" /><w:sz w:val="20" /><w:szCs w:val="20" /><w14:ligatures w14:val="none" /></w:rPr><w:t>Sky Glide</w:t></w:r><w:r><w:rPr><w:rFonts w:ascii="Arial" w:eastAsia="Times New Roman" w:hAnsi="Arial" w:cs="Arial" /><w:color w:val="333333" /><w:kern w:val="0" /><w:sz w:val="20" /><w:szCs w:val="20" /><w14:ligatures w14:val="none" /></w:rPr><w:t xml:space="preserve"> Hot Air Balloon Company, a member of the </w:t></w:r><w:r><w:rPr><w:rFonts w:ascii="Arial" w:eastAsia="Times New Roman" w:hAnsi="Arial" w:cs="Arial" /><w:color w:val="333333" /><w:kern w:val="0" /><w:sz w:val="20" /><w:szCs w:val="20" /><w14:ligatures w14:val="none" /></w:rPr><w:t xml:space="preserve">Mount </w:t></w:r><w:r><w:rPr><w:rFonts w:ascii="Arial" w:eastAsia="Times New Roman" w:hAnsi="Arial" w:cs="Arial" /><w:color w:val="333333" /><w:kern w:val="0" /><w:sz w:val="20" /><w:szCs w:val="20" /><w14:ligatures w14:val="none" /></w:rPr><w:t>Vernon</w:t></w:r><w:r><w:rPr><w:rFonts w:ascii="Arial" w:eastAsia="Times New Roman" w:hAnsi="Arial" w:cs="Arial" /><w:color w:val="333333" /><w:kern w:val="0" /><w:sz w:val="20" /><w:szCs w:val="20" /><w14:ligatures w14:val="none" /></w:rPr><w:t xml:space="preserve"> County</w:t></w:r><w:r><w:rPr><w:rFonts w:ascii="Arial" w:eastAsia="Times New Roman" w:hAnsi="Arial" w:cs="Arial" /><w:color w:val="333333" /><w:kern w:val="0" /><w:sz w:val="20" /><w:szCs w:val="20" /><w14:ligatures w14:val="none" /></w:rPr><w:t xml:space="preserve"> Chamber of Commerce.</w:t></w:r><w:bookmarkStart w:name="_m-5E#02XCWG&gt;LBO7kuh5MXxJlyB{n&quot;GC;GY&amp;x" w:id="99" /><w:bookmarkEnd w:id="99" /><w:bookmarkStart w:name="_m-5E#12~QEeW=3os2@K4lHw;dZmNJ8A0(tiyj" w:id="100" /><w:bookmarkEnd w:id="100" /><w:bookmarkStart w:name="_m-5E#22wF|0yu" w:id="101" /><w:bookmarkEnd w:id="101" /></w:p><w:p><w:pPr><w:rPr><w:b/><w:bCs/></w:rPr></w:pPr><w:r><w:rPr><w:b/><w:bCs/><w:rFonts w:ascii="Arial" w:eastAsia="Times New Roman" w:hAnsi="Arial" w:cs="Arial" /><w:bCs /><w:color w:val="333333" /><w:kern w:val="0" /><w:sz w:val="24" /><w:szCs w:val="24" /><w14:ligatures w14:val="none" /></w:rPr><w:t>What can my children do while visiting the festival?</w:t></w:r><w:bookmarkStart w:name="_m-5C#02XCUG&gt;NBO5kuj5MVxJnyByn&quot;IC;EY&amp;z" w:id="96" /><w:bookmarkEnd w:id="96" /><w:bookmarkStart w:name="_m-5C#12~QCeW?3oq2@M4lFw;fZmLJ8C0(riyl" w:id="97" /><w:bookmarkEnd w:id="97" /><w:bookmarkStart w:name="_m-5C#22wFz0yw" w:id="98" /><w:bookmarkEnd w:id="98" /></w:p><w:p><w:pPr><w:shd w:val="clear" w:color="auto" w:fill="FFFFFF" /><w:spacing w:before="100" w:beforeAutospacing="1" w:after="100" w:afterAutospacing="1" w:line="270" w:lineRule="atLeast" /><w:rPr><w:rFonts w:ascii="Arial" w:eastAsia="Times New Roman" w:hAnsi="Arial" w:cs="Arial" /><w:color w:val="333333" /><w:kern w:val="0" /><w:sz w:val="20" /><w:szCs w:val="20" /><w14:ligatures w14:val="none" /></w:rPr></w:pPr><w:r><w:rPr><w:rFonts w:ascii="Arial" w:eastAsia="Times New Roman" w:hAnsi="Arial" w:cs="Arial" /><w:color w:val="333333" /><w:kern w:val="0" /><w:sz w:val="20" /><w:szCs w:val="20" /><w14:ligatures w14:val="none" /></w:rPr><w:t>Children</w:t></w:r><w:r><w:rPr><w:rFonts w:ascii="Arial" w:eastAsia="Times New Roman" w:hAnsi="Arial" w:cs="Arial" /><w:color w:val="333333" /><w:kern w:val="0" /><w:sz w:val="20" /><w:szCs w:val="20" /><w14:ligatures w14:val="none" /></w:rPr><w:t xml:space="preserve"> can enjoy inflatables, children’s interactive entertainment, reptile displays, and face painting</w:t></w:r><w:r><w:rPr><w:rFonts w:ascii="Arial" w:eastAsia="Times New Roman" w:hAnsi="Arial" w:cs="Arial" /><w:color w:val="333333" /><w:kern w:val="0" /><w:sz w:val="20" /><w:szCs w:val="20" /><w14:ligatures w14:val="none" /></w:rPr><w:t>,</w:t></w:r><w:r><w:rPr><w:rFonts w:ascii="Arial" w:eastAsia="Times New Roman" w:hAnsi="Arial" w:cs="Arial" /><w:color w:val="333333" /><w:kern w:val="0" /><w:sz w:val="20" /><w:szCs w:val="20" /><w14:ligatures w14:val="none" /></w:rPr><w:t xml:space="preserve"> just to name a few!</w:t></w:r><w:r><w:rPr><w:rFonts w:ascii="Arial" w:eastAsia="Times New Roman" w:hAnsi="Arial" w:cs="Arial" /><w:color w:val="333333" /><w:kern w:val="0" /><w:sz w:val="20" /><w:szCs w:val="20" /><w14:ligatures w14:val="none" /></w:rPr><w:t xml:space="preserve"> </w:t></w:r><w:r><w:rPr><w:rFonts w:ascii="Arial" w:eastAsia="Times New Roman" w:hAnsi="Arial" w:cs="Arial" /><w:color w:val="333333" /><w:kern w:val="0" /><w:sz w:val="20" /><w:szCs w:val="20" /><w14:ligatures w14:val="none" /></w:rPr><w:t xml:space="preserve"> These fun activities are located in the free,</w:t></w:r><w:r><w:rPr><w:rFonts w:ascii="Arial" w:eastAsia="Times New Roman" w:hAnsi="Arial" w:cs="Arial" /><w:color w:val="333333" /><w:kern w:val="0" /><w:sz w:val="20" /><w:szCs w:val="20" /><w14:ligatures w14:val="none" /></w:rPr><w:t xml:space="preserve"> gated Children’s Village open 1</w:t></w:r><w:r><w:rPr><w:rFonts w:ascii="Arial" w:eastAsia="Times New Roman" w:hAnsi="Arial" w:cs="Arial" /><w:color w:val="333333" /><w:kern w:val="0" /><w:sz w:val="20" /><w:szCs w:val="20" /><w14:ligatures w14:val="none" /></w:rPr><w:t xml:space="preserve"> p.m. - 8 p.m. on Friday,</w:t></w:r><w:r><w:rPr><w:rFonts w:ascii="Arial" w:eastAsia="Times New Roman" w:hAnsi="Arial" w:cs="Arial" /><w:color w:val="333333" /><w:kern w:val="0" /><w:sz w:val="20" /><w:szCs w:val="20" /><w14:ligatures w14:val="none" /></w:rPr><w:t xml:space="preserve"> and 8 a.m. - 8 p.m. on Saturday.</w:t></w:r><w:bookmarkStart w:name="_m-57#02XDZG=IBP:kte5N[xIiyC~n!DC&lt;JY%u" w:id="93" /><w:bookmarkEnd w:id="93" /><w:bookmarkStart w:name="_m-57#12~RHeV:3pv2?H4mKw:aZnQJ7&gt;0)wixg" w:id="94" /><w:bookmarkEnd w:id="94" /><w:bookmarkStart w:name="_m-57#22wG!0xr" w:id="95" /><w:bookmarkEnd w:id="95" /></w:p><w:p><w:pPr><w:rPr><w:b/><w:bCs/></w:rPr></w:pPr><w:r><w:rPr><w:b/><w:bCs/><w:rFonts w:ascii="Arial" w:eastAsia="Times New Roman" w:hAnsi="Arial" w:cs="Arial" /><w:bCs /><w:color w:val="333333" /><w:kern w:val="0" /><w:sz w:val="24" /><w:szCs w:val="24" /><w14:ligatures w14:val="none" /></w:rPr><w:t>Is smoking permitted on the festival grounds?</w:t></w:r><w:bookmarkStart w:name="_m-55#02XDXG=KBP8ktg5NYxIkyC|n!FC&lt;HY%w" w:id="90" /><w:bookmarkEnd w:id="90" /><w:bookmarkStart w:name="_m-55#12~RFeV&lt;3pt2?J4mIw:cZnOJ7@0)uixi" w:id="91" /><w:bookmarkEnd w:id="91" /><w:bookmarkStart w:name="_m-55#22wG}0xt" w:id="92" /><w:bookmarkEnd w:id="92" /></w:p><w:p><w:pPr><w:shd w:val="clear" w:color="auto" w:fill="FFFFFF" /><w:spacing w:before="100" w:beforeAutospacing="1" w:after="100" w:afterAutospacing="1" w:line="270" w:lineRule="atLeast" /><w:rPr><w:rFonts w:ascii="Arial" w:eastAsia="Times New Roman" w:hAnsi="Arial" w:cs="Arial" /><w:color w:val="333333" /><w:kern w:val="0" /><w:sz w:val="20" /><w:szCs w:val="20" /><w14:ligatures w14:val="none" /></w:rPr></w:pPr><w:r><w:rPr><w:rFonts w:ascii="Arial" w:eastAsia="Times New Roman" w:hAnsi="Arial" w:cs="Arial" /><w:color w:val="333333" /><w:kern w:val="0" /><w:sz w:val="20" /><w:szCs w:val="20" /><w14:ligatures w14:val="none" /></w:rPr><w:t>Smoking is not allowed on the festival grounds while the balloons are present. Please be courteous of other festival patrons.</w:t></w:r><w:bookmarkStart w:name="_m-53#02XDVG=MBP6kti5NWxImyCzn!HC&lt;FY%y" w:id="87" /><w:bookmarkEnd w:id="87" /><w:bookmarkStart w:name="_m-53#12~RDeV&gt;3pr2?L4mGw:eZnMJ7B0)sixk" w:id="88" /><w:bookmarkEnd w:id="88" /><w:bookmarkStart w:name="_m-53#22wG{0xv" w:id="89" /><w:bookmarkEnd w:id="89" /></w:p><w:p><w:pPr><w:rPr><w:b/><w:bCs/></w:rPr></w:pPr><w:r><w:rPr><w:b/><w:bCs/><w:rFonts w:ascii="Arial" w:eastAsia="Times New Roman" w:hAnsi="Arial" w:cs="Arial" /><w:bCs /><w:color w:val="333333" /><w:kern w:val="0" /><w:sz w:val="24" /><w:szCs w:val="24" /><w14:ligatures w14:val="none" /></w:rPr><w:t>Can I bring a cooler with beverage and food into the festival?</w:t></w:r><w:bookmarkStart w:name="_m-52#02XDUG=NBP5ktj5NVxInyCyn!IC&lt;EY%z" w:id="84" /><w:bookmarkEnd w:id="84" /><w:bookmarkStart w:name="_m-52#12~RCeV?3pq2?M4mFw:fZnLJ7C0)rixl" w:id="85" /><w:bookmarkEnd w:id="85" /><w:bookmarkStart w:name="_m-52#22wGz0xw" w:id="86" /><w:bookmarkEnd w:id="86" /></w:p><w:p><w:pPr><w:shd w:val="clear" w:color="auto" w:fill="FFFFFF" /><w:spacing w:before="100" w:beforeAutospacing="1" w:after="100" w:afterAutospacing="1" w:line="270" w:lineRule="atLeast" /><w:rPr><w:rFonts w:ascii="Arial" w:eastAsia="Times New Roman" w:hAnsi="Arial" w:cs="Arial" /><w:color w:val="333333" /><w:kern w:val="0" /><w:sz w:val="20" /><w:szCs w:val="20" /><w14:ligatures w14:val="none" /></w:rPr></w:pPr><w:r><w:rPr><w:rFonts w:ascii="Arial" w:eastAsia="Times New Roman" w:hAnsi="Arial" w:cs="Arial" /><w:color w:val="333333" /><w:kern w:val="0" /><w:sz w:val="20" /><w:szCs w:val="20" /><w14:ligatures w14:val="none" /></w:rPr><w:t>You can bring a cooler with snacks and plastic or aluminum containers. However, no glass bottles or alcohol are allowed at the festival. We do</w:t></w:r><w:r><w:rPr><w:rFonts w:ascii="Arial" w:eastAsia="Times New Roman" w:hAnsi="Arial" w:cs="Arial" /><w:color w:val="333333" /><w:kern w:val="0" /><w:sz w:val="20" /><w:szCs w:val="20" /><w14:ligatures w14:val="none" /></w:rPr><w:t xml:space="preserve"> provide an assortment of unique foods at our </w:t></w:r><w:r><w:rPr><w:rFonts w:ascii="Arial" w:eastAsia="Times New Roman" w:hAnsi="Arial" w:cs="Arial" /><w:color w:val="333333" /><w:kern w:val="0" /><w:sz w:val="20" /><w:szCs w:val="20" /><w14:ligatures w14:val="none" /></w:rPr><w:t>food vendor</w:t></w:r><w:r><w:rPr><w:rFonts w:ascii="Arial" w:eastAsia="Times New Roman" w:hAnsi="Arial" w:cs="Arial" /><w:color w:val="333333" /><w:kern w:val="0" /><w:sz w:val="20" /><w:szCs w:val="20" /><w14:ligatures w14:val="none" /></w:rPr><w:t xml:space="preserve"> stands.</w:t></w:r><w:bookmarkStart w:name="_m-4Y#02XE[G&lt;HBQ;ksd5O\xHhyD!n~CC=KY$t" w:id="81" /><w:bookmarkEnd w:id="81" /><w:bookmarkStart w:name="_m-4Y#12~SIeU93qw2&gt;G4nLw9`ZoRJ6=0*xiwf" w:id="82" /><w:bookmarkEnd w:id="82" /><w:bookmarkStart w:name="_m-4Y#22wH&quot;0wq" w:id="83" /><w:bookmarkEnd w:id="83" /></w:p><w:p><w:pPr><w:rPr><w:b/><w:bCs/></w:rPr></w:pPr><w:r><w:rPr><w:b/><w:bCs/><w:rFonts w:ascii="Arial" w:eastAsia="Times New Roman" w:hAnsi="Arial" w:cs="Arial" /><w:bCs /><w:color w:val="333333" /><w:kern w:val="0" /><w:sz w:val="24" /><w:szCs w:val="24" /><w14:ligatures w14:val="none" /></w:rPr><w:t>What are my camping, RV, or lodging options?</w:t></w:r><w:bookmarkStart w:name="_m-4W#02XEYG&lt;JBQ9ksf5OZxHjyD}n~EC=IY$v" w:id="78" /><w:bookmarkEnd w:id="78" /><w:bookmarkStart w:name="_m-4W#12~SGeU;3qu2&gt;I4nJw9bZoPJ6?0*viwh" w:id="79" /><w:bookmarkEnd w:id="79" /><w:bookmarkStart w:name="_m-4W#22wH~0ws" w:id="80" /><w:bookmarkEnd w:id="80" /></w:p><w:p><w:pPr><w:shd w:val="clear" w:color="auto" w:fill="FFFFFF" /><w:spacing w:beforeAutospacing="1" w:after="0" w:afterAutospacing="1" w:line="270" w:lineRule="atLeast" /><w:rPr><w:rFonts w:ascii="Arial" w:eastAsia="Times New Roman" w:hAnsi="Arial" w:cs="Arial" /><w:color w:val="333333" /><w:kern w:val="0" /><w:sz w:val="20" /><w:szCs w:val="20" /><w14:ligatures w14:val="none" /></w:rPr></w:pPr><w:r><w:rPr><w:rFonts w:ascii="Arial" w:eastAsia="Times New Roman" w:hAnsi="Arial" w:cs="Arial" /><w:color w:val="333333" /><w:kern w:val="0" /><w:sz w:val="20" /><w:szCs w:val="20" /><w14:ligatures w14:val="none" /></w:rPr><w:t>While you cannot camp or park an RV on the festival grounds, there are camping options nearby.</w:t></w:r><w:r><w:rPr><w:rFonts w:ascii="Arial" w:eastAsia="Times New Roman" w:hAnsi="Arial" w:cs="Arial" /><w:color w:val="333333" /><w:kern w:val="0" /><w:sz w:val="20" /><w:szCs w:val="20" /><w14:ligatures w14:val="none" /></w:rPr><w:t xml:space="preserve"> Check with the </w:t></w:r><w:r><w:rPr><w:rFonts w:ascii="Arial" w:eastAsia="Times New Roman" w:hAnsi="Arial" w:cs="Arial" /><w:color w:val="333333" /><w:kern w:val="0" /><w:sz w:val="20" /><w:szCs w:val="20" /><w14:ligatures w14:val="none" /></w:rPr><w:t>Mount Sedona</w:t></w:r><w:r><w:rPr><w:rFonts w:ascii="Arial" w:eastAsia="Times New Roman" w:hAnsi="Arial" w:cs="Arial" /><w:color w:val="333333" /><w:kern w:val="0" /><w:sz w:val="20" /><w:szCs w:val="20" /><w14:ligatures w14:val="none" /></w:rPr><w:t xml:space="preserve"> County Chamber of Commerce for a complete list of camping facilities.</w:t></w:r><w:bookmarkStart w:name="_m-4V#02XEXG&lt;KBQ8ksg5OYxHkyD|n~FC=HY$w" w:id="75" /><w:bookmarkEnd w:id="75" /><w:bookmarkStart w:name="_m-4V#12~SFeU&lt;3qt2&gt;J4nIw9cZoOJ6@0*uiwi" w:id="76" /><w:bookmarkEnd w:id="76" /><w:bookmarkStart w:name="_m-4V#22wH}0wt" w:id="77" /><w:bookmarkEnd w:id="77" /></w:p><w:p><w:pPr><w:rPr><w:b/><w:bCs/></w:rPr></w:pPr><w:r><w:rPr><w:b/><w:bCs/><w:rFonts w:ascii="Arial" w:eastAsia="Times New Roman" w:hAnsi="Arial" w:cs="Arial" /><w:bCs /><w:color w:val="333333" /><w:kern w:val="0" /><w:sz w:val="24" /><w:szCs w:val="24" /><w14:ligatures w14:val="none" /></w:rPr><w:t>How c</w:t></w:r><w:r><w:rPr><w:b/><w:bCs/><w:rFonts w:ascii="Arial" w:eastAsia="Times New Roman" w:hAnsi="Arial" w:cs="Arial" /><w:bCs /><w:color w:val="333333" /><w:kern w:val="0" /><w:sz w:val="24" /><w:szCs w:val="24" /><w14:ligatures w14:val="none" /></w:rPr><w:t xml:space="preserve">an I </w:t></w:r><w:r><w:rPr><w:b/><w:bCs/><w:rFonts w:ascii="Arial" w:eastAsia="Times New Roman" w:hAnsi="Arial" w:cs="Arial" /><w:bCs /><w:color w:val="333333" /><w:kern w:val="0" /><w:sz w:val="24" /><w:szCs w:val="24" /><w14:ligatures w14:val="none" /></w:rPr><w:t>plan for the best e</w:t></w:r><w:r><w:rPr><w:b/><w:bCs/><w:rFonts w:ascii="Arial" w:eastAsia="Times New Roman" w:hAnsi="Arial" w:cs="Arial" /><w:bCs /><w:color w:val="333333" /><w:kern w:val="0" /><w:sz w:val="24" /><w:szCs w:val="24" /><w14:ligatures w14:val="none" /></w:rPr><w:t>xperience?</w:t></w:r><w:bookmarkStart w:name="_m-4S#02XEUG&lt;NBQ5ksj5OVxHnyDyn~IC=EY$z" w:id="72" /><w:bookmarkEnd w:id="72" /><w:bookmarkStart w:name="_m-4S#12~SCeU?3qq2&gt;M4nFw9fZoLJ6C0*riwl" w:id="73" /><w:bookmarkEnd w:id="73" /><w:bookmarkStart w:name="_m-4S#22wHz0ww" w:id="74" /><w:bookmarkEnd w:id="74" /></w:p><w:p><w:pPr><w:numPr><w:ilvl w:val="0"/><w:numId w:val="1"/></w:numPr><w:ind w:left="360" w:hanging="360"/></w:pPr><w:rPr><w:rFonts w:ascii="Arial" w:eastAsia="Times New Roman" w:hAnsi="Arial" w:cs="Arial" /><w:color w:val="333333" /><w:kern w:val="0" /><w:sz w:val="20" /><w:szCs w:val="20" /><w14:ligatures w14:val="none" /></w:rPr></w:pPr><w:r><w:rPr><w:rFonts w:ascii="Arial" w:eastAsia="Times New Roman" w:hAnsi="Arial" w:cs="Arial" /><w:color w:val="333333" /><w:kern w:val="0" /><w:sz w:val="20" /><w:szCs w:val="20" /><w14:ligatures w14:val="none" /></w:rPr><w:t>Although there is no perfect formula, the follow</w:t></w:r><w:r><w:rPr><w:rFonts w:ascii="Arial" w:eastAsia="Times New Roman" w:hAnsi="Arial" w:cs="Arial" /><w:color w:val="333333" /><w:kern w:val="0" /><w:sz w:val="20" /><w:szCs w:val="20" /><w14:ligatures w14:val="none" /></w:rPr><w:t>ing</w:t></w:r><w:r><w:rPr><w:rFonts w:ascii="Arial" w:eastAsia="Times New Roman" w:hAnsi="Arial" w:cs="Arial" /><w:color w:val="333333" /><w:kern w:val="0" /><w:sz w:val="20" /><w:szCs w:val="20" /><w14:ligatures w14:val="none" /></w:rPr><w:t xml:space="preserve"> tips should </w:t></w:r><w:r><w:rPr><w:rFonts w:ascii="Arial" w:eastAsia="Times New Roman" w:hAnsi="Arial" w:cs="Arial" /><w:color w:val="333333" /><w:kern w:val="0" /><w:sz w:val="20" /><w:szCs w:val="20" /><w14:ligatures w14:val="none" /></w:rPr><w:t>e</w:t></w:r><w:r><w:rPr><w:rFonts w:ascii="Arial" w:eastAsia="Times New Roman" w:hAnsi="Arial" w:cs="Arial" /><w:color w:val="333333" /><w:kern w:val="0" /><w:sz w:val="20" /><w:szCs w:val="20" /><w14:ligatures w14:val="none" /></w:rPr><w:t>nsure that you have all the bases covered!</w:t></w:r></w:p><w:p><w:pPr><w:numPr><w:ilvl w:val="0"/><w:numId w:val="1"/></w:numPr><w:ind w:left="360" w:hanging="360"/></w:pPr><w:rPr><w:rFonts w:ascii="Arial" w:eastAsia="Times New Roman" w:hAnsi="Arial" w:cs="Arial" /><w:color w:val="333333" /><w:kern w:val="0" /><w:sz w:val="20" /><w:szCs w:val="20" /><w14:ligatures w14:val="none" /></w:rPr></w:pPr><w:r><w:rPr><w:rFonts w:ascii="Arial" w:eastAsia="Times New Roman" w:hAnsi="Arial" w:cs="Arial" /><w:color w:val="333333" /><w:kern w:val="0" /><w:sz w:val="20" /><w:szCs w:val="20" /><w14:ligatures w14:val="none" /></w:rPr><w:t>Wear good walking shoes. The park encompasses 15 acres, so hiking is a strong possibility.</w:t></w:r></w:p><w:p><w:pPr><w:numPr><w:ilvl w:val="0"/><w:numId w:val="1"/></w:numPr><w:ind w:left="360" w:hanging="360"/></w:pPr><w:rPr><w:rFonts w:ascii="Arial" w:eastAsia="Times New Roman" w:hAnsi="Arial" w:cs="Arial" /><w:color w:val="333333" /><w:kern w:val="0" /><w:sz w:val="20" /><w:szCs w:val="20" /><w14:ligatures w14:val="none" /></w:rPr></w:pPr><w:r><w:rPr><w:rFonts w:ascii="Arial" w:eastAsia="Times New Roman" w:hAnsi="Arial" w:cs="Arial" /><w:color w:val="333333" /><w:kern w:val="0" /><w:sz w:val="20" /><w:szCs w:val="20" /><w14:ligatures w14:val="none" /></w:rPr><w:lastRenderedPageBreak /><w:t>Bring sunscreen. There is very little shade.</w:t></w:r></w:p><w:p><w:pPr><w:numPr><w:ilvl w:val="0"/><w:numId w:val="1"/></w:numPr><w:ind w:left="360" w:hanging="360"/></w:pPr><w:rPr><w:rFonts w:ascii="Arial" w:eastAsia="Times New Roman" w:hAnsi="Arial" w:cs="Arial" /><w:color w:val="333333" /><w:kern w:val="0" /><w:sz w:val="20" /><w:szCs w:val="20" /><w14:ligatures w14:val="none" /></w:rPr></w:pPr><w:r><w:rPr><w:rFonts w:ascii="Arial" w:eastAsia="Times New Roman" w:hAnsi="Arial" w:cs="Arial" /><w:color w:val="333333" /><w:kern w:val="0" /><w:sz w:val="20" /><w:szCs w:val="20" /><w14:ligatures w14:val="none" /></w:rPr><w:t>Get to the park early. When the balloons inflate, long lines form.</w:t></w:r></w:p><w:p><w:pPr><w:numPr><w:ilvl w:val="0"/><w:numId w:val="1"/></w:numPr><w:ind w:left="360" w:hanging="360"/></w:pPr><w:rPr><w:rFonts w:ascii="Arial" w:eastAsia="Times New Roman" w:hAnsi="Arial" w:cs="Arial" /><w:color w:val="333333" /><w:kern w:val="0" /><w:sz w:val="20" /><w:szCs w:val="20" /><w14:ligatures w14:val="none" /></w:rPr></w:pPr><w:r><w:rPr><w:rFonts w:ascii="Arial" w:eastAsia="Times New Roman" w:hAnsi="Arial" w:cs="Arial" /><w:color w:val="333333" /><w:kern w:val="0" /><w:sz w:val="20" /><w:szCs w:val="20" /><w14:ligatures w14:val="none" /></w:rPr><w:t>Wear comfortable, cool clothing. If you take tether rides, the flame does make it hot in the basket.</w:t></w:r></w:p><w:p><w:pPr><w:numPr><w:ilvl w:val="0"/><w:numId w:val="1"/></w:numPr><w:ind w:left="360" w:hanging="360"/></w:pPr><w:rPr><w:rFonts w:ascii="Arial" w:eastAsia="Times New Roman" w:hAnsi="Arial" w:cs="Arial" /><w:color w:val="333333" /><w:kern w:val="0" /><w:sz w:val="20" /><w:szCs w:val="20" /><w14:ligatures w14:val="none" /></w:rPr></w:pPr><w:r><w:rPr><w:rFonts w:ascii="Arial" w:eastAsia="Times New Roman" w:hAnsi="Arial" w:cs="Arial" /><w:color w:val="333333" /><w:kern w:val="0" /><w:sz w:val="20" /><w:szCs w:val="20" /><w14:ligatures w14:val="none" /></w:rPr><w:t>Bring</w:t></w:r><w:r><w:rPr><w:rFonts w:ascii="Arial" w:eastAsia="Times New Roman" w:hAnsi="Arial" w:cs="Arial" /><w:color w:val="333333" /><w:kern w:val="0" /><w:sz w:val="20" /><w:szCs w:val="20" /><w14:ligatures w14:val="none" /></w:rPr><w:t xml:space="preserve"> a camera and tripod. The ballu</w:t></w:r><w:r><w:rPr><w:rFonts w:ascii="Arial" w:eastAsia="Times New Roman" w:hAnsi="Arial" w:cs="Arial" /><w:color w:val="333333" /><w:kern w:val="0" /><w:sz w:val="20" /><w:szCs w:val="20" /><w14:ligatures w14:val="none" /></w:rPr><w:t>mination at dusk is a beautiful photo opportunity, but the low light makes a tripod a necessity.</w:t></w:r></w:p><w:p><w:pPr><w:numPr><w:ilvl w:val="0"/><w:numId w:val="1"/></w:numPr><w:ind w:left="360" w:hanging="360"/></w:pPr><w:rPr><w:rFonts w:ascii="Arial" w:eastAsia="Times New Roman" w:hAnsi="Arial" w:cs="Arial" /><w:color w:val="333333" /><w:kern w:val="0" /><w:sz w:val="20" /><w:szCs w:val="20" /><w14:ligatures w14:val="none" /></w:rPr></w:pPr><w:r><w:rPr><w:rFonts w:ascii="Arial" w:eastAsia="Times New Roman" w:hAnsi="Arial" w:cs="Arial" /><w:color w:val="333333" /><w:kern w:val="0" /><w:sz w:val="20" /><w:szCs w:val="20" /><w14:ligatures w14:val="none" /></w:rPr><w:t>Bring lawn chairs and/or blankets.</w:t></w:r></w:p><w:p><w:pPr><w:numPr><w:ilvl w:val="0"/><w:numId w:val="1"/></w:numPr><w:ind w:left="360" w:hanging="360"/></w:pPr><w:rPr><w:rFonts w:ascii="Arial" w:eastAsia="Times New Roman" w:hAnsi="Arial" w:cs="Arial" /><w:color w:val="333333" /><w:kern w:val="0" /><w:sz w:val="20" /><w:szCs w:val="20" /><w14:ligatures w14:val="none" /></w:rPr></w:pPr><w:r><w:rPr><w:rFonts w:ascii="Arial" w:eastAsia="Times New Roman" w:hAnsi="Arial" w:cs="Arial" /><w:color w:val="333333" /><w:kern w:val="0" /><w:sz w:val="20" /><w:szCs w:val="20" /><w14:ligatures w14:val="none" /></w:rPr><w:t>Bring, or prepare to buy, plenty of water.</w:t></w:r></w:p><w:p><w:pPr><w:numPr><w:ilvl w:val="0"/><w:numId w:val="1"/></w:numPr><w:ind w:left="360" w:hanging="360"/></w:pPr><w:rPr><w:rFonts w:ascii="Arial" w:eastAsia="Times New Roman" w:hAnsi="Arial" w:cs="Arial" /><w:color w:val="333333" /><w:kern w:val="0" /><w:sz w:val="20" /><w:szCs w:val="20" /><w14:ligatures w14:val="none" /></w:rPr></w:pPr><w:r><w:rPr><w:rFonts w:ascii="Arial" w:eastAsia="Times New Roman" w:hAnsi="Arial" w:cs="Arial" /><w:color w:val="333333" /><w:kern w:val="0" /><w:sz w:val="20" /><w:szCs w:val="20" /><w14:ligatures w14:val="none" /></w:rPr><w:t>Bring Frisbees or balls for children to play with in the large open field while you wait for a show to begin.</w:t></w:r></w:p><w:p><w:pPr><w:shd w:val="clear" w:color="auto" w:fill="FFFFFF" /><w:spacing w:beforeAutospacing="1" w:after="0" w:afterAutospacing="1" w:line="270" w:lineRule="atLeast" /><w:rPr><w:rFonts w:ascii="Verdana" w:eastAsia="Times New Roman" w:hAnsi="Verdana" w:cs="Times New Roman" /><w:color w:val="444E5C" /><w:kern w:val="0" /><w:sz w:val="20" /><w:szCs w:val="20" /><w14:ligatures w14:val="none" /></w:rPr></w:pPr><w:bookmarkStart w:name="_m-3X#02XHTG9OBT4kpk5RUxEoyGxn{JC@DY!{" w:id="42" /><w:bookmarkEnd w:id="42" /><w:bookmarkStart w:name="_m-3X#12~VBeR@3tp2;N4qEw6gZrKJ3D0-qitm" w:id="43" /><w:bookmarkEnd w:id="43" /><w:bookmarkStart w:name="_m-3X#22wKy0tx" w:id="44" /><w:bookmarkEnd w:id="44" /></w:p><w:p><w:pPr><w:shd w:val="clear" w:color="auto" w:fill="FFFFFF" /><w:spacing w:beforeAutospacing="1" w:after="0" w:afterAutospacing="1" w:line="270" w:lineRule="atLeast" /><w:rPr><w:rStyle w:val="Strong" /><w:rFonts w:ascii="Arial" w:hAnsi="Arial" w:cs="Arial" /></w:rPr></w:pPr><w:r><w:rPr><w:rStyle w:val="Strong" /><w:rFonts w:ascii="Arial" w:hAnsi="Arial" w:cs="Arial" /></w:rPr><w:t>Event S</w:t></w:r><w:r><w:rPr><w:rStyle w:val="Strong" /><w:rFonts w:ascii="Arial" w:hAnsi="Arial" w:cs="Arial" /></w:rPr><w:t>chedule</w:t></w:r><w:bookmarkStart w:name="_m-3V#02XI\G8GBU&lt;koc5S]xDgyH&quot;nzBCALY~s" w:id="39" /><w:bookmarkEnd w:id="39" /><w:bookmarkStart w:name="_m-3V#12~WJeQ83ux2:F4rMw5_ZsSJ2&lt;0.yise" w:id="40" /><w:bookmarkEnd w:id="40" /><w:bookmarkStart w:name="_m-3V#22wL#0sp" w:id="41" /><w:bookmarkEnd w:id="41" /></w:p><w:p><w:pPr><w:shd w:val="clear" w:color="auto" w:fill="FFFFFF" /><w:spacing w:beforeAutospacing="1" w:after="0" w:afterAutospacing="1" w:line="270" w:lineRule="atLeast" /><w:rPr><w:rStyle w:val="Strong" /><w:rFonts w:ascii="Arial" w:hAnsi="Arial" w:cs="Arial" /></w:rPr></w:pPr><w:r><w:rPr><w:rStyle w:val="Strong" /><w:rFonts w:ascii="Arial" w:hAnsi="Arial" w:cs="Arial" /></w:rPr><w:t>Saturday (5/2</w:t></w:r><w:r><w:rPr><w:rStyle w:val="Strong" /><w:rFonts w:ascii="Arial" w:hAnsi="Arial" w:cs="Arial" /></w:rPr><w:t>8</w:t></w:r><w:r><w:rPr><w:rStyle w:val="Strong" /><w:rFonts w:ascii="Arial" w:hAnsi="Arial" w:cs="Arial" /></w:rPr><w:t>/</w:t></w:r><w:r><w:rPr><w:rStyle w:val="Strong" /><w:rFonts w:ascii="Arial" w:hAnsi="Arial" w:cs="Arial" /></w:rPr><w:t>202</w:t></w:r><w:r><w:rPr><w:rStyle w:val="Strong" /><w:rFonts w:ascii="Arial" w:hAnsi="Arial" w:cs="Arial" /></w:rPr><w:t>4</w:t></w:r><w:r><w:rPr><w:rStyle w:val="Strong" /><w:rFonts w:ascii="Arial" w:hAnsi="Arial" w:cs="Arial" /></w:rPr><w:t>)</w:t></w:r><w:bookmarkStart w:name="_m-3T#02XIZG8IBU:koe5S[xDiyH~nzDCAJY~u" w:id="36" /><w:bookmarkEnd w:id="36" /><w:bookmarkStart w:name="_m-3T#12~WHeQ:3uv2:H4rKw5aZsQJ2&gt;0.wisg" w:id="37" /><w:bookmarkEnd w:id="37" /><w:bookmarkStart w:name="_m-3T#22wL!0sr" w:id="38" /><w:bookmarkEnd w:id="38" /></w:p><w:p><w:pPr><w:tabs><w:tab w:val="left" w:pos="1440"/><w:tab w:val="left" w:leader="dot" w:pos="4320"/></w:tabs></w:pPr><w:r><w:tab/></w:r><w:r><w:t xml:space="preserve">6:00 AM</w:t></w:r><w:r><w:tab/></w:r><w:r><w:t>Pilots Briefing</w:t></w:r></w:p><w:p><w:pPr><w:tabs><w:tab w:val="left" w:pos="1440"/><w:tab w:val="left" w:leader="dot" w:pos="4320"/></w:tabs></w:pPr><w:r><w:tab/></w:r><w:r><w:t xml:space="preserve">6:30 AM</w:t></w:r><w:r><w:tab/></w:r><w:r><w:t>Hare and Hound Race</w:t></w:r></w:p><w:p><w:pPr><w:tabs><w:tab w:val="left" w:pos="1440"/><w:tab w:val="left" w:leader="dot" w:pos="4320"/></w:tabs></w:pPr><w:r><w:tab/></w:r><w:r><w:t xml:space="preserve">5:00 PM</w:t></w:r><w:r><w:tab/></w:r><w:r><w:t>Pilot Briefing</w:t></w:r></w:p><w:p><w:pPr><w:tabs><w:tab w:val="left" w:pos="1440"/><w:tab w:val="left" w:leader="dot" w:pos="4320"/></w:tabs></w:pPr><w:r><w:tab/></w:r><w:r><w:t xml:space="preserve">5:30 PM</w:t></w:r><w:r><w:tab/></w:r><w:r><w:t>Fun Flight</w:t></w:r></w:p><w:p><w:pPr><w:tabs><w:tab w:val="left" w:pos="1440"/><w:tab w:val="left" w:leader="dot" w:pos="4320"/></w:tabs></w:pPr><w:r><w:tab/></w:r><w:r><w:t xml:space="preserve">6:30 PM</w:t></w:r><w:r><w:tab/></w:r><w:r><w:t>Tethers</w:t></w:r></w:p><w:p><w:pPr><w:tabs><w:tab w:val="left" w:pos="1440"/><w:tab w:val="left" w:leader="dot" w:pos="4320"/></w:tabs></w:pPr><w:r><w:tab/></w:r><w:r><w:t xml:space="preserve">8:15 PM</w:t></w:r><w:r><w:tab/></w:r><w:r><w:t>Balloon Glow</w:t></w:r></w:p><w:p><w:pPr><w:shd w:val="clear" w:color="auto" w:fill="FFFFFF" /><w:spacing w:beforeAutospacing="1" w:after="0" w:afterAutospacing="1" w:line="270" w:lineRule="atLeast" /><w:rPr><w:rStyle w:val="Strong" /><w:rFonts w:ascii="Arial" w:hAnsi="Arial" w:cs="Arial" /></w:rPr></w:pPr><w:r><w:rPr><w:rStyle w:val="Strong" /><w:rFonts w:ascii="Arial" w:hAnsi="Arial" w:cs="Arial" /></w:rPr><w:t>Sunday (5/2</w:t></w:r><w:r><w:rPr><w:rStyle w:val="Strong" /><w:rFonts w:ascii="Arial" w:hAnsi="Arial" w:cs="Arial" /></w:rPr><w:t>9</w:t></w:r><w:r><w:rPr><w:rStyle w:val="Strong" /><w:rFonts w:ascii="Arial" w:hAnsi="Arial" w:cs="Arial" /></w:rPr><w:t>/</w:t></w:r><w:r><w:rPr><w:rStyle w:val="Strong" /><w:rFonts w:ascii="Arial" w:hAnsi="Arial" w:cs="Arial" /></w:rPr><w:t>202</w:t></w:r><w:r><w:rPr><w:rStyle w:val="Strong" /><w:rFonts w:ascii="Arial" w:hAnsi="Arial" w:cs="Arial" /></w:rPr><w:t>4</w:t></w:r><w:r><w:rPr><w:rStyle w:val="Strong" /><w:rFonts w:ascii="Arial" w:hAnsi="Arial" w:cs="Arial" /></w:rPr><w:t>)</w:t></w:r><w:bookmarkStart w:name="_m-38#02XKYG6JBW9kmf5UZxBjyJ}nxECCIY|v" w:id="15" /><w:bookmarkEnd w:id="15" /><w:bookmarkStart w:name="_m-38#12~YGeO;3wu28I4tJw3bZuPJ0?00viqh" w:id="16" /><w:bookmarkEnd w:id="16" /><w:bookmarkStart w:name="_m-38#22wN~0qs" w:id="17" /><w:bookmarkEnd w:id="17" /></w:p><w:p><w:pPr><w:tabs><w:tab w:val="left" w:pos="1440"/><w:tab w:val="left" w:leader="dot" w:pos="4320"/></w:tabs></w:pPr><w:r><w:tab/></w:r><w:r><w:t xml:space="preserve">6:00 AM</w:t></w:r><w:r><w:tab/></w:r><w:r><w:t>Pilots Briefing</w:t></w:r></w:p><w:p><w:pPr><w:tabs><w:tab w:val="left" w:pos="1440"/><w:tab w:val="left" w:leader="dot" w:pos="4320"/></w:tabs></w:pPr><w:r><w:tab/></w:r><w:r><w:t xml:space="preserve">6:30 AM</w:t></w:r><w:r><w:tab/></w:r><w:r><w:t>Lynn Layton Key Grab</w:t></w:r></w:p><w:p><w:pPr><w:tabs><w:tab w:val="left" w:pos="1440"/><w:tab w:val="left" w:leader="dot" w:pos="4320"/></w:tabs></w:pPr><w:r><w:tab/></w:r><w:r><w:t xml:space="preserve">5:00 PM</w:t></w:r><w:r><w:tab/></w:r><w:r><w:t>Pilot Briefing</w:t></w:r></w:p><w:p><w:pPr><w:tabs><w:tab w:val="left" w:pos="1440"/><w:tab w:val="left" w:leader="dot" w:pos="4320"/></w:tabs></w:pPr><w:r><w:tab/></w:r><w:r><w:t xml:space="preserve">5:30 PM</w:t></w:r><w:r><w:tab/></w:r><w:r><w:t>Fun Flight</w:t></w:r></w:p><w:p><w:pPr><w:tabs><w:tab w:val="left" w:pos="1440"/><w:tab w:val="left" w:leader="dot" w:pos="4320"/></w:tabs></w:pPr><w:r><w:tab/></w:r><w:r><w:t xml:space="preserve">6:30 PM</w:t></w:r><w:r><w:tab/></w:r><w:r><w:t>Ballumination</w:t></w:r></w:p><w:p><w:r><w:rPr><w:noProof/></w:rPr><w:drawing><wp:anchor distT="0" distB="0" distL="114300" distR="114300" simplePos="0" relativeHeight="251662336" behindDoc="0" locked="0" layoutInCell="1" allowOverlap="1" wp14:anchorId="4D5E6F7A" wp14:editId="8B9C0D1E"><wp:simplePos x="0" y="0"/><wp:positionH relativeFrom="margin"><wp:align>center</wp:align></wp:positionH><wp:positionV relativeFrom="paragraph"><wp:posOffset>457200</wp:posOffset></wp:positionV><wp:extent cx="3200400" cy="731520"/><wp:effectExtent l="0" t="0" r="0" b="0"/><wp:wrapNone/><wp:docPr id="4" name="Text Box 4"/><wp:cNvGraphicFramePr/><a:graphic xmlns:a="http://schemas.openxmlformats.org/drawingml/2006/main"><a:graphicData uri="http://schemas.microsoft.com/office/word/2010/wordprocessingShape"><wps:wsp><wps:cNvSpPr txBox="1"/><wps:spPr><a:xfrm><a:off x="0" y="0"/><a:ext cx="3200400" cy="731520"/></a:xfrm><a:prstGeom prst="rect"><a:avLst/></a:prstGeom><a:solidFill><a:srgbClr val="FFFFFF"/></a:solidFill><a:ln><a:noFill/></a:ln></wps:spPr><wps:txbx><w:txbxContent><w:p><w:pPr><w:jc w:val="center"/></w:pPr><w:r><w:rPr><w:color w:val="4472C4" w:themeColor="accent5"/><w:sz w:val="36"/><w:szCs w:val="36"/></w:rPr><w:t>Where Your Dreams Take Flight</w:t></w:r></w:p><w:p><w:pPr><w:jc w:val="center"/></w:pPr><w:r><w:rPr><w:b/><w:bCs/><w:color w:val="4472C4" w:themeColor="accent5"/></w:rPr><w:t>Mount Vernon Hot Air Balloon Festival</w:t></w:r></w:p><w:p><w:r><w:rPr><w:noProof/></w:rPr><w:drawing><wp:anchor distT="0" distB="0" distL="114300" distR="114300" simplePos="0" relativeHeight="251662336" behindDoc="0" locked="0" layoutInCell="1" allowOverlap="1" wp14:anchorId="4D5E6F7A" wp14:editId="8B9C0D1E"><wp:simplePos x="0" y="0"/><wp:positionH relativeFrom="margin"><wp:align>center</wp:align></wp:positionH><wp:positionV relativeFrom="paragraph"><wp:posOffset>457200</wp:posOffset></wp:positionV><wp:extent cx="3200400" cy="731520"/><wp:effectExtent l="0" t="0" r="0" b="0"/><wp:wrapNone/><wp:docPr id="4" name="Text Box 4"/><wp:cNvGraphicFramePr/><a:graphic xmlns:a="http://schemas.openxmlformats.org/drawingml/2006/main"><a:graphicData uri="http://schemas.microsoft.com/office/word/2010/wordprocessingShape"><wps:wsp><wps:cNvSpPr txBox="1"/><wps:spPr><a:xfrm><a:off x="0" y="0"/><a:ext cx="3200400" cy="731520"/></a:xfrm><a:prstGeom prst="rect"><a:avLst/></a:prstGeom><a:solidFill><a:srgbClr val="FFFFFF"/></a:solidFill><a:ln><a:noFill/></a:ln></wps:spPr><wps:txbx><w:txbxContent><w:p><w:pPr><w:jc w:val="center"/></w:pPr><w:r><w:rPr><w:color w:val="4472C4" w:themeColor="accent5"/><w:sz w:val="36"/><w:szCs w:val="36"/></w:rPr><w:t>Where Your Dreams Take Flight</w:t></w:r></w:p><w:p><w:pPr><w:jc w:val="center"/></w:pPr><w:r><w:rPr><w:b/><w:bCs/><w:color w:val="4472C4" w:themeColor="accent5"/></w:rPr><w:t>Mount Vernon Hot Air Balloon Festival</w:t></w:r></w:p></w:txbxContent></wps:txbx><wps:bodyPr rot="0" vert="horz" wrap="square" lIns="91440" tIns="45720" rIns="91440" bIns="45720" anchor="t"><a:noAutofit/></wps:bodyPr></wps:wsp></a:graphicData></a:graphic></wp:anchor></w:drawing></w:r></w:p></w:txbxContent></wps:txbx><wps:bodyPr rot="0" spcFirstLastPara="0" vert="horz" wrap="square" lIns="91440" tIns="45720" rIns="91440" bIns="45720" anchor="t"><a:noAutofit/></wps:bodyPr></wps:wsp></a:graphicData></a:graphic></wp:anchor></w:drawing></w:r></w:p><w:p><w:r><w:rPr><w:noProof/></w:rPr><w:drawing><wp:anchor distT="0" distB="0" distL="114300" distR="114300" simplePos="0" relativeHeight="251662336" behindDoc="0" locked="0" layoutInCell="1" allowOverlap="1" wp14:anchorId="4D5E6F7A" wp14:editId="8B9C0D1E"><wp:simplePos x="0" y="0"/><wp:positionH relativeFrom="margin"><wp:align>center</wp:align></wp:positionH><wp:positionV relativeFrom="paragraph"><wp:posOffset>457200</wp:posOffset></wp:positionV><wp:extent cx="3200400" cy="731520"/><wp:effectExtent l="0" t="0" r="0" b="0"/><wp:wrapNone/><wp:docPr id="4" name="Text Box 4"/><wp:cNvGraphicFramePr/><a:graphic xmlns:a="http://schemas.openxmlformats.org/drawingml/2006/main"><a:graphicData uri="http://schemas.microsoft.com/office/word/2010/wordprocessingShape"><wps:wsp><wps:cNvSpPr txBox="1"/><wps:spPr><a:xfrm><a:off x="0" y="0"/><a:ext cx="3200400" cy="731520"/></a:xfrm><a:prstGeom prst="rect"><a:avLst/></a:prstGeom><a:solidFill><a:srgbClr val="FFFFFF"/></a:solidFill><a:ln><a:noFill/></a:ln></wps:spPr><wps:txbx><w:txbxContent><w:p><w:pPr><w:jc w:val="center"/></w:pPr><w:r><w:rPr><w:color w:val="4472C4" w:themeColor="accent5"/><w:sz w:val="36"/><w:szCs w:val="36"/></w:rPr><w:t>Where Your Dreams Take Flight</w:t></w:r></w:p><w:p><w:pPr><w:jc w:val="center"/></w:pPr><w:r><w:rPr><w:b/><w:bCs/><w:color w:val="4472C4" w:themeColor="accent5"/></w:rPr><w:t>Mount Vernon Hot Air Balloon Festival</w:t></w:r></w:p></w:txbxContent></wps:txbx><wps:bodyPr rot="0" vert="horz" wrap="square" lIns="91440" tIns="45720" rIns="91440" bIns="45720" anchor="t"><a:noAutofit/></wps:bodyPr></wps:wsp></a:graphicData></a:graphic></wp:anchor></w:drawing></w:r></w:p><w:p><w:r><w:rPr><w:noProof/></w:rPr><mc:AlternateContent><mc:Choice Requires="wps"><w:drawing><wp:anchor distT="0" distB="0" distL="114300" distR="114300" simplePos="0" relativeHeight="251662336" behindDoc="0" locked="0" layoutInCell="1" allowOverlap="1" wp14:anchorId="4D5E6F7A" wp14:editId="8B9C0D1E"><wp:simplePos x="0" y="0"/><wp:positionH relativeFrom="margin"><wp:align>center</wp:align></wp:positionH><wp:positionV relativeFrom="paragraph"><wp:posOffset>457200</wp:posOffset></wp:positionV><wp:extent cx="3200400" cy="731520"/><wp:effectExtent l="0" t="0" r="0" b="0"/><wp:wrapNone/><wp:docPr id="4" name="Text Box 4"/><wp:cNvGraphicFramePr/><a:graphic xmlns:a="http://schemas.openxmlformats.org/drawingml/2006/main"><a:graphicData uri="http://schemas.microsoft.com/office/word/2010/wordprocessingShape"><wps:wsp><wps:cNvSpPr txBox="1"/><wps:spPr><a:xfrm><a:off x="0" y="0"/><a:ext cx="3200400" cy="731520"/></a:xfrm><a:prstGeom prst="rect"><a:avLst/></a:prstGeom><a:solidFill><a:srgbClr val="FFFFFF"/></a:solidFill><a:ln><a:noFill/></a:ln></wps:spPr><wps:txbx><w:txbxContent><w:p><w:pPr><w:jc w:val="center"/></w:pPr><w:r><w:rPr><w:color w:val="4472C4" w:themeColor="accent5"/><w:sz w:val="36"/><w:szCs w:val="36"/></w:rPr><w:t>Where Your Dreams Take Flight</w:t></w:r></w:p><w:p><w:pPr><w:jc w:val="center"/></w:pPr><w:r><w:rPr><w:b/><w:bCs/><w:color w:val="4472C4" w:themeColor="accent5"/></w:rPr><w:t>Mount Vernon Hot Air Balloon Festival</w:t></w:r></w:p></w:txbxContent></wps:txbx><wps:bodyPr rot="0" vert="horz" wrap="square" lIns="91440" tIns="45720" rIns="91440" bIns="45720" anchor="t"><a:noAutofit/></wps:bodyPr></wps:wsp></a:graphicData></a:graphic></wp:anchor></w:drawing></mc:Choice><mc:Fallback><w:pict><v:shape id="TextBox4" o:spid="_x0000_s1027" type="#_x0000_t202" style="position:absolute;margin-left:0;margin-top:36pt;width:252pt;height:57.6pt;z-index:251662336;visibility:visible;mso-wrap-style:square;mso-position-horizontal:center;mso-position-horizontal-relative:margin" filled="t" fillcolor="white" stroked="f"><v:textbox><w:txbxContent><w:p><w:pPr><w:jc w:val="center"/></w:pPr><w:r><w:rPr><w:color w:val="4472C4"/><w:sz w:val="36"/><w:szCs w:val="36"/></w:rPr><w:t>Where Your Dreams Take Flight</w:t></w:r></w:p><w:p><w:pPr><w:jc w:val="center"/></w:pPr><w:r><w:rPr><w:b/><w:bCs/><w:color w:val="4472C4"/></w:rPr><w:t>Mount Vernon Hot Air Balloon Festival</w:t></w:r></w:p></w:txbxContent></v:textbox></v:shape></w:pict></mc:Fallback></mc:AlternateContent></w:r></w:p><w:sectPr><w:type w:val="continuous" /><w:pgSz w:w="12240" w:h="15840" /><w:pgMar w:top="1440" w:right="1440" w:bottom="1440" w:left="1440" w:header="720" w:footer="720" w:gutter="0" /><w:cols w:space="720" /><w:docGrid w:linePitch="360" /></w:sectPr></w:body></w:document>
-</file>
-
-<file path=word/numbering.xml><?xml version="1.0" encoding="utf-8"?>
-<w:numbering xmlns:mc="http://schemas.openxmlformats.org/markup-compatibility/2006" xmlns:r="http://schemas.openxmlformats.org/officeDocument/2006/relationships" xmlns:w="http://schemas.openxmlformats.org/wordprocessingml/2006/main" xmlns:w14="http://schemas.microsoft.com/office/word/2010/wordml" xmlns:w15="http://schemas.microsoft.com/office/word/2012/wordml" mc:Ignorable="w14 w15">
-  <w:abstractNum w:abstractNumId="0">
-    <w:nsid w:val="1A2B3C4D"/>
-    <w:multiLevelType w:val="hybridMultilevel"/>
-    <w:lvl w:ilvl="0" w:tplc="04090001">
-      <w:start w:val="1"/>
-      <w:numFmt w:val="bullet"/>
-      <w:lvlText w:val=""/>
-      <w:lvlJc w:val="left"/>
-      <w:pPr>
-        <w:ind w:left="360" w:hanging="360"/>
-      </w:pPr>
-      <w:rPr>
-        <w:rFonts w:ascii="Symbol" w:hAnsi="Symbol" w:hint="default"/>
-        <w:color w:val="4472C4" w:themeColor="accent5"/>
-      </w:rPr>
-    </w:lvl>
-  </w:abstractNum>
-  <w:num w:numId="1">
-    <w:abstractNumId w:val="0"/>
-  </w:num>
-</w:numbering>
+<file path=word/document.xml><?xml version="1.0" encoding="UTF-8" standalone="yes"?><w:document xmlns:wpc="http://schemas.microsoft.com/office/word/2010/wordprocessingCanvas" xmlns:cx="http://schemas.microsoft.com/office/drawing/2014/chartex" xmlns:cx1="http://schemas.microsoft.com/office/drawing/2015/9/8/chartex" xmlns:cx2="http://schemas.microsoft.com/office/drawing/2015/10/21/chartex" xmlns:cx3="http://schemas.microsoft.com/office/drawing/2016/5/9/chartex" xmlns:cx4="http://schemas.microsoft.com/office/drawing/2016/5/10/chartex" xmlns:cx5="http://schemas.microsoft.com/office/drawing/2016/5/11/chartex" xmlns:cx6="http://schemas.microsoft.com/office/drawing/2016/5/12/chartex" xmlns:cx7="http://schemas.microsoft.com/office/drawing/2016/5/13/chartex" xmlns:cx8="http://schemas.microsoft.com/office/drawing/2016/5/14/chartex" xmlns:mc="http://schemas.openxmlformats.org/markup-compatibility/2006" xmlns:aink="http://schemas.microsoft.com/office/drawing/2016/ink" xmlns:am3d="http://schemas.microsoft.com/office/drawing/2017/model3d" xmlns:o="urn:schemas-microsoft-com:office:office" xmlns:r="http://schemas.openxmlformats.org/officeDocument/2006/relationships" xmlns:m="http://schemas.openxmlformats.org/officeDocument/2006/math" xmlns:v="urn:schemas-microsoft-com:vml" xmlns:wp14="http://schemas.microsoft.com/office/word/2010/wordprocessingDrawing" xmlns:wp="http://schemas.openxmlformats.org/drawingml/2006/wordprocessingDrawing" xmlns:w10="urn:schemas-microsoft-com:office:word" xmlns:w="http://schemas.openxmlformats.org/wordprocessingml/2006/main" xmlns:w14="http://schemas.microsoft.com/office/word/2010/wordml" xmlns:w15="http://schemas.microsoft.com/office/word/2012/wordml" xmlns:w16cex="http://schemas.microsoft.com/office/word/2018/wordml/cex" xmlns:w16cid="http://schemas.microsoft.com/office/word/2016/wordml/cid" xmlns:w16="http://schemas.microsoft.com/office/word/2018/wordml" xmlns:w16se="http://schemas.microsoft.com/office/word/2015/wordml/symex" xmlns:wpg="http://schemas.microsoft.com/office/word/2010/wordprocessingGroup" xmlns:wpi="http://schemas.microsoft.com/office/word/2010/wordprocessingInk" xmlns:wne="http://schemas.microsoft.com/office/word/2006/wordml" xmlns:wps="http://schemas.microsoft.com/office/word/2010/wordprocessingShape" mc:Ignorable="w14 w15 w16se w16cid w16 w16cex wp14"><w:body><w:p><w:pPr><w:shd w:val="clear" w:color="auto" w:fill="FFFFFF" /><w:spacing w:beforeAutospacing="1" w:after="0" w:afterAutospacing="1" w:line="270" w:lineRule="atLeast" /><w:rPr><w:rFonts w:ascii="Arial" w:eastAsia="Times New Roman" w:hAnsi="Arial" w:cs="Arial" /><w:color w:val="333333" /><w:kern w:val="0" /><w:sz w:val="20" /><w:szCs w:val="20" /><w14:ligatures w14:val="none" /></w:rPr></w:pPr><w:r><w:rPr><w:rFonts w:ascii="Arial" w:eastAsia="Times New Roman" w:hAnsi="Arial" w:cs="Arial" /><w:color w:val="333333" /><w:kern w:val="0" /><w:sz w:val="20" /><w:szCs w:val="20" /><w14:ligatures w14:val="none" /></w:rPr><w:t xml:space="preserve">Mount </w:t></w:r><w:r><w:rPr><w:rFonts w:ascii="Arial" w:eastAsia="Times New Roman" w:hAnsi="Arial" w:cs="Arial" /><w:color w:val="333333" /><w:kern w:val="0" /><w:sz w:val="20" /><w:szCs w:val="20" /><w14:ligatures w14:val="none" /></w:rPr><w:t>Vernon</w:t></w:r><w:r><w:rPr><w:rFonts w:ascii="Arial" w:eastAsia="Times New Roman" w:hAnsi="Arial" w:cs="Arial" /><w:color w:val="333333" /><w:kern w:val="0" /><w:sz w:val="20" /><w:szCs w:val="20" /><w14:ligatures w14:val="none" /></w:rPr><w:t xml:space="preserve"> Hot Air Balloon Festival</w:t></w:r><w:bookmarkStart w:name="_m-72#02YGWF:LCS7jqh6QXwFlzF{m|GD?GX&quot;x" w:id="159" /><w:bookmarkEnd w:id="159" /><w:bookmarkStart w:name="_m-72#12!UEdS=4ss1&lt;K5pHv7d[qNI4A1,thuj" w:id="160" /><w:bookmarkEnd w:id="160" /><w:bookmarkStart w:name="_m-72#22xJ|/uu" w:id="161" /><w:bookmarkEnd w:id="161" /></w:p><w:p><w:pPr><w:shd w:val="clear" w:color="auto" w:fill="FFFFFF" /><w:spacing w:beforeAutospacing="1" w:after="0" w:afterAutospacing="1" w:line="270" w:lineRule="atLeast" /><w:rPr><w:rFonts w:ascii="Arial" w:eastAsia="Times New Roman" w:hAnsi="Arial" w:cs="Arial" /><w:color w:val="333333" /><w:kern w:val="0" /><w:sz w:val="20" /><w:szCs w:val="20" /><w14:ligatures w14:val="none" /></w:rPr></w:pPr><w:r><w:rPr><w:rFonts w:ascii="Arial" w:eastAsia="Times New Roman" w:hAnsi="Arial" w:cs="Arial" /><w:color w:val="333333" /><w:kern w:val="0" /><w:sz w:val="20" /><w:szCs w:val="20" /><w14:ligatures w14:val="none" /></w:rPr><w:t xml:space="preserve">See the Canyon From </w:t></w:r><w:r><w:rPr><w:rFonts w:ascii="Arial" w:eastAsia="Times New Roman" w:hAnsi="Arial" w:cs="Arial" /><w:color w:val="333333" /><w:kern w:val="0" /><w:sz w:val="20" /><w:szCs w:val="20" /><w14:ligatures w14:val="none" /></w:rPr><w:t>t</w:t></w:r><w:r><w:rPr><w:rFonts w:ascii="Arial" w:eastAsia="Times New Roman" w:hAnsi="Arial" w:cs="Arial" /><w:color w:val="333333" /><w:kern w:val="0" /><w:sz w:val="20" /><w:szCs w:val="20" /><w14:ligatures w14:val="none" /></w:rPr><w:t>he Top</w:t></w:r><w:r><w:rPr><w:rFonts w:ascii="Arial" w:eastAsia="Times New Roman" w:hAnsi="Arial" w:cs="Arial" /><w:color w:val="333333" /><w:kern w:val="0" /><w:sz w:val="20" /><w:szCs w:val="20" /><w14:ligatures w14:val="none" /></w:rPr><w:t>!</w:t></w:r><w:bookmarkStart w:name="_m-71#02YGVF:MCS6jqi6QWwFmzFzm|HD?FX&quot;y" w:id="156" /><w:bookmarkEnd w:id="156" /><w:bookmarkStart w:name="_m-71#12!UDdS&gt;4sr1&lt;L5pGv7e[qMI4B1,shuk" w:id="157" /><w:bookmarkEnd w:id="157" /><w:bookmarkStart w:name="_m-71#22xJ{/uv" w:id="158" /><w:bookmarkEnd w:id="158" /></w:p><w:p><w:pPr><w:shd w:val="clear" w:color="auto" w:fill="FFFFFF" /><w:spacing w:before="100" w:beforeAutospacing="1" w:after="100" w:afterAutospacing="1" w:line="270" w:lineRule="atLeast" /><w:rPr><w:rFonts w:ascii="Arial" w:eastAsia="Times New Roman" w:hAnsi="Arial" w:cs="Arial" /><w:color w:val="333333" /><w:kern w:val="0" /><w:sz w:val="20" /><w:szCs w:val="20" /><w14:ligatures w14:val="none" /></w:rPr><w:sectPr><w:pgSz w:w="12240" w:h="15840" /><w:pgMar w:top="1440" w:right="1440" w:bottom="1440" w:left="1440" w:header="720" w:footer="720" w:gutter="0" /><w:cols w:space="720" /><w:docGrid w:linePitch="360" /></w:sectPr></w:pPr><w:bookmarkStart w:name="_m-70#02YGUF:NCS5jqj6QVwFnzFym|ID?EX&quot;z" w:id="153" /><w:bookmarkEnd w:id="153" /><w:bookmarkStart w:name="_m-70#12!UCdS?4sq1&lt;M5pFv7f[qLI4C1,rhul" w:id="154" /><w:bookmarkEnd w:id="154" /><w:bookmarkStart w:name="_m-70#22xJz/uw" w:id="155" /><w:bookmarkEnd w:id="155" /></w:p><w:p><w:pPr><w:shd w:val="clear" w:color="auto" w:fill="FFFFFF" /><w:spacing w:before="100" w:beforeAutospacing="1" w:after="100" w:afterAutospacing="1" w:line="270" w:lineRule="atLeast" /><w:rPr><w:rFonts w:ascii="Arial" w:eastAsia="Times New Roman" w:hAnsi="Arial" w:cs="Arial" /><w:color w:val="333333" /><w:kern w:val="0" /><w:sz w:val="20" /><w:szCs w:val="20" /><w14:ligatures w14:val="none" /></w:rPr></w:pPr><w:r><w:rPr><w:rFonts w:ascii="Arial" w:eastAsia="Times New Roman" w:hAnsi="Arial" w:cs="Arial" /><w:color w:val="333333" /><w:kern w:val="0" /><w:sz w:val="20" /><w:szCs w:val="20" /><w14:ligatures w14:val="none" /></w:rPr><w:t>May 2</w:t></w:r><w:r><w:rPr><w:rFonts w:ascii="Arial" w:eastAsia="Times New Roman" w:hAnsi="Arial" w:cs="Arial" /><w:color w:val="333333" /><w:kern w:val="0" /><w:sz w:val="20" /><w:szCs w:val="20" /><w14:ligatures w14:val="none" /></w:rPr><w:t>8</w:t></w:r><w:r><w:rPr><w:rFonts w:ascii="Arial" w:eastAsia="Times New Roman" w:hAnsi="Arial" w:cs="Arial" /><w:color w:val="333333" /><w:kern w:val="0" /><w:sz w:val="20" /><w:szCs w:val="20" /><w14:ligatures w14:val="none" /></w:rPr><w:t>-2</w:t></w:r><w:r><w:rPr><w:rFonts w:ascii="Arial" w:eastAsia="Times New Roman" w:hAnsi="Arial" w:cs="Arial" /><w:color w:val="333333" /><w:kern w:val="0" /><w:sz w:val="20" /><w:szCs w:val="20" /><w14:ligatures w14:val="none" /></w:rPr><w:t>9</w:t></w:r><w:r><w:rPr><w:rFonts w:ascii="Arial" w:eastAsia="Times New Roman" w:hAnsi="Arial" w:cs="Arial" /><w:color w:val="333333" /><w:kern w:val="0" /><w:sz w:val="20" /><w:szCs w:val="20" /><w14:ligatures w14:val="none" /></w:rPr><w:t>, 20</w:t></w:r><w:r><w:rPr><w:rFonts w:ascii="Arial" w:eastAsia="Times New Roman" w:hAnsi="Arial" w:cs="Arial" /><w:color w:val="333333" /><w:kern w:val="0" /><w:sz w:val="20" /><w:szCs w:val="20" /><w14:ligatures w14:val="none" /></w:rPr><w:t>2</w:t></w:r><w:r><w:rPr><w:rFonts w:ascii="Arial" w:eastAsia="Times New Roman" w:hAnsi="Arial" w:cs="Arial" /><w:color w:val="333333" /><w:kern w:val="0" /><w:sz w:val="20" /><w:szCs w:val="20" /><w14:ligatures w14:val="none" /></w:rPr><w:t>4</w:t></w:r><w:bookmarkStart w:name="_m-6V#02YHZF9ICT:jpe6R[wEizG~m{DD@JX!u" w:id="150" /><w:bookmarkEnd w:id="150" /><w:bookmarkStart w:name="_m-6V#12!VHdR:4tv1;H5qKv6a[rQI3&gt;1-whtg" w:id="151" /><w:bookmarkEnd w:id="151" /><w:bookmarkStart w:name="_m-6V#22xK!/tr" w:id="152" /><w:bookmarkEnd w:id="152" /></w:p><w:p><w:pPr><w:shd w:val="clear" w:color="auto" w:fill="FFFFFF" /><w:spacing w:before="100" w:beforeAutospacing="1" w:after="100" w:afterAutospacing="1" w:line="270" w:lineRule="atLeast" /><w:rPr><w:rFonts w:ascii="Arial" w:eastAsia="Times New Roman" w:hAnsi="Arial" w:cs="Arial" /><w:color w:val="333333" /><w:kern w:val="0" /><w:sz w:val="20" /><w:szCs w:val="20" /><w14:ligatures w14:val="none" /></w:rPr></w:pPr><w:r><w:rPr><w:rFonts w:ascii="Arial" w:eastAsia="Times New Roman" w:hAnsi="Arial" w:cs="Arial" /><w:color w:val="333333" /><w:kern w:val="0" /><w:sz w:val="20" /><w:szCs w:val="20" /><w14:ligatures w14:val="none" /></w:rPr><w:t xml:space="preserve">The </w:t></w:r><w:r><w:rPr><w:rFonts w:ascii="Arial" w:eastAsia="Times New Roman" w:hAnsi="Arial" w:cs="Arial" /><w:color w:val="333333" /><w:kern w:val="0" /><w:sz w:val="20" /><w:szCs w:val="20" /><w14:ligatures w14:val="none" /></w:rPr><w:t xml:space="preserve">Mount </w:t></w:r><w:r><w:rPr><w:rFonts w:ascii="Arial" w:eastAsia="Times New Roman" w:hAnsi="Arial" w:cs="Arial" /><w:color w:val="333333" /><w:kern w:val="0" /><w:sz w:val="20" /><w:szCs w:val="20" /><w14:ligatures w14:val="none" /></w:rPr><w:t>Vernon</w:t></w:r><w:r><w:rPr><w:rFonts w:ascii="Arial" w:eastAsia="Times New Roman" w:hAnsi="Arial" w:cs="Arial" /><w:color w:val="333333" /><w:kern w:val="0" /><w:sz w:val="20" /><w:szCs w:val="20" /><w14:ligatures w14:val="none" /></w:rPr><w:t xml:space="preserve"> Hot Air Balloon Festival, presented by </w:t></w:r><w:r><w:rPr><w:rFonts w:ascii="Arial" w:eastAsia="Times New Roman" w:hAnsi="Arial" w:cs="Arial" /><w:color w:val="333333" /><w:kern w:val="0" /><w:sz w:val="20" /><w:szCs w:val="20" /><w14:ligatures w14:val="none" /></w:rPr><w:t>Seattle</w:t></w:r><w:r><w:rPr><w:rFonts w:ascii="Arial" w:eastAsia="Times New Roman" w:hAnsi="Arial" w:cs="Arial" /><w:color w:val="333333" /><w:kern w:val="0" /><w:sz w:val="20" /><w:szCs w:val="20" /><w14:ligatures w14:val="none" /></w:rPr><w:t xml:space="preserve"> </w:t></w:r><w:r><w:rPr><w:rFonts w:ascii="Arial" w:eastAsia="Times New Roman" w:hAnsi="Arial" w:cs="Arial" /><w:color w:val="333333" /><w:kern w:val="0" /><w:sz w:val="20" /><w:szCs w:val="20" /><w14:ligatures w14:val="none" /></w:rPr><w:t xml:space="preserve">Adventure </w:t></w:r><w:r><w:rPr><w:rFonts w:ascii="Arial" w:eastAsia="Times New Roman" w:hAnsi="Arial" w:cs="Arial" /><w:color w:val="333333" /><w:kern w:val="0" /><w:sz w:val="20" /><w:szCs w:val="20" /><w14:ligatures w14:val="none" /></w:rPr><w:t>Explore</w:t></w:r><w:r><w:rPr><w:rFonts w:ascii="Arial" w:eastAsia="Times New Roman" w:hAnsi="Arial" w:cs="Arial" /><w:color w:val="333333" /><w:kern w:val="0" /><w:sz w:val="20" /><w:szCs w:val="20" /><w14:ligatures w14:val="none" /></w:rPr><w:t>rs</w:t></w:r><w:r><w:rPr><w:rFonts w:ascii="Arial" w:eastAsia="Times New Roman" w:hAnsi="Arial" w:cs="Arial" /><w:color w:val="333333" /><w:kern w:val="0" /><w:sz w:val="20" /><w:szCs w:val="20" /><w14:ligatures w14:val="none" /></w:rPr><w:t xml:space="preserve">, welcomes more than </w:t></w:r><w:r><w:rPr><w:rFonts w:ascii="Arial" w:eastAsia="Times New Roman" w:hAnsi="Arial" w:cs="Arial" /><w:color w:val="333333" /><w:kern w:val="0" /><w:sz w:val="20" /><w:szCs w:val="20" /><w14:ligatures w14:val="none" /></w:rPr><w:t>100</w:t></w:r><w:r><w:rPr><w:rFonts w:ascii="Arial" w:eastAsia="Times New Roman" w:hAnsi="Arial" w:cs="Arial" /><w:color w:val="333333" /><w:kern w:val="0" /><w:sz w:val="20" /><w:szCs w:val="20" /><w14:ligatures w14:val="none" /></w:rPr><w:t xml:space="preserve"> hot air balloonists from across the country.</w:t></w:r><w:r><w:rPr><w:rFonts w:ascii="Arial" w:eastAsia="Times New Roman" w:hAnsi="Arial" w:cs="Arial" /><w:color w:val="333333" /><w:kern w:val="0" /><w:sz w:val="20" /><w:szCs w:val="20" /><w14:ligatures w14:val="none" /></w:rPr><w:t xml:space="preserve"> One of the largest free hot-air balloon festivals in the </w:t></w:r><w:r><w:rPr><w:rFonts w:ascii="Arial" w:eastAsia="Times New Roman" w:hAnsi="Arial" w:cs="Arial" /><w:color w:val="333333" /><w:kern w:val="0" /><w:sz w:val="20" /><w:szCs w:val="20" /><w14:ligatures w14:val="none" /></w:rPr><w:t>North</w:t></w:r><w:r><w:rPr><w:rFonts w:ascii="Arial" w:eastAsia="Times New Roman" w:hAnsi="Arial" w:cs="Arial" /><w:color w:val="333333" /><w:kern w:val="0" /><w:sz w:val="20" /><w:szCs w:val="20" /><w14:ligatures w14:val="none" /></w:rPr><w:t xml:space="preserve">west, the event features hot air balloon races, a key grab, tether rides, and our always well-attended Ballumination! </w:t></w:r><w:r><w:rPr><w:rFonts w:ascii="Arial" w:eastAsia="Times New Roman" w:hAnsi="Arial" w:cs="Arial" /><w:color w:val="333333" /><w:kern w:val="0" /><w:sz w:val="20" /><w:szCs w:val="20" /><w14:ligatures w14:val="none" /></w:rPr><w:t xml:space="preserve">Tour Point Shepherd Park, enjoy a free arts and crafts show, visit the multiple </w:t></w:r><w:r><w:rPr><w:rFonts w:ascii="Arial" w:eastAsia="Times New Roman" w:hAnsi="Arial" w:cs="Arial" /><w:color w:val="333333" /><w:kern w:val="0" /><w:sz w:val="20" /><w:szCs w:val="20" /><w14:ligatures w14:val="none" /></w:rPr><w:t xml:space="preserve">farm to table </w:t></w:r><w:r><w:rPr><w:rFonts w:ascii="Arial" w:eastAsia="Times New Roman" w:hAnsi="Arial" w:cs="Arial" /><w:color w:val="333333" /><w:kern w:val="0" /><w:sz w:val="20" /><w:szCs w:val="20" /><w14:ligatures w14:val="none" /></w:rPr><w:t xml:space="preserve">food vendors, and get up close with antique cars and tractors. As the sun sets, you can settle back for musical entertainment and the always fabulous fireworks show over the canyon! </w:t></w:r><w:bookmarkStart w:name="_m-6S#02YHWF9LCT7jph6RXwElzG{m{GD@GX!x" w:id="147" /><w:bookmarkEnd w:id="147" /><w:bookmarkStart w:name="_m-6S#12!VEdR=4ts1;K5qHv6d[rNI3A1-thtj" w:id="148" /><w:bookmarkEnd w:id="148" /><w:bookmarkStart w:name="_m-6S#22xK|/tu" w:id="149" /><w:bookmarkEnd w:id="149" /></w:p><w:p><w:pPr><w:shd w:val="clear" w:color="auto" w:fill="FFFFFF" /><w:spacing w:before="100" w:beforeAutospacing="1" w:after="100" w:afterAutospacing="1" w:line="270" w:lineRule="atLeast" /><w:rPr><w:rFonts w:ascii="Arial" w:eastAsia="Times New Roman" w:hAnsi="Arial" w:cs="Arial" /><w:color w:val="333333" /><w:kern w:val="0" /><w:sz w:val="20" /><w:szCs w:val="20" /><w14:ligatures w14:val="none" /></w:rPr></w:pPr><w:r><w:rPr><w:rFonts w:ascii="Arial" w:eastAsia="Times New Roman" w:hAnsi="Arial" w:cs="Arial" /><w:color w:val="333333" /><w:kern w:val="0" /><w:sz w:val="20" /><w:szCs w:val="20" /><w14:ligatures w14:val="none" /></w:rPr><w:t xml:space="preserve">Saturday’s events feature a 6:30 hare and hound race in which balloons try to follow a hare, </w:t></w:r><w:r><w:rPr><w:rFonts w:ascii="Arial" w:eastAsia="Times New Roman" w:hAnsi="Arial" w:cs="Arial" /><w:color w:val="333333" /><w:kern w:val="0" /><w:sz w:val="20" /><w:szCs w:val="20" /><w14:ligatures w14:val="none" /></w:rPr><w:t xml:space="preserve">ultimately </w:t></w:r><w:r><w:rPr><w:rFonts w:ascii="Arial" w:eastAsia="Times New Roman" w:hAnsi="Arial" w:cs="Arial" /><w:color w:val="333333" /><w:kern w:val="0" /><w:sz w:val="20" /><w:szCs w:val="20" /><w14:ligatures w14:val="none" /></w:rPr><w:t xml:space="preserve">attempting to land on beanbags. A balloon flight flight at dusk, and a balloon glow beginning at </w:t></w:r><w:r><w:rPr><w:rFonts w:ascii="Arial" w:eastAsia="Times New Roman" w:hAnsi="Arial" w:cs="Arial" /><w:color w:val="333333" /><w:kern w:val="0" /><w:sz w:val="20" /><w:szCs w:val="20" /><w14:ligatures w14:val="none" /></w:rPr><w:t>8:00 p.m. round out the day. Get to the park by 6:30 a.m. on Sunday to watch balloons fly into the field while passengers try to grab a ring from a tall pole. Ask a balloon owner for a free tethered ride on Sunday evening. Kids will enjoy the balloon themed play area, with fairground type games including balloon pops and water balloon toss!</w:t></w:r><w:bookmarkStart w:name="_m-6P#02YHTF9OCT4jpk6RUwEozGxm{JD@DX!{" w:id="144" /><w:bookmarkEnd w:id="144" /><w:bookmarkStart w:name="_m-6P#12!VBdR@4tp1;N5qEv6g[rKI3D1-qhtm" w:id="145" /><w:bookmarkEnd w:id="145" /><w:bookmarkStart w:name="_m-6P#22xKy/tx" w:id="146" /><w:bookmarkEnd w:id="146" /></w:p><w:p><w:pPr><w:shd w:val="clear" w:color="auto" w:fill="FFFFFF" /><w:spacing w:before="100" w:beforeAutospacing="1" w:after="100" w:afterAutospacing="1" w:line="270" w:lineRule="atLeast" /><w:rPr><w:rFonts w:ascii="Arial" w:eastAsia="Times New Roman" w:hAnsi="Arial" w:cs="Arial" /><w:color w:val="333333" /><w:kern w:val="0" /><w:sz w:val="20" /><w:szCs w:val="20" /><w14:ligatures w14:val="none" /></w:rPr></w:pPr><w:r><w:rPr><w:rFonts w:ascii="Arial" w:eastAsia="Times New Roman" w:hAnsi="Arial" w:cs="Arial" /><w:color w:val="333333" /><w:kern w:val="0" /><w:sz w:val="20" /><w:szCs w:val="20" /><w14:ligatures w14:val="none" /></w:rPr><w:t xml:space="preserve">As for entertainment, you’re in luck! </w:t></w:r><w:r><w:rPr><w:rFonts w:ascii="Arial" w:eastAsia="Times New Roman" w:hAnsi="Arial" w:cs="Arial" /><w:color w:val="333333" /><w:kern w:val="0" /><w:sz w:val="20" /><w:szCs w:val="20" /><w14:ligatures w14:val="none" /></w:rPr><w:t xml:space="preserve">Spread out your blanket, grab a cold drink, and enjoy a variety of live music daily, </w:t></w:r><w:r><w:rPr><w:rFonts w:ascii="Arial" w:eastAsia="Times New Roman" w:hAnsi="Arial" w:cs="Arial" /><w:color w:val="333333" /><w:kern w:val="0" /><w:sz w:val="20" /><w:szCs w:val="20" /><w14:ligatures w14:val="none" /></w:rPr><w:t>from</w:t></w:r><w:r><w:rPr><w:rFonts w:ascii="Arial" w:eastAsia="Times New Roman" w:hAnsi="Arial" w:cs="Arial" /><w:color w:val="333333" /><w:kern w:val="0" /><w:sz w:val="20" /><w:szCs w:val="20" /><w14:ligatures w14:val="none" /></w:rPr><w:t xml:space="preserve"> country to rock and roll. With activities for the kids, shopping and entertainment for adults, and plenty of photo ops, this is a festival you won’t want to miss!</w:t></w:r><w:bookmarkStart w:name="_m-6K#02YIYF8JCU9jof6SZwDjzH}mzEDAIX~v" w:id="141" /><w:bookmarkEnd w:id="141" /><w:bookmarkStart w:name="_m-6K#12!WGdQ;4uu1:I5rJv5b[sPI2?1.vhsh" w:id="142" /><w:bookmarkEnd w:id="142" /><w:bookmarkStart w:name="_m-6K#22xL~/ss" w:id="143" /><w:bookmarkEnd w:id="143" /></w:p><w:p><w:pPr><w:shd w:val="clear" w:color="auto" w:fill="FFFFFF" /><w:spacing w:before="100" w:beforeAutospacing="1" w:after="100" w:afterAutospacing="1" w:line="270" w:lineRule="atLeast" /><w:rPr><w:rFonts w:ascii="Arial" w:eastAsia="Times New Roman" w:hAnsi="Arial" w:cs="Arial" /><w:color w:val="333333" /><w:kern w:val="0" /><w:sz w:val="20" /><w:szCs w:val="20" /><w14:ligatures w14:val="none" /></w:rPr></w:pPr><w:r><w:rPr><w:rFonts w:ascii="Arial" w:eastAsia="Times New Roman" w:hAnsi="Arial" w:cs="Arial" /><w:color w:val="333333" /><w:kern w:val="0" /><w:sz w:val="20" /><w:szCs w:val="20" /><w14:ligatures w14:val="none" /></w:rPr><w:t xml:space="preserve">This year’s music acts include EZ Star, Black Dog, Rachel Mac, and the LLC Five Star Jazz Orchestra. </w:t></w:r><w:r><w:rPr><w:rFonts w:ascii="Arial" w:eastAsia="Times New Roman" w:hAnsi="Arial" w:cs="Arial" /><w:color w:val="333333" /><w:kern w:val="0" /><w:sz w:val="20" /><w:szCs w:val="20" /><w14:ligatures w14:val="none" /></w:rPr><w:t xml:space="preserve">Plenty of others will be on hand, as well. Stroll the park, visiting each live music stage, to enjoy just about any type of musical act on your playlist. Be sure to bring </w:t></w:r><w:r><w:rPr><w:rFonts w:ascii="Arial" w:eastAsia="Times New Roman" w:hAnsi="Arial" w:cs="Arial" /><w:color w:val="333333" /><w:kern w:val="0" /><w:sz w:val="20" /><w:szCs w:val="20" /><w14:ligatures w14:val="none" /></w:rPr><w:t xml:space="preserve">your pet, </w:t></w:r><w:r><w:rPr><w:rFonts w:ascii="Arial" w:eastAsia="Times New Roman" w:hAnsi="Arial" w:cs="Arial" /><w:color w:val="333333" /><w:kern w:val="0" /><w:sz w:val="20" /><w:szCs w:val="20" /><w14:ligatures w14:val="none" /></w:rPr><w:t>a lawn chair</w:t></w:r><w:r><w:rPr><w:rFonts w:ascii="Arial" w:eastAsia="Times New Roman" w:hAnsi="Arial" w:cs="Arial" /><w:color w:val="333333" /><w:kern w:val="0" /><w:sz w:val="20" /><w:szCs w:val="20" /><w14:ligatures w14:val="none" /></w:rPr><w:t>,</w:t></w:r><w:r><w:rPr><w:rFonts w:ascii="Arial" w:eastAsia="Times New Roman" w:hAnsi="Arial" w:cs="Arial" /><w:color w:val="333333" /><w:kern w:val="0" /><w:sz w:val="20" /><w:szCs w:val="20" /><w14:ligatures w14:val="none" /></w:rPr><w:t xml:space="preserve"> and </w:t></w:r><w:r><w:rPr><w:rFonts w:ascii="Arial" w:eastAsia="Times New Roman" w:hAnsi="Arial" w:cs="Arial" /><w:color w:val="333333" /><w:kern w:val="0" /><w:sz w:val="20" /><w:szCs w:val="20" /><w14:ligatures w14:val="none" /></w:rPr><w:t xml:space="preserve">a </w:t></w:r><w:r><w:rPr><w:rFonts w:ascii="Arial" w:eastAsia="Times New Roman" w:hAnsi="Arial" w:cs="Arial" /><w:color w:val="333333" /><w:kern w:val="0" /><w:sz w:val="20" /><w:szCs w:val="20" /><w14:ligatures w14:val="none" /></w:rPr><w:t xml:space="preserve">cooler </w:t></w:r><w:r><w:rPr><w:rFonts w:ascii="Arial" w:eastAsia="Times New Roman" w:hAnsi="Arial" w:cs="Arial" /><w:color w:val="333333" /><w:kern w:val="0" /><w:sz w:val="20" /><w:szCs w:val="20" /><w14:ligatures w14:val="none" /></w:rPr><w:t xml:space="preserve">full of your favorite drinks </w:t></w:r><w:r><w:rPr><w:rFonts w:ascii="Arial" w:eastAsia="Times New Roman" w:hAnsi="Arial" w:cs="Arial" /><w:color w:val="333333" /><w:kern w:val="0" /><w:sz w:val="20" /><w:szCs w:val="20" /><w14:ligatures w14:val="none" /></w:rPr><w:t>(</w:t></w:r><w:r><w:rPr><w:rFonts w:ascii="Arial" w:eastAsia="Times New Roman" w:hAnsi="Arial" w:cs="Arial" /><w:color w:val="333333" /><w:kern w:val="0" /><w:sz w:val="20" /><w:szCs w:val="20" /><w14:ligatures w14:val="none" /></w:rPr><w:t>for safety reasons, please do not bring</w:t></w:r><w:r><w:rPr><w:rFonts w:ascii="Arial" w:eastAsia="Times New Roman" w:hAnsi="Arial" w:cs="Arial" /><w:color w:val="333333" /><w:kern w:val="0" /><w:sz w:val="20" /><w:szCs w:val="20" /><w14:ligatures w14:val="none" /></w:rPr><w:t xml:space="preserve"> glass bottles in</w:t></w:r><w:r><w:rPr><w:rFonts w:ascii="Arial" w:eastAsia="Times New Roman" w:hAnsi="Arial" w:cs="Arial" /><w:color w:val="333333" /><w:kern w:val="0" /><w:sz w:val="20" /><w:szCs w:val="20" /><w14:ligatures w14:val="none" /></w:rPr><w:t>to</w:t></w:r><w:r><w:rPr><w:rFonts w:ascii="Arial" w:eastAsia="Times New Roman" w:hAnsi="Arial" w:cs="Arial" /><w:color w:val="333333" /><w:kern w:val="0" /><w:sz w:val="20" /><w:szCs w:val="20" /><w14:ligatures w14:val="none" /></w:rPr><w:t xml:space="preserve"> the park).</w:t></w:r><w:bookmarkStart w:name="_m-6F#02YITF8OCU4jok6SUwDozHxmzJDADX~{" w:id="138" /><w:bookmarkEnd w:id="138" /><w:bookmarkStart w:name="_m-6F#12!WBdQ@4up1:N5rEv5g[sKI2D1.qhsm" w:id="139" /><w:bookmarkEnd w:id="139" /><w:bookmarkStart w:name="_m-6F#22xLy/sx" w:id="140" /><w:bookmarkEnd w:id="140" /></w:p><w:p><w:pPr><w:shd w:val="clear" w:color="auto" w:fill="FFFFFF" /><w:spacing w:before="100" w:beforeAutospacing="1" w:after="100" w:afterAutospacing="1" w:line="270" w:lineRule="atLeast" /><w:rPr><w:rFonts w:ascii="Arial" w:eastAsia="Times New Roman" w:hAnsi="Arial" w:cs="Arial" /><w:color w:val="333333" /><w:kern w:val="0" /><w:sz w:val="20" /><w:szCs w:val="20" /><w14:ligatures w14:val="none" /></w:rPr></w:pPr><w:r><w:rPr><w:rFonts w:ascii="Arial" w:eastAsia="Times New Roman" w:hAnsi="Arial" w:cs="Arial" /><w:color w:val="333333" /><w:kern w:val="0" /><w:sz w:val="20" /><w:szCs w:val="20" /><w14:ligatures w14:val="none" /></w:rPr><w:t xml:space="preserve">As for the kids, hold on to your hat! Your children can pet a baby </w:t></w:r><w:r><w:rPr><w:rFonts w:ascii="Arial" w:eastAsia="Times New Roman" w:hAnsi="Arial" w:cs="Arial" /><w:color w:val="333333" /><w:kern w:val="0" /><w:sz w:val="20" /><w:szCs w:val="20" /><w14:ligatures w14:val="none" /></w:rPr><w:t>sheep</w:t></w:r><w:r><w:rPr><w:rFonts w:ascii="Arial" w:eastAsia="Times New Roman" w:hAnsi="Arial" w:cs="Arial" /><w:color w:val="333333" /><w:kern w:val="0" /><w:sz w:val="20" /><w:szCs w:val="20" /><w14:ligatures w14:val="none" /></w:rPr><w:t xml:space="preserve">, dance like a butterfly to fun tunes, get their faces painted with balloon art, and try a little limbo. At the children’s village, they can enjoy </w:t></w:r><w:r><w:rPr><w:rFonts w:ascii="Arial" w:eastAsia="Times New Roman" w:hAnsi="Arial" w:cs="Arial" /><w:color w:val="333333" /><w:kern w:val="0" /><w:sz w:val="20" /><w:szCs w:val="20" /><w14:ligatures w14:val="none" /></w:rPr><w:t>John</w:t></w:r><w:r><w:rPr><w:rFonts w:ascii="Arial" w:eastAsia="Times New Roman" w:hAnsi="Arial" w:cs="Arial" /><w:color w:val="333333" /><w:kern w:val="0" /><w:sz w:val="20" /><w:szCs w:val="20" /><w14:ligatures w14:val="none" /></w:rPr><w:t>ny</w:t></w:r><w:r><w:rPr><w:rFonts w:ascii="Arial" w:eastAsia="Times New Roman" w:hAnsi="Arial" w:cs="Arial" /><w:color w:val="333333" /><w:kern w:val="0" /><w:sz w:val="20" /><w:szCs w:val="20" /><w14:ligatures w14:val="none" /></w:rPr><w:t xml:space="preserve"> Drake </w:t></w:r><w:r><w:rPr><w:rFonts w:ascii="Arial" w:eastAsia="Times New Roman" w:hAnsi="Arial" w:cs="Arial" /><w:color w:val="333333" /><w:kern w:val="0" /><w:sz w:val="20" /><w:szCs w:val="20" /><w14:ligatures w14:val="none" /></w:rPr><w:t>as he</w:t></w:r><w:r><w:rPr><w:rFonts w:ascii="Arial" w:eastAsia="Times New Roman" w:hAnsi="Arial" w:cs="Arial" /><w:color w:val="333333" /><w:kern w:val="0" /><w:sz w:val="20" /><w:szCs w:val="20" /><w14:ligatures w14:val="none" /></w:rPr><w:t xml:space="preserve"> perform</w:t></w:r><w:r><w:rPr><w:rFonts w:ascii="Arial" w:eastAsia="Times New Roman" w:hAnsi="Arial" w:cs="Arial" /><w:color w:val="333333" /><w:kern w:val="0" /><w:sz w:val="20" /><w:szCs w:val="20" /><w14:ligatures w14:val="none" /></w:rPr><w:t>s</w:t></w:r><w:r><w:rPr><w:rFonts w:ascii="Arial" w:eastAsia="Times New Roman" w:hAnsi="Arial" w:cs="Arial" /><w:color w:val="333333" /><w:kern w:val="0" /><w:sz w:val="20" /><w:szCs w:val="20" /><w14:ligatures w14:val="none" /></w:rPr><w:t xml:space="preserve"> his magic show</w:t></w:r><w:r><w:rPr><w:rFonts w:ascii="Arial" w:eastAsia="Times New Roman" w:hAnsi="Arial" w:cs="Arial" /><w:color w:val="333333" /><w:kern w:val="0" /><w:sz w:val="20" /><w:szCs w:val="20" /><w14:ligatures w14:val="none" /></w:rPr><w:t xml:space="preserve">. In the next booth, they can catch storytelling and puppet shows sponsored by the </w:t></w:r><w:r><w:rPr><w:rFonts w:ascii="Arial" w:eastAsia="Times New Roman" w:hAnsi="Arial" w:cs="Arial" /><w:color w:val="333333" /><w:kern w:val="0" /><w:sz w:val="20" /><w:szCs w:val="20" /><w14:ligatures w14:val="none" /></w:rPr><w:t>Lancaster County</w:t></w:r><w:r><w:rPr><w:rFonts w:ascii="Arial" w:eastAsia="Times New Roman" w:hAnsi="Arial" w:cs="Arial" /><w:color w:val="333333" /><w:kern w:val="0" /><w:sz w:val="20" /><w:szCs w:val="20" /><w14:ligatures w14:val="none" /></w:rPr><w:t xml:space="preserve"> </w:t></w:r><w:r><w:rPr><w:rFonts w:ascii="Arial" w:eastAsia="Times New Roman" w:hAnsi="Arial" w:cs="Arial" /><w:color w:val="333333" /><w:kern w:val="0" /><w:sz w:val="20" /><w:szCs w:val="20" /><w14:ligatures w14:val="none" /></w:rPr><w:t>School System</w:t></w:r><w:r><w:rPr><w:rFonts w:ascii="Arial" w:eastAsia="Times New Roman" w:hAnsi="Arial" w:cs="Arial" /><w:color w:val="333333" /><w:kern w:val="0" /><w:sz w:val="20" /><w:szCs w:val="20" /><w14:ligatures w14:val="none" /></w:rPr><w:t>.</w:t></w:r><w:bookmarkStart w:name="_m-6A#02YJYF7JCV9jnf6TZwCjzI}myEDBIX}v" w:id="135" /><w:bookmarkEnd w:id="135" /><w:bookmarkStart w:name="_m-6A#12!XGdP;4vu19I5sJv4b[tPI1?1/vhrh" w:id="136" /><w:bookmarkEnd w:id="136" /><w:bookmarkStart w:name="_m-6A#22xM~/rs" w:id="137" /><w:bookmarkEnd w:id="137" /></w:p><w:p><w:pPr><w:shd w:val="clear" w:color="auto" w:fill="FFFFFF" /><w:spacing w:before="100" w:beforeAutospacing="1" w:after="100" w:afterAutospacing="1" w:line="270" w:lineRule="atLeast" /><w:rPr><w:rFonts w:ascii="Arial" w:eastAsia="Times New Roman" w:hAnsi="Arial" w:cs="Arial" /><w:color w:val="333333" /><w:kern w:val="0" /><w:sz w:val="20" /><w:szCs w:val="20" /><w14:ligatures w14:val="none" /></w:rPr></w:pPr><w:r><w:rPr><w:rFonts w:ascii="Arial" w:eastAsia="Times New Roman" w:hAnsi="Arial" w:cs="Arial" /><w:color w:val="333333" /><w:kern w:val="0" /><w:sz w:val="20" /><w:szCs w:val="20" /><w14:ligatures w14:val="none" /></w:rPr><w:t>And don’t forget the dogs! In a special enclosure, well-behaved dogs</w:t></w:r><w:r><w:rPr><w:rFonts w:ascii="Arial" w:eastAsia="Times New Roman" w:hAnsi="Arial" w:cs="Arial" /><w:color w:val="333333" /><w:kern w:val="0" /><w:sz w:val="20" /><w:szCs w:val="20" /><w14:ligatures w14:val="none" /></w:rPr><w:t xml:space="preserve"> can participate in the Stay Connected K-9 Frisbee Toss. Dogs can splash in pools, chase toys, and dig for buried treasure. Adult supervision required, of course!</w:t></w:r><w:bookmarkStart w:name="_m-67#02YJVF7MCV6jni6TWwCmzIzmyHDBFX}y" w:id="132" /><w:bookmarkEnd w:id="132" /><w:bookmarkStart w:name="_m-67#12!XDdP&gt;4vr19L5sGv4e[tMI1B1/shrk" w:id="133" /><w:bookmarkEnd w:id="133" /><w:bookmarkStart w:name="_m-67#22xM{/rv" w:id="134" /><w:bookmarkEnd w:id="134" /></w:p><w:p><w:pPr><w:shd w:val="clear" w:color="auto" w:fill="FFFFFF" /><w:spacing w:before="100" w:beforeAutospacing="1" w:after="100" w:afterAutospacing="1" w:line="270" w:lineRule="atLeast" /><w:rPr><w:rFonts w:ascii="Arial" w:eastAsia="Times New Roman" w:hAnsi="Arial" w:cs="Arial" /><w:color w:val="333333" /><w:kern w:val="0" /><w:sz w:val="20" /><w:szCs w:val="20" /><w14:ligatures w14:val="none" /></w:rPr></w:pPr><w:r><w:rPr><w:rFonts w:ascii="Arial" w:eastAsia="Times New Roman" w:hAnsi="Arial" w:cs="Arial" /><w:color w:val="333333" /><w:kern w:val="0" /><w:sz w:val="20" /><w:szCs w:val="20" /><w14:ligatures w14:val="none" /></w:rPr><w:t>We guarantee you’ll be hungry! Grab an ice cream cone or snack on popcorn as you stroll through the vendors and hot air balloons. The barbecue cook-off is sure to be a stellar attraction, as well. With food vendors</w:t></w:r><w:r><w:rPr><w:rFonts w:ascii="Arial" w:eastAsia="Times New Roman" w:hAnsi="Arial" w:cs="Arial" /><w:color w:val="333333" /><w:kern w:val="0" /><w:sz w:val="20" /><w:szCs w:val="20" /><w14:ligatures w14:val="none" /></w:rPr><w:t>—many participated in the farm to table concept—</w:t></w:r><w:r><w:rPr><w:rFonts w:ascii="Arial" w:eastAsia="Times New Roman" w:hAnsi="Arial" w:cs="Arial" /><w:color w:val="333333" /><w:kern w:val="0" /><w:sz w:val="20" /><w:szCs w:val="20" /><w14:ligatures w14:val="none" /></w:rPr><w:t>scattered throughout the park, you’re never too far from your next meal.</w:t></w:r><w:bookmarkStart w:name="_m-64#02YJSF7PCV3jnl6TTwCpzIwmyKDBCX}|" w:id="129" /><w:bookmarkEnd w:id="129" /><w:bookmarkStart w:name="_m-64#12!XAdPA4vo19O5sDv4h[tJI1E1/phrn" w:id="130" /><w:bookmarkEnd w:id="130" /><w:bookmarkStart w:name="_m-64#22xMx/ry" w:id="131" /><w:bookmarkEnd w:id="131" /></w:p><w:p><w:pPr><w:shd w:val="clear" w:color="auto" w:fill="FFFFFF" /><w:spacing w:before="100" w:beforeAutospacing="1" w:after="100" w:afterAutospacing="1" w:line="270" w:lineRule="atLeast" /><w:rPr><w:rFonts w:ascii="Arial" w:eastAsia="Times New Roman" w:hAnsi="Arial" w:cs="Arial" /><w:color w:val="333333" /><w:kern w:val="0" /><w:sz w:val="20" /><w:szCs w:val="20" /><w14:ligatures w14:val="none" /></w:rPr></w:pPr><w:r><w:rPr><w:rFonts w:ascii="Arial" w:eastAsia="Times New Roman" w:hAnsi="Arial" w:cs="Arial" /><w:color w:val="333333" /><w:kern w:val="0" /><w:sz w:val="20" /><w:szCs w:val="20" /><w14:ligatures w14:val="none" /></w:rPr><w:t>All balloon flights and displays are weather permitting. Winds must be less than 5 mph to safely inflate balloons on the festival grounds.</w:t></w:r><w:bookmarkStart w:name="_m-60#02YKYF6JCW9jmf6UZwBjzJ}mxEDCIX|v" w:id="126" /><w:bookmarkEnd w:id="126" /><w:bookmarkStart w:name="_m-60#12!YGdO;4wu18I5tJv3b[uPI0?10vhqh" w:id="127" /><w:bookmarkEnd w:id="127" /><w:bookmarkStart w:name="_m-60#22xN~/qs" w:id="128" /><w:bookmarkEnd w:id="128" /></w:p><w:p><w:r><w:br w:type="page"/></w:r></w:p><w:p><w:pPr><w:shd w:val="clear" w:color="auto" w:fill="FFFFFF" /><w:spacing w:before="100" w:beforeAutospacing="1" w:after="100" w:afterAutospacing="1" w:line="270" w:lineRule="atLeast" /><w:outlineLvl w:val="1" /><w:rPr><w:rFonts w:ascii="Arial" w:eastAsia="Times New Roman" w:hAnsi="Arial" w:cs="Arial" /><w:b /><w:bCs /><w:color w:val="333333" /><w:kern w:val="0" /><w:sz w:val="36" /><w:szCs w:val="36" /><w14:ligatures w14:val="none" /></w:rPr><w:sectPr><w:type w:val="continuous" /><w:pgSz w:w="12240" w:h="15840" /><w:pgMar w:top="1440" w:right="1440" w:bottom="1440" w:left="1440" w:header="720" w:footer="720" w:gutter="0" /><w:cols w:num="2" w:sep="1" w:space="720" /><w:docGrid w:linePitch="360" /></w:sectPr></w:pPr><w:bookmarkStart w:name="_m-5X#02YKVF6MCW6jmi6UWwBmzJzmxHDCFX|y" w:id="123" /><w:bookmarkEnd w:id="123" /><w:bookmarkStart w:name="_m-5X#12!YDdO&gt;4wr18L5tGv3e[uMI0B10shqk" w:id="124" /><w:bookmarkEnd w:id="124" /><w:bookmarkStart w:name="_m-5X#22xN{/qv" w:id="125" /><w:bookmarkEnd w:id="125" /></w:p><w:p><w:pPr><w:shd w:val="clear" w:color="auto" w:fill="FFFFFF" /><w:spacing w:before="100" w:beforeAutospacing="1" w:after="100" w:afterAutospacing="1" w:line="270" w:lineRule="atLeast" /><w:outlineLvl w:val="1" /><w:rPr><w:rFonts w:ascii="Arial" w:eastAsia="Times New Roman" w:hAnsi="Arial" w:cs="Arial" /><w:b /><w:bCs /><w:color w:val="333333" /><w:kern w:val="0" /><w:sz w:val="36" /><w:szCs w:val="36" /><w14:ligatures w14:val="none" /></w:rPr></w:pPr><w:r><w:rPr><w:rFonts w:ascii="Arial" w:eastAsia="Times New Roman" w:hAnsi="Arial" w:cs="Arial" /><w:b /><w:bCs /><w:color w:val="333333" /><w:kern w:val="0" /><w:sz w:val="36" /><w:szCs w:val="36" /><w14:ligatures w14:val="none" /></w:rPr><w:t>Frequently Asked Questions</w:t></w:r><w:bookmarkStart w:name="_m-5V#02YKTF6OCW4jmk6UUwBozJxmxJDCDX|{" w:id="120" /><w:bookmarkEnd w:id="120" /><w:bookmarkStart w:name="_m-5V#12!YBdO@4wp18N5tEv3g[uKI0D10qhqm" w:id="121" /><w:bookmarkEnd w:id="121" /><w:bookmarkStart w:name="_m-5V#22xNy/qx" w:id="122" /><w:bookmarkEnd w:id="122" /></w:p><w:p><w:pPr><w:shd w:val="clear" w:color="auto" w:fill="FFFFFF" /><w:spacing w:before="100" w:beforeAutospacing="1" w:after="100" w:afterAutospacing="1" w:line="270" w:lineRule="atLeast" /><w:outlineLvl w:val="3" /><w:rPr><w:b/><w:bCs/><w:rFonts w:ascii="Arial" w:eastAsia="Times New Roman" w:hAnsi="Arial" w:cs="Arial" /><w:bCs /><w:color w:val="333333" /><w:kern w:val="0" /><w:sz w:val="24" /><w:szCs w:val="24" /><w14:ligatures w14:val="none" /></w:rPr></w:pPr><w:r><w:rPr><w:b/><w:bCs/><w:rFonts w:ascii="Arial" w:eastAsia="Times New Roman" w:hAnsi="Arial" w:cs="Arial" /><w:bCs /><w:color w:val="333333" /><w:kern w:val="0" /><w:sz w:val="24" /><w:szCs w:val="24" /><w14:ligatures w14:val="none" /></w:rPr><w:t>When is the best time to see balloons?</w:t></w:r><w:bookmarkStart w:name="_m-5U#02YKSF6PCW3jml6UTwBpzJwmxKDCCX||" w:id="117" /><w:bookmarkEnd w:id="117" /><w:bookmarkStart w:name="_m-5U#12!YAdOA4wo18O5tDv3h[uJI0E10phqn" w:id="118" /><w:bookmarkEnd w:id="118" /><w:bookmarkStart w:name="_m-5U#22xNx/qy" w:id="119" /><w:bookmarkEnd w:id="119" /></w:p><w:p><w:pPr><w:shd w:val="clear" w:color="auto" w:fill="FFFFFF" /><w:spacing w:before="100" w:beforeAutospacing="1" w:after="100" w:afterAutospacing="1" w:line="270" w:lineRule="atLeast" /><w:rPr><w:rFonts w:ascii="Arial" w:eastAsia="Times New Roman" w:hAnsi="Arial" w:cs="Arial" /><w:color w:val="333333" /><w:kern w:val="0" /><w:sz w:val="20" /><w:szCs w:val="20" /><w14:ligatures w14:val="none" /></w:rPr></w:pPr><w:r><w:rPr><w:rFonts w:ascii="Arial" w:eastAsia="Times New Roman" w:hAnsi="Arial" w:cs="Arial" /><w:color w:val="333333" /><w:kern w:val="0" /><w:sz w:val="20" /><w:szCs w:val="20" /><w14:ligatures w14:val="none" /></w:rPr><w:lastRenderedPageBreak /><w:t>The best time to view balloons and get great pictures is early morning. Flights begin at approximately 6:00 a.m. each morning. It’s definitely worth getting up early to see balloons grace the early morning sky. Balloons also fly at dusk (approximately 7:00 p.m. on Friday and Saturday night</w:t></w:r><w:r><w:rPr><w:rFonts w:ascii="Arial" w:eastAsia="Times New Roman" w:hAnsi="Arial" w:cs="Arial" /><w:color w:val="333333" /><w:kern w:val="0" /><w:sz w:val="20" /><w:szCs w:val="20" /><w14:ligatures w14:val="none" /></w:rPr><w:t>)</w:t></w:r><w:r><w:rPr><w:rFonts w:ascii="Arial" w:eastAsia="Times New Roman" w:hAnsi="Arial" w:cs="Arial" /><w:color w:val="333333" /><w:kern w:val="0" /><w:sz w:val="20" /><w:szCs w:val="20" /><w14:ligatures w14:val="none" /></w:rPr><w:t>.</w:t></w:r><w:bookmarkStart w:name="_m-5Q#02YLYF5JCX9jlf6VZwAjzK}mwEDDIX{v" w:id="114" /><w:bookmarkEnd w:id="114" /><w:bookmarkStart w:name="_m-5Q#12!ZGdN;4xu17I5uJv2b[vPI/?11vhph" w:id="115" /><w:bookmarkEnd w:id="115" /><w:bookmarkStart w:name="_m-5Q#22xO~/ps" w:id="116" /><w:bookmarkEnd w:id="116" /></w:p><w:p><w:pPr><w:shd w:val="clear" w:color="auto" w:fill="FFFFFF" /><w:spacing w:beforeAutospacing="1" w:after="0" w:afterAutospacing="1" w:line="270" w:lineRule="atLeast" /><w:rPr><w:rFonts w:ascii="Arial" w:eastAsia="Times New Roman" w:hAnsi="Arial" w:cs="Arial" /><w:color w:val="333333" /><w:kern w:val="0" /><w:sz w:val="20" /><w:szCs w:val="20" /><w14:ligatures w14:val="none" /></w:rPr></w:pPr><w:r><w:rPr><w:rFonts w:ascii="Arial" w:eastAsia="Times New Roman" w:hAnsi="Arial" w:cs="Arial" /><w:color w:val="333333" /><w:kern w:val="0" /><w:sz w:val="20" /><w:szCs w:val="20" /><w14:ligatures w14:val="none" /></w:rPr><w:t>Please be aware that b</w:t></w:r><w:r><w:rPr><w:rFonts w:ascii="Arial" w:eastAsia="Times New Roman" w:hAnsi="Arial" w:cs="Arial" /><w:color w:val="333333" /><w:kern w:val="0" /><w:sz w:val="20" /><w:szCs w:val="20" /><w14:ligatures w14:val="none" /></w:rPr><w:t>allooning is extremely weather dependent. Winds must be less than 1</w:t></w:r><w:r><w:rPr><w:rFonts w:ascii="Arial" w:eastAsia="Times New Roman" w:hAnsi="Arial" w:cs="Arial" /><w:color w:val="333333" /><w:kern w:val="0" /><w:sz w:val="20" /><w:szCs w:val="20" /><w14:ligatures w14:val="none" /></w:rPr><w:t>5 mph</w:t></w:r><w:r><w:rPr><w:rFonts w:ascii="Arial" w:eastAsia="Times New Roman" w:hAnsi="Arial" w:cs="Arial" /><w:color w:val="333333" /><w:kern w:val="0" /><w:sz w:val="20" /><w:szCs w:val="20" /><w14:ligatures w14:val="none" /></w:rPr><w:t xml:space="preserve"> fo</w:t></w:r><w:r><w:rPr><w:rFonts w:ascii="Arial" w:eastAsia="Times New Roman" w:hAnsi="Arial" w:cs="Arial" /><w:color w:val="333333" /><w:kern w:val="0" /><w:sz w:val="20" /><w:szCs w:val="20" /><w14:ligatures w14:val="none" /></w:rPr><w:t>r balloons to fly. Listen to W</w:t></w:r><w:r><w:rPr><w:rFonts w:ascii="Arial" w:eastAsia="Times New Roman" w:hAnsi="Arial" w:cs="Arial" /><w:color w:val="333333" /><w:kern w:val="0" /><w:sz w:val="20" /><w:szCs w:val="20" /><w14:ligatures w14:val="none" /></w:rPr><w:t xml:space="preserve">LITE </w:t></w:r><w:r><w:rPr><w:rFonts w:ascii="Arial" w:eastAsia="Times New Roman" w:hAnsi="Arial" w:cs="Arial" /><w:color w:val="333333" /><w:kern w:val="0" /><w:sz w:val="20" /><w:szCs w:val="20" /><w14:ligatures w14:val="none" /></w:rPr><w:t>1</w:t></w:r><w:r><w:rPr><w:rFonts w:ascii="Arial" w:eastAsia="Times New Roman" w:hAnsi="Arial" w:cs="Arial" /><w:color w:val="333333" /><w:kern w:val="0" /><w:sz w:val="20" /><w:szCs w:val="20" /><w14:ligatures w14:val="none" /></w:rPr><w:t>0</w:t></w:r><w:r><w:rPr><w:rFonts w:ascii="Arial" w:eastAsia="Times New Roman" w:hAnsi="Arial" w:cs="Arial" /><w:color w:val="333333" /><w:kern w:val="0" /><w:sz w:val="20" /><w:szCs w:val="20" /><w14:ligatures w14:val="none" /></w:rPr><w:t>5</w:t></w:r><w:r><w:rPr><w:rFonts w:ascii="Arial" w:eastAsia="Times New Roman" w:hAnsi="Arial" w:cs="Arial" /><w:color w:val="333333" /><w:kern w:val="0" /><w:sz w:val="20" /><w:szCs w:val="20" /><w14:ligatures w14:val="none" /></w:rPr><w:t>0 AM or 9</w:t></w:r><w:r><w:rPr><w:rFonts w:ascii="Arial" w:eastAsia="Times New Roman" w:hAnsi="Arial" w:cs="Arial" /><w:color w:val="333333" /><w:kern w:val="0" /><w:sz w:val="20" /><w:szCs w:val="20" /><w14:ligatures w14:val="none" /></w:rPr><w:t>5</w:t></w:r><w:r><w:rPr><w:rFonts w:ascii="Arial" w:eastAsia="Times New Roman" w:hAnsi="Arial" w:cs="Arial" /><w:color w:val="333333" /><w:kern w:val="0" /><w:sz w:val="20" /><w:szCs w:val="20" /><w14:ligatures w14:val="none" /></w:rPr><w:t>.</w:t></w:r><w:r><w:rPr><w:rFonts w:ascii="Arial" w:eastAsia="Times New Roman" w:hAnsi="Arial" w:cs="Arial" /><w:color w:val="333333" /><w:kern w:val="0" /><w:sz w:val="20" /><w:szCs w:val="20" /><w14:ligatures w14:val="none" /></w:rPr><w:t>7</w:t></w:r><w:r><w:rPr><w:rFonts w:ascii="Arial" w:eastAsia="Times New Roman" w:hAnsi="Arial" w:cs="Arial" /><w:color w:val="333333" /><w:kern w:val="0" /><w:sz w:val="20" /><w:szCs w:val="20" /><w14:ligatures w14:val="none" /></w:rPr><w:t xml:space="preserve"> FM for the latest on flight information.</w:t></w:r><w:bookmarkStart w:name="_m-5O#02YLWF5LCX7jlh6VXwAlzK{mwGDDGX{x" w:id="111" /><w:bookmarkEnd w:id="111" /><w:bookmarkStart w:name="_m-5O#12!ZEdN=4xs17K5uHv2d[vNI/A11thpj" w:id="112" /><w:bookmarkEnd w:id="112" /><w:bookmarkStart w:name="_m-5O#22xO|/pu" w:id="113" /><w:bookmarkEnd w:id="113" /></w:p><w:p><w:pPr><w:shd w:val="clear" w:color="auto" w:fill="FFFFFF" /><w:spacing w:before="100" w:beforeAutospacing="1" w:after="100" w:afterAutospacing="1" w:line="270" w:lineRule="atLeast" /><w:outlineLvl w:val="3" /><w:rPr><w:rFonts w:ascii="Arial" w:eastAsia="Times New Roman" w:hAnsi="Arial" w:cs="Arial" /><w:bCs /><w:color w:val="333333" /><w:kern w:val="0" /><w:sz w:val="24" /><w:szCs w:val="24" /><w14:ligatures w14:val="none" /></w:rPr></w:pPr><w:r><w:rPr><w:rFonts w:ascii="Arial" w:eastAsia="Times New Roman" w:hAnsi="Arial" w:cs="Arial" /><w:bCs /><w:color w:val="333333" /><w:kern w:val="0" /><w:sz w:val="24" /><w:szCs w:val="24" /><w14:ligatures w14:val="none" /></w:rPr><w:t>Wh</w:t></w:r><w:r><w:rPr><w:rFonts w:ascii="Arial" w:eastAsia="Times New Roman" w:hAnsi="Arial" w:cs="Arial" /><w:bCs /><w:color w:val="333333" /><w:kern w:val="0" /><w:sz w:val="24" /><w:szCs w:val="24" /><w14:ligatures w14:val="none" /></w:rPr><w:t>ere are the balloons and pilots during the day?</w:t></w:r><w:bookmarkStart w:name="_m-5N#02YLVF5MCX6jli6VWwAmzKzmwHDDFX{y" w:id="108" /><w:bookmarkEnd w:id="108" /><w:bookmarkStart w:name="_m-5N#12!ZDdN&gt;4xr17L5uGv2e[vMI/B11shpk" w:id="109" /><w:bookmarkEnd w:id="109" /><w:bookmarkStart w:name="_m-5N#22xO{/pv" w:id="110" /><w:bookmarkEnd w:id="110" /></w:p><w:p><w:pPr><w:shd w:val="clear" w:color="auto" w:fill="FFFFFF" /><w:spacing w:before="100" w:beforeAutospacing="1" w:after="100" w:afterAutospacing="1" w:line="270" w:lineRule="atLeast" /><w:rPr><w:rFonts w:ascii="Arial" w:eastAsia="Times New Roman" w:hAnsi="Arial" w:cs="Arial" /><w:color w:val="333333" /><w:kern w:val="0" /><w:sz w:val="20" /><w:szCs w:val="20" /><w14:ligatures w14:val="none" /></w:rPr></w:pPr><w:r><w:rPr><w:rFonts w:ascii="Arial" w:eastAsia="Times New Roman" w:hAnsi="Arial" w:cs="Arial" /><w:color w:val="333333" /><w:kern w:val="0" /><w:sz w:val="20" /><w:szCs w:val="20" /><w14:ligatures w14:val="none" /></w:rPr><w:t>High canyon winds make it impossible to inflate balloons during the day. Pilots and their families enjoy the same things that you do at the park—live music, quality arts &amp; crafts, and local cuisine.</w:t></w:r><w:bookmarkStart w:name="_m-5I#02XC[G&gt;HBO;kud5M\xJhyB!n&quot;CC;KY&amp;t" w:id="105" /><w:bookmarkEnd w:id="105" /><w:bookmarkStart w:name="_m-5I#12~QIeW93ow2@G4lLw;`ZmRJ8=0(xiyf" w:id="106" /><w:bookmarkEnd w:id="106" /><w:bookmarkStart w:name="_m-5I#22wF&quot;0yq" w:id="107" /><w:bookmarkEnd w:id="107" /></w:p><w:p><w:pPr><w:shd w:val="clear" w:color="auto" w:fill="FFFFFF" /><w:spacing w:before="100" w:beforeAutospacing="1" w:after="100" w:afterAutospacing="1" w:line="270" w:lineRule="atLeast" /><w:outlineLvl w:val="3" /><w:rPr><w:b/><w:bCs/><w:rFonts w:ascii="Arial" w:eastAsia="Times New Roman" w:hAnsi="Arial" w:cs="Arial" /><w:bCs /><w:color w:val="333333" /><w:kern w:val="0" /><w:sz w:val="24" /><w:szCs w:val="24" /><w14:ligatures w14:val="none" /></w:rPr></w:pPr><w:r><w:rPr><w:b/><w:bCs/><w:rFonts w:ascii="Arial" w:eastAsia="Times New Roman" w:hAnsi="Arial" w:cs="Arial" /><w:bCs /><w:color w:val="333333" /><w:kern w:val="0" /><w:sz w:val="24" /><w:szCs w:val="24" /><w14:ligatures w14:val="none" /></w:rPr><w:t>Can I purchase a hot air balloon ride during the Festival?</w:t></w:r><w:bookmarkStart w:name="_m-5F#02XCXG&gt;KBO8kug5MYxJkyB|n&quot;FC;HY&amp;w" w:id="102" /><w:bookmarkEnd w:id="102" /><w:bookmarkStart w:name="_m-5F#12~QFeW&lt;3ot2@J4lIw;cZmOJ8@0(uiyi" w:id="103" /><w:bookmarkEnd w:id="103" /><w:bookmarkStart w:name="_m-5F#22wF}0yt" w:id="104" /><w:bookmarkEnd w:id="104" /></w:p><w:p><w:pPr><w:shd w:val="clear" w:color="auto" w:fill="FFFFFF" /><w:spacing w:beforeAutospacing="1" w:after="0" w:afterAutospacing="1" w:line="270" w:lineRule="atLeast" /><w:rPr><w:rFonts w:ascii="Arial" w:eastAsia="Times New Roman" w:hAnsi="Arial" w:cs="Arial" /><w:color w:val="333333" /><w:kern w:val="0" /><w:sz w:val="20" /><w:szCs w:val="20" /><w14:ligatures w14:val="none" /></w:rPr></w:pPr><w:r><w:rPr><w:rFonts w:ascii="Arial" w:eastAsia="Times New Roman" w:hAnsi="Arial" w:cs="Arial" /><w:color w:val="333333" /><w:kern w:val="0" /><w:sz w:val="20" /><w:szCs w:val="20" /><w14:ligatures w14:val="none" /></w:rPr><w:t>Due to the overwhelming demand for balloon rides during the fes</w:t></w:r><w:r><w:rPr><w:rFonts w:ascii="Arial" w:eastAsia="Times New Roman" w:hAnsi="Arial" w:cs="Arial" /><w:color w:val="333333" /><w:kern w:val="0" /><w:sz w:val="20" /><w:szCs w:val="20" /><w14:ligatures w14:val="none" /></w:rPr><w:t>tival, rides are not available. However, most pilots will give tether rides on Saturday and Sunday mornings.</w:t></w:r><w:r><w:rPr><w:rFonts w:ascii="Arial" w:eastAsia="Times New Roman" w:hAnsi="Arial" w:cs="Arial" /><w:color w:val="333333" /><w:kern w:val="0" /><w:sz w:val="20" /><w:szCs w:val="20" /><w14:ligatures w14:val="none" /></w:rPr><w:t xml:space="preserve"> Rides can be purchased before</w:t></w:r><w:r><w:rPr><w:rFonts w:ascii="Arial" w:eastAsia="Times New Roman" w:hAnsi="Arial" w:cs="Arial" /><w:color w:val="333333" /><w:kern w:val="0" /><w:sz w:val="20" /><w:szCs w:val="20" /><w14:ligatures w14:val="none" /></w:rPr><w:t xml:space="preserve"> or</w:t></w:r><w:r><w:rPr><w:rFonts w:ascii="Arial" w:eastAsia="Times New Roman" w:hAnsi="Arial" w:cs="Arial" /><w:color w:val="333333" /><w:kern w:val="0" /><w:sz w:val="20" /><w:szCs w:val="20" /><w14:ligatures w14:val="none" /></w:rPr><w:t xml:space="preserve"> </w:t></w:r><w:r><w:rPr><w:rFonts w:ascii="Arial" w:eastAsia="Times New Roman" w:hAnsi="Arial" w:cs="Arial" /><w:color w:val="333333" /><w:kern w:val="0" /><w:sz w:val="20" /><w:szCs w:val="20" /><w14:ligatures w14:val="none" /></w:rPr><w:t xml:space="preserve">after the festival from </w:t></w:r><w:r><w:rPr><w:rFonts w:ascii="Arial" w:eastAsia="Times New Roman" w:hAnsi="Arial" w:cs="Arial" /><w:color w:val="333333" /><w:kern w:val="0" /><w:sz w:val="20" /><w:szCs w:val="20" /><w14:ligatures w14:val="none" /></w:rPr><w:t>Sky Glide</w:t></w:r><w:r><w:rPr><w:rFonts w:ascii="Arial" w:eastAsia="Times New Roman" w:hAnsi="Arial" w:cs="Arial" /><w:color w:val="333333" /><w:kern w:val="0" /><w:sz w:val="20" /><w:szCs w:val="20" /><w14:ligatures w14:val="none" /></w:rPr><w:t xml:space="preserve"> Hot Air Balloon Company, a member of the </w:t></w:r><w:r><w:rPr><w:rFonts w:ascii="Arial" w:eastAsia="Times New Roman" w:hAnsi="Arial" w:cs="Arial" /><w:color w:val="333333" /><w:kern w:val="0" /><w:sz w:val="20" /><w:szCs w:val="20" /><w14:ligatures w14:val="none" /></w:rPr><w:t xml:space="preserve">Mount </w:t></w:r><w:r><w:rPr><w:rFonts w:ascii="Arial" w:eastAsia="Times New Roman" w:hAnsi="Arial" w:cs="Arial" /><w:color w:val="333333" /><w:kern w:val="0" /><w:sz w:val="20" /><w:szCs w:val="20" /><w14:ligatures w14:val="none" /></w:rPr><w:t>Vernon</w:t></w:r><w:r><w:rPr><w:rFonts w:ascii="Arial" w:eastAsia="Times New Roman" w:hAnsi="Arial" w:cs="Arial" /><w:color w:val="333333" /><w:kern w:val="0" /><w:sz w:val="20" /><w:szCs w:val="20" /><w14:ligatures w14:val="none" /></w:rPr><w:t xml:space="preserve"> County</w:t></w:r><w:r><w:rPr><w:rFonts w:ascii="Arial" w:eastAsia="Times New Roman" w:hAnsi="Arial" w:cs="Arial" /><w:color w:val="333333" /><w:kern w:val="0" /><w:sz w:val="20" /><w:szCs w:val="20" /><w14:ligatures w14:val="none" /></w:rPr><w:t xml:space="preserve"> Chamber of Commerce.</w:t></w:r><w:bookmarkStart w:name="_m-5E#02XCWG&gt;LBO7kuh5MXxJlyB{n&quot;GC;GY&amp;x" w:id="99" /><w:bookmarkEnd w:id="99" /><w:bookmarkStart w:name="_m-5E#12~QEeW=3os2@K4lHw;dZmNJ8A0(tiyj" w:id="100" /><w:bookmarkEnd w:id="100" /><w:bookmarkStart w:name="_m-5E#22wF|0yu" w:id="101" /><w:bookmarkEnd w:id="101" /></w:p><w:p><w:pPr><w:shd w:val="clear" w:color="auto" w:fill="FFFFFF" /><w:spacing w:before="100" w:beforeAutospacing="1" w:after="100" w:afterAutospacing="1" w:line="270" w:lineRule="atLeast" /><w:outlineLvl w:val="3" /><w:rPr><w:b/><w:bCs/><w:rFonts w:ascii="Arial" w:eastAsia="Times New Roman" w:hAnsi="Arial" w:cs="Arial" /><w:bCs /><w:color w:val="333333" /><w:kern w:val="0" /><w:sz w:val="24" /><w:szCs w:val="24" /><w14:ligatures w14:val="none" /></w:rPr></w:pPr><w:r><w:rPr><w:b/><w:bCs/><w:rFonts w:ascii="Arial" w:eastAsia="Times New Roman" w:hAnsi="Arial" w:cs="Arial" /><w:bCs /><w:color w:val="333333" /><w:kern w:val="0" /><w:sz w:val="24" /><w:szCs w:val="24" /><w14:ligatures w14:val="none" /></w:rPr><w:t>What can my children do while visiting the festival?</w:t></w:r><w:bookmarkStart w:name="_m-5C#02XCUG&gt;NBO5kuj5MVxJnyByn&quot;IC;EY&amp;z" w:id="96" /><w:bookmarkEnd w:id="96" /><w:bookmarkStart w:name="_m-5C#12~QCeW?3oq2@M4lFw;fZmLJ8C0(riyl" w:id="97" /><w:bookmarkEnd w:id="97" /><w:bookmarkStart w:name="_m-5C#22wFz0yw" w:id="98" /><w:bookmarkEnd w:id="98" /></w:p><w:p><w:pPr><w:shd w:val="clear" w:color="auto" w:fill="FFFFFF" /><w:spacing w:before="100" w:beforeAutospacing="1" w:after="100" w:afterAutospacing="1" w:line="270" w:lineRule="atLeast" /><w:rPr><w:rFonts w:ascii="Arial" w:eastAsia="Times New Roman" w:hAnsi="Arial" w:cs="Arial" /><w:color w:val="333333" /><w:kern w:val="0" /><w:sz w:val="20" /><w:szCs w:val="20" /><w14:ligatures w14:val="none" /></w:rPr></w:pPr><w:r><w:rPr><w:rFonts w:ascii="Arial" w:eastAsia="Times New Roman" w:hAnsi="Arial" w:cs="Arial" /><w:color w:val="333333" /><w:kern w:val="0" /><w:sz w:val="20" /><w:szCs w:val="20" /><w14:ligatures w14:val="none" /></w:rPr><w:t>Children</w:t></w:r><w:r><w:rPr><w:rFonts w:ascii="Arial" w:eastAsia="Times New Roman" w:hAnsi="Arial" w:cs="Arial" /><w:color w:val="333333" /><w:kern w:val="0" /><w:sz w:val="20" /><w:szCs w:val="20" /><w14:ligatures w14:val="none" /></w:rPr><w:t xml:space="preserve"> can enjoy inflatables, children’s interactive entertainment, reptile displays, and face painting</w:t></w:r><w:r><w:rPr><w:rFonts w:ascii="Arial" w:eastAsia="Times New Roman" w:hAnsi="Arial" w:cs="Arial" /><w:color w:val="333333" /><w:kern w:val="0" /><w:sz w:val="20" /><w:szCs w:val="20" /><w14:ligatures w14:val="none" /></w:rPr><w:t>,</w:t></w:r><w:r><w:rPr><w:rFonts w:ascii="Arial" w:eastAsia="Times New Roman" w:hAnsi="Arial" w:cs="Arial" /><w:color w:val="333333" /><w:kern w:val="0" /><w:sz w:val="20" /><w:szCs w:val="20" /><w14:ligatures w14:val="none" /></w:rPr><w:t xml:space="preserve"> just to name a few!</w:t></w:r><w:r><w:rPr><w:rFonts w:ascii="Arial" w:eastAsia="Times New Roman" w:hAnsi="Arial" w:cs="Arial" /><w:color w:val="333333" /><w:kern w:val="0" /><w:sz w:val="20" /><w:szCs w:val="20" /><w14:ligatures w14:val="none" /></w:rPr><w:t xml:space="preserve"> </w:t></w:r><w:r><w:rPr><w:rFonts w:ascii="Arial" w:eastAsia="Times New Roman" w:hAnsi="Arial" w:cs="Arial" /><w:color w:val="333333" /><w:kern w:val="0" /><w:sz w:val="20" /><w:szCs w:val="20" /><w14:ligatures w14:val="none" /></w:rPr><w:t xml:space="preserve"> These fun activities are located in the free,</w:t></w:r><w:r><w:rPr><w:rFonts w:ascii="Arial" w:eastAsia="Times New Roman" w:hAnsi="Arial" w:cs="Arial" /><w:color w:val="333333" /><w:kern w:val="0" /><w:sz w:val="20" /><w:szCs w:val="20" /><w14:ligatures w14:val="none" /></w:rPr><w:t xml:space="preserve"> gated Children’s Village open 1</w:t></w:r><w:r><w:rPr><w:rFonts w:ascii="Arial" w:eastAsia="Times New Roman" w:hAnsi="Arial" w:cs="Arial" /><w:color w:val="333333" /><w:kern w:val="0" /><w:sz w:val="20" /><w:szCs w:val="20" /><w14:ligatures w14:val="none" /></w:rPr><w:t xml:space="preserve"> p.m. - 8 p.m. on Friday,</w:t></w:r><w:r><w:rPr><w:rFonts w:ascii="Arial" w:eastAsia="Times New Roman" w:hAnsi="Arial" w:cs="Arial" /><w:color w:val="333333" /><w:kern w:val="0" /><w:sz w:val="20" /><w:szCs w:val="20" /><w14:ligatures w14:val="none" /></w:rPr><w:t xml:space="preserve"> and 8 a.m. - 8 p.m. on Saturday.</w:t></w:r><w:bookmarkStart w:name="_m-57#02XDZG=IBP:kte5N[xIiyC~n!DC&lt;JY%u" w:id="93" /><w:bookmarkEnd w:id="93" /><w:bookmarkStart w:name="_m-57#12~RHeV:3pv2?H4mKw:aZnQJ7&gt;0)wixg" w:id="94" /><w:bookmarkEnd w:id="94" /><w:bookmarkStart w:name="_m-57#22wG!0xr" w:id="95" /><w:bookmarkEnd w:id="95" /></w:p><w:p><w:pPr><w:shd w:val="clear" w:color="auto" w:fill="FFFFFF" /><w:spacing w:before="100" w:beforeAutospacing="1" w:after="100" w:afterAutospacing="1" w:line="270" w:lineRule="atLeast" /><w:outlineLvl w:val="3" /><w:rPr><w:b/><w:bCs/><w:rFonts w:ascii="Arial" w:eastAsia="Times New Roman" w:hAnsi="Arial" w:cs="Arial" /><w:bCs /><w:color w:val="333333" /><w:kern w:val="0" /><w:sz w:val="24" /><w:szCs w:val="24" /><w14:ligatures w14:val="none" /></w:rPr></w:pPr><w:r><w:rPr><w:b/><w:bCs/><w:rFonts w:ascii="Arial" w:eastAsia="Times New Roman" w:hAnsi="Arial" w:cs="Arial" /><w:bCs /><w:color w:val="333333" /><w:kern w:val="0" /><w:sz w:val="24" /><w:szCs w:val="24" /><w14:ligatures w14:val="none" /></w:rPr><w:t>Is smoking permitted on the festival grounds?</w:t></w:r><w:bookmarkStart w:name="_m-55#02XDXG=KBP8ktg5NYxIkyC|n!FC&lt;HY%w" w:id="90" /><w:bookmarkEnd w:id="90" /><w:bookmarkStart w:name="_m-55#12~RFeV&lt;3pt2?J4mIw:cZnOJ7@0)uixi" w:id="91" /><w:bookmarkEnd w:id="91" /><w:bookmarkStart w:name="_m-55#22wG}0xt" w:id="92" /><w:bookmarkEnd w:id="92" /></w:p><w:p><w:pPr><w:shd w:val="clear" w:color="auto" w:fill="FFFFFF" /><w:spacing w:before="100" w:beforeAutospacing="1" w:after="100" w:afterAutospacing="1" w:line="270" w:lineRule="atLeast" /><w:rPr><w:rFonts w:ascii="Arial" w:eastAsia="Times New Roman" w:hAnsi="Arial" w:cs="Arial" /><w:color w:val="333333" /><w:kern w:val="0" /><w:sz w:val="20" /><w:szCs w:val="20" /><w14:ligatures w14:val="none" /></w:rPr></w:pPr><w:r><w:rPr><w:rFonts w:ascii="Arial" w:eastAsia="Times New Roman" w:hAnsi="Arial" w:cs="Arial" /><w:color w:val="333333" /><w:kern w:val="0" /><w:sz w:val="20" /><w:szCs w:val="20" /><w14:ligatures w14:val="none" /></w:rPr><w:t>Smoking is not allowed on the festival grounds while the balloons are present. Please be courteous of other festival patrons.</w:t></w:r><w:bookmarkStart w:name="_m-53#02XDVG=MBP6kti5NWxImyCzn!HC&lt;FY%y" w:id="87" /><w:bookmarkEnd w:id="87" /><w:bookmarkStart w:name="_m-53#12~RDeV&gt;3pr2?L4mGw:eZnMJ7B0)sixk" w:id="88" /><w:bookmarkEnd w:id="88" /><w:bookmarkStart w:name="_m-53#22wG{0xv" w:id="89" /><w:bookmarkEnd w:id="89" /></w:p><w:p><w:pPr><w:shd w:val="clear" w:color="auto" w:fill="FFFFFF" /><w:spacing w:before="100" w:beforeAutospacing="1" w:after="100" w:afterAutospacing="1" w:line="270" w:lineRule="atLeast" /><w:outlineLvl w:val="3" /><w:rPr><w:b/><w:bCs/><w:rFonts w:ascii="Arial" w:eastAsia="Times New Roman" w:hAnsi="Arial" w:cs="Arial" /><w:bCs /><w:color w:val="333333" /><w:kern w:val="0" /><w:sz w:val="24" /><w:szCs w:val="24" /><w14:ligatures w14:val="none" /></w:rPr></w:pPr><w:r><w:rPr><w:b/><w:bCs/><w:rFonts w:ascii="Arial" w:eastAsia="Times New Roman" w:hAnsi="Arial" w:cs="Arial" /><w:bCs /><w:color w:val="333333" /><w:kern w:val="0" /><w:sz w:val="24" /><w:szCs w:val="24" /><w14:ligatures w14:val="none" /></w:rPr><w:t>Can I bring a cooler with beverage and food into the festival?</w:t></w:r><w:bookmarkStart w:name="_m-52#02XDUG=NBP5ktj5NVxInyCyn!IC&lt;EY%z" w:id="84" /><w:bookmarkEnd w:id="84" /><w:bookmarkStart w:name="_m-52#12~RCeV?3pq2?M4mFw:fZnLJ7C0)rixl" w:id="85" /><w:bookmarkEnd w:id="85" /><w:bookmarkStart w:name="_m-52#22wGz0xw" w:id="86" /><w:bookmarkEnd w:id="86" /></w:p><w:p><w:pPr><w:shd w:val="clear" w:color="auto" w:fill="FFFFFF" /><w:spacing w:before="100" w:beforeAutospacing="1" w:after="100" w:afterAutospacing="1" w:line="270" w:lineRule="atLeast" /><w:rPr><w:rFonts w:ascii="Arial" w:eastAsia="Times New Roman" w:hAnsi="Arial" w:cs="Arial" /><w:color w:val="333333" /><w:kern w:val="0" /><w:sz w:val="20" /><w:szCs w:val="20" /><w14:ligatures w14:val="none" /></w:rPr></w:pPr><w:r><w:rPr><w:rFonts w:ascii="Arial" w:eastAsia="Times New Roman" w:hAnsi="Arial" w:cs="Arial" /><w:color w:val="333333" /><w:kern w:val="0" /><w:sz w:val="20" /><w:szCs w:val="20" /><w14:ligatures w14:val="none" /></w:rPr><w:t>You can bring a cooler with snacks and plastic or aluminum containers. However, no glass bottles or alcohol are allowed at the festival. We do</w:t></w:r><w:r><w:rPr><w:rFonts w:ascii="Arial" w:eastAsia="Times New Roman" w:hAnsi="Arial" w:cs="Arial" /><w:color w:val="333333" /><w:kern w:val="0" /><w:sz w:val="20" /><w:szCs w:val="20" /><w14:ligatures w14:val="none" /></w:rPr><w:t xml:space="preserve"> provide an assortment of unique foods at our </w:t></w:r><w:r><w:rPr><w:rFonts w:ascii="Arial" w:eastAsia="Times New Roman" w:hAnsi="Arial" w:cs="Arial" /><w:color w:val="333333" /><w:kern w:val="0" /><w:sz w:val="20" /><w:szCs w:val="20" /><w14:ligatures w14:val="none" /></w:rPr><w:t>food vendor</w:t></w:r><w:r><w:rPr><w:rFonts w:ascii="Arial" w:eastAsia="Times New Roman" w:hAnsi="Arial" w:cs="Arial" /><w:color w:val="333333" /><w:kern w:val="0" /><w:sz w:val="20" /><w:szCs w:val="20" /><w14:ligatures w14:val="none" /></w:rPr><w:t xml:space="preserve"> stands.</w:t></w:r><w:bookmarkStart w:name="_m-4Y#02XE[G&lt;HBQ;ksd5O\xHhyD!n~CC=KY$t" w:id="81" /><w:bookmarkEnd w:id="81" /><w:bookmarkStart w:name="_m-4Y#12~SIeU93qw2&gt;G4nLw9`ZoRJ6=0*xiwf" w:id="82" /><w:bookmarkEnd w:id="82" /><w:bookmarkStart w:name="_m-4Y#22wH&quot;0wq" w:id="83" /><w:bookmarkEnd w:id="83" /></w:p><w:p><w:pPr><w:shd w:val="clear" w:color="auto" w:fill="FFFFFF" /><w:spacing w:before="100" w:beforeAutospacing="1" w:after="100" w:afterAutospacing="1" w:line="270" w:lineRule="atLeast" /><w:outlineLvl w:val="3" /><w:rPr><w:b/><w:bCs/><w:rFonts w:ascii="Arial" w:eastAsia="Times New Roman" w:hAnsi="Arial" w:cs="Arial" /><w:bCs /><w:color w:val="333333" /><w:kern w:val="0" /><w:sz w:val="24" /><w:szCs w:val="24" /><w14:ligatures w14:val="none" /></w:rPr></w:pPr><w:r><w:rPr><w:b/><w:bCs/><w:rFonts w:ascii="Arial" w:eastAsia="Times New Roman" w:hAnsi="Arial" w:cs="Arial" /><w:bCs /><w:color w:val="333333" /><w:kern w:val="0" /><w:sz w:val="24" /><w:szCs w:val="24" /><w14:ligatures w14:val="none" /></w:rPr><w:t>What are my camping, RV, or lodging options?</w:t></w:r><w:bookmarkStart w:name="_m-4W#02XEYG&lt;JBQ9ksf5OZxHjyD}n~EC=IY$v" w:id="78" /><w:bookmarkEnd w:id="78" /><w:bookmarkStart w:name="_m-4W#12~SGeU;3qu2&gt;I4nJw9bZoPJ6?0*viwh" w:id="79" /><w:bookmarkEnd w:id="79" /><w:bookmarkStart w:name="_m-4W#22wH~0ws" w:id="80" /><w:bookmarkEnd w:id="80" /></w:p><w:p><w:pPr><w:shd w:val="clear" w:color="auto" w:fill="FFFFFF" /><w:spacing w:beforeAutospacing="1" w:after="0" w:afterAutospacing="1" w:line="270" w:lineRule="atLeast" /><w:rPr><w:rFonts w:ascii="Arial" w:eastAsia="Times New Roman" w:hAnsi="Arial" w:cs="Arial" /><w:color w:val="333333" /><w:kern w:val="0" /><w:sz w:val="20" /><w:szCs w:val="20" /><w14:ligatures w14:val="none" /></w:rPr></w:pPr><w:r><w:rPr><w:rFonts w:ascii="Arial" w:eastAsia="Times New Roman" w:hAnsi="Arial" w:cs="Arial" /><w:color w:val="333333" /><w:kern w:val="0" /><w:sz w:val="20" /><w:szCs w:val="20" /><w14:ligatures w14:val="none" /></w:rPr><w:t>While you cannot camp or park an RV on the festival grounds, there are camping options nearby.</w:t></w:r><w:r><w:rPr><w:rFonts w:ascii="Arial" w:eastAsia="Times New Roman" w:hAnsi="Arial" w:cs="Arial" /><w:color w:val="333333" /><w:kern w:val="0" /><w:sz w:val="20" /><w:szCs w:val="20" /><w14:ligatures w14:val="none" /></w:rPr><w:t xml:space="preserve"> Check with the </w:t></w:r><w:r><w:rPr><w:rFonts w:ascii="Arial" w:eastAsia="Times New Roman" w:hAnsi="Arial" w:cs="Arial" /><w:color w:val="333333" /><w:kern w:val="0" /><w:sz w:val="20" /><w:szCs w:val="20" /><w14:ligatures w14:val="none" /></w:rPr><w:t>Mount Sedona</w:t></w:r><w:r><w:rPr><w:rFonts w:ascii="Arial" w:eastAsia="Times New Roman" w:hAnsi="Arial" w:cs="Arial" /><w:color w:val="333333" /><w:kern w:val="0" /><w:sz w:val="20" /><w:szCs w:val="20" /><w14:ligatures w14:val="none" /></w:rPr><w:t xml:space="preserve"> County Chamber of Commerce for a complete list of camping facilities.</w:t></w:r><w:bookmarkStart w:name="_m-4V#02XEXG&lt;KBQ8ksg5OYxHkyD|n~FC=HY$w" w:id="75" /><w:bookmarkEnd w:id="75" /><w:bookmarkStart w:name="_m-4V#12~SFeU&lt;3qt2&gt;J4nIw9cZoOJ6@0*uiwi" w:id="76" /><w:bookmarkEnd w:id="76" /><w:bookmarkStart w:name="_m-4V#22wH}0wt" w:id="77" /><w:bookmarkEnd w:id="77" /></w:p><w:p><w:pPr><w:shd w:val="clear" w:color="auto" w:fill="FFFFFF" /><w:spacing w:before="100" w:beforeAutospacing="1" w:after="100" w:afterAutospacing="1" w:line="270" w:lineRule="atLeast" /><w:outlineLvl w:val="3" /><w:rPr><w:rFonts w:ascii="Arial" w:eastAsia="Times New Roman" w:hAnsi="Arial" w:cs="Arial" /><w:bCs /><w:color w:val="333333" /><w:kern w:val="0" /><w:sz w:val="24" /><w:szCs w:val="24" /><w14:ligatures w14:val="none" /></w:rPr></w:pPr><w:r><w:rPr><w:rFonts w:ascii="Arial" w:eastAsia="Times New Roman" w:hAnsi="Arial" w:cs="Arial" /><w:bCs /><w:color w:val="333333" /><w:kern w:val="0" /><w:sz w:val="24" /><w:szCs w:val="24" /><w14:ligatures w14:val="none" /></w:rPr><w:t>How c</w:t></w:r><w:r><w:rPr><w:rFonts w:ascii="Arial" w:eastAsia="Times New Roman" w:hAnsi="Arial" w:cs="Arial" /><w:bCs /><w:color w:val="333333" /><w:kern w:val="0" /><w:sz w:val="24" /><w:szCs w:val="24" /><w14:ligatures w14:val="none" /></w:rPr><w:t xml:space="preserve">an I </w:t></w:r><w:r><w:rPr><w:rFonts w:ascii="Arial" w:eastAsia="Times New Roman" w:hAnsi="Arial" w:cs="Arial" /><w:bCs /><w:color w:val="333333" /><w:kern w:val="0" /><w:sz w:val="24" /><w:szCs w:val="24" /><w14:ligatures w14:val="none" /></w:rPr><w:t>plan for the best e</w:t></w:r><w:r><w:rPr><w:rFonts w:ascii="Arial" w:eastAsia="Times New Roman" w:hAnsi="Arial" w:cs="Arial" /><w:bCs /><w:color w:val="333333" /><w:kern w:val="0" /><w:sz w:val="24" /><w:szCs w:val="24" /><w14:ligatures w14:val="none" /></w:rPr><w:t>xperience?</w:t></w:r><w:bookmarkStart w:name="_m-4S#02XEUG&lt;NBQ5ksj5OVxHnyDyn~IC=EY$z" w:id="72" /><w:bookmarkEnd w:id="72" /><w:bookmarkStart w:name="_m-4S#12~SCeU?3qq2&gt;M4nFw9fZoLJ6C0*riwl" w:id="73" /><w:bookmarkEnd w:id="73" /><w:bookmarkStart w:name="_m-4S#22wHz0ww" w:id="74" /><w:bookmarkEnd w:id="74" /></w:p><w:p><w:pPr><w:shd w:val="clear" w:color="auto" w:fill="FFFFFF" /><w:spacing w:beforeAutospacing="1" w:after="0" w:afterAutospacing="1" w:line="270" w:lineRule="atLeast" /><w:rPr><w:rFonts w:ascii="Arial" w:eastAsia="Times New Roman" w:hAnsi="Arial" w:cs="Arial" /><w:color w:val="333333" /><w:kern w:val="0" /><w:sz w:val="20" /><w:szCs w:val="20" /><w14:ligatures w14:val="none" /></w:rPr></w:pPr><w:r><w:rPr><w:rFonts w:ascii="Arial" w:eastAsia="Times New Roman" w:hAnsi="Arial" w:cs="Arial" /><w:color w:val="333333" /><w:kern w:val="0" /><w:sz w:val="20" /><w:szCs w:val="20" /><w14:ligatures w14:val="none" /></w:rPr><w:t>Although there is no perfect formula, the follow</w:t></w:r><w:r><w:rPr><w:rFonts w:ascii="Arial" w:eastAsia="Times New Roman" w:hAnsi="Arial" w:cs="Arial" /><w:color w:val="333333" /><w:kern w:val="0" /><w:sz w:val="20" /><w:szCs w:val="20" /><w14:ligatures w14:val="none" /></w:rPr><w:t>ing</w:t></w:r><w:r><w:rPr><w:rFonts w:ascii="Arial" w:eastAsia="Times New Roman" w:hAnsi="Arial" w:cs="Arial" /><w:color w:val="333333" /><w:kern w:val="0" /><w:sz w:val="20" /><w:szCs w:val="20" /><w14:ligatures w14:val="none" /></w:rPr><w:t xml:space="preserve"> tips should </w:t></w:r><w:r><w:rPr><w:rFonts w:ascii="Arial" w:eastAsia="Times New Roman" w:hAnsi="Arial" w:cs="Arial" /><w:color w:val="333333" /><w:kern w:val="0" /><w:sz w:val="20" /><w:szCs w:val="20" /><w14:ligatures w14:val="none" /></w:rPr><w:t>e</w:t></w:r><w:r><w:rPr><w:rFonts w:ascii="Arial" w:eastAsia="Times New Roman" w:hAnsi="Arial" w:cs="Arial" /><w:color w:val="333333" /><w:kern w:val="0" /><w:sz w:val="20" /><w:szCs w:val="20" /><w14:ligatures w14:val="none" /></w:rPr><w:t>nsure that you have all the bases covered!</w:t></w:r><w:bookmarkStart w:name="_m-4Q#02XESG&lt;PBQ3ksl5OTxHpyDwn~KC=CY$|" w:id="69" /><w:bookmarkEnd w:id="69" /><w:bookmarkStart w:name="_m-4Q#12~SAeUA3qo2&gt;O4nDw9hZoJJ6E0*piwn" w:id="70" /><w:bookmarkEnd w:id="70" /><w:bookmarkStart w:name="_m-4Q#22wHx0wy" w:id="71" /><w:bookmarkEnd w:id="71" /></w:p><w:p><w:pPr><w:shd w:val="clear" w:color="auto" w:fill="FFFFFF" /><w:spacing w:beforeAutospacing="1" w:after="0" w:afterAutospacing="1" w:line="270" w:lineRule="atLeast" /><w:rPr><w:rFonts w:ascii="Arial" w:eastAsia="Times New Roman" w:hAnsi="Arial" w:cs="Arial" /><w:color w:val="333333" /><w:kern w:val="0" /><w:sz w:val="20" /><w:szCs w:val="20" /><w14:ligatures w14:val="none" /></w:rPr></w:pPr><w:r><w:rPr><w:rFonts w:ascii="Arial" w:eastAsia="Times New Roman" w:hAnsi="Arial" w:cs="Arial" /><w:color w:val="333333" /><w:kern w:val="0" /><w:sz w:val="20" /><w:szCs w:val="20" /><w14:ligatures w14:val="none" /></w:rPr><w:t>Wear good walking shoes. The park encompasses 15 acres, so hiking is a strong possibility.</w:t></w:r><w:bookmarkStart w:name="_m-4N#02XFZG;IBR:kre5P[xGiyE~n}DC&gt;JY#u" w:id="66" /><w:bookmarkEnd w:id="66" /><w:bookmarkStart w:name="_m-4N#12~THeT:3rv2=H4oKw8aZpQJ5&gt;0+wivg" w:id="67" /><w:bookmarkEnd w:id="67" /><w:bookmarkStart w:name="_m-4N#22wI!0vr" w:id="68" /><w:bookmarkEnd w:id="68" /></w:p><w:p><w:pPr><w:shd w:val="clear" w:color="auto" w:fill="FFFFFF" /><w:spacing w:beforeAutospacing="1" w:after="0" w:afterAutospacing="1" w:line="270" w:lineRule="atLeast" /><w:rPr><w:rFonts w:ascii="Arial" w:eastAsia="Times New Roman" w:hAnsi="Arial" w:cs="Arial" /><w:color w:val="333333" /><w:kern w:val="0" /><w:sz w:val="20" /><w:szCs w:val="20" /><w14:ligatures w14:val="none" /></w:rPr></w:pPr><w:r><w:rPr><w:rFonts w:ascii="Arial" w:eastAsia="Times New Roman" w:hAnsi="Arial" w:cs="Arial" /><w:color w:val="333333" /><w:kern w:val="0" /><w:sz w:val="20" /><w:szCs w:val="20" /><w14:ligatures w14:val="none" /></w:rPr><w:lastRenderedPageBreak /><w:t>Bring sunscreen. There is very little shade.</w:t></w:r><w:bookmarkStart w:name="_m-4J#02XFVG;MBR6kri5PWxGmyEzn}HC&gt;FY#y" w:id="63" /><w:bookmarkEnd w:id="63" /><w:bookmarkStart w:name="_m-4J#12~TDeT&gt;3rr2=L4oGw8eZpMJ5B0+sivk" w:id="64" /><w:bookmarkEnd w:id="64" /><w:bookmarkStart w:name="_m-4J#22wI{0vv" w:id="65" /><w:bookmarkEnd w:id="65" /></w:p><w:p><w:pPr><w:shd w:val="clear" w:color="auto" w:fill="FFFFFF" /><w:spacing w:beforeAutospacing="1" w:after="0" w:afterAutospacing="1" w:line="270" w:lineRule="atLeast" /><w:rPr><w:rFonts w:ascii="Arial" w:eastAsia="Times New Roman" w:hAnsi="Arial" w:cs="Arial" /><w:color w:val="333333" /><w:kern w:val="0" /><w:sz w:val="20" /><w:szCs w:val="20" /><w14:ligatures w14:val="none" /></w:rPr></w:pPr><w:r><w:rPr><w:rFonts w:ascii="Arial" w:eastAsia="Times New Roman" w:hAnsi="Arial" w:cs="Arial" /><w:color w:val="333333" /><w:kern w:val="0" /><w:sz w:val="20" /><w:szCs w:val="20" /><w14:ligatures w14:val="none" /></w:rPr><w:t>Get to the park early. When the balloons inflate, long lines form.</w:t></w:r><w:bookmarkStart w:name="_m-4H#02XFTG;OBR4krk5PUxGoyExn}JC&gt;DY#{" w:id="60" /><w:bookmarkEnd w:id="60" /><w:bookmarkStart w:name="_m-4H#12~TBeT@3rp2=N4oEw8gZpKJ5D0+qivm" w:id="61" /><w:bookmarkEnd w:id="61" /><w:bookmarkStart w:name="_m-4H#22wIy0vx" w:id="62" /><w:bookmarkEnd w:id="62" /></w:p><w:p><w:pPr><w:shd w:val="clear" w:color="auto" w:fill="FFFFFF" /><w:spacing w:beforeAutospacing="1" w:after="0" w:afterAutospacing="1" w:line="270" w:lineRule="atLeast" /><w:rPr><w:rFonts w:ascii="Arial" w:eastAsia="Times New Roman" w:hAnsi="Arial" w:cs="Arial" /><w:color w:val="333333" /><w:kern w:val="0" /><w:sz w:val="20" /><w:szCs w:val="20" /><w14:ligatures w14:val="none" /></w:rPr></w:pPr><w:r><w:rPr><w:rFonts w:ascii="Arial" w:eastAsia="Times New Roman" w:hAnsi="Arial" w:cs="Arial" /><w:color w:val="333333" /><w:kern w:val="0" /><w:sz w:val="20" /><w:szCs w:val="20" /><w14:ligatures w14:val="none" /></w:rPr><w:t>Wear comfortable, cool clothing. If you take tether rides, the flame does make it hot in the basket.</w:t></w:r><w:bookmarkStart w:name="_m-4E#02XG[G:HBS;kqd5Q\xFhyF!n|CC?KY&quot;t" w:id="57" /><w:bookmarkEnd w:id="57" /><w:bookmarkStart w:name="_m-4E#12~UIeS93sw2&lt;G4pLw7`ZqRJ4=0,xiuf" w:id="58" /><w:bookmarkEnd w:id="58" /><w:bookmarkStart w:name="_m-4E#22wJ&quot;0uq" w:id="59" /><w:bookmarkEnd w:id="59" /></w:p><w:p><w:pPr><w:shd w:val="clear" w:color="auto" w:fill="FFFFFF" /><w:spacing w:beforeAutospacing="1" w:after="0" w:afterAutospacing="1" w:line="270" w:lineRule="atLeast" /><w:rPr><w:rFonts w:ascii="Arial" w:eastAsia="Times New Roman" w:hAnsi="Arial" w:cs="Arial" /><w:color w:val="333333" /><w:kern w:val="0" /><w:sz w:val="20" /><w:szCs w:val="20" /><w14:ligatures w14:val="none" /></w:rPr></w:pPr><w:r><w:rPr><w:rFonts w:ascii="Arial" w:eastAsia="Times New Roman" w:hAnsi="Arial" w:cs="Arial" /><w:color w:val="333333" /><w:kern w:val="0" /><w:sz w:val="20" /><w:szCs w:val="20" /><w14:ligatures w14:val="none" /></w:rPr><w:t>Bring</w:t></w:r><w:r><w:rPr><w:rFonts w:ascii="Arial" w:eastAsia="Times New Roman" w:hAnsi="Arial" w:cs="Arial" /><w:color w:val="333333" /><w:kern w:val="0" /><w:sz w:val="20" /><w:szCs w:val="20" /><w14:ligatures w14:val="none" /></w:rPr><w:t xml:space="preserve"> a camera and tripod. The ballu</w:t></w:r><w:r><w:rPr><w:rFonts w:ascii="Arial" w:eastAsia="Times New Roman" w:hAnsi="Arial" w:cs="Arial" /><w:color w:val="333333" /><w:kern w:val="0" /><w:sz w:val="20" /><w:szCs w:val="20" /><w14:ligatures w14:val="none" /></w:rPr><w:t>mination at dusk is a beautiful photo opportunity, but the low light makes a tripod a necessity.</w:t></w:r><w:bookmarkStart w:name="_m-4B#02XGXG:KBS8kqg5QYxFkyF|n|FC?HY&quot;w" w:id="54" /><w:bookmarkEnd w:id="54" /><w:bookmarkStart w:name="_m-4B#12~UFeS&lt;3st2&lt;J4pIw7cZqOJ4@0,uiui" w:id="55" /><w:bookmarkEnd w:id="55" /><w:bookmarkStart w:name="_m-4B#22wJ}0ut" w:id="56" /><w:bookmarkEnd w:id="56" /></w:p><w:p><w:pPr><w:shd w:val="clear" w:color="auto" w:fill="FFFFFF" /><w:spacing w:beforeAutospacing="1" w:after="0" w:afterAutospacing="1" w:line="270" w:lineRule="atLeast" /><w:rPr><w:rFonts w:ascii="Arial" w:eastAsia="Times New Roman" w:hAnsi="Arial" w:cs="Arial" /><w:color w:val="333333" /><w:kern w:val="0" /><w:sz w:val="20" /><w:szCs w:val="20" /><w14:ligatures w14:val="none" /></w:rPr></w:pPr><w:r><w:rPr><w:rFonts w:ascii="Arial" w:eastAsia="Times New Roman" w:hAnsi="Arial" w:cs="Arial" /><w:color w:val="333333" /><w:kern w:val="0" /><w:sz w:val="20" /><w:szCs w:val="20" /><w14:ligatures w14:val="none" /></w:rPr><w:t>Bring lawn chairs and/or blankets.</w:t></w:r><w:bookmarkStart w:name="_m-48#02XGUG:NBS5kqj5QVxFnyFyn|IC?EY&quot;z" w:id="51" /><w:bookmarkEnd w:id="51" /><w:bookmarkStart w:name="_m-48#12~UCeS?3sq2&lt;M4pFw7fZqLJ4C0,riul" w:id="52" /><w:bookmarkEnd w:id="52" /><w:bookmarkStart w:name="_m-48#22wJz0uw" w:id="53" /><w:bookmarkEnd w:id="53" /></w:p><w:p><w:pPr><w:shd w:val="clear" w:color="auto" w:fill="FFFFFF" /><w:spacing w:beforeAutospacing="1" w:after="0" w:afterAutospacing="1" w:line="270" w:lineRule="atLeast" /><w:rPr><w:rFonts w:ascii="Arial" w:eastAsia="Times New Roman" w:hAnsi="Arial" w:cs="Arial" /><w:color w:val="333333" /><w:kern w:val="0" /><w:sz w:val="20" /><w:szCs w:val="20" /><w14:ligatures w14:val="none" /></w:rPr></w:pPr><w:r><w:rPr><w:rFonts w:ascii="Arial" w:eastAsia="Times New Roman" w:hAnsi="Arial" w:cs="Arial" /><w:color w:val="333333" /><w:kern w:val="0" /><w:sz w:val="20" /><w:szCs w:val="20" /><w14:ligatures w14:val="none" /></w:rPr><w:t>Bring, or prepare to buy, plenty of water.</w:t></w:r><w:bookmarkStart w:name="_m-47#02XGTG:OBS4kqk5QUxFoyFxn|JC?DY&quot;{" w:id="48" /><w:bookmarkEnd w:id="48" /><w:bookmarkStart w:name="_m-47#12~UBeS@3sp2&lt;N4pEw7gZqKJ4D0,qium" w:id="49" /><w:bookmarkEnd w:id="49" /><w:bookmarkStart w:name="_m-47#22wJy0ux" w:id="50" /><w:bookmarkEnd w:id="50" /></w:p><w:p><w:pPr><w:shd w:val="clear" w:color="auto" w:fill="FFFFFF" /><w:spacing w:beforeAutospacing="1" w:after="0" w:afterAutospacing="1" w:line="270" w:lineRule="atLeast" /><w:rPr><w:rFonts w:ascii="Arial" w:eastAsia="Times New Roman" w:hAnsi="Arial" w:cs="Arial" /><w:color w:val="333333" /><w:kern w:val="0" /><w:sz w:val="20" /><w:szCs w:val="20" /><w14:ligatures w14:val="none" /></w:rPr></w:pPr><w:r><w:rPr><w:rFonts w:ascii="Arial" w:eastAsia="Times New Roman" w:hAnsi="Arial" w:cs="Arial" /><w:color w:val="333333" /><w:kern w:val="0" /><w:sz w:val="20" /><w:szCs w:val="20" /><w14:ligatures w14:val="none" /></w:rPr><w:t>Bring Frisbees or balls for children to play with in the large open field while you wait for a show to begin.</w:t></w:r><w:bookmarkStart w:name="_m-42#02XHYG9JBT9kpf5RZxEjyG}n{EC@IY!v" w:id="45" /><w:bookmarkEnd w:id="45" /><w:bookmarkStart w:name="_m-42#12~VGeR;3tu2;I4qJw6bZrPJ3?0-vith" w:id="46" /><w:bookmarkEnd w:id="46" /><w:bookmarkStart w:name="_m-42#22wK~0ts" w:id="47" /><w:bookmarkEnd w:id="47" /></w:p><w:p><w:pPr><w:shd w:val="clear" w:color="auto" w:fill="FFFFFF" /><w:spacing w:beforeAutospacing="1" w:after="0" w:afterAutospacing="1" w:line="270" w:lineRule="atLeast" /><w:rPr><w:rFonts w:ascii="Verdana" w:eastAsia="Times New Roman" w:hAnsi="Verdana" w:cs="Times New Roman" /><w:color w:val="444E5C" /><w:kern w:val="0" /><w:sz w:val="20" /><w:szCs w:val="20" /><w14:ligatures w14:val="none" /></w:rPr></w:pPr><w:bookmarkStart w:name="_m-3X#02XHTG9OBT4kpk5RUxEoyGxn{JC@DY!{" w:id="42" /><w:bookmarkEnd w:id="42" /><w:bookmarkStart w:name="_m-3X#12~VBeR@3tp2;N4qEw6gZrKJ3D0-qitm" w:id="43" /><w:bookmarkEnd w:id="43" /><w:bookmarkStart w:name="_m-3X#22wKy0tx" w:id="44" /><w:bookmarkEnd w:id="44" /></w:p><w:p><w:pPr><w:shd w:val="clear" w:color="auto" w:fill="FFFFFF" /><w:spacing w:beforeAutospacing="1" w:after="0" w:afterAutospacing="1" w:line="270" w:lineRule="atLeast" /><w:rPr><w:rStyle w:val="Strong" /><w:rFonts w:ascii="Arial" w:hAnsi="Arial" w:cs="Arial" /></w:rPr></w:pPr><w:r><w:rPr><w:rStyle w:val="Strong" /><w:rFonts w:ascii="Arial" w:hAnsi="Arial" w:cs="Arial" /></w:rPr><w:t>Event S</w:t></w:r><w:r><w:rPr><w:rStyle w:val="Strong" /><w:rFonts w:ascii="Arial" w:hAnsi="Arial" w:cs="Arial" /></w:rPr><w:t>chedule</w:t></w:r><w:bookmarkStart w:name="_m-3V#02XI\G8GBU&lt;koc5S]xDgyH&quot;nzBCALY~s" w:id="39" /><w:bookmarkEnd w:id="39" /><w:bookmarkStart w:name="_m-3V#12~WJeQ83ux2:F4rMw5_ZsSJ2&lt;0.yise" w:id="40" /><w:bookmarkEnd w:id="40" /><w:bookmarkStart w:name="_m-3V#22wL#0sp" w:id="41" /><w:bookmarkEnd w:id="41" /></w:p><w:p><w:pPr><w:shd w:val="clear" w:color="auto" w:fill="FFFFFF" /><w:spacing w:beforeAutospacing="1" w:after="0" w:afterAutospacing="1" w:line="270" w:lineRule="atLeast" /><w:rPr><w:rStyle w:val="Strong" /><w:rFonts w:ascii="Arial" w:hAnsi="Arial" w:cs="Arial" /></w:rPr></w:pPr><w:r><w:rPr><w:rStyle w:val="Strong" /><w:rFonts w:ascii="Arial" w:hAnsi="Arial" w:cs="Arial" /></w:rPr><w:t>Saturday (5/2</w:t></w:r><w:r><w:rPr><w:rStyle w:val="Strong" /><w:rFonts w:ascii="Arial" w:hAnsi="Arial" w:cs="Arial" /></w:rPr><w:t>8</w:t></w:r><w:r><w:rPr><w:rStyle w:val="Strong" /><w:rFonts w:ascii="Arial" w:hAnsi="Arial" w:cs="Arial" /></w:rPr><w:t>/</w:t></w:r><w:r><w:rPr><w:rStyle w:val="Strong" /><w:rFonts w:ascii="Arial" w:hAnsi="Arial" w:cs="Arial" /></w:rPr><w:t>202</w:t></w:r><w:r><w:rPr><w:rStyle w:val="Strong" /><w:rFonts w:ascii="Arial" w:hAnsi="Arial" w:cs="Arial" /></w:rPr><w:t>4</w:t></w:r><w:r><w:rPr><w:rStyle w:val="Strong" /><w:rFonts w:ascii="Arial" w:hAnsi="Arial" w:cs="Arial" /></w:rPr><w:t>)</w:t></w:r><w:bookmarkStart w:name="_m-3T#02XIZG8IBU:koe5S[xDiyH~nzDCAJY~u" w:id="36" /><w:bookmarkEnd w:id="36" /><w:bookmarkStart w:name="_m-3T#12~WHeQ:3uv2:H4rKw5aZsQJ2&gt;0.wisg" w:id="37" /><w:bookmarkEnd w:id="37" /><w:bookmarkStart w:name="_m-3T#22wL!0sr" w:id="38" /><w:bookmarkEnd w:id="38" /></w:p><w:p><w:pPr><w:shd w:val="clear" w:color="auto" w:fill="FFFFFF" /><w:spacing w:beforeAutospacing="1" w:after="0" w:afterAutospacing="1" w:line="270" w:lineRule="atLeast" /><w:rPr><w:rFonts w:ascii="Arial" w:hAnsi="Arial" w:cs="Arial" /></w:rPr></w:pPr><w:r><w:rPr><w:rFonts w:ascii="Arial" w:hAnsi="Arial" w:cs="Arial" /></w:rPr><w:t xml:space="preserve">6:00 AM </w:t></w:r><w:r><w:rPr><w:rFonts w:ascii="Arial" w:hAnsi="Arial" w:cs="Arial" /></w:rPr><w:t>Pilots Briefing</w:t></w:r><w:bookmarkStart w:name="_m-3R#02XIXG8KBU8kog5SYxDkyH|nzFCAHY~w" w:id="33" /><w:bookmarkEnd w:id="33" /><w:bookmarkStart w:name="_m-3R#12~WFeQ&lt;3ut2:J4rIw5cZsOJ2@0.uisi" w:id="34" /><w:bookmarkEnd w:id="34" /><w:bookmarkStart w:name="_m-3R#22wL}0st" w:id="35" /><w:bookmarkEnd w:id="35" /></w:p><w:p><w:pPr><w:shd w:val="clear" w:color="auto" w:fill="FFFFFF" /><w:spacing w:beforeAutospacing="1" w:after="0" w:afterAutospacing="1" w:line="270" w:lineRule="atLeast" /><w:rPr><w:rFonts w:ascii="Arial" w:hAnsi="Arial" w:cs="Arial" /></w:rPr></w:pPr><w:r><w:rPr><w:rFonts w:ascii="Arial" w:hAnsi="Arial" w:cs="Arial" /></w:rPr><w:t>6:30 AM Hare and Hound Race</w:t></w:r><w:bookmarkStart w:name="_m-3N#02XITG8OBU4kok5SUxDoyHxnzJCADY~{" w:id="30" /><w:bookmarkEnd w:id="30" /><w:bookmarkStart w:name="_m-3N#12~WBeQ@3up2:N4rEw5gZsKJ2D0.qism" w:id="31" /><w:bookmarkEnd w:id="31" /><w:bookmarkStart w:name="_m-3N#22wLy0sx" w:id="32" /><w:bookmarkEnd w:id="32" /></w:p><w:p><w:pPr><w:shd w:val="clear" w:color="auto" w:fill="FFFFFF" /><w:spacing w:beforeAutospacing="1" w:after="0" w:afterAutospacing="1" w:line="270" w:lineRule="atLeast" /><w:rPr><w:rFonts w:ascii="Arial" w:hAnsi="Arial" w:cs="Arial" /></w:rPr></w:pPr><w:r><w:rPr><w:rFonts w:ascii="Arial" w:hAnsi="Arial" w:cs="Arial" /></w:rPr><w:t>5:00 PM Pilot Briefing</w:t></w:r><w:bookmarkStart w:name="_m-3J#02XJZG7IBV:kne5T[xCiyI~nyDCBJY}u" w:id="27" /><w:bookmarkEnd w:id="27" /><w:bookmarkStart w:name="_m-3J#12~XHeP:3vv29H4sKw4aZtQJ1&gt;0/wirg" w:id="28" /><w:bookmarkEnd w:id="28" /><w:bookmarkStart w:name="_m-3J#22wM!0rr" w:id="29" /><w:bookmarkEnd w:id="29" /></w:p><w:p><w:pPr><w:shd w:val="clear" w:color="auto" w:fill="FFFFFF" /><w:spacing w:beforeAutospacing="1" w:after="0" w:afterAutospacing="1" w:line="270" w:lineRule="atLeast" /><w:rPr><w:rFonts w:ascii="Arial" w:hAnsi="Arial" w:cs="Arial" /></w:rPr></w:pPr><w:r><w:rPr><w:rFonts w:ascii="Arial" w:hAnsi="Arial" w:cs="Arial" /></w:rPr><w:t>5:30 PM Fun Flight</w:t></w:r><w:bookmarkStart w:name="_m-3H#02XJXG7KBV8kng5TYxCkyI|nyFCBHY}w" w:id="24" /><w:bookmarkEnd w:id="24" /><w:bookmarkStart w:name="_m-3H#12~XFeP&lt;3vt29J4sIw4cZtOJ1@0/uiri" w:id="25" /><w:bookmarkEnd w:id="25" /><w:bookmarkStart w:name="_m-3H#22wM}0rt" w:id="26" /><w:bookmarkEnd w:id="26" /></w:p><w:p><w:pPr><w:shd w:val="clear" w:color="auto" w:fill="FFFFFF" /><w:spacing w:beforeAutospacing="1" w:after="0" w:afterAutospacing="1" w:line="270" w:lineRule="atLeast" /><w:rPr><w:rFonts w:ascii="Arial" w:hAnsi="Arial" w:cs="Arial" /></w:rPr></w:pPr><w:r><w:rPr><w:rFonts w:ascii="Arial" w:hAnsi="Arial" w:cs="Arial" /></w:rPr><w:t>6:30 PM Tethers</w:t></w:r><w:bookmarkStart w:name="_m-3C#02XJSG7PBV3knl5TTxCpyIwnyKCBCY}|" w:id="21" /><w:bookmarkEnd w:id="21" /><w:bookmarkStart w:name="_m-3C#12~XAePA3vo29O4sDw4hZtJJ1E0/pirn" w:id="22" /><w:bookmarkEnd w:id="22" /><w:bookmarkStart w:name="_m-3C#22wMx0ry" w:id="23" /><w:bookmarkEnd w:id="23" /></w:p><w:p><w:pPr><w:shd w:val="clear" w:color="auto" w:fill="FFFFFF" /><w:spacing w:beforeAutospacing="1" w:after="0" w:afterAutospacing="1" w:line="270" w:lineRule="atLeast" /><w:rPr><w:rFonts w:ascii="Arial" w:hAnsi="Arial" w:cs="Arial" /></w:rPr></w:pPr><w:r><w:rPr><w:rFonts w:ascii="Arial" w:hAnsi="Arial" w:cs="Arial" /></w:rPr><w:t>8:15 PM Balloon Glow</w:t></w:r><w:bookmarkStart w:name="_m-3A#02XK[G6HBW;kmd5U\xBhyJ!nxCCCKY|t" w:id="18" /><w:bookmarkEnd w:id="18" /><w:bookmarkStart w:name="_m-3A#12~YIeO93ww28G4tLw3`ZuRJ0=00xiqf" w:id="19" /><w:bookmarkEnd w:id="19" /><w:bookmarkStart w:name="_m-3A#22wN&quot;0qq" w:id="20" /><w:bookmarkEnd w:id="20" /></w:p><w:p><w:pPr><w:shd w:val="clear" w:color="auto" w:fill="FFFFFF" /><w:spacing w:beforeAutospacing="1" w:after="0" w:afterAutospacing="1" w:line="270" w:lineRule="atLeast" /><w:rPr><w:rStyle w:val="Strong" /><w:rFonts w:ascii="Arial" w:hAnsi="Arial" w:cs="Arial" /></w:rPr></w:pPr><w:r><w:rPr><w:rStyle w:val="Strong" /><w:rFonts w:ascii="Arial" w:hAnsi="Arial" w:cs="Arial" /></w:rPr><w:t>Sunday (5/2</w:t></w:r><w:r><w:rPr><w:rStyle w:val="Strong" /><w:rFonts w:ascii="Arial" w:hAnsi="Arial" w:cs="Arial" /></w:rPr><w:t>9</w:t></w:r><w:r><w:rPr><w:rStyle w:val="Strong" /><w:rFonts w:ascii="Arial" w:hAnsi="Arial" w:cs="Arial" /></w:rPr><w:t>/</w:t></w:r><w:r><w:rPr><w:rStyle w:val="Strong" /><w:rFonts w:ascii="Arial" w:hAnsi="Arial" w:cs="Arial" /></w:rPr><w:t>202</w:t></w:r><w:r><w:rPr><w:rStyle w:val="Strong" /><w:rFonts w:ascii="Arial" w:hAnsi="Arial" w:cs="Arial" /></w:rPr><w:t>4</w:t></w:r><w:r><w:rPr><w:rStyle w:val="Strong" /><w:rFonts w:ascii="Arial" w:hAnsi="Arial" w:cs="Arial" /></w:rPr><w:t>)</w:t></w:r><w:bookmarkStart w:name="_m-38#02XKYG6JBW9kmf5UZxBjyJ}nxECCIY|v" w:id="15" /><w:bookmarkEnd w:id="15" /><w:bookmarkStart w:name="_m-38#12~YGeO;3wu28I4tJw3bZuPJ0?00viqh" w:id="16" /><w:bookmarkEnd w:id="16" /><w:bookmarkStart w:name="_m-38#22wN~0qs" w:id="17" /><w:bookmarkEnd w:id="17" /></w:p><w:p><w:pPr><w:shd w:val="clear" w:color="auto" w:fill="FFFFFF" /><w:spacing w:beforeAutospacing="1" w:after="0" w:afterAutospacing="1" w:line="270" w:lineRule="atLeast" /><w:rPr><w:rFonts w:ascii="Arial" w:hAnsi="Arial" w:cs="Arial" /></w:rPr></w:pPr><w:r><w:rPr><w:rFonts w:ascii="Arial" w:hAnsi="Arial" w:cs="Arial" /></w:rPr><w:t>6:00 AM Pilots Briefing</w:t></w:r><w:bookmarkStart w:name="_m-37#02XKXG6KBW8kmg5UYxBkyJ|nxFCCHY|w" w:id="12" /><w:bookmarkEnd w:id="12" /><w:bookmarkStart w:name="_m-37#12~YFeO&lt;3wt28J4tIw3cZuOJ0@00uiqi" w:id="13" /><w:bookmarkEnd w:id="13" /><w:bookmarkStart w:name="_m-37#22wN}0qt" w:id="14" /><w:bookmarkEnd w:id="14" /></w:p><w:p><w:pPr><w:shd w:val="clear" w:color="auto" w:fill="FFFFFF" /><w:spacing w:beforeAutospacing="1" w:after="0" w:afterAutospacing="1" w:line="270" w:lineRule="atLeast" /><w:rPr><w:rFonts w:ascii="Arial" w:hAnsi="Arial" w:cs="Arial" /></w:rPr></w:pPr><w:r><w:rPr><w:rFonts w:ascii="Arial" w:hAnsi="Arial" w:cs="Arial" /></w:rPr><w:t>6:30 AM Lynn Layton Key Grab</w:t></w:r><w:bookmarkStart w:name="_m-33#02XKTG6OBW4kmk5UUxBoyJxnxJCCDY|{" w:id="9" /><w:bookmarkEnd w:id="9" /><w:bookmarkStart w:name="_m-33#12~YBeO@3wp28N4tEw3gZuKJ0D00qiqm" w:id="10" /><w:bookmarkEnd w:id="10" /><w:bookmarkStart w:name="_m-33#22wNy0qx" w:id="11" /><w:bookmarkEnd w:id="11" /></w:p><w:p><w:pPr><w:shd w:val="clear" w:color="auto" w:fill="FFFFFF" /><w:spacing w:beforeAutospacing="1" w:after="0" w:afterAutospacing="1" w:line="270" w:lineRule="atLeast" /><w:rPr><w:rFonts w:ascii="Arial" w:hAnsi="Arial" w:cs="Arial" /></w:rPr></w:pPr><w:r><w:rPr><w:rFonts w:ascii="Arial" w:hAnsi="Arial" w:cs="Arial" /></w:rPr><w:t>5:00 PM Pilot Briefing</w:t></w:r><w:bookmarkStart w:name="_m-2Z#02XLZG5IBX:kle5V[xAiyK~nwDCDJY{u" w:id="6" /><w:bookmarkEnd w:id="6" /><w:bookmarkStart w:name="_m-2Z#12~ZHeN:3xv27H4uKw2aZvQJ/&gt;01wipg" w:id="7" /><w:bookmarkEnd w:id="7" /><w:bookmarkStart w:name="_m-2Z#22wO!0pr" w:id="8" /><w:bookmarkEnd w:id="8" /></w:p><w:p><w:pPr><w:shd w:val="clear" w:color="auto" w:fill="FFFFFF" /><w:spacing w:beforeAutospacing="1" w:after="0" w:afterAutospacing="1" w:line="270" w:lineRule="atLeast" /><w:rPr><w:rFonts w:ascii="Arial" w:hAnsi="Arial" w:cs="Arial" /></w:rPr></w:pPr><w:r><w:rPr><w:rFonts w:ascii="Arial" w:hAnsi="Arial" w:cs="Arial" /></w:rPr><w:t>5:30 PM Fun Flight</w:t></w:r><w:bookmarkStart w:name="_m-2U#02XLUG5NBX5klj5VVxAnyKynwICDEY{z" w:id="3" /><w:bookmarkEnd w:id="3" /><w:bookmarkStart w:name="_m-2U#12~ZCeN?3xq27M4uFw2fZvLJ/C01ripl" w:id="4" /><w:bookmarkEnd w:id="4" /><w:bookmarkStart w:name="_m-2U#22wOz0pw" w:id="5" /><w:bookmarkEnd w:id="5" /></w:p><w:p><w:pPr><w:shd w:val="clear" w:color="auto" w:fill="FFFFFF" /><w:spacing w:beforeAutospacing="1" w:after="0" w:afterAutospacing="1" w:line="270" w:lineRule="atLeast" /><w:jc w:val="center"/><w:jc w:val="right"/></w:pPr><w:r><w:rPr><w:b/><w:bCs/><w:color w:val="4472C4" w:themeColor="accent5"/><w:rFonts w:ascii="Arial" w:hAnsi="Arial" w:cs="Arial" /></w:rPr><w:t xml:space="preserve">6:30 PM </w:t></w:r><w:r><w:rPr><w:b/><w:bCs/><w:color w:val="4472C4" w:themeColor="accent5"/><w:rFonts w:ascii="Arial" w:hAnsi="Arial" w:cs="Arial" /></w:rPr><w:t>Ballumination</w:t></w:r><w:bookmarkStart w:name="_m-2S#02XLSG5PBX3kll5VTxApyKwnwKCDCY{|" w:id="0" /><w:bookmarkEnd w:id="0" /><w:bookmarkStart w:name="_m-2S#12~ZAeNA3xo27O4uDw2hZvJJ/E01pipn" w:id="1" /><w:bookmarkEnd w:id="1" /><w:bookmarkStart w:name="_m-2S#22wOx0py" w:id="2" /><w:bookmarkEnd w:id="2" /></w:p><w:sectPr><w:type w:val="continuous" /><w:pgSz w:w="12240" w:h="15840" /><w:pgMar w:top="1440" w:right="1440" w:bottom="1440" w:left="1440" w:header="720" w:footer="720" w:gutter="0" /><w:cols w:space="720" /><w:docGrid w:linePitch="360" /></w:sectPr></w:body></w:document<w:p><w:pPr><w:shd w:val="clear" w:color="auto" w:fill="FFFFFF" /><w:spacing w:before="100" w:beforeAutospacing="1" w:after="100" w:afterAutospacing="1" w:line="270" w:lineRule="atLeast" /><w:outlineLvl w:val="1" /><w:rPr><w:rFonts w:ascii="Arial" w:eastAsia="Times New Roman" w:hAnsi="Arial" w:cs="Arial" /><w:b /><w:bCs /><w:color w:val="333333" /><w:kern w:val="0" /><w:sz w:val="36" /><w:szCs w:val="36" /><w14:ligatures w14:val="none" /></w:rPr><w:sectPr><w:type w:val="continuous" /><w:pgSz w:w="12240" w:h="15840" /><w:pgMar w:top="1440" w:right="1440" w:bottom="1440" w:left="1440" w:header="720" w:footer="720" w:gutter="0" /><w:cols w:num="2" w:sep="1" w:space="720" /><w:docGrid w:linePitch="360" /></w:sectPr></w:pPr><w:bookmarkStart w:name="_m-5X#02YKVF6MCW6jmi6UWwBmzJzmxHDCFX|y" w:id="123" /><w:bookmarkEnd w:id="123" /><w:bookmarkStart w:name="_m-5X#12!YDdO&gt;4wr18L5tGv3e[uMI0B10shqk" w:id="124" /><w:bookmarkEnd w:id="124" /><w:bookmarkStart w:name="_m-5X#22xN{/qv" w:id="125" /><w:bookmarkEnd w:id="125" /></w:p><w:p><w:pPr><w:shd w:val="clear" w:color="auto" w:fill="FFFFFF" /><w:spacing w:before="100" w:beforeAutospacing="1" w:after="100" w:afterAutospacing="1" w:line="270" w:lineRule="atLeast" /><w:outlineLvl w:val="1" /><w:rPr><w:rFonts w:ascii="Arial" w:eastAsia="Times New Roman" w:hAnsi="Arial" w:cs="Arial" /><w:b /><w:bCs /><w:color w:val="333333" /><w:kern w:val="0" /><w:sz w:val="36" /><w:szCs w:val="36" /><w14:ligatures w14:val="none" /></w:rPr></w:pPr><w:r><w:rPr><w:rFonts w:ascii="Arial" w:eastAsia="Times New Roman" w:hAnsi="Arial" w:cs="Arial" /><w:b /><w:bCs /><w:color w:val="333333" /><w:kern w:val="0" /><w:sz w:val="36" /><w:szCs w:val="36" /><w14:ligatures w14:val="none" /></w:rPr><w:t>Frequently Asked Questions</w:t></w:r><w:bookmarkStart w:name="_m-5V#02YKTF6OCW4jmk6UUwBozJxmxJDCDX|{" w:id="120" /><w:bookmarkEnd w:id="120" /><w:bookmarkStart w:name="_m-5V#12!YBdO@4wp18N5tEv3g[uKI0D10qhqm" w:id="121" /><w:bookmarkEnd w:id="121" /><w:bookmarkStart w:name="_m-5V#22xNy/qx" w:id="122" /><w:bookmarkEnd w:id="122" /></w:p><w:p><w:pPr><w:shd w:val="clear" w:color="auto" w:fill="FFFFFF" /><w:spacing w:before="100" w:beforeAutospacing="1" w:after="100" w:afterAutospacing="1" w:line="270" w:lineRule="atLeast" /><w:outlineLvl w:val="3" /><w:rPr><w:rFonts w:ascii="Arial" w:eastAsia="Times New Roman" w:hAnsi="Arial" w:cs="Arial" /><w:bCs /><w:color w:val="333333" /><w:kern w:val="0" /><w:sz w:val="24" /><w:szCs w:val="24" /><w14:ligatures w14:val="none" /></w:rPr></w:pPr><w:r><w:rPr><w:rFonts w:ascii="Arial" w:eastAsia="Times New Roman" w:hAnsi="Arial" w:cs="Arial" /><w:bCs /><w:color w:val="333333" /><w:kern w:val="0" /><w:sz w:val="24" /><w:szCs w:val="24" /><w14:ligatures w14:val="none" /></w:rPr><w:t>When is the best time to see balloons?</w:t></w:r><w:bookmarkStart w:name="_m-5U#02YKSF6PCW3jml6UTwBpzJwmxKDCCX||" w:id="117" /><w:bookmarkEnd w:id="117" /><w:bookmarkStart w:name="_m-5U#12!YAdOA4wo18O5tDv3h[uJI0E10phqn" w:id="118" /><w:bookmarkEnd w:id="118" /><w:bookmarkStart w:name="_m-5U#22xNx/qy" w:id="119" /><w:bookmarkEnd w:id="119" /></w:p><w:p><w:pPr><w:shd w:val="clear" w:color="auto" w:fill="FFFFFF" /><w:spacing w:before="100" w:beforeAutospacing="1" w:after="100" w:afterAutospacing="1" w:line="270" w:lineRule="atLeast" /><w:rPr><w:rFonts w:ascii="Arial" w:eastAsia="Times New Roman" w:hAnsi="Arial" w:cs="Arial" /><w:color w:val="333333" /><w:kern w:val="0" /><w:sz w:val="20" /><w:szCs w:val="20" /><w14:ligatures w14:val="none" /></w:rPr></w:pPr><w:r><w:rPr><w:rFonts w:ascii="Arial" w:eastAsia="Times New Roman" w:hAnsi="Arial" w:cs="Arial" /><w:color w:val="333333" /><w:kern w:val="0" /><w:sz w:val="20" /><w:szCs w:val="20" /><w14:ligatures w14:val="none" /></w:rPr><w:lastRenderedPageBreak /><w:t>The best time to view balloons and get great pictures is early morning. Flights begin at approximately 6:00 a.m. each morning. It’s definitely worth getting up early to see balloons grace the early morning sky. Balloons also fly at dusk (approximately 7:00 p.m. on Friday and Saturday night</w:t></w:r><w:r><w:rPr><w:rFonts w:ascii="Arial" w:eastAsia="Times New Roman" w:hAnsi="Arial" w:cs="Arial" /><w:color w:val="333333" /><w:kern w:val="0" /><w:sz w:val="20" /><w:szCs w:val="20" /><w14:ligatures w14:val="none" /></w:rPr><w:t>)</w:t></w:r><w:r><w:rPr><w:rFonts w:ascii="Arial" w:eastAsia="Times New Roman" w:hAnsi="Arial" w:cs="Arial" /><w:color w:val="333333" /><w:kern w:val="0" /><w:sz w:val="20" /><w:szCs w:val="20" /><w14:ligatures w14:val="none" /></w:rPr><w:t>.</w:t></w:r><w:bookmarkStart w:name="_m-5Q#02YLYF5JCX9jlf6VZwAjzK}mwEDDIX{v" w:id="114" /><w:bookmarkEnd w:id="114" /><w:bookmarkStart w:name="_m-5Q#12!ZGdN;4xu17I5uJv2b[vPI/?11vhph" w:id="115" /><w:bookmarkEnd w:id="115" /><w:bookmarkStart w:name="_m-5Q#22xO~/ps" w:id="116" /><w:bookmarkEnd w:id="116" /></w:p><w:p><w:pPr><w:shd w:val="clear" w:color="auto" w:fill="FFFFFF" /><w:spacing w:beforeAutospacing="1" w:after="0" w:afterAutospacing="1" w:line="270" w:lineRule="atLeast" /><w:rPr><w:rFonts w:ascii="Arial" w:eastAsia="Times New Roman" w:hAnsi="Arial" w:cs="Arial" /><w:color w:val="333333" /><w:kern w:val="0" /><w:sz w:val="20" /><w:szCs w:val="20" /><w14:ligatures w14:val="none" /></w:rPr></w:pPr><w:r><w:rPr><w:rFonts w:ascii="Arial" w:eastAsia="Times New Roman" w:hAnsi="Arial" w:cs="Arial" /><w:color w:val="333333" /><w:kern w:val="0" /><w:sz w:val="20" /><w:szCs w:val="20" /><w14:ligatures w14:val="none" /></w:rPr><w:t>Please be aware that b</w:t></w:r><w:r><w:rPr><w:rFonts w:ascii="Arial" w:eastAsia="Times New Roman" w:hAnsi="Arial" w:cs="Arial" /><w:color w:val="333333" /><w:kern w:val="0" /><w:sz w:val="20" /><w:szCs w:val="20" /><w14:ligatures w14:val="none" /></w:rPr><w:t>allooning is extremely weather dependent. Winds must be less than 1</w:t></w:r><w:r><w:rPr><w:rFonts w:ascii="Arial" w:eastAsia="Times New Roman" w:hAnsi="Arial" w:cs="Arial" /><w:color w:val="333333" /><w:kern w:val="0" /><w:sz w:val="20" /><w:szCs w:val="20" /><w14:ligatures w14:val="none" /></w:rPr><w:t>5 mph</w:t></w:r><w:r><w:rPr><w:rFonts w:ascii="Arial" w:eastAsia="Times New Roman" w:hAnsi="Arial" w:cs="Arial" /><w:color w:val="333333" /><w:kern w:val="0" /><w:sz w:val="20" /><w:szCs w:val="20" /><w14:ligatures w14:val="none" /></w:rPr><w:t xml:space="preserve"> fo</w:t></w:r><w:r><w:rPr><w:rFonts w:ascii="Arial" w:eastAsia="Times New Roman" w:hAnsi="Arial" w:cs="Arial" /><w:color w:val="333333" /><w:kern w:val="0" /><w:sz w:val="20" /><w:szCs w:val="20" /><w14:ligatures w14:val="none" /></w:rPr><w:t>r balloons to fly. Listen to W</w:t></w:r><w:r><w:rPr><w:rFonts w:ascii="Arial" w:eastAsia="Times New Roman" w:hAnsi="Arial" w:cs="Arial" /><w:color w:val="333333" /><w:kern w:val="0" /><w:sz w:val="20" /><w:szCs w:val="20" /><w14:ligatures w14:val="none" /></w:rPr><w:t xml:space="preserve">LITE </w:t></w:r><w:r><w:rPr><w:rFonts w:ascii="Arial" w:eastAsia="Times New Roman" w:hAnsi="Arial" w:cs="Arial" /><w:color w:val="333333" /><w:kern w:val="0" /><w:sz w:val="20" /><w:szCs w:val="20" /><w14:ligatures w14:val="none" /></w:rPr><w:t>1</w:t></w:r><w:r><w:rPr><w:rFonts w:ascii="Arial" w:eastAsia="Times New Roman" w:hAnsi="Arial" w:cs="Arial" /><w:color w:val="333333" /><w:kern w:val="0" /><w:sz w:val="20" /><w:szCs w:val="20" /><w14:ligatures w14:val="none" /></w:rPr><w:t>0</w:t></w:r><w:r><w:rPr><w:rFonts w:ascii="Arial" w:eastAsia="Times New Roman" w:hAnsi="Arial" w:cs="Arial" /><w:color w:val="333333" /><w:kern w:val="0" /><w:sz w:val="20" /><w:szCs w:val="20" /><w14:ligatures w14:val="none" /></w:rPr><w:t>5</w:t></w:r><w:r><w:rPr><w:rFonts w:ascii="Arial" w:eastAsia="Times New Roman" w:hAnsi="Arial" w:cs="Arial" /><w:color w:val="333333" /><w:kern w:val="0" /><w:sz w:val="20" /><w:szCs w:val="20" /><w14:ligatures w14:val="none" /></w:rPr><w:t>0 AM or 9</w:t></w:r><w:r><w:rPr><w:rFonts w:ascii="Arial" w:eastAsia="Times New Roman" w:hAnsi="Arial" w:cs="Arial" /><w:color w:val="333333" /><w:kern w:val="0" /><w:sz w:val="20" /><w:szCs w:val="20" /><w14:ligatures w14:val="none" /></w:rPr><w:t>5</w:t></w:r><w:r><w:rPr><w:rFonts w:ascii="Arial" w:eastAsia="Times New Roman" w:hAnsi="Arial" w:cs="Arial" /><w:color w:val="333333" /><w:kern w:val="0" /><w:sz w:val="20" /><w:szCs w:val="20" /><w14:ligatures w14:val="none" /></w:rPr><w:t>.</w:t></w:r><w:r><w:rPr><w:rFonts w:ascii="Arial" w:eastAsia="Times New Roman" w:hAnsi="Arial" w:cs="Arial" /><w:color w:val="333333" /><w:kern w:val="0" /><w:sz w:val="20" /><w:szCs w:val="20" /><w14:ligatures w14:val="none" /></w:rPr><w:t>7</w:t></w:r><w:r><w:rPr><w:rFonts w:ascii="Arial" w:eastAsia="Times New Roman" w:hAnsi="Arial" w:cs="Arial" /><w:color w:val="333333" /><w:kern w:val="0" /><w:sz w:val="20" /><w:szCs w:val="20" /><w14:ligatures w14:val="none" /></w:rPr><w:t xml:space="preserve"> FM for the latest on flight information.</w:t></w:r><w:bookmarkStart w:name="_m-5O#02YLWF5LCX7jlh6VXwAlzK{mwGDDGX{x" w:id="111" /><w:bookmarkEnd w:id="111" /><w:bookmarkStart w:name="_m-5O#12!ZEdN=4xs17K5uHv2d[vNI/A11thpj" w:id="112" /><w:bookmarkEnd w:id="112" /><w:bookmarkStart w:name="_m-5O#22xO|/pu" w:id="113" /><w:bookmarkEnd w:id="113" /></w:p><w:p><w:pPr><w:shd w:val="clear" w:color="auto" w:fill="FFFFFF" /><w:spacing w:before="100" w:beforeAutospacing="1" w:after="100" w:afterAutospacing="1" w:line="270" w:lineRule="atLeast" /><w:outlineLvl w:val="3" /><w:rPr><w:rFonts w:ascii="Arial" w:eastAsia="Times New Roman" w:hAnsi="Arial" w:cs="Arial" /><w:bCs /><w:color w:val="333333" /><w:kern w:val="0" /><w:sz w:val="24" /><w:szCs w:val="24" /><w14:ligatures w14:val="none" /></w:rPr></w:pPr><w:r><w:rPr><w:rFonts w:ascii="Arial" w:eastAsia="Times New Roman" w:hAnsi="Arial" w:cs="Arial" /><w:bCs /><w:color w:val="333333" /><w:kern w:val="0" /><w:sz w:val="24" /><w:szCs w:val="24" /><w14:ligatures w14:val="none" /></w:rPr><w:t>Wh</w:t></w:r><w:r><w:rPr><w:rFonts w:ascii="Arial" w:eastAsia="Times New Roman" w:hAnsi="Arial" w:cs="Arial" /><w:bCs /><w:color w:val="333333" /><w:kern w:val="0" /><w:sz w:val="24" /><w:szCs w:val="24" /><w14:ligatures w14:val="none" /></w:rPr><w:t>ere are the balloons and pilots during the day?</w:t></w:r><w:bookmarkStart w:name="_m-5N#02YLVF5MCX6jli6VWwAmzKzmwHDDFX{y" w:id="108" /><w:bookmarkEnd w:id="108" /><w:bookmarkStart w:name="_m-5N#12!ZDdN&gt;4xr17L5uGv2e[vMI/B11shpk" w:id="109" /><w:bookmarkEnd w:id="109" /><w:bookmarkStart w:name="_m-5N#22xO{/pv" w:id="110" /><w:bookmarkEnd w:id="110" /></w:p><w:p><w:pPr><w:shd w:val="clear" w:color="auto" w:fill="FFFFFF" /><w:spacing w:before="100" w:beforeAutospacing="1" w:after="100" w:afterAutospacing="1" w:line="270" w:lineRule="atLeast" /><w:rPr><w:rFonts w:ascii="Arial" w:eastAsia="Times New Roman" w:hAnsi="Arial" w:cs="Arial" /><w:color w:val="333333" /><w:kern w:val="0" /><w:sz w:val="20" /><w:szCs w:val="20" /><w14:ligatures w14:val="none" /></w:rPr></w:pPr><w:r><w:rPr><w:rFonts w:ascii="Arial" w:eastAsia="Times New Roman" w:hAnsi="Arial" w:cs="Arial" /><w:color w:val="333333" /><w:kern w:val="0" /><w:sz w:val="20" /><w:szCs w:val="20" /><w14:ligatures w14:val="none" /></w:rPr><w:t>High canyon winds make it impossible to inflate balloons during the day. Pilots and their families enjoy the same things that you do at the park—live music, quality arts &amp; crafts, and local cuisine.</w:t></w:r><w:bookmarkStart w:name="_m-5I#02XC[G&gt;HBO;kud5M\xJhyB!n&quot;CC;KY&amp;t" w:id="105" /><w:bookmarkEnd w:id="105" /><w:bookmarkStart w:name="_m-5I#12~QIeW93ow2@G4lLw;`ZmRJ8=0(xiyf" w:id="106" /><w:bookmarkEnd w:id="106" /><w:bookmarkStart w:name="_m-5I#22wF&quot;0yq" w:id="107" /><w:bookmarkEnd w:id="107" /></w:p><w:p><w:pPr><w:shd w:val="clear" w:color="auto" w:fill="FFFFFF" /><w:spacing w:before="100" w:beforeAutospacing="1" w:after="100" w:afterAutospacing="1" w:line="270" w:lineRule="atLeast" /><w:outlineLvl w:val="3" /><w:rPr><w:rFonts w:ascii="Arial" w:eastAsia="Times New Roman" w:hAnsi="Arial" w:cs="Arial" /><w:bCs /><w:color w:val="333333" /><w:kern w:val="0" /><w:sz w:val="24" /><w:szCs w:val="24" /><w14:ligatures w14:val="none" /></w:rPr></w:pPr><w:r><w:rPr><w:rFonts w:ascii="Arial" w:eastAsia="Times New Roman" w:hAnsi="Arial" w:cs="Arial" /><w:bCs /><w:color w:val="333333" /><w:kern w:val="0" /><w:sz w:val="24" /><w:szCs w:val="24" /><w14:ligatures w14:val="none" /></w:rPr><w:t>Can I purchase a hot air balloon ride during the Festival?</w:t></w:r><w:bookmarkStart w:name="_m-5F#02XCXG&gt;KBO8kug5MYxJkyB|n&quot;FC;HY&amp;w" w:id="102" /><w:bookmarkEnd w:id="102" /><w:bookmarkStart w:name="_m-5F#12~QFeW&lt;3ot2@J4lIw;cZmOJ8@0(uiyi" w:id="103" /><w:bookmarkEnd w:id="103" /><w:bookmarkStart w:name="_m-5F#22wF}0yt" w:id="104" /><w:bookmarkEnd w:id="104" /></w:p><w:p><w:pPr><w:shd w:val="clear" w:color="auto" w:fill="FFFFFF" /><w:spacing w:beforeAutospacing="1" w:after="0" w:afterAutospacing="1" w:line="270" w:lineRule="atLeast" /><w:rPr><w:rFonts w:ascii="Arial" w:eastAsia="Times New Roman" w:hAnsi="Arial" w:cs="Arial" /><w:color w:val="333333" /><w:kern w:val="0" /><w:sz w:val="20" /><w:szCs w:val="20" /><w14:ligatures w14:val="none" /></w:rPr></w:pPr><w:r><w:rPr><w:rFonts w:ascii="Arial" w:eastAsia="Times New Roman" w:hAnsi="Arial" w:cs="Arial" /><w:color w:val="333333" /><w:kern w:val="0" /><w:sz w:val="20" /><w:szCs w:val="20" /><w14:ligatures w14:val="none" /></w:rPr><w:t>Due to the overwhelming demand for balloon rides during the fes</w:t></w:r><w:r><w:rPr><w:rFonts w:ascii="Arial" w:eastAsia="Times New Roman" w:hAnsi="Arial" w:cs="Arial" /><w:color w:val="333333" /><w:kern w:val="0" /><w:sz w:val="20" /><w:szCs w:val="20" /><w14:ligatures w14:val="none" /></w:rPr><w:t>tival, rides are not available. However, most pilots will give tether rides on Saturday and Sunday mornings.</w:t></w:r><w:r><w:rPr><w:rFonts w:ascii="Arial" w:eastAsia="Times New Roman" w:hAnsi="Arial" w:cs="Arial" /><w:color w:val="333333" /><w:kern w:val="0" /><w:sz w:val="20" /><w:szCs w:val="20" /><w14:ligatures w14:val="none" /></w:rPr><w:t xml:space="preserve"> Rides can be purchased before</w:t></w:r><w:r><w:rPr><w:rFonts w:ascii="Arial" w:eastAsia="Times New Roman" w:hAnsi="Arial" w:cs="Arial" /><w:color w:val="333333" /><w:kern w:val="0" /><w:sz w:val="20" /><w:szCs w:val="20" /><w14:ligatures w14:val="none" /></w:rPr><w:t xml:space="preserve"> or</w:t></w:r><w:r><w:rPr><w:rFonts w:ascii="Arial" w:eastAsia="Times New Roman" w:hAnsi="Arial" w:cs="Arial" /><w:color w:val="333333" /><w:kern w:val="0" /><w:sz w:val="20" /><w:szCs w:val="20" /><w14:ligatures w14:val="none" /></w:rPr><w:t xml:space="preserve"> </w:t></w:r><w:r><w:rPr><w:rFonts w:ascii="Arial" w:eastAsia="Times New Roman" w:hAnsi="Arial" w:cs="Arial" /><w:color w:val="333333" /><w:kern w:val="0" /><w:sz w:val="20" /><w:szCs w:val="20" /><w14:ligatures w14:val="none" /></w:rPr><w:t xml:space="preserve">after the festival from </w:t></w:r><w:r><w:rPr><w:rFonts w:ascii="Arial" w:eastAsia="Times New Roman" w:hAnsi="Arial" w:cs="Arial" /><w:color w:val="333333" /><w:kern w:val="0" /><w:sz w:val="20" /><w:szCs w:val="20" /><w14:ligatures w14:val="none" /></w:rPr><w:t>Sky Glide</w:t></w:r><w:r><w:rPr><w:rFonts w:ascii="Arial" w:eastAsia="Times New Roman" w:hAnsi="Arial" w:cs="Arial" /><w:color w:val="333333" /><w:kern w:val="0" /><w:sz w:val="20" /><w:szCs w:val="20" /><w14:ligatures w14:val="none" /></w:rPr><w:t xml:space="preserve"> Hot Air Balloon Company, a member of the </w:t></w:r><w:r><w:rPr><w:rFonts w:ascii="Arial" w:eastAsia="Times New Roman" w:hAnsi="Arial" w:cs="Arial" /><w:color w:val="333333" /><w:kern w:val="0" /><w:sz w:val="20" /><w:szCs w:val="20" /><w14:ligatures w14:val="none" /></w:rPr><w:t xml:space="preserve">Mount </w:t></w:r><w:r><w:rPr><w:rFonts w:ascii="Arial" w:eastAsia="Times New Roman" w:hAnsi="Arial" w:cs="Arial" /><w:color w:val="333333" /><w:kern w:val="0" /><w:sz w:val="20" /><w:szCs w:val="20" /><w14:ligatures w14:val="none" /></w:rPr><w:t>Vernon</w:t></w:r><w:r><w:rPr><w:rFonts w:ascii="Arial" w:eastAsia="Times New Roman" w:hAnsi="Arial" w:cs="Arial" /><w:color w:val="333333" /><w:kern w:val="0" /><w:sz w:val="20" /><w:szCs w:val="20" /><w14:ligatures w14:val="none" /></w:rPr><w:t xml:space="preserve"> County</w:t></w:r><w:r><w:rPr><w:rFonts w:ascii="Arial" w:eastAsia="Times New Roman" w:hAnsi="Arial" w:cs="Arial" /><w:color w:val="333333" /><w:kern w:val="0" /><w:sz w:val="20" /><w:szCs w:val="20" /><w14:ligatures w14:val="none" /></w:rPr><w:t xml:space="preserve"> Chamber of Commerce.</w:t></w:r><w:bookmarkStart w:name="_m-5E#02XCWG&gt;LBO7kuh5MXxJlyB{n&quot;GC;GY&amp;x" w:id="99" /><w:bookmarkEnd w:id="99" /><w:bookmarkStart w:name="_m-5E#12~QEeW=3os2@K4lHw;dZmNJ8A0(tiyj" w:id="100" /><w:bookmarkEnd w:id="100" /><w:bookmarkStart w:name="_m-5E#22wF|0yu" w:id="101" /><w:bookmarkEnd w:id="101" /></w:p><w:p><w:pPr><w:shd w:val="clear" w:color="auto" w:fill="FFFFFF" /><w:spacing w:before="100" w:beforeAutospacing="1" w:after="100" w:afterAutospacing="1" w:line="270" w:lineRule="atLeast" /><w:outlineLvl w:val="3" /><w:rPr><w:rFonts w:ascii="Arial" w:eastAsia="Times New Roman" w:hAnsi="Arial" w:cs="Arial" /><w:bCs /><w:color w:val="333333" /><w:kern w:val="0" /><w:sz w:val="24" /><w:szCs w:val="24" /><w14:ligatures w14:val="none" /></w:rPr></w:pPr><w:r><w:rPr><w:rFonts w:ascii="Arial" w:eastAsia="Times New Roman" w:hAnsi="Arial" w:cs="Arial" /><w:bCs /><w:color w:val="333333" /><w:kern w:val="0" /><w:sz w:val="24" /><w:szCs w:val="24" /><w14:ligatures w14:val="none" /></w:rPr><w:t>What can my children do while visiting the festival?</w:t></w:r><w:bookmarkStart w:name="_m-5C#02XCUG&gt;NBO5kuj5MVxJnyByn&quot;IC;EY&amp;z" w:id="96" /><w:bookmarkEnd w:id="96" /><w:bookmarkStart w:name="_m-5C#12~QCeW?3oq2@M4lFw;fZmLJ8C0(riyl" w:id="97" /><w:bookmarkEnd w:id="97" /><w:bookmarkStart w:name="_m-5C#22wFz0yw" w:id="98" /><w:bookmarkEnd w:id="98" /></w:p><w:p><w:pPr><w:shd w:val="clear" w:color="auto" w:fill="FFFFFF" /><w:spacing w:before="100" w:beforeAutospacing="1" w:after="100" w:afterAutospacing="1" w:line="270" w:lineRule="atLeast" /><w:rPr><w:rFonts w:ascii="Arial" w:eastAsia="Times New Roman" w:hAnsi="Arial" w:cs="Arial" /><w:color w:val="333333" /><w:kern w:val="0" /><w:sz w:val="20" /><w:szCs w:val="20" /><w14:ligatures w14:val="none" /></w:rPr></w:pPr><w:r><w:rPr><w:rFonts w:ascii="Arial" w:eastAsia="Times New Roman" w:hAnsi="Arial" w:cs="Arial" /><w:color w:val="333333" /><w:kern w:val="0" /><w:sz w:val="20" /><w:szCs w:val="20" /><w14:ligatures w14:val="none" /></w:rPr><w:t>Children</w:t></w:r><w:r><w:rPr><w:rFonts w:ascii="Arial" w:eastAsia="Times New Roman" w:hAnsi="Arial" w:cs="Arial" /><w:color w:val="333333" /><w:kern w:val="0" /><w:sz w:val="20" /><w:szCs w:val="20" /><w14:ligatures w14:val="none" /></w:rPr><w:t xml:space="preserve"> can enjoy inflatables, children’s interactive entertainment, reptile displays, and face painting</w:t></w:r><w:r><w:rPr><w:rFonts w:ascii="Arial" w:eastAsia="Times New Roman" w:hAnsi="Arial" w:cs="Arial" /><w:color w:val="333333" /><w:kern w:val="0" /><w:sz w:val="20" /><w:szCs w:val="20" /><w14:ligatures w14:val="none" /></w:rPr><w:t>,</w:t></w:r><w:r><w:rPr><w:rFonts w:ascii="Arial" w:eastAsia="Times New Roman" w:hAnsi="Arial" w:cs="Arial" /><w:color w:val="333333" /><w:kern w:val="0" /><w:sz w:val="20" /><w:szCs w:val="20" /><w14:ligatures w14:val="none" /></w:rPr><w:t xml:space="preserve"> just to name a few!</w:t></w:r><w:r><w:rPr><w:rFonts w:ascii="Arial" w:eastAsia="Times New Roman" w:hAnsi="Arial" w:cs="Arial" /><w:color w:val="333333" /><w:kern w:val="0" /><w:sz w:val="20" /><w:szCs w:val="20" /><w14:ligatures w14:val="none" /></w:rPr><w:t xml:space="preserve"> </w:t></w:r><w:r><w:rPr><w:rFonts w:ascii="Arial" w:eastAsia="Times New Roman" w:hAnsi="Arial" w:cs="Arial" /><w:color w:val="333333" /><w:kern w:val="0" /><w:sz w:val="20" /><w:szCs w:val="20" /><w14:ligatures w14:val="none" /></w:rPr><w:t xml:space="preserve"> These fun activities are located in the free,</w:t></w:r><w:r><w:rPr><w:rFonts w:ascii="Arial" w:eastAsia="Times New Roman" w:hAnsi="Arial" w:cs="Arial" /><w:color w:val="333333" /><w:kern w:val="0" /><w:sz w:val="20" /><w:szCs w:val="20" /><w14:ligatures w14:val="none" /></w:rPr><w:t xml:space="preserve"> gated Children’s Village open 1</w:t></w:r><w:r><w:rPr><w:rFonts w:ascii="Arial" w:eastAsia="Times New Roman" w:hAnsi="Arial" w:cs="Arial" /><w:color w:val="333333" /><w:kern w:val="0" /><w:sz w:val="20" /><w:szCs w:val="20" /><w14:ligatures w14:val="none" /></w:rPr><w:t xml:space="preserve"> p.m. - 8 p.m. on Friday,</w:t></w:r><w:r><w:rPr><w:rFonts w:ascii="Arial" w:eastAsia="Times New Roman" w:hAnsi="Arial" w:cs="Arial" /><w:color w:val="333333" /><w:kern w:val="0" /><w:sz w:val="20" /><w:szCs w:val="20" /><w14:ligatures w14:val="none" /></w:rPr><w:t xml:space="preserve"> and 8 a.m. - 8 p.m. on Saturday.</w:t></w:r><w:bookmarkStart w:name="_m-57#02XDZG=IBP:kte5N[xIiyC~n!DC&lt;JY%u" w:id="93" /><w:bookmarkEnd w:id="93" /><w:bookmarkStart w:name="_m-57#12~RHeV:3pv2?H4mKw:aZnQJ7&gt;0)wixg" w:id="94" /><w:bookmarkEnd w:id="94" /><w:bookmarkStart w:name="_m-57#22wG!0xr" w:id="95" /><w:bookmarkEnd w:id="95" /></w:p><w:p><w:pPr><w:shd w:val="clear" w:color="auto" w:fill="FFFFFF" /><w:spacing w:before="100" w:beforeAutospacing="1" w:after="100" w:afterAutospacing="1" w:line="270" w:lineRule="atLeast" /><w:outlineLvl w:val="3" /><w:rPr><w:rFonts w:ascii="Arial" w:eastAsia="Times New Roman" w:hAnsi="Arial" w:cs="Arial" /><w:bCs /><w:color w:val="333333" /><w:kern w:val="0" /><w:sz w:val="24" /><w:szCs w:val="24" /><w14:ligatures w14:val="none" /></w:rPr></w:pPr><w:r><w:rPr><w:rFonts w:ascii="Arial" w:eastAsia="Times New Roman" w:hAnsi="Arial" w:cs="Arial" /><w:bCs /><w:color w:val="333333" /><w:kern w:val="0" /><w:sz w:val="24" /><w:szCs w:val="24" /><w14:ligatures w14:val="none" /></w:rPr><w:t>Is smoking permitted on the festival grounds?</w:t></w:r><w:bookmarkStart w:name="_m-55#02XDXG=KBP8ktg5NYxIkyC|n!FC&lt;HY%w" w:id="90" /><w:bookmarkEnd w:id="90" /><w:bookmarkStart w:name="_m-55#12~RFeV&lt;3pt2?J4mIw:cZnOJ7@0)uixi" w:id="91" /><w:bookmarkEnd w:id="91" /><w:bookmarkStart w:name="_m-55#22wG}0xt" w:id="92" /><w:bookmarkEnd w:id="92" /></w:p><w:p><w:pPr><w:shd w:val="clear" w:color="auto" w:fill="FFFFFF" /><w:spacing w:before="100" w:beforeAutospacing="1" w:after="100" w:afterAutospacing="1" w:line="270" w:lineRule="atLeast" /><w:rPr><w:rFonts w:ascii="Arial" w:eastAsia="Times New Roman" w:hAnsi="Arial" w:cs="Arial" /><w:color w:val="333333" /><w:kern w:val="0" /><w:sz w:val="20" /><w:szCs w:val="20" /><w14:ligatures w14:val="none" /></w:rPr></w:pPr><w:r><w:rPr><w:rFonts w:ascii="Arial" w:eastAsia="Times New Roman" w:hAnsi="Arial" w:cs="Arial" /><w:color w:val="333333" /><w:kern w:val="0" /><w:sz w:val="20" /><w:szCs w:val="20" /><w14:ligatures w14:val="none" /></w:rPr><w:t>Smoking is not allowed on the festival grounds while the balloons are present. Please be courteous of other festival patrons.</w:t></w:r><w:bookmarkStart w:name="_m-53#02XDVG=MBP6kti5NWxImyCzn!HC&lt;FY%y" w:id="87" /><w:bookmarkEnd w:id="87" /><w:bookmarkStart w:name="_m-53#12~RDeV&gt;3pr2?L4mGw:eZnMJ7B0)sixk" w:id="88" /><w:bookmarkEnd w:id="88" /><w:bookmarkStart w:name="_m-53#22wG{0xv" w:id="89" /><w:bookmarkEnd w:id="89" /></w:p><w:p><w:pPr><w:shd w:val="clear" w:color="auto" w:fill="FFFFFF" /><w:spacing w:before="100" w:beforeAutospacing="1" w:after="100" w:afterAutospacing="1" w:line="270" w:lineRule="atLeast" /><w:outlineLvl w:val="3" /><w:rPr><w:rFonts w:ascii="Arial" w:eastAsia="Times New Roman" w:hAnsi="Arial" w:cs="Arial" /><w:bCs /><w:color w:val="333333" /><w:kern w:val="0" /><w:sz w:val="24" /><w:szCs w:val="24" /><w14:ligatures w14:val="none" /></w:rPr></w:pPr><w:r><w:rPr><w:rFonts w:ascii="Arial" w:eastAsia="Times New Roman" w:hAnsi="Arial" w:cs="Arial" /><w:bCs /><w:color w:val="333333" /><w:kern w:val="0" /><w:sz w:val="24" /><w:szCs w:val="24" /><w14:ligatures w14:val="none" /></w:rPr><w:t>Can I bring a cooler with beverage and food into the festival?</w:t></w:r><w:bookmarkStart w:name="_m-52#02XDUG=NBP5ktj5NVxInyCyn!IC&lt;EY%z" w:id="84" /><w:bookmarkEnd w:id="84" /><w:bookmarkStart w:name="_m-52#12~RCeV?3pq2?M4mFw:fZnLJ7C0)rixl" w:id="85" /><w:bookmarkEnd w:id="85" /><w:bookmarkStart w:name="_m-52#22wGz0xw" w:id="86" /><w:bookmarkEnd w:id="86" /></w:p><w:p><w:pPr><w:shd w:val="clear" w:color="auto" w:fill="FFFFFF" /><w:spacing w:before="100" w:beforeAutospacing="1" w:after="100" w:afterAutospacing="1" w:line="270" w:lineRule="atLeast" /><w:rPr><w:rFonts w:ascii="Arial" w:eastAsia="Times New Roman" w:hAnsi="Arial" w:cs="Arial" /><w:color w:val="333333" /><w:kern w:val="0" /><w:sz w:val="20" /><w:szCs w:val="20" /><w14:ligatures w14:val="none" /></w:rPr></w:pPr><w:r><w:rPr><w:rFonts w:ascii="Arial" w:eastAsia="Times New Roman" w:hAnsi="Arial" w:cs="Arial" /><w:color w:val="333333" /><w:kern w:val="0" /><w:sz w:val="20" /><w:szCs w:val="20" /><w14:ligatures w14:val="none" /></w:rPr><w:t>You can bring a cooler with snacks and plastic or aluminum containers. However, no glass bottles or alcohol are allowed at the festival. We do</w:t></w:r><w:r><w:rPr><w:rFonts w:ascii="Arial" w:eastAsia="Times New Roman" w:hAnsi="Arial" w:cs="Arial" /><w:color w:val="333333" /><w:kern w:val="0" /><w:sz w:val="20" /><w:szCs w:val="20" /><w14:ligatures w14:val="none" /></w:rPr><w:t xml:space="preserve"> provide an assortment of unique foods at our </w:t></w:r><w:r><w:rPr><w:rFonts w:ascii="Arial" w:eastAsia="Times New Roman" w:hAnsi="Arial" w:cs="Arial" /><w:color w:val="333333" /><w:kern w:val="0" /><w:sz w:val="20" /><w:szCs w:val="20" /><w14:ligatures w14:val="none" /></w:rPr><w:t>food vendor</w:t></w:r><w:r><w:rPr><w:rFonts w:ascii="Arial" w:eastAsia="Times New Roman" w:hAnsi="Arial" w:cs="Arial" /><w:color w:val="333333" /><w:kern w:val="0" /><w:sz w:val="20" /><w:szCs w:val="20" /><w14:ligatures w14:val="none" /></w:rPr><w:t xml:space="preserve"> stands.</w:t></w:r><w:bookmarkStart w:name="_m-4Y#02XE[G&lt;HBQ;ksd5O\xHhyD!n~CC=KY$t" w:id="81" /><w:bookmarkEnd w:id="81" /><w:bookmarkStart w:name="_m-4Y#12~SIeU93qw2&gt;G4nLw9`ZoRJ6=0*xiwf" w:id="82" /><w:bookmarkEnd w:id="82" /><w:bookmarkStart w:name="_m-4Y#22wH&quot;0wq" w:id="83" /><w:bookmarkEnd w:id="83" /></w:p><w:p><w:pPr><w:shd w:val="clear" w:color="auto" w:fill="FFFFFF" /><w:spacing w:before="100" w:beforeAutospacing="1" w:after="100" w:afterAutospacing="1" w:line="270" w:lineRule="atLeast" /><w:outlineLvl w:val="3" /><w:rPr><w:rFonts w:ascii="Arial" w:eastAsia="Times New Roman" w:hAnsi="Arial" w:cs="Arial" /><w:bCs /><w:color w:val="333333" /><w:kern w:val="0" /><w:sz w:val="24" /><w:szCs w:val="24" /><w14:ligatures w14:val="none" /></w:rPr></w:pPr><w:r><w:rPr><w:rFonts w:ascii="Arial" w:eastAsia="Times New Roman" w:hAnsi="Arial" w:cs="Arial" /><w:bCs /><w:color w:val="333333" /><w:kern w:val="0" /><w:sz w:val="24" /><w:szCs w:val="24" /><w14:ligatures w14:val="none" /></w:rPr><w:t>What are my camping, RV, or lodging options?</w:t></w:r><w:bookmarkStart w:name="_m-4W#02XEYG&lt;JBQ9ksf5OZxHjyD}n~EC=IY$v" w:id="78" /><w:bookmarkEnd w:id="78" /><w:bookmarkStart w:name="_m-4W#12~SGeU;3qu2&gt;I4nJw9bZoPJ6?0*viwh" w:id="79" /><w:bookmarkEnd w:id="79" /><w:bookmarkStart w:name="_m-4W#22wH~0ws" w:id="80" /><w:bookmarkEnd w:id="80" /></w:p><w:p><w:pPr><w:shd w:val="clear" w:color="auto" w:fill="FFFFFF" /><w:spacing w:beforeAutospacing="1" w:after="0" w:afterAutospacing="1" w:line="270" w:lineRule="atLeast" /><w:rPr><w:rFonts w:ascii="Arial" w:eastAsia="Times New Roman" w:hAnsi="Arial" w:cs="Arial" /><w:color w:val="333333" /><w:kern w:val="0" /><w:sz w:val="20" /><w:szCs w:val="20" /><w14:ligatures w14:val="none" /></w:rPr></w:pPr><w:r><w:rPr><w:rFonts w:ascii="Arial" w:eastAsia="Times New Roman" w:hAnsi="Arial" w:cs="Arial" /><w:color w:val="333333" /><w:kern w:val="0" /><w:sz w:val="20" /><w:szCs w:val="20" /><w14:ligatures w14:val="none" /></w:rPr><w:t>While you cannot camp or park an RV on the festival grounds, there are camping options nearby.</w:t></w:r><w:r><w:rPr><w:rFonts w:ascii="Arial" w:eastAsia="Times New Roman" w:hAnsi="Arial" w:cs="Arial" /><w:color w:val="333333" /><w:kern w:val="0" /><w:sz w:val="20" /><w:szCs w:val="20" /><w14:ligatures w14:val="none" /></w:rPr><w:t xml:space="preserve"> Check with the </w:t></w:r><w:r><w:rPr><w:rFonts w:ascii="Arial" w:eastAsia="Times New Roman" w:hAnsi="Arial" w:cs="Arial" /><w:color w:val="333333" /><w:kern w:val="0" /><w:sz w:val="20" /><w:szCs w:val="20" /><w14:ligatures w14:val="none" /></w:rPr><w:t>Mount Sedona</w:t></w:r><w:r><w:rPr><w:rFonts w:ascii="Arial" w:eastAsia="Times New Roman" w:hAnsi="Arial" w:cs="Arial" /><w:color w:val="333333" /><w:kern w:val="0" /><w:sz w:val="20" /><w:szCs w:val="20" /><w14:ligatures w14:val="none" /></w:rPr><w:t xml:space="preserve"> County Chamber of Commerce for a complete list of camping facilities.</w:t></w:r><w:bookmarkStart w:name="_m-4V#02XEXG&lt;KBQ8ksg5OYxHkyD|n~FC=HY$w" w:id="75" /><w:bookmarkEnd w:id="75" /><w:bookmarkStart w:name="_m-4V#12~SFeU&lt;3qt2&gt;J4nIw9cZoOJ6@0*uiwi" w:id="76" /><w:bookmarkEnd w:id="76" /><w:bookmarkStart w:name="_m-4V#22wH}0wt" w:id="77" /><w:bookmarkEnd w:id="77" /></w:p><w:p><w:pPr><w:shd w:val="clear" w:color="auto" w:fill="FFFFFF" /><w:spacing w:before="100" w:beforeAutospacing="1" w:after="100" w:afterAutospacing="1" w:line="270" w:lineRule="atLeast" /><w:outlineLvl w:val="3" /><w:rPr><w:rFonts w:ascii="Arial" w:eastAsia="Times New Roman" w:hAnsi="Arial" w:cs="Arial" /><w:bCs /><w:color w:val="333333" /><w:kern w:val="0" /><w:sz w:val="24" /><w:szCs w:val="24" /><w14:ligatures w14:val="none" /></w:rPr></w:pPr><w:r><w:rPr><w:rFonts w:ascii="Arial" w:eastAsia="Times New Roman" w:hAnsi="Arial" w:cs="Arial" /><w:bCs /><w:color w:val="333333" /><w:kern w:val="0" /><w:sz w:val="24" /><w:szCs w:val="24" /><w14:ligatures w14:val="none" /></w:rPr><w:t>How c</w:t></w:r><w:r><w:rPr><w:rFonts w:ascii="Arial" w:eastAsia="Times New Roman" w:hAnsi="Arial" w:cs="Arial" /><w:bCs /><w:color w:val="333333" /><w:kern w:val="0" /><w:sz w:val="24" /><w:szCs w:val="24" /><w14:ligatures w14:val="none" /></w:rPr><w:t xml:space="preserve">an I </w:t></w:r><w:r><w:rPr><w:rFonts w:ascii="Arial" w:eastAsia="Times New Roman" w:hAnsi="Arial" w:cs="Arial" /><w:bCs /><w:color w:val="333333" /><w:kern w:val="0" /><w:sz w:val="24" /><w:szCs w:val="24" /><w14:ligatures w14:val="none" /></w:rPr><w:t>plan for the best e</w:t></w:r><w:r><w:rPr><w:rFonts w:ascii="Arial" w:eastAsia="Times New Roman" w:hAnsi="Arial" w:cs="Arial" /><w:bCs /><w:color w:val="333333" /><w:kern w:val="0" /><w:sz w:val="24" /><w:szCs w:val="24" /><w14:ligatures w14:val="none" /></w:rPr><w:t>xperience?</w:t></w:r><w:bookmarkStart w:name="_m-4S#02XEUG&lt;NBQ5ksj5OVxHnyDyn~IC=EY$z" w:id="72" /><w:bookmarkEnd w:id="72" /><w:bookmarkStart w:name="_m-4S#12~SCeU?3qq2&gt;M4nFw9fZoLJ6C0*riwl" w:id="73" /><w:bookmarkEnd w:id="73" /><w:bookmarkStart w:name="_m-4S#22wHz0ww" w:id="74" /><w:bookmarkEnd w:id="74" /></w:p><w:p><w:pPr><w:shd w:val="clear" w:color="auto" w:fill="FFFFFF" /><w:spacing w:beforeAutospacing="1" w:after="0" w:afterAutospacing="1" w:line="270" w:lineRule="atLeast" /><w:rPr><w:rFonts w:ascii="Arial" w:eastAsia="Times New Roman" w:hAnsi="Arial" w:cs="Arial" /><w:color w:val="333333" /><w:kern w:val="0" /><w:sz w:val="20" /><w:szCs w:val="20" /><w14:ligatures w14:val="none" /></w:rPr></w:pPr><w:r><w:rPr><w:rFonts w:ascii="Arial" w:eastAsia="Times New Roman" w:hAnsi="Arial" w:cs="Arial" /><w:color w:val="333333" /><w:kern w:val="0" /><w:sz w:val="20" /><w:szCs w:val="20" /><w14:ligatures w14:val="none" /></w:rPr><w:t>Although there is no perfect formula, the follow</w:t></w:r><w:r><w:rPr><w:rFonts w:ascii="Arial" w:eastAsia="Times New Roman" w:hAnsi="Arial" w:cs="Arial" /><w:color w:val="333333" /><w:kern w:val="0" /><w:sz w:val="20" /><w:szCs w:val="20" /><w14:ligatures w14:val="none" /></w:rPr><w:t>ing</w:t></w:r><w:r><w:rPr><w:rFonts w:ascii="Arial" w:eastAsia="Times New Roman" w:hAnsi="Arial" w:cs="Arial" /><w:color w:val="333333" /><w:kern w:val="0" /><w:sz w:val="20" /><w:szCs w:val="20" /><w14:ligatures w14:val="none" /></w:rPr><w:t xml:space="preserve"> tips should </w:t></w:r><w:r><w:rPr><w:rFonts w:ascii="Arial" w:eastAsia="Times New Roman" w:hAnsi="Arial" w:cs="Arial" /><w:color w:val="333333" /><w:kern w:val="0" /><w:sz w:val="20" /><w:szCs w:val="20" /><w14:ligatures w14:val="none" /></w:rPr><w:t>e</w:t></w:r><w:r><w:rPr><w:rFonts w:ascii="Arial" w:eastAsia="Times New Roman" w:hAnsi="Arial" w:cs="Arial" /><w:color w:val="333333" /><w:kern w:val="0" /><w:sz w:val="20" /><w:szCs w:val="20" /><w14:ligatures w14:val="none" /></w:rPr><w:t>nsure that you have all the bases covered!</w:t></w:r><w:bookmarkStart w:name="_m-4Q#02XESG&lt;PBQ3ksl5OTxHpyDwn~KC=CY$|" w:id="69" /><w:bookmarkEnd w:id="69" /><w:bookmarkStart w:name="_m-4Q#12~SAeUA3qo2&gt;O4nDw9hZoJJ6E0*piwn" w:id="70" /><w:bookmarkEnd w:id="70" /><w:bookmarkStart w:name="_m-4Q#22wHx0wy" w:id="71" /><w:bookmarkEnd w:id="71" /></w:p><w:p><w:pPr><w:shd w:val="clear" w:color="auto" w:fill="FFFFFF" /><w:spacing w:beforeAutospacing="1" w:after="0" w:afterAutospacing="1" w:line="270" w:lineRule="atLeast" /><w:rPr><w:rFonts w:ascii="Arial" w:eastAsia="Times New Roman" w:hAnsi="Arial" w:cs="Arial" /><w:color w:val="333333" /><w:kern w:val="0" /><w:sz w:val="20" /><w:szCs w:val="20" /><w14:ligatures w14:val="none" /></w:rPr></w:pPr><w:r><w:rPr><w:rFonts w:ascii="Arial" w:eastAsia="Times New Roman" w:hAnsi="Arial" w:cs="Arial" /><w:color w:val="333333" /><w:kern w:val="0" /><w:sz w:val="20" /><w:szCs w:val="20" /><w14:ligatures w14:val="none" /></w:rPr><w:t>Wear good walking shoes. The park encompasses 15 acres, so hiking is a strong possibility.</w:t></w:r><w:bookmarkStart w:name="_m-4N#02XFZG;IBR:kre5P[xGiyE~n}DC&gt;JY#u" w:id="66" /><w:bookmarkEnd w:id="66" /><w:bookmarkStart w:name="_m-4N#12~THeT:3rv2=H4oKw8aZpQJ5&gt;0+wivg" w:id="67" /><w:bookmarkEnd w:id="67" /><w:bookmarkStart w:name="_m-4N#22wI!0vr" w:id="68" /><w:bookmarkEnd w:id="68" /></w:p><w:p><w:pPr><w:shd w:val="clear" w:color="auto" w:fill="FFFFFF" /><w:spacing w:beforeAutospacing="1" w:after="0" w:afterAutospacing="1" w:line="270" w:lineRule="atLeast" /><w:rPr><w:rFonts w:ascii="Arial" w:eastAsia="Times New Roman" w:hAnsi="Arial" w:cs="Arial" /><w:color w:val="333333" /><w:kern w:val="0" /><w:sz w:val="20" /><w:szCs w:val="20" /><w14:ligatures w14:val="none" /></w:rPr></w:pPr><w:r><w:rPr><w:rFonts w:ascii="Arial" w:eastAsia="Times New Roman" w:hAnsi="Arial" w:cs="Arial" /><w:color w:val="333333" /><w:kern w:val="0" /><w:sz w:val="20" /><w:szCs w:val="20" /><w14:ligatures w14:val="none" /></w:rPr><w:lastRenderedPageBreak /><w:t>Bring sunscreen. There is very little shade.</w:t></w:r><w:bookmarkStart w:name="_m-4J#02XFVG;MBR6kri5PWxGmyEzn}HC&gt;FY#y" w:id="63" /><w:bookmarkEnd w:id="63" /><w:bookmarkStart w:name="_m-4J#12~TDeT&gt;3rr2=L4oGw8eZpMJ5B0+sivk" w:id="64" /><w:bookmarkEnd w:id="64" /><w:bookmarkStart w:name="_m-4J#22wI{0vv" w:id="65" /><w:bookmarkEnd w:id="65" /></w:p><w:p><w:pPr><w:shd w:val="clear" w:color="auto" w:fill="FFFFFF" /><w:spacing w:beforeAutospacing="1" w:after="0" w:afterAutospacing="1" w:line="270" w:lineRule="atLeast" /><w:rPr><w:rFonts w:ascii="Arial" w:eastAsia="Times New Roman" w:hAnsi="Arial" w:cs="Arial" /><w:color w:val="333333" /><w:kern w:val="0" /><w:sz w:val="20" /><w:szCs w:val="20" /><w14:ligatures w14:val="none" /></w:rPr></w:pPr><w:r><w:rPr><w:rFonts w:ascii="Arial" w:eastAsia="Times New Roman" w:hAnsi="Arial" w:cs="Arial" /><w:color w:val="333333" /><w:kern w:val="0" /><w:sz w:val="20" /><w:szCs w:val="20" /><w14:ligatures w14:val="none" /></w:rPr><w:t>Get to the park early. When the balloons inflate, long lines form.</w:t></w:r><w:bookmarkStart w:name="_m-4H#02XFTG;OBR4krk5PUxGoyExn}JC&gt;DY#{" w:id="60" /><w:bookmarkEnd w:id="60" /><w:bookmarkStart w:name="_m-4H#12~TBeT@3rp2=N4oEw8gZpKJ5D0+qivm" w:id="61" /><w:bookmarkEnd w:id="61" /><w:bookmarkStart w:name="_m-4H#22wIy0vx" w:id="62" /><w:bookmarkEnd w:id="62" /></w:p><w:p><w:pPr><w:shd w:val="clear" w:color="auto" w:fill="FFFFFF" /><w:spacing w:beforeAutospacing="1" w:after="0" w:afterAutospacing="1" w:line="270" w:lineRule="atLeast" /><w:rPr><w:rFonts w:ascii="Arial" w:eastAsia="Times New Roman" w:hAnsi="Arial" w:cs="Arial" /><w:color w:val="333333" /><w:kern w:val="0" /><w:sz w:val="20" /><w:szCs w:val="20" /><w14:ligatures w14:val="none" /></w:rPr></w:pPr><w:r><w:rPr><w:rFonts w:ascii="Arial" w:eastAsia="Times New Roman" w:hAnsi="Arial" w:cs="Arial" /><w:color w:val="333333" /><w:kern w:val="0" /><w:sz w:val="20" /><w:szCs w:val="20" /><w14:ligatures w14:val="none" /></w:rPr><w:t>Wear comfortable, cool clothing. If you take tether rides, the flame does make it hot in the basket.</w:t></w:r><w:bookmarkStart w:name="_m-4E#02XG[G:HBS;kqd5Q\xFhyF!n|CC?KY&quot;t" w:id="57" /><w:bookmarkEnd w:id="57" /><w:bookmarkStart w:name="_m-4E#12~UIeS93sw2&lt;G4pLw7`ZqRJ4=0,xiuf" w:id="58" /><w:bookmarkEnd w:id="58" /><w:bookmarkStart w:name="_m-4E#22wJ&quot;0uq" w:id="59" /><w:bookmarkEnd w:id="59" /></w:p><w:p><w:pPr><w:shd w:val="clear" w:color="auto" w:fill="FFFFFF" /><w:spacing w:beforeAutospacing="1" w:after="0" w:afterAutospacing="1" w:line="270" w:lineRule="atLeast" /><w:rPr><w:rFonts w:ascii="Arial" w:eastAsia="Times New Roman" w:hAnsi="Arial" w:cs="Arial" /><w:color w:val="333333" /><w:kern w:val="0" /><w:sz w:val="20" /><w:szCs w:val="20" /><w14:ligatures w14:val="none" /></w:rPr></w:pPr><w:r><w:rPr><w:rFonts w:ascii="Arial" w:eastAsia="Times New Roman" w:hAnsi="Arial" w:cs="Arial" /><w:color w:val="333333" /><w:kern w:val="0" /><w:sz w:val="20" /><w:szCs w:val="20" /><w14:ligatures w14:val="none" /></w:rPr><w:t>Bring</w:t></w:r><w:r><w:rPr><w:rFonts w:ascii="Arial" w:eastAsia="Times New Roman" w:hAnsi="Arial" w:cs="Arial" /><w:color w:val="333333" /><w:kern w:val="0" /><w:sz w:val="20" /><w:szCs w:val="20" /><w14:ligatures w14:val="none" /></w:rPr><w:t xml:space="preserve"> a camera and tripod. The ballu</w:t></w:r><w:r><w:rPr><w:rFonts w:ascii="Arial" w:eastAsia="Times New Roman" w:hAnsi="Arial" w:cs="Arial" /><w:color w:val="333333" /><w:kern w:val="0" /><w:sz w:val="20" /><w:szCs w:val="20" /><w14:ligatures w14:val="none" /></w:rPr><w:t>mination at dusk is a beautiful photo opportunity, but the low light makes a tripod a necessity.</w:t></w:r><w:bookmarkStart w:name="_m-4B#02XGXG:KBS8kqg5QYxFkyF|n|FC?HY&quot;w" w:id="54" /><w:bookmarkEnd w:id="54" /><w:bookmarkStart w:name="_m-4B#12~UFeS&lt;3st2&lt;J4pIw7cZqOJ4@0,uiui" w:id="55" /><w:bookmarkEnd w:id="55" /><w:bookmarkStart w:name="_m-4B#22wJ}0ut" w:id="56" /><w:bookmarkEnd w:id="56" /></w:p><w:p><w:pPr><w:shd w:val="clear" w:color="auto" w:fill="FFFFFF" /><w:spacing w:beforeAutospacing="1" w:after="0" w:afterAutospacing="1" w:line="270" w:lineRule="atLeast" /><w:rPr><w:rFonts w:ascii="Arial" w:eastAsia="Times New Roman" w:hAnsi="Arial" w:cs="Arial" /><w:color w:val="333333" /><w:kern w:val="0" /><w:sz w:val="20" /><w:szCs w:val="20" /><w14:ligatures w14:val="none" /></w:rPr></w:pPr><w:r><w:rPr><w:rFonts w:ascii="Arial" w:eastAsia="Times New Roman" w:hAnsi="Arial" w:cs="Arial" /><w:color w:val="333333" /><w:kern w:val="0" /><w:sz w:val="20" /><w:szCs w:val="20" /><w14:ligatures w14:val="none" /></w:rPr><w:t>Bring lawn chairs and/or blankets.</w:t></w:r><w:bookmarkStart w:name="_m-48#02XGUG:NBS5kqj5QVxFnyFyn|IC?EY&quot;z" w:id="51" /><w:bookmarkEnd w:id="51" /><w:bookmarkStart w:name="_m-48#12~UCeS?3sq2&lt;M4pFw7fZqLJ4C0,riul" w:id="52" /><w:bookmarkEnd w:id="52" /><w:bookmarkStart w:name="_m-48#22wJz0uw" w:id="53" /><w:bookmarkEnd w:id="53" /></w:p><w:p><w:pPr><w:shd w:val="clear" w:color="auto" w:fill="FFFFFF" /><w:spacing w:beforeAutospacing="1" w:after="0" w:afterAutospacing="1" w:line="270" w:lineRule="atLeast" /><w:rPr><w:rFonts w:ascii="Arial" w:eastAsia="Times New Roman" w:hAnsi="Arial" w:cs="Arial" /><w:color w:val="333333" /><w:kern w:val="0" /><w:sz w:val="20" /><w:szCs w:val="20" /><w14:ligatures w14:val="none" /></w:rPr></w:pPr><w:r><w:rPr><w:rFonts w:ascii="Arial" w:eastAsia="Times New Roman" w:hAnsi="Arial" w:cs="Arial" /><w:color w:val="333333" /><w:kern w:val="0" /><w:sz w:val="20" /><w:szCs w:val="20" /><w14:ligatures w14:val="none" /></w:rPr><w:t>Bring, or prepare to buy, plenty of water.</w:t></w:r><w:bookmarkStart w:name="_m-47#02XGTG:OBS4kqk5QUxFoyFxn|JC?DY&quot;{" w:id="48" /><w:bookmarkEnd w:id="48" /><w:bookmarkStart w:name="_m-47#12~UBeS@3sp2&lt;N4pEw7gZqKJ4D0,qium" w:id="49" /><w:bookmarkEnd w:id="49" /><w:bookmarkStart w:name="_m-47#22wJy0ux" w:id="50" /><w:bookmarkEnd w:id="50" /></w:p><w:p><w:pPr><w:shd w:val="clear" w:color="auto" w:fill="FFFFFF" /><w:spacing w:beforeAutospacing="1" w:after="0" w:afterAutospacing="1" w:line="270" w:lineRule="atLeast" /><w:rPr><w:rFonts w:ascii="Arial" w:eastAsia="Times New Roman" w:hAnsi="Arial" w:cs="Arial" /><w:color w:val="333333" /><w:kern w:val="0" /><w:sz w:val="20" /><w:szCs w:val="20" /><w14:ligatures w14:val="none" /></w:rPr></w:pPr><w:r><w:rPr><w:rFonts w:ascii="Arial" w:eastAsia="Times New Roman" w:hAnsi="Arial" w:cs="Arial" /><w:color w:val="333333" /><w:kern w:val="0" /><w:sz w:val="20" /><w:szCs w:val="20" /><w14:ligatures w14:val="none" /></w:rPr><w:t>Bring Frisbees or balls for children to play with in the large open field while you wait for a show to begin.</w:t></w:r><w:bookmarkStart w:name="_m-42#02XHYG9JBT9kpf5RZxEjyG}n{EC@IY!v" w:id="45" /><w:bookmarkEnd w:id="45" /><w:bookmarkStart w:name="_m-42#12~VGeR;3tu2;I4qJw6bZrPJ3?0-vith" w:id="46" /><w:bookmarkEnd w:id="46" /><w:bookmarkStart w:name="_m-42#22wK~0ts" w:id="47" /><w:bookmarkEnd w:id="47" /></w:p><w:p><w:pPr><w:shd w:val="clear" w:color="auto" w:fill="FFFFFF" /><w:spacing w:beforeAutospacing="1" w:after="0" w:afterAutospacing="1" w:line="270" w:lineRule="atLeast" /><w:rPr><w:rFonts w:ascii="Verdana" w:eastAsia="Times New Roman" w:hAnsi="Verdana" w:cs="Times New Roman" /><w:color w:val="444E5C" /><w:kern w:val="0" /><w:sz w:val="20" /><w:szCs w:val="20" /><w14:ligatures w14:val="none" /></w:rPr></w:pPr><w:bookmarkStart w:name="_m-3X#02XHTG9OBT4kpk5RUxEoyGxn{JC@DY!{" w:id="42" /><w:bookmarkEnd w:id="42" /><w:bookmarkStart w:name="_m-3X#12~VBeR@3tp2;N4qEw6gZrKJ3D0-qitm" w:id="43" /><w:bookmarkEnd w:id="43" /><w:bookmarkStart w:name="_m-3X#22wKy0tx" w:id="44" /><w:bookmarkEnd w:id="44" /></w:p><w:p><w:pPr><w:shd w:val="clear" w:color="auto" w:fill="FFFFFF" /><w:spacing w:beforeAutospacing="1" w:after="0" w:afterAutospacing="1" w:line="270" w:lineRule="atLeast" /><w:rPr><w:rStyle w:val="Strong" /><w:rFonts w:ascii="Arial" w:hAnsi="Arial" w:cs="Arial" /></w:rPr></w:pPr><w:r><w:rPr><w:rStyle w:val="Strong" /><w:rFonts w:ascii="Arial" w:hAnsi="Arial" w:cs="Arial" /></w:rPr><w:t>Event S</w:t></w:r><w:r><w:rPr><w:rStyle w:val="Strong" /><w:rFonts w:ascii="Arial" w:hAnsi="Arial" w:cs="Arial" /></w:rPr><w:t>chedule</w:t></w:r><w:bookmarkStart w:name="_m-3V#02XI\G8GBU&lt;koc5S]xDgyH&quot;nzBCALY~s" w:id="39" /><w:bookmarkEnd w:id="39" /><w:bookmarkStart w:name="_m-3V#12~WJeQ83ux2:F4rMw5_ZsSJ2&lt;0.yise" w:id="40" /><w:bookmarkEnd w:id="40" /><w:bookmarkStart w:name="_m-3V#22wL#0sp" w:id="41" /><w:bookmarkEnd w:id="41" /></w:p><w:p><w:pPr><w:shd w:val="clear" w:color="auto" w:fill="FFFFFF" /><w:spacing w:beforeAutospacing="1" w:after="0" w:afterAutospacing="1" w:line="270" w:lineRule="atLeast" /><w:rPr><w:rStyle w:val="Strong" /><w:rFonts w:ascii="Arial" w:hAnsi="Arial" w:cs="Arial" /></w:rPr></w:pPr><w:r><w:rPr><w:rStyle w:val="Strong" /><w:rFonts w:ascii="Arial" w:hAnsi="Arial" w:cs="Arial" /></w:rPr><w:t>Saturday (5/2</w:t></w:r><w:r><w:rPr><w:rStyle w:val="Strong" /><w:rFonts w:ascii="Arial" w:hAnsi="Arial" w:cs="Arial" /></w:rPr><w:t>8</w:t></w:r><w:r><w:rPr><w:rStyle w:val="Strong" /><w:rFonts w:ascii="Arial" w:hAnsi="Arial" w:cs="Arial" /></w:rPr><w:t>/</w:t></w:r><w:r><w:rPr><w:rStyle w:val="Strong" /><w:rFonts w:ascii="Arial" w:hAnsi="Arial" w:cs="Arial" /></w:rPr><w:t>202</w:t></w:r><w:r><w:rPr><w:rStyle w:val="Strong" /><w:rFonts w:ascii="Arial" w:hAnsi="Arial" w:cs="Arial" /></w:rPr><w:t>4</w:t></w:r><w:r><w:rPr><w:rStyle w:val="Strong" /><w:rFonts w:ascii="Arial" w:hAnsi="Arial" w:cs="Arial" /></w:rPr><w:t>)</w:t></w:r><w:bookmarkStart w:name="_m-3T#02XIZG8IBU:koe5S[xDiyH~nzDCAJY~u" w:id="36" /><w:bookmarkEnd w:id="36" /><w:bookmarkStart w:name="_m-3T#12~WHeQ:3uv2:H4rKw5aZsQJ2&gt;0.wisg" w:id="37" /><w:bookmarkEnd w:id="37" /><w:bookmarkStart w:name="_m-3T#22wL!0sr" w:id="38" /><w:bookmarkEnd w:id="38" /></w:p><w:p><w:pPr><w:shd w:val="clear" w:color="auto" w:fill="FFFFFF" /><w:spacing w:beforeAutospacing="1" w:after="0" w:afterAutospacing="1" w:line="270" w:lineRule="atLeast" /><w:rPr><w:rFonts w:ascii="Arial" w:hAnsi="Arial" w:cs="Arial" /></w:rPr></w:pPr><w:r><w:rPr><w:rFonts w:ascii="Arial" w:hAnsi="Arial" w:cs="Arial" /></w:rPr><w:t xml:space="preserve">6:00 AM </w:t></w:r><w:r><w:rPr><w:rFonts w:ascii="Arial" w:hAnsi="Arial" w:cs="Arial" /></w:rPr><w:t>Pilots Briefing</w:t></w:r><w:bookmarkStart w:name="_m-3R#02XIXG8KBU8kog5SYxDkyH|nzFCAHY~w" w:id="33" /><w:bookmarkEnd w:id="33" /><w:bookmarkStart w:name="_m-3R#12~WFeQ&lt;3ut2:J4rIw5cZsOJ2@0.uisi" w:id="34" /><w:bookmarkEnd w:id="34" /><w:bookmarkStart w:name="_m-3R#22wL}0st" w:id="35" /><w:bookmarkEnd w:id="35" /></w:p><w:p><w:pPr><w:shd w:val="clear" w:color="auto" w:fill="FFFFFF" /><w:spacing w:beforeAutospacing="1" w:after="0" w:afterAutospacing="1" w:line="270" w:lineRule="atLeast" /><w:rPr><w:rFonts w:ascii="Arial" w:hAnsi="Arial" w:cs="Arial" /></w:rPr></w:pPr><w:r><w:rPr><w:rFonts w:ascii="Arial" w:hAnsi="Arial" w:cs="Arial" /></w:rPr><w:t>6:30 AM Hare and Hound Race</w:t></w:r><w:bookmarkStart w:name="_m-3N#02XITG8OBU4kok5SUxDoyHxnzJCADY~{" w:id="30" /><w:bookmarkEnd w:id="30" /><w:bookmarkStart w:name="_m-3N#12~WBeQ@3up2:N4rEw5gZsKJ2D0.qism" w:id="31" /><w:bookmarkEnd w:id="31" /><w:bookmarkStart w:name="_m-3N#22wLy0sx" w:id="32" /><w:bookmarkEnd w:id="32" /></w:p><w:p><w:pPr><w:shd w:val="clear" w:color="auto" w:fill="FFFFFF" /><w:spacing w:beforeAutospacing="1" w:after="0" w:afterAutospacing="1" w:line="270" w:lineRule="atLeast" /><w:rPr><w:rFonts w:ascii="Arial" w:hAnsi="Arial" w:cs="Arial" /></w:rPr></w:pPr><w:r><w:rPr><w:rFonts w:ascii="Arial" w:hAnsi="Arial" w:cs="Arial" /></w:rPr><w:t>5:00 PM Pilot Briefing</w:t></w:r><w:bookmarkStart w:name="_m-3J#02XJZG7IBV:kne5T[xCiyI~nyDCBJY}u" w:id="27" /><w:bookmarkEnd w:id="27" /><w:bookmarkStart w:name="_m-3J#12~XHeP:3vv29H4sKw4aZtQJ1&gt;0/wirg" w:id="28" /><w:bookmarkEnd w:id="28" /><w:bookmarkStart w:name="_m-3J#22wM!0rr" w:id="29" /><w:bookmarkEnd w:id="29" /></w:p><w:p><w:pPr><w:shd w:val="clear" w:color="auto" w:fill="FFFFFF" /><w:spacing w:beforeAutospacing="1" w:after="0" w:afterAutospacing="1" w:line="270" w:lineRule="atLeast" /><w:rPr><w:rFonts w:ascii="Arial" w:hAnsi="Arial" w:cs="Arial" /></w:rPr></w:pPr><w:r><w:rPr><w:rFonts w:ascii="Arial" w:hAnsi="Arial" w:cs="Arial" /></w:rPr><w:t>5:30 PM Fun Flight</w:t></w:r><w:bookmarkStart w:name="_m-3H#02XJXG7KBV8kng5TYxCkyI|nyFCBHY}w" w:id="24" /><w:bookmarkEnd w:id="24" /><w:bookmarkStart w:name="_m-3H#12~XFeP&lt;3vt29J4sIw4cZtOJ1@0/uiri" w:id="25" /><w:bookmarkEnd w:id="25" /><w:bookmarkStart w:name="_m-3H#22wM}0rt" w:id="26" /><w:bookmarkEnd w:id="26" /></w:p><w:p><w:pPr><w:shd w:val="clear" w:color="auto" w:fill="FFFFFF" /><w:spacing w:beforeAutospacing="1" w:after="0" w:afterAutospacing="1" w:line="270" w:lineRule="atLeast" /><w:rPr><w:rFonts w:ascii="Arial" w:hAnsi="Arial" w:cs="Arial" /></w:rPr></w:pPr><w:r><w:rPr><w:rFonts w:ascii="Arial" w:hAnsi="Arial" w:cs="Arial" /></w:rPr><w:t>6:30 PM Tethers</w:t></w:r><w:bookmarkStart w:name="_m-3C#02XJSG7PBV3knl5TTxCpyIwnyKCBCY}|" w:id="21" /><w:bookmarkEnd w:id="21" /><w:bookmarkStart w:name="_m-3C#12~XAePA3vo29O4sDw4hZtJJ1E0/pirn" w:id="22" /><w:bookmarkEnd w:id="22" /><w:bookmarkStart w:name="_m-3C#22wMx0ry" w:id="23" /><w:bookmarkEnd w:id="23" /></w:p><w:p><w:pPr><w:shd w:val="clear" w:color="auto" w:fill="FFFFFF" /><w:spacing w:beforeAutospacing="1" w:after="0" w:afterAutospacing="1" w:line="270" w:lineRule="atLeast" /><w:rPr><w:rFonts w:ascii="Arial" w:hAnsi="Arial" w:cs="Arial" /></w:rPr></w:pPr><w:r><w:rPr><w:rFonts w:ascii="Arial" w:hAnsi="Arial" w:cs="Arial" /></w:rPr><w:t>8:15 PM Balloon Glow</w:t></w:r><w:bookmarkStart w:name="_m-3A#02XK[G6HBW;kmd5U\xBhyJ!nxCCCKY|t" w:id="18" /><w:bookmarkEnd w:id="18" /><w:bookmarkStart w:name="_m-3A#12~YIeO93ww28G4tLw3`ZuRJ0=00xiqf" w:id="19" /><w:bookmarkEnd w:id="19" /><w:bookmarkStart w:name="_m-3A#22wN&quot;0qq" w:id="20" /><w:bookmarkEnd w:id="20" /></w:p><w:p><w:pPr><w:shd w:val="clear" w:color="auto" w:fill="FFFFFF" /><w:spacing w:beforeAutospacing="1" w:after="0" w:afterAutospacing="1" w:line="270" w:lineRule="atLeast" /><w:rPr><w:rStyle w:val="Strong" /><w:rFonts w:ascii="Arial" w:hAnsi="Arial" w:cs="Arial" /></w:rPr></w:pPr><w:r><w:rPr><w:rStyle w:val="Strong" /><w:rFonts w:ascii="Arial" w:hAnsi="Arial" w:cs="Arial" /></w:rPr><w:t>Sunday (5/2</w:t></w:r><w:r><w:rPr><w:rStyle w:val="Strong" /><w:rFonts w:ascii="Arial" w:hAnsi="Arial" w:cs="Arial" /></w:rPr><w:t>9</w:t></w:r><w:r><w:rPr><w:rStyle w:val="Strong" /><w:rFonts w:ascii="Arial" w:hAnsi="Arial" w:cs="Arial" /></w:rPr><w:t>/</w:t></w:r><w:r><w:rPr><w:rStyle w:val="Strong" /><w:rFonts w:ascii="Arial" w:hAnsi="Arial" w:cs="Arial" /></w:rPr><w:t>202</w:t></w:r><w:r><w:rPr><w:rStyle w:val="Strong" /><w:rFonts w:ascii="Arial" w:hAnsi="Arial" w:cs="Arial" /></w:rPr><w:t>4</w:t></w:r><w:r><w:rPr><w:rStyle w:val="Strong" /><w:rFonts w:ascii="Arial" w:hAnsi="Arial" w:cs="Arial" /></w:rPr><w:t>)</w:t></w:r><w:bookmarkStart w:name="_m-38#02XKYG6JBW9kmf5UZxBjyJ}nxECCIY|v" w:id="15" /><w:bookmarkEnd w:id="15" /><w:bookmarkStart w:name="_m-38#12~YGeO;3wu28I4tJw3bZuPJ0?00viqh" w:id="16" /><w:bookmarkEnd w:id="16" /><w:bookmarkStart w:name="_m-38#22wN~0qs" w:id="17" /><w:bookmarkEnd w:id="17" /></w:p><w:p><w:pPr><w:shd w:val="clear" w:color="auto" w:fill="FFFFFF" /><w:spacing w:beforeAutospacing="1" w:after="0" w:afterAutospacing="1" w:line="270" w:lineRule="atLeast" /><w:rPr><w:rFonts w:ascii="Arial" w:hAnsi="Arial" w:cs="Arial" /></w:rPr></w:pPr><w:r><w:rPr><w:rFonts w:ascii="Arial" w:hAnsi="Arial" w:cs="Arial" /></w:rPr><w:t>6:00 AM Pilots Briefing</w:t></w:r><w:bookmarkStart w:name="_m-37#02XKXG6KBW8kmg5UYxBkyJ|nxFCCHY|w" w:id="12" /><w:bookmarkEnd w:id="12" /><w:bookmarkStart w:name="_m-37#12~YFeO&lt;3wt28J4tIw3cZuOJ0@00uiqi" w:id="13" /><w:bookmarkEnd w:id="13" /><w:bookmarkStart w:name="_m-37#22wN}0qt" w:id="14" /><w:bookmarkEnd w:id="14" /></w:p><w:p><w:pPr><w:shd w:val="clear" w:color="auto" w:fill="FFFFFF" /><w:spacing w:beforeAutospacing="1" w:after="0" w:afterAutospacing="1" w:line="270" w:lineRule="atLeast" /><w:rPr><w:rFonts w:ascii="Arial" w:hAnsi="Arial" w:cs="Arial" /></w:rPr></w:pPr><w:r><w:rPr><w:rFonts w:ascii="Arial" w:hAnsi="Arial" w:cs="Arial" /></w:rPr><w:t>6:30 AM Lynn Layton Key Grab</w:t></w:r><w:bookmarkStart w:name="_m-33#02XKTG6OBW4kmk5UUxBoyJxnxJCCDY|{" w:id="9" /><w:bookmarkEnd w:id="9" /><w:bookmarkStart w:name="_m-33#12~YBeO@3wp28N4tEw3gZuKJ0D00qiqm" w:id="10" /><w:bookmarkEnd w:id="10" /><w:bookmarkStart w:name="_m-33#22wNy0qx" w:id="11" /><w:bookmarkEnd w:id="11" /></w:p><w:p><w:pPr><w:shd w:val="clear" w:color="auto" w:fill="FFFFFF" /><w:spacing w:beforeAutospacing="1" w:after="0" w:afterAutospacing="1" w:line="270" w:lineRule="atLeast" /><w:rPr><w:rFonts w:ascii="Arial" w:hAnsi="Arial" w:cs="Arial" /></w:rPr></w:pPr><w:r><w:rPr><w:rFonts w:ascii="Arial" w:hAnsi="Arial" w:cs="Arial" /></w:rPr><w:t>5:00 PM Pilot Briefing</w:t></w:r><w:bookmarkStart w:name="_m-2Z#02XLZG5IBX:kle5V[xAiyK~nwDCDJY{u" w:id="6" /><w:bookmarkEnd w:id="6" /><w:bookmarkStart w:name="_m-2Z#12~ZHeN:3xv27H4uKw2aZvQJ/&gt;01wipg" w:id="7" /><w:bookmarkEnd w:id="7" /><w:bookmarkStart w:name="_m-2Z#22wO!0pr" w:id="8" /><w:bookmarkEnd w:id="8" /></w:p><w:p><w:pPr><w:shd w:val="clear" w:color="auto" w:fill="FFFFFF" /><w:spacing w:beforeAutospacing="1" w:after="0" w:afterAutospacing="1" w:line="270" w:lineRule="atLeast" /><w:rPr><w:rFonts w:ascii="Arial" w:hAnsi="Arial" w:cs="Arial" /></w:rPr></w:pPr><w:r><w:rPr><w:rFonts w:ascii="Arial" w:hAnsi="Arial" w:cs="Arial" /></w:rPr><w:t>5:30 PM Fun Flight</w:t></w:r><w:bookmarkStart w:name="_m-2U#02XLUG5NBX5klj5VVxAnyKynwICDEY{z" w:id="3" /><w:bookmarkEnd w:id="3" /><w:bookmarkStart w:name="_m-2U#12~ZCeN?3xq27M4uFw2fZvLJ/C01ripl" w:id="4" /><w:bookmarkEnd w:id="4" /><w:bookmarkStart w:name="_m-2U#22wOz0pw" w:id="5" /><w:bookmarkEnd w:id="5" /></w:p><w:p><w:pPr><w:shd w:val="clear" w:color="auto" w:fill="FFFFFF" /><w:spacing w:beforeAutospacing="1" w:after="0" w:afterAutospacing="1" w:line="270" w:lineRule="atLeast" /><w:jc w:val="center"/><w:jc w:val="right"/></w:pPr><w:r><w:rPr><w:b/><w:bCs/><w:color w:val="4472C4" w:themeColor="accent5"/><w:rFonts w:ascii="Arial" w:hAnsi="Arial" w:cs="Arial" /></w:rPr><w:t xml:space="preserve">6:30 PM </w:t></w:r><w:r><w:rPr><w:b/><w:bCs/><w:color w:val="4472C4" w:themeColor="accent5"/><w:rFonts w:ascii="Arial" w:hAnsi="Arial" w:cs="Arial" /></w:rPr><w:t>Ballumination</w:t></w:r><w:bookmarkStart w:name="_m-2S#02XLSG5PBX3kll5VTxApyKwnwKCDCY{|" w:id="0" /><w:bookmarkEnd w:id="0" /><w:bookmarkStart w:name="_m-2S#12~ZAeNA3xo27O4uDw2hZvJJ/E01pipn" w:id="1" /><w:bookmarkEnd w:id="1" /><w:bookmarkStart w:name="_m-2S#22wOx0py" w:id="2" /><w:bookmarkEnd w:id="2" /></w:p><w:sectPr><w:type w:val="continuous" /><w:pgSz w:w="12240" w:h="15840" /><w:pgMar w:top="1440" w:right="1440" w:bottom="1440" w:left="1440" w:header="720" w:footer="720" w:gutter="0" /><w:cols w:space="720" /><w:docGrid w:linePitch="360" /></w:sectPr></w:body></w:document>
 </file>
 
 <file path=word/styles.xml><?xml version="1.0" encoding="utf-8"?>

</xml_diff>

<commit_message>
Restore original unmodified file
</commit_message>
<xml_diff>
--- a/Cailao_Exp22_Word_Ch02_ML1_Festival.docx
+++ b/Cailao_Exp22_Word_Ch02_ML1_Festival.docx
@@ -1,5 +1,2914 @@
 
-<file path=word/document.xml><?xml version="1.0" encoding="UTF-8" standalone="yes"?><w:document xmlns:wpc="http://schemas.microsoft.com/office/word/2010/wordprocessingCanvas" xmlns:cx="http://schemas.microsoft.com/office/drawing/2014/chartex" xmlns:cx1="http://schemas.microsoft.com/office/drawing/2015/9/8/chartex" xmlns:cx2="http://schemas.microsoft.com/office/drawing/2015/10/21/chartex" xmlns:cx3="http://schemas.microsoft.com/office/drawing/2016/5/9/chartex" xmlns:cx4="http://schemas.microsoft.com/office/drawing/2016/5/10/chartex" xmlns:cx5="http://schemas.microsoft.com/office/drawing/2016/5/11/chartex" xmlns:cx6="http://schemas.microsoft.com/office/drawing/2016/5/12/chartex" xmlns:cx7="http://schemas.microsoft.com/office/drawing/2016/5/13/chartex" xmlns:cx8="http://schemas.microsoft.com/office/drawing/2016/5/14/chartex" xmlns:mc="http://schemas.openxmlformats.org/markup-compatibility/2006" xmlns:aink="http://schemas.microsoft.com/office/drawing/2016/ink" xmlns:am3d="http://schemas.microsoft.com/office/drawing/2017/model3d" xmlns:o="urn:schemas-microsoft-com:office:office" xmlns:r="http://schemas.openxmlformats.org/officeDocument/2006/relationships" xmlns:m="http://schemas.openxmlformats.org/officeDocument/2006/math" xmlns:v="urn:schemas-microsoft-com:vml" xmlns:wp14="http://schemas.microsoft.com/office/word/2010/wordprocessingDrawing" xmlns:wp="http://schemas.openxmlformats.org/drawingml/2006/wordprocessingDrawing" xmlns:w10="urn:schemas-microsoft-com:office:word" xmlns:w="http://schemas.openxmlformats.org/wordprocessingml/2006/main" xmlns:w14="http://schemas.microsoft.com/office/word/2010/wordml" xmlns:w15="http://schemas.microsoft.com/office/word/2012/wordml" xmlns:w16cex="http://schemas.microsoft.com/office/word/2018/wordml/cex" xmlns:w16cid="http://schemas.microsoft.com/office/word/2016/wordml/cid" xmlns:w16="http://schemas.microsoft.com/office/word/2018/wordml" xmlns:w16se="http://schemas.microsoft.com/office/word/2015/wordml/symex" xmlns:wpg="http://schemas.microsoft.com/office/word/2010/wordprocessingGroup" xmlns:wpi="http://schemas.microsoft.com/office/word/2010/wordprocessingInk" xmlns:wne="http://schemas.microsoft.com/office/word/2006/wordml" xmlns:wps="http://schemas.microsoft.com/office/word/2010/wordprocessingShape" mc:Ignorable="w14 w15 w16se w16cid w16 w16cex wp14"><w:body><w:p><w:pPr><w:shd w:val="clear" w:color="auto" w:fill="FFFFFF" /><w:spacing w:beforeAutospacing="1" w:after="0" w:afterAutospacing="1" w:line="270" w:lineRule="atLeast" /><w:rPr><w:rFonts w:ascii="Arial" w:eastAsia="Times New Roman" w:hAnsi="Arial" w:cs="Arial" /><w:color w:val="333333" /><w:kern w:val="0" /><w:sz w:val="20" /><w:szCs w:val="20" /><w14:ligatures w14:val="none" /></w:rPr></w:pPr><w:r><w:rPr><w:rFonts w:ascii="Arial" w:eastAsia="Times New Roman" w:hAnsi="Arial" w:cs="Arial" /><w:color w:val="333333" /><w:kern w:val="0" /><w:sz w:val="20" /><w:szCs w:val="20" /><w14:ligatures w14:val="none" /></w:rPr><w:t xml:space="preserve">Mount </w:t></w:r><w:r><w:rPr><w:rFonts w:ascii="Arial" w:eastAsia="Times New Roman" w:hAnsi="Arial" w:cs="Arial" /><w:color w:val="333333" /><w:kern w:val="0" /><w:sz w:val="20" /><w:szCs w:val="20" /><w14:ligatures w14:val="none" /></w:rPr><w:t>Vernon</w:t></w:r><w:r><w:rPr><w:rFonts w:ascii="Arial" w:eastAsia="Times New Roman" w:hAnsi="Arial" w:cs="Arial" /><w:color w:val="333333" /><w:kern w:val="0" /><w:sz w:val="20" /><w:szCs w:val="20" /><w14:ligatures w14:val="none" /></w:rPr><w:t xml:space="preserve"> Hot Air Balloon Festival</w:t></w:r><w:bookmarkStart w:name="_m-72#02YGWF:LCS7jqh6QXwFlzF{m|GD?GX&quot;x" w:id="159" /><w:bookmarkEnd w:id="159" /><w:bookmarkStart w:name="_m-72#12!UEdS=4ss1&lt;K5pHv7d[qNI4A1,thuj" w:id="160" /><w:bookmarkEnd w:id="160" /><w:bookmarkStart w:name="_m-72#22xJ|/uu" w:id="161" /><w:bookmarkEnd w:id="161" /></w:p><w:p><w:pPr><w:shd w:val="clear" w:color="auto" w:fill="FFFFFF" /><w:spacing w:beforeAutospacing="1" w:after="0" w:afterAutospacing="1" w:line="270" w:lineRule="atLeast" /><w:rPr><w:rFonts w:ascii="Arial" w:eastAsia="Times New Roman" w:hAnsi="Arial" w:cs="Arial" /><w:color w:val="333333" /><w:kern w:val="0" /><w:sz w:val="20" /><w:szCs w:val="20" /><w14:ligatures w14:val="none" /></w:rPr></w:pPr><w:r><w:rPr><w:rFonts w:ascii="Arial" w:eastAsia="Times New Roman" w:hAnsi="Arial" w:cs="Arial" /><w:color w:val="333333" /><w:kern w:val="0" /><w:sz w:val="20" /><w:szCs w:val="20" /><w14:ligatures w14:val="none" /></w:rPr><w:t xml:space="preserve">See the Canyon From </w:t></w:r><w:r><w:rPr><w:rFonts w:ascii="Arial" w:eastAsia="Times New Roman" w:hAnsi="Arial" w:cs="Arial" /><w:color w:val="333333" /><w:kern w:val="0" /><w:sz w:val="20" /><w:szCs w:val="20" /><w14:ligatures w14:val="none" /></w:rPr><w:t>t</w:t></w:r><w:r><w:rPr><w:rFonts w:ascii="Arial" w:eastAsia="Times New Roman" w:hAnsi="Arial" w:cs="Arial" /><w:color w:val="333333" /><w:kern w:val="0" /><w:sz w:val="20" /><w:szCs w:val="20" /><w14:ligatures w14:val="none" /></w:rPr><w:t>he Top</w:t></w:r><w:r><w:rPr><w:rFonts w:ascii="Arial" w:eastAsia="Times New Roman" w:hAnsi="Arial" w:cs="Arial" /><w:color w:val="333333" /><w:kern w:val="0" /><w:sz w:val="20" /><w:szCs w:val="20" /><w14:ligatures w14:val="none" /></w:rPr><w:t>!</w:t></w:r><w:bookmarkStart w:name="_m-71#02YGVF:MCS6jqi6QWwFmzFzm|HD?FX&quot;y" w:id="156" /><w:bookmarkEnd w:id="156" /><w:bookmarkStart w:name="_m-71#12!UDdS&gt;4sr1&lt;L5pGv7e[qMI4B1,shuk" w:id="157" /><w:bookmarkEnd w:id="157" /><w:bookmarkStart w:name="_m-71#22xJ{/uv" w:id="158" /><w:bookmarkEnd w:id="158" /></w:p><w:p><w:pPr><w:shd w:val="clear" w:color="auto" w:fill="FFFFFF" /><w:spacing w:before="100" w:beforeAutospacing="1" w:after="100" w:afterAutospacing="1" w:line="270" w:lineRule="atLeast" /><w:rPr><w:rFonts w:ascii="Arial" w:eastAsia="Times New Roman" w:hAnsi="Arial" w:cs="Arial" /><w:color w:val="333333" /><w:kern w:val="0" /><w:sz w:val="20" /><w:szCs w:val="20" /><w14:ligatures w14:val="none" /></w:rPr><w:sectPr><w:pgSz w:w="12240" w:h="15840" /><w:pgMar w:top="1440" w:right="1440" w:bottom="1440" w:left="1440" w:header="720" w:footer="720" w:gutter="0" /><w:cols w:space="720" /><w:docGrid w:linePitch="360" /></w:sectPr></w:pPr><w:bookmarkStart w:name="_m-70#02YGUF:NCS5jqj6QVwFnzFym|ID?EX&quot;z" w:id="153" /><w:bookmarkEnd w:id="153" /><w:bookmarkStart w:name="_m-70#12!UCdS?4sq1&lt;M5pFv7f[qLI4C1,rhul" w:id="154" /><w:bookmarkEnd w:id="154" /><w:bookmarkStart w:name="_m-70#22xJz/uw" w:id="155" /><w:bookmarkEnd w:id="155" /></w:p><w:p><w:pPr><w:shd w:val="clear" w:color="auto" w:fill="FFFFFF" /><w:spacing w:before="100" w:beforeAutospacing="1" w:after="100" w:afterAutospacing="1" w:line="270" w:lineRule="atLeast" /><w:rPr><w:rFonts w:ascii="Arial" w:eastAsia="Times New Roman" w:hAnsi="Arial" w:cs="Arial" /><w:color w:val="333333" /><w:kern w:val="0" /><w:sz w:val="20" /><w:szCs w:val="20" /><w14:ligatures w14:val="none" /></w:rPr></w:pPr><w:r><w:rPr><w:rFonts w:ascii="Arial" w:eastAsia="Times New Roman" w:hAnsi="Arial" w:cs="Arial" /><w:color w:val="333333" /><w:kern w:val="0" /><w:sz w:val="20" /><w:szCs w:val="20" /><w14:ligatures w14:val="none" /></w:rPr><w:t>May 2</w:t></w:r><w:r><w:rPr><w:rFonts w:ascii="Arial" w:eastAsia="Times New Roman" w:hAnsi="Arial" w:cs="Arial" /><w:color w:val="333333" /><w:kern w:val="0" /><w:sz w:val="20" /><w:szCs w:val="20" /><w14:ligatures w14:val="none" /></w:rPr><w:t>8</w:t></w:r><w:r><w:rPr><w:rFonts w:ascii="Arial" w:eastAsia="Times New Roman" w:hAnsi="Arial" w:cs="Arial" /><w:color w:val="333333" /><w:kern w:val="0" /><w:sz w:val="20" /><w:szCs w:val="20" /><w14:ligatures w14:val="none" /></w:rPr><w:t>-2</w:t></w:r><w:r><w:rPr><w:rFonts w:ascii="Arial" w:eastAsia="Times New Roman" w:hAnsi="Arial" w:cs="Arial" /><w:color w:val="333333" /><w:kern w:val="0" /><w:sz w:val="20" /><w:szCs w:val="20" /><w14:ligatures w14:val="none" /></w:rPr><w:t>9</w:t></w:r><w:r><w:rPr><w:rFonts w:ascii="Arial" w:eastAsia="Times New Roman" w:hAnsi="Arial" w:cs="Arial" /><w:color w:val="333333" /><w:kern w:val="0" /><w:sz w:val="20" /><w:szCs w:val="20" /><w14:ligatures w14:val="none" /></w:rPr><w:t>, 20</w:t></w:r><w:r><w:rPr><w:rFonts w:ascii="Arial" w:eastAsia="Times New Roman" w:hAnsi="Arial" w:cs="Arial" /><w:color w:val="333333" /><w:kern w:val="0" /><w:sz w:val="20" /><w:szCs w:val="20" /><w14:ligatures w14:val="none" /></w:rPr><w:t>2</w:t></w:r><w:r><w:rPr><w:rFonts w:ascii="Arial" w:eastAsia="Times New Roman" w:hAnsi="Arial" w:cs="Arial" /><w:color w:val="333333" /><w:kern w:val="0" /><w:sz w:val="20" /><w:szCs w:val="20" /><w14:ligatures w14:val="none" /></w:rPr><w:t>4</w:t></w:r><w:bookmarkStart w:name="_m-6V#02YHZF9ICT:jpe6R[wEizG~m{DD@JX!u" w:id="150" /><w:bookmarkEnd w:id="150" /><w:bookmarkStart w:name="_m-6V#12!VHdR:4tv1;H5qKv6a[rQI3&gt;1-whtg" w:id="151" /><w:bookmarkEnd w:id="151" /><w:bookmarkStart w:name="_m-6V#22xK!/tr" w:id="152" /><w:bookmarkEnd w:id="152" /></w:p><w:p><w:pPr><w:shd w:val="clear" w:color="auto" w:fill="FFFFFF" /><w:spacing w:before="100" w:beforeAutospacing="1" w:after="100" w:afterAutospacing="1" w:line="270" w:lineRule="atLeast" /><w:rPr><w:rFonts w:ascii="Arial" w:eastAsia="Times New Roman" w:hAnsi="Arial" w:cs="Arial" /><w:color w:val="333333" /><w:kern w:val="0" /><w:sz w:val="20" /><w:szCs w:val="20" /><w14:ligatures w14:val="none" /></w:rPr></w:pPr><w:r><w:rPr><w:rFonts w:ascii="Arial" w:eastAsia="Times New Roman" w:hAnsi="Arial" w:cs="Arial" /><w:color w:val="333333" /><w:kern w:val="0" /><w:sz w:val="20" /><w:szCs w:val="20" /><w14:ligatures w14:val="none" /></w:rPr><w:t xml:space="preserve">The </w:t></w:r><w:r><w:rPr><w:rFonts w:ascii="Arial" w:eastAsia="Times New Roman" w:hAnsi="Arial" w:cs="Arial" /><w:color w:val="333333" /><w:kern w:val="0" /><w:sz w:val="20" /><w:szCs w:val="20" /><w14:ligatures w14:val="none" /></w:rPr><w:t xml:space="preserve">Mount </w:t></w:r><w:r><w:rPr><w:rFonts w:ascii="Arial" w:eastAsia="Times New Roman" w:hAnsi="Arial" w:cs="Arial" /><w:color w:val="333333" /><w:kern w:val="0" /><w:sz w:val="20" /><w:szCs w:val="20" /><w14:ligatures w14:val="none" /></w:rPr><w:t>Vernon</w:t></w:r><w:r><w:rPr><w:rFonts w:ascii="Arial" w:eastAsia="Times New Roman" w:hAnsi="Arial" w:cs="Arial" /><w:color w:val="333333" /><w:kern w:val="0" /><w:sz w:val="20" /><w:szCs w:val="20" /><w14:ligatures w14:val="none" /></w:rPr><w:t xml:space="preserve"> Hot Air Balloon Festival, presented by </w:t></w:r><w:r><w:rPr><w:rFonts w:ascii="Arial" w:eastAsia="Times New Roman" w:hAnsi="Arial" w:cs="Arial" /><w:color w:val="333333" /><w:kern w:val="0" /><w:sz w:val="20" /><w:szCs w:val="20" /><w14:ligatures w14:val="none" /></w:rPr><w:t>Seattle</w:t></w:r><w:r><w:rPr><w:rFonts w:ascii="Arial" w:eastAsia="Times New Roman" w:hAnsi="Arial" w:cs="Arial" /><w:color w:val="333333" /><w:kern w:val="0" /><w:sz w:val="20" /><w:szCs w:val="20" /><w14:ligatures w14:val="none" /></w:rPr><w:t xml:space="preserve"> </w:t></w:r><w:r><w:rPr><w:rFonts w:ascii="Arial" w:eastAsia="Times New Roman" w:hAnsi="Arial" w:cs="Arial" /><w:color w:val="333333" /><w:kern w:val="0" /><w:sz w:val="20" /><w:szCs w:val="20" /><w14:ligatures w14:val="none" /></w:rPr><w:t xml:space="preserve">Adventure </w:t></w:r><w:r><w:rPr><w:rFonts w:ascii="Arial" w:eastAsia="Times New Roman" w:hAnsi="Arial" w:cs="Arial" /><w:color w:val="333333" /><w:kern w:val="0" /><w:sz w:val="20" /><w:szCs w:val="20" /><w14:ligatures w14:val="none" /></w:rPr><w:t>Explore</w:t></w:r><w:r><w:rPr><w:rFonts w:ascii="Arial" w:eastAsia="Times New Roman" w:hAnsi="Arial" w:cs="Arial" /><w:color w:val="333333" /><w:kern w:val="0" /><w:sz w:val="20" /><w:szCs w:val="20" /><w14:ligatures w14:val="none" /></w:rPr><w:t>rs</w:t></w:r><w:r><w:rPr><w:rFonts w:ascii="Arial" w:eastAsia="Times New Roman" w:hAnsi="Arial" w:cs="Arial" /><w:color w:val="333333" /><w:kern w:val="0" /><w:sz w:val="20" /><w:szCs w:val="20" /><w14:ligatures w14:val="none" /></w:rPr><w:t xml:space="preserve">, welcomes more than </w:t></w:r><w:r><w:rPr><w:rFonts w:ascii="Arial" w:eastAsia="Times New Roman" w:hAnsi="Arial" w:cs="Arial" /><w:color w:val="333333" /><w:kern w:val="0" /><w:sz w:val="20" /><w:szCs w:val="20" /><w14:ligatures w14:val="none" /></w:rPr><w:t>100</w:t></w:r><w:r><w:rPr><w:rFonts w:ascii="Arial" w:eastAsia="Times New Roman" w:hAnsi="Arial" w:cs="Arial" /><w:color w:val="333333" /><w:kern w:val="0" /><w:sz w:val="20" /><w:szCs w:val="20" /><w14:ligatures w14:val="none" /></w:rPr><w:t xml:space="preserve"> hot air balloonists from across the country.</w:t></w:r><w:r><w:rPr><w:rFonts w:ascii="Arial" w:eastAsia="Times New Roman" w:hAnsi="Arial" w:cs="Arial" /><w:color w:val="333333" /><w:kern w:val="0" /><w:sz w:val="20" /><w:szCs w:val="20" /><w14:ligatures w14:val="none" /></w:rPr><w:t xml:space="preserve"> One of the largest free hot-air balloon festivals in the </w:t></w:r><w:r><w:rPr><w:rFonts w:ascii="Arial" w:eastAsia="Times New Roman" w:hAnsi="Arial" w:cs="Arial" /><w:color w:val="333333" /><w:kern w:val="0" /><w:sz w:val="20" /><w:szCs w:val="20" /><w14:ligatures w14:val="none" /></w:rPr><w:t>North</w:t></w:r><w:r><w:rPr><w:rFonts w:ascii="Arial" w:eastAsia="Times New Roman" w:hAnsi="Arial" w:cs="Arial" /><w:color w:val="333333" /><w:kern w:val="0" /><w:sz w:val="20" /><w:szCs w:val="20" /><w14:ligatures w14:val="none" /></w:rPr><w:t xml:space="preserve">west, the event features hot air balloon races, a key grab, tether rides, and our always well-attended Ballumination! </w:t></w:r><w:r><w:rPr><w:rFonts w:ascii="Arial" w:eastAsia="Times New Roman" w:hAnsi="Arial" w:cs="Arial" /><w:color w:val="333333" /><w:kern w:val="0" /><w:sz w:val="20" /><w:szCs w:val="20" /><w14:ligatures w14:val="none" /></w:rPr><w:t xml:space="preserve">Tour Point Shepherd Park, enjoy a free arts and crafts show, visit the multiple </w:t></w:r><w:r><w:rPr><w:rFonts w:ascii="Arial" w:eastAsia="Times New Roman" w:hAnsi="Arial" w:cs="Arial" /><w:color w:val="333333" /><w:kern w:val="0" /><w:sz w:val="20" /><w:szCs w:val="20" /><w14:ligatures w14:val="none" /></w:rPr><w:t xml:space="preserve">farm to table </w:t></w:r><w:r><w:rPr><w:rFonts w:ascii="Arial" w:eastAsia="Times New Roman" w:hAnsi="Arial" w:cs="Arial" /><w:color w:val="333333" /><w:kern w:val="0" /><w:sz w:val="20" /><w:szCs w:val="20" /><w14:ligatures w14:val="none" /></w:rPr><w:t xml:space="preserve">food vendors, and get up close with antique cars and tractors. As the sun sets, you can settle back for musical entertainment and the always fabulous fireworks show over the canyon! </w:t></w:r><w:bookmarkStart w:name="_m-6S#02YHWF9LCT7jph6RXwElzG{m{GD@GX!x" w:id="147" /><w:bookmarkEnd w:id="147" /><w:bookmarkStart w:name="_m-6S#12!VEdR=4ts1;K5qHv6d[rNI3A1-thtj" w:id="148" /><w:bookmarkEnd w:id="148" /><w:bookmarkStart w:name="_m-6S#22xK|/tu" w:id="149" /><w:bookmarkEnd w:id="149" /></w:p><w:p><w:pPr><w:shd w:val="clear" w:color="auto" w:fill="FFFFFF" /><w:spacing w:before="100" w:beforeAutospacing="1" w:after="100" w:afterAutospacing="1" w:line="270" w:lineRule="atLeast" /><w:rPr><w:rFonts w:ascii="Arial" w:eastAsia="Times New Roman" w:hAnsi="Arial" w:cs="Arial" /><w:color w:val="333333" /><w:kern w:val="0" /><w:sz w:val="20" /><w:szCs w:val="20" /><w14:ligatures w14:val="none" /></w:rPr></w:pPr><w:r><w:rPr><w:rFonts w:ascii="Arial" w:eastAsia="Times New Roman" w:hAnsi="Arial" w:cs="Arial" /><w:color w:val="333333" /><w:kern w:val="0" /><w:sz w:val="20" /><w:szCs w:val="20" /><w14:ligatures w14:val="none" /></w:rPr><w:t xml:space="preserve">Saturday’s events feature a 6:30 hare and hound race in which balloons try to follow a hare, </w:t></w:r><w:r><w:rPr><w:rFonts w:ascii="Arial" w:eastAsia="Times New Roman" w:hAnsi="Arial" w:cs="Arial" /><w:color w:val="333333" /><w:kern w:val="0" /><w:sz w:val="20" /><w:szCs w:val="20" /><w14:ligatures w14:val="none" /></w:rPr><w:t xml:space="preserve">ultimately </w:t></w:r><w:r><w:rPr><w:rFonts w:ascii="Arial" w:eastAsia="Times New Roman" w:hAnsi="Arial" w:cs="Arial" /><w:color w:val="333333" /><w:kern w:val="0" /><w:sz w:val="20" /><w:szCs w:val="20" /><w14:ligatures w14:val="none" /></w:rPr><w:t xml:space="preserve">attempting to land on beanbags. A balloon flight flight at dusk, and a balloon glow beginning at </w:t></w:r><w:r><w:rPr><w:rFonts w:ascii="Arial" w:eastAsia="Times New Roman" w:hAnsi="Arial" w:cs="Arial" /><w:color w:val="333333" /><w:kern w:val="0" /><w:sz w:val="20" /><w:szCs w:val="20" /><w14:ligatures w14:val="none" /></w:rPr><w:t>8:00 p.m. round out the day. Get to the park by 6:30 a.m. on Sunday to watch balloons fly into the field while passengers try to grab a ring from a tall pole. Ask a balloon owner for a free tethered ride on Sunday evening. Kids will enjoy the balloon themed play area, with fairground type games including balloon pops and water balloon toss!</w:t></w:r><w:bookmarkStart w:name="_m-6P#02YHTF9OCT4jpk6RUwEozGxm{JD@DX!{" w:id="144" /><w:bookmarkEnd w:id="144" /><w:bookmarkStart w:name="_m-6P#12!VBdR@4tp1;N5qEv6g[rKI3D1-qhtm" w:id="145" /><w:bookmarkEnd w:id="145" /><w:bookmarkStart w:name="_m-6P#22xKy/tx" w:id="146" /><w:bookmarkEnd w:id="146" /></w:p><w:p><w:pPr><w:shd w:val="clear" w:color="auto" w:fill="FFFFFF" /><w:spacing w:before="100" w:beforeAutospacing="1" w:after="100" w:afterAutospacing="1" w:line="270" w:lineRule="atLeast" /><w:rPr><w:rFonts w:ascii="Arial" w:eastAsia="Times New Roman" w:hAnsi="Arial" w:cs="Arial" /><w:color w:val="333333" /><w:kern w:val="0" /><w:sz w:val="20" /><w:szCs w:val="20" /><w14:ligatures w14:val="none" /></w:rPr></w:pPr><w:r><w:rPr><w:rFonts w:ascii="Arial" w:eastAsia="Times New Roman" w:hAnsi="Arial" w:cs="Arial" /><w:color w:val="333333" /><w:kern w:val="0" /><w:sz w:val="20" /><w:szCs w:val="20" /><w14:ligatures w14:val="none" /></w:rPr><w:t xml:space="preserve">As for entertainment, you’re in luck! </w:t></w:r><w:r><w:rPr><w:rFonts w:ascii="Arial" w:eastAsia="Times New Roman" w:hAnsi="Arial" w:cs="Arial" /><w:color w:val="333333" /><w:kern w:val="0" /><w:sz w:val="20" /><w:szCs w:val="20" /><w14:ligatures w14:val="none" /></w:rPr><w:t xml:space="preserve">Spread out your blanket, grab a cold drink, and enjoy a variety of live music daily, </w:t></w:r><w:r><w:rPr><w:rFonts w:ascii="Arial" w:eastAsia="Times New Roman" w:hAnsi="Arial" w:cs="Arial" /><w:color w:val="333333" /><w:kern w:val="0" /><w:sz w:val="20" /><w:szCs w:val="20" /><w14:ligatures w14:val="none" /></w:rPr><w:t>from</w:t></w:r><w:r><w:rPr><w:rFonts w:ascii="Arial" w:eastAsia="Times New Roman" w:hAnsi="Arial" w:cs="Arial" /><w:color w:val="333333" /><w:kern w:val="0" /><w:sz w:val="20" /><w:szCs w:val="20" /><w14:ligatures w14:val="none" /></w:rPr><w:t xml:space="preserve"> country to rock and roll. With activities for the kids, shopping and entertainment for adults, and plenty of photo ops, this is a festival you won’t want to miss!</w:t></w:r><w:bookmarkStart w:name="_m-6K#02YIYF8JCU9jof6SZwDjzH}mzEDAIX~v" w:id="141" /><w:bookmarkEnd w:id="141" /><w:bookmarkStart w:name="_m-6K#12!WGdQ;4uu1:I5rJv5b[sPI2?1.vhsh" w:id="142" /><w:bookmarkEnd w:id="142" /><w:bookmarkStart w:name="_m-6K#22xL~/ss" w:id="143" /><w:bookmarkEnd w:id="143" /></w:p><w:p><w:pPr><w:shd w:val="clear" w:color="auto" w:fill="FFFFFF" /><w:spacing w:before="100" w:beforeAutospacing="1" w:after="100" w:afterAutospacing="1" w:line="270" w:lineRule="atLeast" /><w:rPr><w:rFonts w:ascii="Arial" w:eastAsia="Times New Roman" w:hAnsi="Arial" w:cs="Arial" /><w:color w:val="333333" /><w:kern w:val="0" /><w:sz w:val="20" /><w:szCs w:val="20" /><w14:ligatures w14:val="none" /></w:rPr></w:pPr><w:r><w:rPr><w:rFonts w:ascii="Arial" w:eastAsia="Times New Roman" w:hAnsi="Arial" w:cs="Arial" /><w:color w:val="333333" /><w:kern w:val="0" /><w:sz w:val="20" /><w:szCs w:val="20" /><w14:ligatures w14:val="none" /></w:rPr><w:t xml:space="preserve">This year’s music acts include EZ Star, Black Dog, Rachel Mac, and the LLC Five Star Jazz Orchestra. </w:t></w:r><w:r><w:rPr><w:rFonts w:ascii="Arial" w:eastAsia="Times New Roman" w:hAnsi="Arial" w:cs="Arial" /><w:color w:val="333333" /><w:kern w:val="0" /><w:sz w:val="20" /><w:szCs w:val="20" /><w14:ligatures w14:val="none" /></w:rPr><w:t xml:space="preserve">Plenty of others will be on hand, as well. Stroll the park, visiting each live music stage, to enjoy just about any type of musical act on your playlist. Be sure to bring </w:t></w:r><w:r><w:rPr><w:rFonts w:ascii="Arial" w:eastAsia="Times New Roman" w:hAnsi="Arial" w:cs="Arial" /><w:color w:val="333333" /><w:kern w:val="0" /><w:sz w:val="20" /><w:szCs w:val="20" /><w14:ligatures w14:val="none" /></w:rPr><w:t xml:space="preserve">your pet, </w:t></w:r><w:r><w:rPr><w:rFonts w:ascii="Arial" w:eastAsia="Times New Roman" w:hAnsi="Arial" w:cs="Arial" /><w:color w:val="333333" /><w:kern w:val="0" /><w:sz w:val="20" /><w:szCs w:val="20" /><w14:ligatures w14:val="none" /></w:rPr><w:t>a lawn chair</w:t></w:r><w:r><w:rPr><w:rFonts w:ascii="Arial" w:eastAsia="Times New Roman" w:hAnsi="Arial" w:cs="Arial" /><w:color w:val="333333" /><w:kern w:val="0" /><w:sz w:val="20" /><w:szCs w:val="20" /><w14:ligatures w14:val="none" /></w:rPr><w:t>,</w:t></w:r><w:r><w:rPr><w:rFonts w:ascii="Arial" w:eastAsia="Times New Roman" w:hAnsi="Arial" w:cs="Arial" /><w:color w:val="333333" /><w:kern w:val="0" /><w:sz w:val="20" /><w:szCs w:val="20" /><w14:ligatures w14:val="none" /></w:rPr><w:t xml:space="preserve"> and </w:t></w:r><w:r><w:rPr><w:rFonts w:ascii="Arial" w:eastAsia="Times New Roman" w:hAnsi="Arial" w:cs="Arial" /><w:color w:val="333333" /><w:kern w:val="0" /><w:sz w:val="20" /><w:szCs w:val="20" /><w14:ligatures w14:val="none" /></w:rPr><w:t xml:space="preserve">a </w:t></w:r><w:r><w:rPr><w:rFonts w:ascii="Arial" w:eastAsia="Times New Roman" w:hAnsi="Arial" w:cs="Arial" /><w:color w:val="333333" /><w:kern w:val="0" /><w:sz w:val="20" /><w:szCs w:val="20" /><w14:ligatures w14:val="none" /></w:rPr><w:t xml:space="preserve">cooler </w:t></w:r><w:r><w:rPr><w:rFonts w:ascii="Arial" w:eastAsia="Times New Roman" w:hAnsi="Arial" w:cs="Arial" /><w:color w:val="333333" /><w:kern w:val="0" /><w:sz w:val="20" /><w:szCs w:val="20" /><w14:ligatures w14:val="none" /></w:rPr><w:t xml:space="preserve">full of your favorite drinks </w:t></w:r><w:r><w:rPr><w:rFonts w:ascii="Arial" w:eastAsia="Times New Roman" w:hAnsi="Arial" w:cs="Arial" /><w:color w:val="333333" /><w:kern w:val="0" /><w:sz w:val="20" /><w:szCs w:val="20" /><w14:ligatures w14:val="none" /></w:rPr><w:t>(</w:t></w:r><w:r><w:rPr><w:rFonts w:ascii="Arial" w:eastAsia="Times New Roman" w:hAnsi="Arial" w:cs="Arial" /><w:color w:val="333333" /><w:kern w:val="0" /><w:sz w:val="20" /><w:szCs w:val="20" /><w14:ligatures w14:val="none" /></w:rPr><w:t>for safety reasons, please do not bring</w:t></w:r><w:r><w:rPr><w:rFonts w:ascii="Arial" w:eastAsia="Times New Roman" w:hAnsi="Arial" w:cs="Arial" /><w:color w:val="333333" /><w:kern w:val="0" /><w:sz w:val="20" /><w:szCs w:val="20" /><w14:ligatures w14:val="none" /></w:rPr><w:t xml:space="preserve"> glass bottles in</w:t></w:r><w:r><w:rPr><w:rFonts w:ascii="Arial" w:eastAsia="Times New Roman" w:hAnsi="Arial" w:cs="Arial" /><w:color w:val="333333" /><w:kern w:val="0" /><w:sz w:val="20" /><w:szCs w:val="20" /><w14:ligatures w14:val="none" /></w:rPr><w:t>to</w:t></w:r><w:r><w:rPr><w:rFonts w:ascii="Arial" w:eastAsia="Times New Roman" w:hAnsi="Arial" w:cs="Arial" /><w:color w:val="333333" /><w:kern w:val="0" /><w:sz w:val="20" /><w:szCs w:val="20" /><w14:ligatures w14:val="none" /></w:rPr><w:t xml:space="preserve"> the park).</w:t></w:r><w:bookmarkStart w:name="_m-6F#02YITF8OCU4jok6SUwDozHxmzJDADX~{" w:id="138" /><w:bookmarkEnd w:id="138" /><w:bookmarkStart w:name="_m-6F#12!WBdQ@4up1:N5rEv5g[sKI2D1.qhsm" w:id="139" /><w:bookmarkEnd w:id="139" /><w:bookmarkStart w:name="_m-6F#22xLy/sx" w:id="140" /><w:bookmarkEnd w:id="140" /></w:p><w:p><w:pPr><w:shd w:val="clear" w:color="auto" w:fill="FFFFFF" /><w:spacing w:before="100" w:beforeAutospacing="1" w:after="100" w:afterAutospacing="1" w:line="270" w:lineRule="atLeast" /><w:rPr><w:rFonts w:ascii="Arial" w:eastAsia="Times New Roman" w:hAnsi="Arial" w:cs="Arial" /><w:color w:val="333333" /><w:kern w:val="0" /><w:sz w:val="20" /><w:szCs w:val="20" /><w14:ligatures w14:val="none" /></w:rPr></w:pPr><w:r><w:rPr><w:rFonts w:ascii="Arial" w:eastAsia="Times New Roman" w:hAnsi="Arial" w:cs="Arial" /><w:color w:val="333333" /><w:kern w:val="0" /><w:sz w:val="20" /><w:szCs w:val="20" /><w14:ligatures w14:val="none" /></w:rPr><w:t xml:space="preserve">As for the kids, hold on to your hat! Your children can pet a baby </w:t></w:r><w:r><w:rPr><w:rFonts w:ascii="Arial" w:eastAsia="Times New Roman" w:hAnsi="Arial" w:cs="Arial" /><w:color w:val="333333" /><w:kern w:val="0" /><w:sz w:val="20" /><w:szCs w:val="20" /><w14:ligatures w14:val="none" /></w:rPr><w:t>sheep</w:t></w:r><w:r><w:rPr><w:rFonts w:ascii="Arial" w:eastAsia="Times New Roman" w:hAnsi="Arial" w:cs="Arial" /><w:color w:val="333333" /><w:kern w:val="0" /><w:sz w:val="20" /><w:szCs w:val="20" /><w14:ligatures w14:val="none" /></w:rPr><w:t xml:space="preserve">, dance like a butterfly to fun tunes, get their faces painted with balloon art, and try a little limbo. At the children’s village, they can enjoy </w:t></w:r><w:r><w:rPr><w:rFonts w:ascii="Arial" w:eastAsia="Times New Roman" w:hAnsi="Arial" w:cs="Arial" /><w:color w:val="333333" /><w:kern w:val="0" /><w:sz w:val="20" /><w:szCs w:val="20" /><w14:ligatures w14:val="none" /></w:rPr><w:t>John</w:t></w:r><w:r><w:rPr><w:rFonts w:ascii="Arial" w:eastAsia="Times New Roman" w:hAnsi="Arial" w:cs="Arial" /><w:color w:val="333333" /><w:kern w:val="0" /><w:sz w:val="20" /><w:szCs w:val="20" /><w14:ligatures w14:val="none" /></w:rPr><w:t>ny</w:t></w:r><w:r><w:rPr><w:rFonts w:ascii="Arial" w:eastAsia="Times New Roman" w:hAnsi="Arial" w:cs="Arial" /><w:color w:val="333333" /><w:kern w:val="0" /><w:sz w:val="20" /><w:szCs w:val="20" /><w14:ligatures w14:val="none" /></w:rPr><w:t xml:space="preserve"> Drake </w:t></w:r><w:r><w:rPr><w:rFonts w:ascii="Arial" w:eastAsia="Times New Roman" w:hAnsi="Arial" w:cs="Arial" /><w:color w:val="333333" /><w:kern w:val="0" /><w:sz w:val="20" /><w:szCs w:val="20" /><w14:ligatures w14:val="none" /></w:rPr><w:t>as he</w:t></w:r><w:r><w:rPr><w:rFonts w:ascii="Arial" w:eastAsia="Times New Roman" w:hAnsi="Arial" w:cs="Arial" /><w:color w:val="333333" /><w:kern w:val="0" /><w:sz w:val="20" /><w:szCs w:val="20" /><w14:ligatures w14:val="none" /></w:rPr><w:t xml:space="preserve"> perform</w:t></w:r><w:r><w:rPr><w:rFonts w:ascii="Arial" w:eastAsia="Times New Roman" w:hAnsi="Arial" w:cs="Arial" /><w:color w:val="333333" /><w:kern w:val="0" /><w:sz w:val="20" /><w:szCs w:val="20" /><w14:ligatures w14:val="none" /></w:rPr><w:t>s</w:t></w:r><w:r><w:rPr><w:rFonts w:ascii="Arial" w:eastAsia="Times New Roman" w:hAnsi="Arial" w:cs="Arial" /><w:color w:val="333333" /><w:kern w:val="0" /><w:sz w:val="20" /><w:szCs w:val="20" /><w14:ligatures w14:val="none" /></w:rPr><w:t xml:space="preserve"> his magic show</w:t></w:r><w:r><w:rPr><w:rFonts w:ascii="Arial" w:eastAsia="Times New Roman" w:hAnsi="Arial" w:cs="Arial" /><w:color w:val="333333" /><w:kern w:val="0" /><w:sz w:val="20" /><w:szCs w:val="20" /><w14:ligatures w14:val="none" /></w:rPr><w:t xml:space="preserve">. In the next booth, they can catch storytelling and puppet shows sponsored by the </w:t></w:r><w:r><w:rPr><w:rFonts w:ascii="Arial" w:eastAsia="Times New Roman" w:hAnsi="Arial" w:cs="Arial" /><w:color w:val="333333" /><w:kern w:val="0" /><w:sz w:val="20" /><w:szCs w:val="20" /><w14:ligatures w14:val="none" /></w:rPr><w:t>Lancaster County</w:t></w:r><w:r><w:rPr><w:rFonts w:ascii="Arial" w:eastAsia="Times New Roman" w:hAnsi="Arial" w:cs="Arial" /><w:color w:val="333333" /><w:kern w:val="0" /><w:sz w:val="20" /><w:szCs w:val="20" /><w14:ligatures w14:val="none" /></w:rPr><w:t xml:space="preserve"> </w:t></w:r><w:r><w:rPr><w:rFonts w:ascii="Arial" w:eastAsia="Times New Roman" w:hAnsi="Arial" w:cs="Arial" /><w:color w:val="333333" /><w:kern w:val="0" /><w:sz w:val="20" /><w:szCs w:val="20" /><w14:ligatures w14:val="none" /></w:rPr><w:t>School System</w:t></w:r><w:r><w:rPr><w:rFonts w:ascii="Arial" w:eastAsia="Times New Roman" w:hAnsi="Arial" w:cs="Arial" /><w:color w:val="333333" /><w:kern w:val="0" /><w:sz w:val="20" /><w:szCs w:val="20" /><w14:ligatures w14:val="none" /></w:rPr><w:t>.</w:t></w:r><w:bookmarkStart w:name="_m-6A#02YJYF7JCV9jnf6TZwCjzI}myEDBIX}v" w:id="135" /><w:bookmarkEnd w:id="135" /><w:bookmarkStart w:name="_m-6A#12!XGdP;4vu19I5sJv4b[tPI1?1/vhrh" w:id="136" /><w:bookmarkEnd w:id="136" /><w:bookmarkStart w:name="_m-6A#22xM~/rs" w:id="137" /><w:bookmarkEnd w:id="137" /></w:p><w:p><w:pPr><w:shd w:val="clear" w:color="auto" w:fill="FFFFFF" /><w:spacing w:before="100" w:beforeAutospacing="1" w:after="100" w:afterAutospacing="1" w:line="270" w:lineRule="atLeast" /><w:rPr><w:rFonts w:ascii="Arial" w:eastAsia="Times New Roman" w:hAnsi="Arial" w:cs="Arial" /><w:color w:val="333333" /><w:kern w:val="0" /><w:sz w:val="20" /><w:szCs w:val="20" /><w14:ligatures w14:val="none" /></w:rPr></w:pPr><w:r><w:rPr><w:rFonts w:ascii="Arial" w:eastAsia="Times New Roman" w:hAnsi="Arial" w:cs="Arial" /><w:color w:val="333333" /><w:kern w:val="0" /><w:sz w:val="20" /><w:szCs w:val="20" /><w14:ligatures w14:val="none" /></w:rPr><w:t>And don’t forget the dogs! In a special enclosure, well-behaved dogs</w:t></w:r><w:r><w:rPr><w:rFonts w:ascii="Arial" w:eastAsia="Times New Roman" w:hAnsi="Arial" w:cs="Arial" /><w:color w:val="333333" /><w:kern w:val="0" /><w:sz w:val="20" /><w:szCs w:val="20" /><w14:ligatures w14:val="none" /></w:rPr><w:t xml:space="preserve"> can participate in the Stay Connected K-9 Frisbee Toss. Dogs can splash in pools, chase toys, and dig for buried treasure. Adult supervision required, of course!</w:t></w:r><w:bookmarkStart w:name="_m-67#02YJVF7MCV6jni6TWwCmzIzmyHDBFX}y" w:id="132" /><w:bookmarkEnd w:id="132" /><w:bookmarkStart w:name="_m-67#12!XDdP&gt;4vr19L5sGv4e[tMI1B1/shrk" w:id="133" /><w:bookmarkEnd w:id="133" /><w:bookmarkStart w:name="_m-67#22xM{/rv" w:id="134" /><w:bookmarkEnd w:id="134" /></w:p><w:p><w:pPr><w:shd w:val="clear" w:color="auto" w:fill="FFFFFF" /><w:spacing w:before="100" w:beforeAutospacing="1" w:after="100" w:afterAutospacing="1" w:line="270" w:lineRule="atLeast" /><w:rPr><w:rFonts w:ascii="Arial" w:eastAsia="Times New Roman" w:hAnsi="Arial" w:cs="Arial" /><w:color w:val="333333" /><w:kern w:val="0" /><w:sz w:val="20" /><w:szCs w:val="20" /><w14:ligatures w14:val="none" /></w:rPr></w:pPr><w:r><w:rPr><w:rFonts w:ascii="Arial" w:eastAsia="Times New Roman" w:hAnsi="Arial" w:cs="Arial" /><w:color w:val="333333" /><w:kern w:val="0" /><w:sz w:val="20" /><w:szCs w:val="20" /><w14:ligatures w14:val="none" /></w:rPr><w:t>We guarantee you’ll be hungry! Grab an ice cream cone or snack on popcorn as you stroll through the vendors and hot air balloons. The barbecue cook-off is sure to be a stellar attraction, as well. With food vendors</w:t></w:r><w:r><w:rPr><w:rFonts w:ascii="Arial" w:eastAsia="Times New Roman" w:hAnsi="Arial" w:cs="Arial" /><w:color w:val="333333" /><w:kern w:val="0" /><w:sz w:val="20" /><w:szCs w:val="20" /><w14:ligatures w14:val="none" /></w:rPr><w:t>—many participated in the farm to table concept—</w:t></w:r><w:r><w:rPr><w:rFonts w:ascii="Arial" w:eastAsia="Times New Roman" w:hAnsi="Arial" w:cs="Arial" /><w:color w:val="333333" /><w:kern w:val="0" /><w:sz w:val="20" /><w:szCs w:val="20" /><w14:ligatures w14:val="none" /></w:rPr><w:t>scattered throughout the park, you’re never too far from your next meal.</w:t></w:r><w:bookmarkStart w:name="_m-64#02YJSF7PCV3jnl6TTwCpzIwmyKDBCX}|" w:id="129" /><w:bookmarkEnd w:id="129" /><w:bookmarkStart w:name="_m-64#12!XAdPA4vo19O5sDv4h[tJI1E1/phrn" w:id="130" /><w:bookmarkEnd w:id="130" /><w:bookmarkStart w:name="_m-64#22xMx/ry" w:id="131" /><w:bookmarkEnd w:id="131" /></w:p><w:p><w:pPr><w:shd w:val="clear" w:color="auto" w:fill="FFFFFF" /><w:spacing w:before="100" w:beforeAutospacing="1" w:after="100" w:afterAutospacing="1" w:line="270" w:lineRule="atLeast" /><w:rPr><w:rFonts w:ascii="Arial" w:eastAsia="Times New Roman" w:hAnsi="Arial" w:cs="Arial" /><w:color w:val="333333" /><w:kern w:val="0" /><w:sz w:val="20" /><w:szCs w:val="20" /><w14:ligatures w14:val="none" /></w:rPr></w:pPr><w:r><w:rPr><w:rFonts w:ascii="Arial" w:eastAsia="Times New Roman" w:hAnsi="Arial" w:cs="Arial" /><w:color w:val="333333" /><w:kern w:val="0" /><w:sz w:val="20" /><w:szCs w:val="20" /><w14:ligatures w14:val="none" /></w:rPr><w:t>All balloon flights and displays are weather permitting. Winds must be less than 5 mph to safely inflate balloons on the festival grounds.</w:t></w:r><w:bookmarkStart w:name="_m-60#02YKYF6JCW9jmf6UZwBjzJ}mxEDCIX|v" w:id="126" /><w:bookmarkEnd w:id="126" /><w:bookmarkStart w:name="_m-60#12!YGdO;4wu18I5tJv3b[uPI0?10vhqh" w:id="127" /><w:bookmarkEnd w:id="127" /><w:bookmarkStart w:name="_m-60#22xN~/qs" w:id="128" /><w:bookmarkEnd w:id="128" /></w:p><w:p><w:r><w:br w:type="page"/></w:r></w:p><w:p><w:pPr><w:shd w:val="clear" w:color="auto" w:fill="FFFFFF" /><w:spacing w:before="100" w:beforeAutospacing="1" w:after="100" w:afterAutospacing="1" w:line="270" w:lineRule="atLeast" /><w:outlineLvl w:val="1" /><w:rPr><w:rFonts w:ascii="Arial" w:eastAsia="Times New Roman" w:hAnsi="Arial" w:cs="Arial" /><w:b /><w:bCs /><w:color w:val="333333" /><w:kern w:val="0" /><w:sz w:val="36" /><w:szCs w:val="36" /><w14:ligatures w14:val="none" /></w:rPr><w:sectPr><w:type w:val="continuous" /><w:pgSz w:w="12240" w:h="15840" /><w:pgMar w:top="1440" w:right="1440" w:bottom="1440" w:left="1440" w:header="720" w:footer="720" w:gutter="0" /><w:cols w:num="2" w:sep="1" w:space="720" /><w:docGrid w:linePitch="360" /></w:sectPr></w:pPr><w:bookmarkStart w:name="_m-5X#02YKVF6MCW6jmi6UWwBmzJzmxHDCFX|y" w:id="123" /><w:bookmarkEnd w:id="123" /><w:bookmarkStart w:name="_m-5X#12!YDdO&gt;4wr18L5tGv3e[uMI0B10shqk" w:id="124" /><w:bookmarkEnd w:id="124" /><w:bookmarkStart w:name="_m-5X#22xN{/qv" w:id="125" /><w:bookmarkEnd w:id="125" /></w:p><w:p><w:pPr><w:shd w:val="clear" w:color="auto" w:fill="FFFFFF" /><w:spacing w:before="100" w:beforeAutospacing="1" w:after="100" w:afterAutospacing="1" w:line="270" w:lineRule="atLeast" /><w:outlineLvl w:val="1" /><w:rPr><w:rFonts w:ascii="Arial" w:eastAsia="Times New Roman" w:hAnsi="Arial" w:cs="Arial" /><w:b /><w:bCs /><w:color w:val="333333" /><w:kern w:val="0" /><w:sz w:val="36" /><w:szCs w:val="36" /><w14:ligatures w14:val="none" /></w:rPr></w:pPr><w:r><w:rPr><w:rFonts w:ascii="Arial" w:eastAsia="Times New Roman" w:hAnsi="Arial" w:cs="Arial" /><w:b /><w:bCs /><w:color w:val="333333" /><w:kern w:val="0" /><w:sz w:val="36" /><w:szCs w:val="36" /><w14:ligatures w14:val="none" /></w:rPr><w:t>Frequently Asked Questions</w:t></w:r><w:bookmarkStart w:name="_m-5V#02YKTF6OCW4jmk6UUwBozJxmxJDCDX|{" w:id="120" /><w:bookmarkEnd w:id="120" /><w:bookmarkStart w:name="_m-5V#12!YBdO@4wp18N5tEv3g[uKI0D10qhqm" w:id="121" /><w:bookmarkEnd w:id="121" /><w:bookmarkStart w:name="_m-5V#22xNy/qx" w:id="122" /><w:bookmarkEnd w:id="122" /></w:p><w:p><w:pPr><w:shd w:val="clear" w:color="auto" w:fill="FFFFFF" /><w:spacing w:before="100" w:beforeAutospacing="1" w:after="100" w:afterAutospacing="1" w:line="270" w:lineRule="atLeast" /><w:outlineLvl w:val="3" /><w:rPr><w:b/><w:bCs/><w:rFonts w:ascii="Arial" w:eastAsia="Times New Roman" w:hAnsi="Arial" w:cs="Arial" /><w:bCs /><w:color w:val="333333" /><w:kern w:val="0" /><w:sz w:val="24" /><w:szCs w:val="24" /><w14:ligatures w14:val="none" /></w:rPr></w:pPr><w:r><w:rPr><w:b/><w:bCs/><w:rFonts w:ascii="Arial" w:eastAsia="Times New Roman" w:hAnsi="Arial" w:cs="Arial" /><w:bCs /><w:color w:val="333333" /><w:kern w:val="0" /><w:sz w:val="24" /><w:szCs w:val="24" /><w14:ligatures w14:val="none" /></w:rPr><w:t>When is the best time to see balloons?</w:t></w:r><w:bookmarkStart w:name="_m-5U#02YKSF6PCW3jml6UTwBpzJwmxKDCCX||" w:id="117" /><w:bookmarkEnd w:id="117" /><w:bookmarkStart w:name="_m-5U#12!YAdOA4wo18O5tDv3h[uJI0E10phqn" w:id="118" /><w:bookmarkEnd w:id="118" /><w:bookmarkStart w:name="_m-5U#22xNx/qy" w:id="119" /><w:bookmarkEnd w:id="119" /></w:p><w:p><w:pPr><w:shd w:val="clear" w:color="auto" w:fill="FFFFFF" /><w:spacing w:before="100" w:beforeAutospacing="1" w:after="100" w:afterAutospacing="1" w:line="270" w:lineRule="atLeast" /><w:rPr><w:rFonts w:ascii="Arial" w:eastAsia="Times New Roman" w:hAnsi="Arial" w:cs="Arial" /><w:color w:val="333333" /><w:kern w:val="0" /><w:sz w:val="20" /><w:szCs w:val="20" /><w14:ligatures w14:val="none" /></w:rPr></w:pPr><w:r><w:rPr><w:rFonts w:ascii="Arial" w:eastAsia="Times New Roman" w:hAnsi="Arial" w:cs="Arial" /><w:color w:val="333333" /><w:kern w:val="0" /><w:sz w:val="20" /><w:szCs w:val="20" /><w14:ligatures w14:val="none" /></w:rPr><w:lastRenderedPageBreak /><w:t>The best time to view balloons and get great pictures is early morning. Flights begin at approximately 6:00 a.m. each morning. It’s definitely worth getting up early to see balloons grace the early morning sky. Balloons also fly at dusk (approximately 7:00 p.m. on Friday and Saturday night</w:t></w:r><w:r><w:rPr><w:rFonts w:ascii="Arial" w:eastAsia="Times New Roman" w:hAnsi="Arial" w:cs="Arial" /><w:color w:val="333333" /><w:kern w:val="0" /><w:sz w:val="20" /><w:szCs w:val="20" /><w14:ligatures w14:val="none" /></w:rPr><w:t>)</w:t></w:r><w:r><w:rPr><w:rFonts w:ascii="Arial" w:eastAsia="Times New Roman" w:hAnsi="Arial" w:cs="Arial" /><w:color w:val="333333" /><w:kern w:val="0" /><w:sz w:val="20" /><w:szCs w:val="20" /><w14:ligatures w14:val="none" /></w:rPr><w:t>.</w:t></w:r><w:bookmarkStart w:name="_m-5Q#02YLYF5JCX9jlf6VZwAjzK}mwEDDIX{v" w:id="114" /><w:bookmarkEnd w:id="114" /><w:bookmarkStart w:name="_m-5Q#12!ZGdN;4xu17I5uJv2b[vPI/?11vhph" w:id="115" /><w:bookmarkEnd w:id="115" /><w:bookmarkStart w:name="_m-5Q#22xO~/ps" w:id="116" /><w:bookmarkEnd w:id="116" /></w:p><w:p><w:pPr><w:shd w:val="clear" w:color="auto" w:fill="FFFFFF" /><w:spacing w:beforeAutospacing="1" w:after="0" w:afterAutospacing="1" w:line="270" w:lineRule="atLeast" /><w:rPr><w:rFonts w:ascii="Arial" w:eastAsia="Times New Roman" w:hAnsi="Arial" w:cs="Arial" /><w:color w:val="333333" /><w:kern w:val="0" /><w:sz w:val="20" /><w:szCs w:val="20" /><w14:ligatures w14:val="none" /></w:rPr></w:pPr><w:r><w:rPr><w:rFonts w:ascii="Arial" w:eastAsia="Times New Roman" w:hAnsi="Arial" w:cs="Arial" /><w:color w:val="333333" /><w:kern w:val="0" /><w:sz w:val="20" /><w:szCs w:val="20" /><w14:ligatures w14:val="none" /></w:rPr><w:t>Please be aware that b</w:t></w:r><w:r><w:rPr><w:rFonts w:ascii="Arial" w:eastAsia="Times New Roman" w:hAnsi="Arial" w:cs="Arial" /><w:color w:val="333333" /><w:kern w:val="0" /><w:sz w:val="20" /><w:szCs w:val="20" /><w14:ligatures w14:val="none" /></w:rPr><w:t>allooning is extremely weather dependent. Winds must be less than 1</w:t></w:r><w:r><w:rPr><w:rFonts w:ascii="Arial" w:eastAsia="Times New Roman" w:hAnsi="Arial" w:cs="Arial" /><w:color w:val="333333" /><w:kern w:val="0" /><w:sz w:val="20" /><w:szCs w:val="20" /><w14:ligatures w14:val="none" /></w:rPr><w:t>5 mph</w:t></w:r><w:r><w:rPr><w:rFonts w:ascii="Arial" w:eastAsia="Times New Roman" w:hAnsi="Arial" w:cs="Arial" /><w:color w:val="333333" /><w:kern w:val="0" /><w:sz w:val="20" /><w:szCs w:val="20" /><w14:ligatures w14:val="none" /></w:rPr><w:t xml:space="preserve"> fo</w:t></w:r><w:r><w:rPr><w:rFonts w:ascii="Arial" w:eastAsia="Times New Roman" w:hAnsi="Arial" w:cs="Arial" /><w:color w:val="333333" /><w:kern w:val="0" /><w:sz w:val="20" /><w:szCs w:val="20" /><w14:ligatures w14:val="none" /></w:rPr><w:t>r balloons to fly. Listen to W</w:t></w:r><w:r><w:rPr><w:rFonts w:ascii="Arial" w:eastAsia="Times New Roman" w:hAnsi="Arial" w:cs="Arial" /><w:color w:val="333333" /><w:kern w:val="0" /><w:sz w:val="20" /><w:szCs w:val="20" /><w14:ligatures w14:val="none" /></w:rPr><w:t xml:space="preserve">LITE </w:t></w:r><w:r><w:rPr><w:rFonts w:ascii="Arial" w:eastAsia="Times New Roman" w:hAnsi="Arial" w:cs="Arial" /><w:color w:val="333333" /><w:kern w:val="0" /><w:sz w:val="20" /><w:szCs w:val="20" /><w14:ligatures w14:val="none" /></w:rPr><w:t>1</w:t></w:r><w:r><w:rPr><w:rFonts w:ascii="Arial" w:eastAsia="Times New Roman" w:hAnsi="Arial" w:cs="Arial" /><w:color w:val="333333" /><w:kern w:val="0" /><w:sz w:val="20" /><w:szCs w:val="20" /><w14:ligatures w14:val="none" /></w:rPr><w:t>0</w:t></w:r><w:r><w:rPr><w:rFonts w:ascii="Arial" w:eastAsia="Times New Roman" w:hAnsi="Arial" w:cs="Arial" /><w:color w:val="333333" /><w:kern w:val="0" /><w:sz w:val="20" /><w:szCs w:val="20" /><w14:ligatures w14:val="none" /></w:rPr><w:t>5</w:t></w:r><w:r><w:rPr><w:rFonts w:ascii="Arial" w:eastAsia="Times New Roman" w:hAnsi="Arial" w:cs="Arial" /><w:color w:val="333333" /><w:kern w:val="0" /><w:sz w:val="20" /><w:szCs w:val="20" /><w14:ligatures w14:val="none" /></w:rPr><w:t>0 AM or 9</w:t></w:r><w:r><w:rPr><w:rFonts w:ascii="Arial" w:eastAsia="Times New Roman" w:hAnsi="Arial" w:cs="Arial" /><w:color w:val="333333" /><w:kern w:val="0" /><w:sz w:val="20" /><w:szCs w:val="20" /><w14:ligatures w14:val="none" /></w:rPr><w:t>5</w:t></w:r><w:r><w:rPr><w:rFonts w:ascii="Arial" w:eastAsia="Times New Roman" w:hAnsi="Arial" w:cs="Arial" /><w:color w:val="333333" /><w:kern w:val="0" /><w:sz w:val="20" /><w:szCs w:val="20" /><w14:ligatures w14:val="none" /></w:rPr><w:t>.</w:t></w:r><w:r><w:rPr><w:rFonts w:ascii="Arial" w:eastAsia="Times New Roman" w:hAnsi="Arial" w:cs="Arial" /><w:color w:val="333333" /><w:kern w:val="0" /><w:sz w:val="20" /><w:szCs w:val="20" /><w14:ligatures w14:val="none" /></w:rPr><w:t>7</w:t></w:r><w:r><w:rPr><w:rFonts w:ascii="Arial" w:eastAsia="Times New Roman" w:hAnsi="Arial" w:cs="Arial" /><w:color w:val="333333" /><w:kern w:val="0" /><w:sz w:val="20" /><w:szCs w:val="20" /><w14:ligatures w14:val="none" /></w:rPr><w:t xml:space="preserve"> FM for the latest on flight information.</w:t></w:r><w:bookmarkStart w:name="_m-5O#02YLWF5LCX7jlh6VXwAlzK{mwGDDGX{x" w:id="111" /><w:bookmarkEnd w:id="111" /><w:bookmarkStart w:name="_m-5O#12!ZEdN=4xs17K5uHv2d[vNI/A11thpj" w:id="112" /><w:bookmarkEnd w:id="112" /><w:bookmarkStart w:name="_m-5O#22xO|/pu" w:id="113" /><w:bookmarkEnd w:id="113" /></w:p><w:p><w:pPr><w:shd w:val="clear" w:color="auto" w:fill="FFFFFF" /><w:spacing w:before="100" w:beforeAutospacing="1" w:after="100" w:afterAutospacing="1" w:line="270" w:lineRule="atLeast" /><w:outlineLvl w:val="3" /><w:rPr><w:rFonts w:ascii="Arial" w:eastAsia="Times New Roman" w:hAnsi="Arial" w:cs="Arial" /><w:bCs /><w:color w:val="333333" /><w:kern w:val="0" /><w:sz w:val="24" /><w:szCs w:val="24" /><w14:ligatures w14:val="none" /></w:rPr></w:pPr><w:r><w:rPr><w:rFonts w:ascii="Arial" w:eastAsia="Times New Roman" w:hAnsi="Arial" w:cs="Arial" /><w:bCs /><w:color w:val="333333" /><w:kern w:val="0" /><w:sz w:val="24" /><w:szCs w:val="24" /><w14:ligatures w14:val="none" /></w:rPr><w:t>Wh</w:t></w:r><w:r><w:rPr><w:rFonts w:ascii="Arial" w:eastAsia="Times New Roman" w:hAnsi="Arial" w:cs="Arial" /><w:bCs /><w:color w:val="333333" /><w:kern w:val="0" /><w:sz w:val="24" /><w:szCs w:val="24" /><w14:ligatures w14:val="none" /></w:rPr><w:t>ere are the balloons and pilots during the day?</w:t></w:r><w:bookmarkStart w:name="_m-5N#02YLVF5MCX6jli6VWwAmzKzmwHDDFX{y" w:id="108" /><w:bookmarkEnd w:id="108" /><w:bookmarkStart w:name="_m-5N#12!ZDdN&gt;4xr17L5uGv2e[vMI/B11shpk" w:id="109" /><w:bookmarkEnd w:id="109" /><w:bookmarkStart w:name="_m-5N#22xO{/pv" w:id="110" /><w:bookmarkEnd w:id="110" /></w:p><w:p><w:pPr><w:shd w:val="clear" w:color="auto" w:fill="FFFFFF" /><w:spacing w:before="100" w:beforeAutospacing="1" w:after="100" w:afterAutospacing="1" w:line="270" w:lineRule="atLeast" /><w:rPr><w:rFonts w:ascii="Arial" w:eastAsia="Times New Roman" w:hAnsi="Arial" w:cs="Arial" /><w:color w:val="333333" /><w:kern w:val="0" /><w:sz w:val="20" /><w:szCs w:val="20" /><w14:ligatures w14:val="none" /></w:rPr></w:pPr><w:r><w:rPr><w:rFonts w:ascii="Arial" w:eastAsia="Times New Roman" w:hAnsi="Arial" w:cs="Arial" /><w:color w:val="333333" /><w:kern w:val="0" /><w:sz w:val="20" /><w:szCs w:val="20" /><w14:ligatures w14:val="none" /></w:rPr><w:t>High canyon winds make it impossible to inflate balloons during the day. Pilots and their families enjoy the same things that you do at the park—live music, quality arts &amp; crafts, and local cuisine.</w:t></w:r><w:bookmarkStart w:name="_m-5I#02XC[G&gt;HBO;kud5M\xJhyB!n&quot;CC;KY&amp;t" w:id="105" /><w:bookmarkEnd w:id="105" /><w:bookmarkStart w:name="_m-5I#12~QIeW93ow2@G4lLw;`ZmRJ8=0(xiyf" w:id="106" /><w:bookmarkEnd w:id="106" /><w:bookmarkStart w:name="_m-5I#22wF&quot;0yq" w:id="107" /><w:bookmarkEnd w:id="107" /></w:p><w:p><w:pPr><w:shd w:val="clear" w:color="auto" w:fill="FFFFFF" /><w:spacing w:before="100" w:beforeAutospacing="1" w:after="100" w:afterAutospacing="1" w:line="270" w:lineRule="atLeast" /><w:outlineLvl w:val="3" /><w:rPr><w:b/><w:bCs/><w:rFonts w:ascii="Arial" w:eastAsia="Times New Roman" w:hAnsi="Arial" w:cs="Arial" /><w:bCs /><w:color w:val="333333" /><w:kern w:val="0" /><w:sz w:val="24" /><w:szCs w:val="24" /><w14:ligatures w14:val="none" /></w:rPr></w:pPr><w:r><w:rPr><w:b/><w:bCs/><w:rFonts w:ascii="Arial" w:eastAsia="Times New Roman" w:hAnsi="Arial" w:cs="Arial" /><w:bCs /><w:color w:val="333333" /><w:kern w:val="0" /><w:sz w:val="24" /><w:szCs w:val="24" /><w14:ligatures w14:val="none" /></w:rPr><w:t>Can I purchase a hot air balloon ride during the Festival?</w:t></w:r><w:bookmarkStart w:name="_m-5F#02XCXG&gt;KBO8kug5MYxJkyB|n&quot;FC;HY&amp;w" w:id="102" /><w:bookmarkEnd w:id="102" /><w:bookmarkStart w:name="_m-5F#12~QFeW&lt;3ot2@J4lIw;cZmOJ8@0(uiyi" w:id="103" /><w:bookmarkEnd w:id="103" /><w:bookmarkStart w:name="_m-5F#22wF}0yt" w:id="104" /><w:bookmarkEnd w:id="104" /></w:p><w:p><w:pPr><w:shd w:val="clear" w:color="auto" w:fill="FFFFFF" /><w:spacing w:beforeAutospacing="1" w:after="0" w:afterAutospacing="1" w:line="270" w:lineRule="atLeast" /><w:rPr><w:rFonts w:ascii="Arial" w:eastAsia="Times New Roman" w:hAnsi="Arial" w:cs="Arial" /><w:color w:val="333333" /><w:kern w:val="0" /><w:sz w:val="20" /><w:szCs w:val="20" /><w14:ligatures w14:val="none" /></w:rPr></w:pPr><w:r><w:rPr><w:rFonts w:ascii="Arial" w:eastAsia="Times New Roman" w:hAnsi="Arial" w:cs="Arial" /><w:color w:val="333333" /><w:kern w:val="0" /><w:sz w:val="20" /><w:szCs w:val="20" /><w14:ligatures w14:val="none" /></w:rPr><w:t>Due to the overwhelming demand for balloon rides during the fes</w:t></w:r><w:r><w:rPr><w:rFonts w:ascii="Arial" w:eastAsia="Times New Roman" w:hAnsi="Arial" w:cs="Arial" /><w:color w:val="333333" /><w:kern w:val="0" /><w:sz w:val="20" /><w:szCs w:val="20" /><w14:ligatures w14:val="none" /></w:rPr><w:t>tival, rides are not available. However, most pilots will give tether rides on Saturday and Sunday mornings.</w:t></w:r><w:r><w:rPr><w:rFonts w:ascii="Arial" w:eastAsia="Times New Roman" w:hAnsi="Arial" w:cs="Arial" /><w:color w:val="333333" /><w:kern w:val="0" /><w:sz w:val="20" /><w:szCs w:val="20" /><w14:ligatures w14:val="none" /></w:rPr><w:t xml:space="preserve"> Rides can be purchased before</w:t></w:r><w:r><w:rPr><w:rFonts w:ascii="Arial" w:eastAsia="Times New Roman" w:hAnsi="Arial" w:cs="Arial" /><w:color w:val="333333" /><w:kern w:val="0" /><w:sz w:val="20" /><w:szCs w:val="20" /><w14:ligatures w14:val="none" /></w:rPr><w:t xml:space="preserve"> or</w:t></w:r><w:r><w:rPr><w:rFonts w:ascii="Arial" w:eastAsia="Times New Roman" w:hAnsi="Arial" w:cs="Arial" /><w:color w:val="333333" /><w:kern w:val="0" /><w:sz w:val="20" /><w:szCs w:val="20" /><w14:ligatures w14:val="none" /></w:rPr><w:t xml:space="preserve"> </w:t></w:r><w:r><w:rPr><w:rFonts w:ascii="Arial" w:eastAsia="Times New Roman" w:hAnsi="Arial" w:cs="Arial" /><w:color w:val="333333" /><w:kern w:val="0" /><w:sz w:val="20" /><w:szCs w:val="20" /><w14:ligatures w14:val="none" /></w:rPr><w:t xml:space="preserve">after the festival from </w:t></w:r><w:r><w:rPr><w:rFonts w:ascii="Arial" w:eastAsia="Times New Roman" w:hAnsi="Arial" w:cs="Arial" /><w:color w:val="333333" /><w:kern w:val="0" /><w:sz w:val="20" /><w:szCs w:val="20" /><w14:ligatures w14:val="none" /></w:rPr><w:t>Sky Glide</w:t></w:r><w:r><w:rPr><w:rFonts w:ascii="Arial" w:eastAsia="Times New Roman" w:hAnsi="Arial" w:cs="Arial" /><w:color w:val="333333" /><w:kern w:val="0" /><w:sz w:val="20" /><w:szCs w:val="20" /><w14:ligatures w14:val="none" /></w:rPr><w:t xml:space="preserve"> Hot Air Balloon Company, a member of the </w:t></w:r><w:r><w:rPr><w:rFonts w:ascii="Arial" w:eastAsia="Times New Roman" w:hAnsi="Arial" w:cs="Arial" /><w:color w:val="333333" /><w:kern w:val="0" /><w:sz w:val="20" /><w:szCs w:val="20" /><w14:ligatures w14:val="none" /></w:rPr><w:t xml:space="preserve">Mount </w:t></w:r><w:r><w:rPr><w:rFonts w:ascii="Arial" w:eastAsia="Times New Roman" w:hAnsi="Arial" w:cs="Arial" /><w:color w:val="333333" /><w:kern w:val="0" /><w:sz w:val="20" /><w:szCs w:val="20" /><w14:ligatures w14:val="none" /></w:rPr><w:t>Vernon</w:t></w:r><w:r><w:rPr><w:rFonts w:ascii="Arial" w:eastAsia="Times New Roman" w:hAnsi="Arial" w:cs="Arial" /><w:color w:val="333333" /><w:kern w:val="0" /><w:sz w:val="20" /><w:szCs w:val="20" /><w14:ligatures w14:val="none" /></w:rPr><w:t xml:space="preserve"> County</w:t></w:r><w:r><w:rPr><w:rFonts w:ascii="Arial" w:eastAsia="Times New Roman" w:hAnsi="Arial" w:cs="Arial" /><w:color w:val="333333" /><w:kern w:val="0" /><w:sz w:val="20" /><w:szCs w:val="20" /><w14:ligatures w14:val="none" /></w:rPr><w:t xml:space="preserve"> Chamber of Commerce.</w:t></w:r><w:bookmarkStart w:name="_m-5E#02XCWG&gt;LBO7kuh5MXxJlyB{n&quot;GC;GY&amp;x" w:id="99" /><w:bookmarkEnd w:id="99" /><w:bookmarkStart w:name="_m-5E#12~QEeW=3os2@K4lHw;dZmNJ8A0(tiyj" w:id="100" /><w:bookmarkEnd w:id="100" /><w:bookmarkStart w:name="_m-5E#22wF|0yu" w:id="101" /><w:bookmarkEnd w:id="101" /></w:p><w:p><w:pPr><w:shd w:val="clear" w:color="auto" w:fill="FFFFFF" /><w:spacing w:before="100" w:beforeAutospacing="1" w:after="100" w:afterAutospacing="1" w:line="270" w:lineRule="atLeast" /><w:outlineLvl w:val="3" /><w:rPr><w:b/><w:bCs/><w:rFonts w:ascii="Arial" w:eastAsia="Times New Roman" w:hAnsi="Arial" w:cs="Arial" /><w:bCs /><w:color w:val="333333" /><w:kern w:val="0" /><w:sz w:val="24" /><w:szCs w:val="24" /><w14:ligatures w14:val="none" /></w:rPr></w:pPr><w:r><w:rPr><w:b/><w:bCs/><w:rFonts w:ascii="Arial" w:eastAsia="Times New Roman" w:hAnsi="Arial" w:cs="Arial" /><w:bCs /><w:color w:val="333333" /><w:kern w:val="0" /><w:sz w:val="24" /><w:szCs w:val="24" /><w14:ligatures w14:val="none" /></w:rPr><w:t>What can my children do while visiting the festival?</w:t></w:r><w:bookmarkStart w:name="_m-5C#02XCUG&gt;NBO5kuj5MVxJnyByn&quot;IC;EY&amp;z" w:id="96" /><w:bookmarkEnd w:id="96" /><w:bookmarkStart w:name="_m-5C#12~QCeW?3oq2@M4lFw;fZmLJ8C0(riyl" w:id="97" /><w:bookmarkEnd w:id="97" /><w:bookmarkStart w:name="_m-5C#22wFz0yw" w:id="98" /><w:bookmarkEnd w:id="98" /></w:p><w:p><w:pPr><w:shd w:val="clear" w:color="auto" w:fill="FFFFFF" /><w:spacing w:before="100" w:beforeAutospacing="1" w:after="100" w:afterAutospacing="1" w:line="270" w:lineRule="atLeast" /><w:rPr><w:rFonts w:ascii="Arial" w:eastAsia="Times New Roman" w:hAnsi="Arial" w:cs="Arial" /><w:color w:val="333333" /><w:kern w:val="0" /><w:sz w:val="20" /><w:szCs w:val="20" /><w14:ligatures w14:val="none" /></w:rPr></w:pPr><w:r><w:rPr><w:rFonts w:ascii="Arial" w:eastAsia="Times New Roman" w:hAnsi="Arial" w:cs="Arial" /><w:color w:val="333333" /><w:kern w:val="0" /><w:sz w:val="20" /><w:szCs w:val="20" /><w14:ligatures w14:val="none" /></w:rPr><w:t>Children</w:t></w:r><w:r><w:rPr><w:rFonts w:ascii="Arial" w:eastAsia="Times New Roman" w:hAnsi="Arial" w:cs="Arial" /><w:color w:val="333333" /><w:kern w:val="0" /><w:sz w:val="20" /><w:szCs w:val="20" /><w14:ligatures w14:val="none" /></w:rPr><w:t xml:space="preserve"> can enjoy inflatables, children’s interactive entertainment, reptile displays, and face painting</w:t></w:r><w:r><w:rPr><w:rFonts w:ascii="Arial" w:eastAsia="Times New Roman" w:hAnsi="Arial" w:cs="Arial" /><w:color w:val="333333" /><w:kern w:val="0" /><w:sz w:val="20" /><w:szCs w:val="20" /><w14:ligatures w14:val="none" /></w:rPr><w:t>,</w:t></w:r><w:r><w:rPr><w:rFonts w:ascii="Arial" w:eastAsia="Times New Roman" w:hAnsi="Arial" w:cs="Arial" /><w:color w:val="333333" /><w:kern w:val="0" /><w:sz w:val="20" /><w:szCs w:val="20" /><w14:ligatures w14:val="none" /></w:rPr><w:t xml:space="preserve"> just to name a few!</w:t></w:r><w:r><w:rPr><w:rFonts w:ascii="Arial" w:eastAsia="Times New Roman" w:hAnsi="Arial" w:cs="Arial" /><w:color w:val="333333" /><w:kern w:val="0" /><w:sz w:val="20" /><w:szCs w:val="20" /><w14:ligatures w14:val="none" /></w:rPr><w:t xml:space="preserve"> </w:t></w:r><w:r><w:rPr><w:rFonts w:ascii="Arial" w:eastAsia="Times New Roman" w:hAnsi="Arial" w:cs="Arial" /><w:color w:val="333333" /><w:kern w:val="0" /><w:sz w:val="20" /><w:szCs w:val="20" /><w14:ligatures w14:val="none" /></w:rPr><w:t xml:space="preserve"> These fun activities are located in the free,</w:t></w:r><w:r><w:rPr><w:rFonts w:ascii="Arial" w:eastAsia="Times New Roman" w:hAnsi="Arial" w:cs="Arial" /><w:color w:val="333333" /><w:kern w:val="0" /><w:sz w:val="20" /><w:szCs w:val="20" /><w14:ligatures w14:val="none" /></w:rPr><w:t xml:space="preserve"> gated Children’s Village open 1</w:t></w:r><w:r><w:rPr><w:rFonts w:ascii="Arial" w:eastAsia="Times New Roman" w:hAnsi="Arial" w:cs="Arial" /><w:color w:val="333333" /><w:kern w:val="0" /><w:sz w:val="20" /><w:szCs w:val="20" /><w14:ligatures w14:val="none" /></w:rPr><w:t xml:space="preserve"> p.m. - 8 p.m. on Friday,</w:t></w:r><w:r><w:rPr><w:rFonts w:ascii="Arial" w:eastAsia="Times New Roman" w:hAnsi="Arial" w:cs="Arial" /><w:color w:val="333333" /><w:kern w:val="0" /><w:sz w:val="20" /><w:szCs w:val="20" /><w14:ligatures w14:val="none" /></w:rPr><w:t xml:space="preserve"> and 8 a.m. - 8 p.m. on Saturday.</w:t></w:r><w:bookmarkStart w:name="_m-57#02XDZG=IBP:kte5N[xIiyC~n!DC&lt;JY%u" w:id="93" /><w:bookmarkEnd w:id="93" /><w:bookmarkStart w:name="_m-57#12~RHeV:3pv2?H4mKw:aZnQJ7&gt;0)wixg" w:id="94" /><w:bookmarkEnd w:id="94" /><w:bookmarkStart w:name="_m-57#22wG!0xr" w:id="95" /><w:bookmarkEnd w:id="95" /></w:p><w:p><w:pPr><w:shd w:val="clear" w:color="auto" w:fill="FFFFFF" /><w:spacing w:before="100" w:beforeAutospacing="1" w:after="100" w:afterAutospacing="1" w:line="270" w:lineRule="atLeast" /><w:outlineLvl w:val="3" /><w:rPr><w:b/><w:bCs/><w:rFonts w:ascii="Arial" w:eastAsia="Times New Roman" w:hAnsi="Arial" w:cs="Arial" /><w:bCs /><w:color w:val="333333" /><w:kern w:val="0" /><w:sz w:val="24" /><w:szCs w:val="24" /><w14:ligatures w14:val="none" /></w:rPr></w:pPr><w:r><w:rPr><w:b/><w:bCs/><w:rFonts w:ascii="Arial" w:eastAsia="Times New Roman" w:hAnsi="Arial" w:cs="Arial" /><w:bCs /><w:color w:val="333333" /><w:kern w:val="0" /><w:sz w:val="24" /><w:szCs w:val="24" /><w14:ligatures w14:val="none" /></w:rPr><w:t>Is smoking permitted on the festival grounds?</w:t></w:r><w:bookmarkStart w:name="_m-55#02XDXG=KBP8ktg5NYxIkyC|n!FC&lt;HY%w" w:id="90" /><w:bookmarkEnd w:id="90" /><w:bookmarkStart w:name="_m-55#12~RFeV&lt;3pt2?J4mIw:cZnOJ7@0)uixi" w:id="91" /><w:bookmarkEnd w:id="91" /><w:bookmarkStart w:name="_m-55#22wG}0xt" w:id="92" /><w:bookmarkEnd w:id="92" /></w:p><w:p><w:pPr><w:shd w:val="clear" w:color="auto" w:fill="FFFFFF" /><w:spacing w:before="100" w:beforeAutospacing="1" w:after="100" w:afterAutospacing="1" w:line="270" w:lineRule="atLeast" /><w:rPr><w:rFonts w:ascii="Arial" w:eastAsia="Times New Roman" w:hAnsi="Arial" w:cs="Arial" /><w:color w:val="333333" /><w:kern w:val="0" /><w:sz w:val="20" /><w:szCs w:val="20" /><w14:ligatures w14:val="none" /></w:rPr></w:pPr><w:r><w:rPr><w:rFonts w:ascii="Arial" w:eastAsia="Times New Roman" w:hAnsi="Arial" w:cs="Arial" /><w:color w:val="333333" /><w:kern w:val="0" /><w:sz w:val="20" /><w:szCs w:val="20" /><w14:ligatures w14:val="none" /></w:rPr><w:t>Smoking is not allowed on the festival grounds while the balloons are present. Please be courteous of other festival patrons.</w:t></w:r><w:bookmarkStart w:name="_m-53#02XDVG=MBP6kti5NWxImyCzn!HC&lt;FY%y" w:id="87" /><w:bookmarkEnd w:id="87" /><w:bookmarkStart w:name="_m-53#12~RDeV&gt;3pr2?L4mGw:eZnMJ7B0)sixk" w:id="88" /><w:bookmarkEnd w:id="88" /><w:bookmarkStart w:name="_m-53#22wG{0xv" w:id="89" /><w:bookmarkEnd w:id="89" /></w:p><w:p><w:pPr><w:shd w:val="clear" w:color="auto" w:fill="FFFFFF" /><w:spacing w:before="100" w:beforeAutospacing="1" w:after="100" w:afterAutospacing="1" w:line="270" w:lineRule="atLeast" /><w:outlineLvl w:val="3" /><w:rPr><w:b/><w:bCs/><w:rFonts w:ascii="Arial" w:eastAsia="Times New Roman" w:hAnsi="Arial" w:cs="Arial" /><w:bCs /><w:color w:val="333333" /><w:kern w:val="0" /><w:sz w:val="24" /><w:szCs w:val="24" /><w14:ligatures w14:val="none" /></w:rPr></w:pPr><w:r><w:rPr><w:b/><w:bCs/><w:rFonts w:ascii="Arial" w:eastAsia="Times New Roman" w:hAnsi="Arial" w:cs="Arial" /><w:bCs /><w:color w:val="333333" /><w:kern w:val="0" /><w:sz w:val="24" /><w:szCs w:val="24" /><w14:ligatures w14:val="none" /></w:rPr><w:t>Can I bring a cooler with beverage and food into the festival?</w:t></w:r><w:bookmarkStart w:name="_m-52#02XDUG=NBP5ktj5NVxInyCyn!IC&lt;EY%z" w:id="84" /><w:bookmarkEnd w:id="84" /><w:bookmarkStart w:name="_m-52#12~RCeV?3pq2?M4mFw:fZnLJ7C0)rixl" w:id="85" /><w:bookmarkEnd w:id="85" /><w:bookmarkStart w:name="_m-52#22wGz0xw" w:id="86" /><w:bookmarkEnd w:id="86" /></w:p><w:p><w:pPr><w:shd w:val="clear" w:color="auto" w:fill="FFFFFF" /><w:spacing w:before="100" w:beforeAutospacing="1" w:after="100" w:afterAutospacing="1" w:line="270" w:lineRule="atLeast" /><w:rPr><w:rFonts w:ascii="Arial" w:eastAsia="Times New Roman" w:hAnsi="Arial" w:cs="Arial" /><w:color w:val="333333" /><w:kern w:val="0" /><w:sz w:val="20" /><w:szCs w:val="20" /><w14:ligatures w14:val="none" /></w:rPr></w:pPr><w:r><w:rPr><w:rFonts w:ascii="Arial" w:eastAsia="Times New Roman" w:hAnsi="Arial" w:cs="Arial" /><w:color w:val="333333" /><w:kern w:val="0" /><w:sz w:val="20" /><w:szCs w:val="20" /><w14:ligatures w14:val="none" /></w:rPr><w:t>You can bring a cooler with snacks and plastic or aluminum containers. However, no glass bottles or alcohol are allowed at the festival. We do</w:t></w:r><w:r><w:rPr><w:rFonts w:ascii="Arial" w:eastAsia="Times New Roman" w:hAnsi="Arial" w:cs="Arial" /><w:color w:val="333333" /><w:kern w:val="0" /><w:sz w:val="20" /><w:szCs w:val="20" /><w14:ligatures w14:val="none" /></w:rPr><w:t xml:space="preserve"> provide an assortment of unique foods at our </w:t></w:r><w:r><w:rPr><w:rFonts w:ascii="Arial" w:eastAsia="Times New Roman" w:hAnsi="Arial" w:cs="Arial" /><w:color w:val="333333" /><w:kern w:val="0" /><w:sz w:val="20" /><w:szCs w:val="20" /><w14:ligatures w14:val="none" /></w:rPr><w:t>food vendor</w:t></w:r><w:r><w:rPr><w:rFonts w:ascii="Arial" w:eastAsia="Times New Roman" w:hAnsi="Arial" w:cs="Arial" /><w:color w:val="333333" /><w:kern w:val="0" /><w:sz w:val="20" /><w:szCs w:val="20" /><w14:ligatures w14:val="none" /></w:rPr><w:t xml:space="preserve"> stands.</w:t></w:r><w:bookmarkStart w:name="_m-4Y#02XE[G&lt;HBQ;ksd5O\xHhyD!n~CC=KY$t" w:id="81" /><w:bookmarkEnd w:id="81" /><w:bookmarkStart w:name="_m-4Y#12~SIeU93qw2&gt;G4nLw9`ZoRJ6=0*xiwf" w:id="82" /><w:bookmarkEnd w:id="82" /><w:bookmarkStart w:name="_m-4Y#22wH&quot;0wq" w:id="83" /><w:bookmarkEnd w:id="83" /></w:p><w:p><w:pPr><w:shd w:val="clear" w:color="auto" w:fill="FFFFFF" /><w:spacing w:before="100" w:beforeAutospacing="1" w:after="100" w:afterAutospacing="1" w:line="270" w:lineRule="atLeast" /><w:outlineLvl w:val="3" /><w:rPr><w:b/><w:bCs/><w:rFonts w:ascii="Arial" w:eastAsia="Times New Roman" w:hAnsi="Arial" w:cs="Arial" /><w:bCs /><w:color w:val="333333" /><w:kern w:val="0" /><w:sz w:val="24" /><w:szCs w:val="24" /><w14:ligatures w14:val="none" /></w:rPr></w:pPr><w:r><w:rPr><w:b/><w:bCs/><w:rFonts w:ascii="Arial" w:eastAsia="Times New Roman" w:hAnsi="Arial" w:cs="Arial" /><w:bCs /><w:color w:val="333333" /><w:kern w:val="0" /><w:sz w:val="24" /><w:szCs w:val="24" /><w14:ligatures w14:val="none" /></w:rPr><w:t>What are my camping, RV, or lodging options?</w:t></w:r><w:bookmarkStart w:name="_m-4W#02XEYG&lt;JBQ9ksf5OZxHjyD}n~EC=IY$v" w:id="78" /><w:bookmarkEnd w:id="78" /><w:bookmarkStart w:name="_m-4W#12~SGeU;3qu2&gt;I4nJw9bZoPJ6?0*viwh" w:id="79" /><w:bookmarkEnd w:id="79" /><w:bookmarkStart w:name="_m-4W#22wH~0ws" w:id="80" /><w:bookmarkEnd w:id="80" /></w:p><w:p><w:pPr><w:shd w:val="clear" w:color="auto" w:fill="FFFFFF" /><w:spacing w:beforeAutospacing="1" w:after="0" w:afterAutospacing="1" w:line="270" w:lineRule="atLeast" /><w:rPr><w:rFonts w:ascii="Arial" w:eastAsia="Times New Roman" w:hAnsi="Arial" w:cs="Arial" /><w:color w:val="333333" /><w:kern w:val="0" /><w:sz w:val="20" /><w:szCs w:val="20" /><w14:ligatures w14:val="none" /></w:rPr></w:pPr><w:r><w:rPr><w:rFonts w:ascii="Arial" w:eastAsia="Times New Roman" w:hAnsi="Arial" w:cs="Arial" /><w:color w:val="333333" /><w:kern w:val="0" /><w:sz w:val="20" /><w:szCs w:val="20" /><w14:ligatures w14:val="none" /></w:rPr><w:t>While you cannot camp or park an RV on the festival grounds, there are camping options nearby.</w:t></w:r><w:r><w:rPr><w:rFonts w:ascii="Arial" w:eastAsia="Times New Roman" w:hAnsi="Arial" w:cs="Arial" /><w:color w:val="333333" /><w:kern w:val="0" /><w:sz w:val="20" /><w:szCs w:val="20" /><w14:ligatures w14:val="none" /></w:rPr><w:t xml:space="preserve"> Check with the </w:t></w:r><w:r><w:rPr><w:rFonts w:ascii="Arial" w:eastAsia="Times New Roman" w:hAnsi="Arial" w:cs="Arial" /><w:color w:val="333333" /><w:kern w:val="0" /><w:sz w:val="20" /><w:szCs w:val="20" /><w14:ligatures w14:val="none" /></w:rPr><w:t>Mount Sedona</w:t></w:r><w:r><w:rPr><w:rFonts w:ascii="Arial" w:eastAsia="Times New Roman" w:hAnsi="Arial" w:cs="Arial" /><w:color w:val="333333" /><w:kern w:val="0" /><w:sz w:val="20" /><w:szCs w:val="20" /><w14:ligatures w14:val="none" /></w:rPr><w:t xml:space="preserve"> County Chamber of Commerce for a complete list of camping facilities.</w:t></w:r><w:bookmarkStart w:name="_m-4V#02XEXG&lt;KBQ8ksg5OYxHkyD|n~FC=HY$w" w:id="75" /><w:bookmarkEnd w:id="75" /><w:bookmarkStart w:name="_m-4V#12~SFeU&lt;3qt2&gt;J4nIw9cZoOJ6@0*uiwi" w:id="76" /><w:bookmarkEnd w:id="76" /><w:bookmarkStart w:name="_m-4V#22wH}0wt" w:id="77" /><w:bookmarkEnd w:id="77" /></w:p><w:p><w:pPr><w:shd w:val="clear" w:color="auto" w:fill="FFFFFF" /><w:spacing w:before="100" w:beforeAutospacing="1" w:after="100" w:afterAutospacing="1" w:line="270" w:lineRule="atLeast" /><w:outlineLvl w:val="3" /><w:rPr><w:rFonts w:ascii="Arial" w:eastAsia="Times New Roman" w:hAnsi="Arial" w:cs="Arial" /><w:bCs /><w:color w:val="333333" /><w:kern w:val="0" /><w:sz w:val="24" /><w:szCs w:val="24" /><w14:ligatures w14:val="none" /></w:rPr></w:pPr><w:r><w:rPr><w:rFonts w:ascii="Arial" w:eastAsia="Times New Roman" w:hAnsi="Arial" w:cs="Arial" /><w:bCs /><w:color w:val="333333" /><w:kern w:val="0" /><w:sz w:val="24" /><w:szCs w:val="24" /><w14:ligatures w14:val="none" /></w:rPr><w:t>How c</w:t></w:r><w:r><w:rPr><w:rFonts w:ascii="Arial" w:eastAsia="Times New Roman" w:hAnsi="Arial" w:cs="Arial" /><w:bCs /><w:color w:val="333333" /><w:kern w:val="0" /><w:sz w:val="24" /><w:szCs w:val="24" /><w14:ligatures w14:val="none" /></w:rPr><w:t xml:space="preserve">an I </w:t></w:r><w:r><w:rPr><w:rFonts w:ascii="Arial" w:eastAsia="Times New Roman" w:hAnsi="Arial" w:cs="Arial" /><w:bCs /><w:color w:val="333333" /><w:kern w:val="0" /><w:sz w:val="24" /><w:szCs w:val="24" /><w14:ligatures w14:val="none" /></w:rPr><w:t>plan for the best e</w:t></w:r><w:r><w:rPr><w:rFonts w:ascii="Arial" w:eastAsia="Times New Roman" w:hAnsi="Arial" w:cs="Arial" /><w:bCs /><w:color w:val="333333" /><w:kern w:val="0" /><w:sz w:val="24" /><w:szCs w:val="24" /><w14:ligatures w14:val="none" /></w:rPr><w:t>xperience?</w:t></w:r><w:bookmarkStart w:name="_m-4S#02XEUG&lt;NBQ5ksj5OVxHnyDyn~IC=EY$z" w:id="72" /><w:bookmarkEnd w:id="72" /><w:bookmarkStart w:name="_m-4S#12~SCeU?3qq2&gt;M4nFw9fZoLJ6C0*riwl" w:id="73" /><w:bookmarkEnd w:id="73" /><w:bookmarkStart w:name="_m-4S#22wHz0ww" w:id="74" /><w:bookmarkEnd w:id="74" /></w:p><w:p><w:pPr><w:shd w:val="clear" w:color="auto" w:fill="FFFFFF" /><w:spacing w:beforeAutospacing="1" w:after="0" w:afterAutospacing="1" w:line="270" w:lineRule="atLeast" /><w:rPr><w:rFonts w:ascii="Arial" w:eastAsia="Times New Roman" w:hAnsi="Arial" w:cs="Arial" /><w:color w:val="333333" /><w:kern w:val="0" /><w:sz w:val="20" /><w:szCs w:val="20" /><w14:ligatures w14:val="none" /></w:rPr></w:pPr><w:r><w:rPr><w:rFonts w:ascii="Arial" w:eastAsia="Times New Roman" w:hAnsi="Arial" w:cs="Arial" /><w:color w:val="333333" /><w:kern w:val="0" /><w:sz w:val="20" /><w:szCs w:val="20" /><w14:ligatures w14:val="none" /></w:rPr><w:t>Although there is no perfect formula, the follow</w:t></w:r><w:r><w:rPr><w:rFonts w:ascii="Arial" w:eastAsia="Times New Roman" w:hAnsi="Arial" w:cs="Arial" /><w:color w:val="333333" /><w:kern w:val="0" /><w:sz w:val="20" /><w:szCs w:val="20" /><w14:ligatures w14:val="none" /></w:rPr><w:t>ing</w:t></w:r><w:r><w:rPr><w:rFonts w:ascii="Arial" w:eastAsia="Times New Roman" w:hAnsi="Arial" w:cs="Arial" /><w:color w:val="333333" /><w:kern w:val="0" /><w:sz w:val="20" /><w:szCs w:val="20" /><w14:ligatures w14:val="none" /></w:rPr><w:t xml:space="preserve"> tips should </w:t></w:r><w:r><w:rPr><w:rFonts w:ascii="Arial" w:eastAsia="Times New Roman" w:hAnsi="Arial" w:cs="Arial" /><w:color w:val="333333" /><w:kern w:val="0" /><w:sz w:val="20" /><w:szCs w:val="20" /><w14:ligatures w14:val="none" /></w:rPr><w:t>e</w:t></w:r><w:r><w:rPr><w:rFonts w:ascii="Arial" w:eastAsia="Times New Roman" w:hAnsi="Arial" w:cs="Arial" /><w:color w:val="333333" /><w:kern w:val="0" /><w:sz w:val="20" /><w:szCs w:val="20" /><w14:ligatures w14:val="none" /></w:rPr><w:t>nsure that you have all the bases covered!</w:t></w:r><w:bookmarkStart w:name="_m-4Q#02XESG&lt;PBQ3ksl5OTxHpyDwn~KC=CY$|" w:id="69" /><w:bookmarkEnd w:id="69" /><w:bookmarkStart w:name="_m-4Q#12~SAeUA3qo2&gt;O4nDw9hZoJJ6E0*piwn" w:id="70" /><w:bookmarkEnd w:id="70" /><w:bookmarkStart w:name="_m-4Q#22wHx0wy" w:id="71" /><w:bookmarkEnd w:id="71" /></w:p><w:p><w:pPr><w:shd w:val="clear" w:color="auto" w:fill="FFFFFF" /><w:spacing w:beforeAutospacing="1" w:after="0" w:afterAutospacing="1" w:line="270" w:lineRule="atLeast" /><w:rPr><w:rFonts w:ascii="Arial" w:eastAsia="Times New Roman" w:hAnsi="Arial" w:cs="Arial" /><w:color w:val="333333" /><w:kern w:val="0" /><w:sz w:val="20" /><w:szCs w:val="20" /><w14:ligatures w14:val="none" /></w:rPr></w:pPr><w:r><w:rPr><w:rFonts w:ascii="Arial" w:eastAsia="Times New Roman" w:hAnsi="Arial" w:cs="Arial" /><w:color w:val="333333" /><w:kern w:val="0" /><w:sz w:val="20" /><w:szCs w:val="20" /><w14:ligatures w14:val="none" /></w:rPr><w:t>Wear good walking shoes. The park encompasses 15 acres, so hiking is a strong possibility.</w:t></w:r><w:bookmarkStart w:name="_m-4N#02XFZG;IBR:kre5P[xGiyE~n}DC&gt;JY#u" w:id="66" /><w:bookmarkEnd w:id="66" /><w:bookmarkStart w:name="_m-4N#12~THeT:3rv2=H4oKw8aZpQJ5&gt;0+wivg" w:id="67" /><w:bookmarkEnd w:id="67" /><w:bookmarkStart w:name="_m-4N#22wI!0vr" w:id="68" /><w:bookmarkEnd w:id="68" /></w:p><w:p><w:pPr><w:shd w:val="clear" w:color="auto" w:fill="FFFFFF" /><w:spacing w:beforeAutospacing="1" w:after="0" w:afterAutospacing="1" w:line="270" w:lineRule="atLeast" /><w:rPr><w:rFonts w:ascii="Arial" w:eastAsia="Times New Roman" w:hAnsi="Arial" w:cs="Arial" /><w:color w:val="333333" /><w:kern w:val="0" /><w:sz w:val="20" /><w:szCs w:val="20" /><w14:ligatures w14:val="none" /></w:rPr></w:pPr><w:r><w:rPr><w:rFonts w:ascii="Arial" w:eastAsia="Times New Roman" w:hAnsi="Arial" w:cs="Arial" /><w:color w:val="333333" /><w:kern w:val="0" /><w:sz w:val="20" /><w:szCs w:val="20" /><w14:ligatures w14:val="none" /></w:rPr><w:lastRenderedPageBreak /><w:t>Bring sunscreen. There is very little shade.</w:t></w:r><w:bookmarkStart w:name="_m-4J#02XFVG;MBR6kri5PWxGmyEzn}HC&gt;FY#y" w:id="63" /><w:bookmarkEnd w:id="63" /><w:bookmarkStart w:name="_m-4J#12~TDeT&gt;3rr2=L4oGw8eZpMJ5B0+sivk" w:id="64" /><w:bookmarkEnd w:id="64" /><w:bookmarkStart w:name="_m-4J#22wI{0vv" w:id="65" /><w:bookmarkEnd w:id="65" /></w:p><w:p><w:pPr><w:shd w:val="clear" w:color="auto" w:fill="FFFFFF" /><w:spacing w:beforeAutospacing="1" w:after="0" w:afterAutospacing="1" w:line="270" w:lineRule="atLeast" /><w:rPr><w:rFonts w:ascii="Arial" w:eastAsia="Times New Roman" w:hAnsi="Arial" w:cs="Arial" /><w:color w:val="333333" /><w:kern w:val="0" /><w:sz w:val="20" /><w:szCs w:val="20" /><w14:ligatures w14:val="none" /></w:rPr></w:pPr><w:r><w:rPr><w:rFonts w:ascii="Arial" w:eastAsia="Times New Roman" w:hAnsi="Arial" w:cs="Arial" /><w:color w:val="333333" /><w:kern w:val="0" /><w:sz w:val="20" /><w:szCs w:val="20" /><w14:ligatures w14:val="none" /></w:rPr><w:t>Get to the park early. When the balloons inflate, long lines form.</w:t></w:r><w:bookmarkStart w:name="_m-4H#02XFTG;OBR4krk5PUxGoyExn}JC&gt;DY#{" w:id="60" /><w:bookmarkEnd w:id="60" /><w:bookmarkStart w:name="_m-4H#12~TBeT@3rp2=N4oEw8gZpKJ5D0+qivm" w:id="61" /><w:bookmarkEnd w:id="61" /><w:bookmarkStart w:name="_m-4H#22wIy0vx" w:id="62" /><w:bookmarkEnd w:id="62" /></w:p><w:p><w:pPr><w:shd w:val="clear" w:color="auto" w:fill="FFFFFF" /><w:spacing w:beforeAutospacing="1" w:after="0" w:afterAutospacing="1" w:line="270" w:lineRule="atLeast" /><w:rPr><w:rFonts w:ascii="Arial" w:eastAsia="Times New Roman" w:hAnsi="Arial" w:cs="Arial" /><w:color w:val="333333" /><w:kern w:val="0" /><w:sz w:val="20" /><w:szCs w:val="20" /><w14:ligatures w14:val="none" /></w:rPr></w:pPr><w:r><w:rPr><w:rFonts w:ascii="Arial" w:eastAsia="Times New Roman" w:hAnsi="Arial" w:cs="Arial" /><w:color w:val="333333" /><w:kern w:val="0" /><w:sz w:val="20" /><w:szCs w:val="20" /><w14:ligatures w14:val="none" /></w:rPr><w:t>Wear comfortable, cool clothing. If you take tether rides, the flame does make it hot in the basket.</w:t></w:r><w:bookmarkStart w:name="_m-4E#02XG[G:HBS;kqd5Q\xFhyF!n|CC?KY&quot;t" w:id="57" /><w:bookmarkEnd w:id="57" /><w:bookmarkStart w:name="_m-4E#12~UIeS93sw2&lt;G4pLw7`ZqRJ4=0,xiuf" w:id="58" /><w:bookmarkEnd w:id="58" /><w:bookmarkStart w:name="_m-4E#22wJ&quot;0uq" w:id="59" /><w:bookmarkEnd w:id="59" /></w:p><w:p><w:pPr><w:shd w:val="clear" w:color="auto" w:fill="FFFFFF" /><w:spacing w:beforeAutospacing="1" w:after="0" w:afterAutospacing="1" w:line="270" w:lineRule="atLeast" /><w:rPr><w:rFonts w:ascii="Arial" w:eastAsia="Times New Roman" w:hAnsi="Arial" w:cs="Arial" /><w:color w:val="333333" /><w:kern w:val="0" /><w:sz w:val="20" /><w:szCs w:val="20" /><w14:ligatures w14:val="none" /></w:rPr></w:pPr><w:r><w:rPr><w:rFonts w:ascii="Arial" w:eastAsia="Times New Roman" w:hAnsi="Arial" w:cs="Arial" /><w:color w:val="333333" /><w:kern w:val="0" /><w:sz w:val="20" /><w:szCs w:val="20" /><w14:ligatures w14:val="none" /></w:rPr><w:t>Bring</w:t></w:r><w:r><w:rPr><w:rFonts w:ascii="Arial" w:eastAsia="Times New Roman" w:hAnsi="Arial" w:cs="Arial" /><w:color w:val="333333" /><w:kern w:val="0" /><w:sz w:val="20" /><w:szCs w:val="20" /><w14:ligatures w14:val="none" /></w:rPr><w:t xml:space="preserve"> a camera and tripod. The ballu</w:t></w:r><w:r><w:rPr><w:rFonts w:ascii="Arial" w:eastAsia="Times New Roman" w:hAnsi="Arial" w:cs="Arial" /><w:color w:val="333333" /><w:kern w:val="0" /><w:sz w:val="20" /><w:szCs w:val="20" /><w14:ligatures w14:val="none" /></w:rPr><w:t>mination at dusk is a beautiful photo opportunity, but the low light makes a tripod a necessity.</w:t></w:r><w:bookmarkStart w:name="_m-4B#02XGXG:KBS8kqg5QYxFkyF|n|FC?HY&quot;w" w:id="54" /><w:bookmarkEnd w:id="54" /><w:bookmarkStart w:name="_m-4B#12~UFeS&lt;3st2&lt;J4pIw7cZqOJ4@0,uiui" w:id="55" /><w:bookmarkEnd w:id="55" /><w:bookmarkStart w:name="_m-4B#22wJ}0ut" w:id="56" /><w:bookmarkEnd w:id="56" /></w:p><w:p><w:pPr><w:shd w:val="clear" w:color="auto" w:fill="FFFFFF" /><w:spacing w:beforeAutospacing="1" w:after="0" w:afterAutospacing="1" w:line="270" w:lineRule="atLeast" /><w:rPr><w:rFonts w:ascii="Arial" w:eastAsia="Times New Roman" w:hAnsi="Arial" w:cs="Arial" /><w:color w:val="333333" /><w:kern w:val="0" /><w:sz w:val="20" /><w:szCs w:val="20" /><w14:ligatures w14:val="none" /></w:rPr></w:pPr><w:r><w:rPr><w:rFonts w:ascii="Arial" w:eastAsia="Times New Roman" w:hAnsi="Arial" w:cs="Arial" /><w:color w:val="333333" /><w:kern w:val="0" /><w:sz w:val="20" /><w:szCs w:val="20" /><w14:ligatures w14:val="none" /></w:rPr><w:t>Bring lawn chairs and/or blankets.</w:t></w:r><w:bookmarkStart w:name="_m-48#02XGUG:NBS5kqj5QVxFnyFyn|IC?EY&quot;z" w:id="51" /><w:bookmarkEnd w:id="51" /><w:bookmarkStart w:name="_m-48#12~UCeS?3sq2&lt;M4pFw7fZqLJ4C0,riul" w:id="52" /><w:bookmarkEnd w:id="52" /><w:bookmarkStart w:name="_m-48#22wJz0uw" w:id="53" /><w:bookmarkEnd w:id="53" /></w:p><w:p><w:pPr><w:shd w:val="clear" w:color="auto" w:fill="FFFFFF" /><w:spacing w:beforeAutospacing="1" w:after="0" w:afterAutospacing="1" w:line="270" w:lineRule="atLeast" /><w:rPr><w:rFonts w:ascii="Arial" w:eastAsia="Times New Roman" w:hAnsi="Arial" w:cs="Arial" /><w:color w:val="333333" /><w:kern w:val="0" /><w:sz w:val="20" /><w:szCs w:val="20" /><w14:ligatures w14:val="none" /></w:rPr></w:pPr><w:r><w:rPr><w:rFonts w:ascii="Arial" w:eastAsia="Times New Roman" w:hAnsi="Arial" w:cs="Arial" /><w:color w:val="333333" /><w:kern w:val="0" /><w:sz w:val="20" /><w:szCs w:val="20" /><w14:ligatures w14:val="none" /></w:rPr><w:t>Bring, or prepare to buy, plenty of water.</w:t></w:r><w:bookmarkStart w:name="_m-47#02XGTG:OBS4kqk5QUxFoyFxn|JC?DY&quot;{" w:id="48" /><w:bookmarkEnd w:id="48" /><w:bookmarkStart w:name="_m-47#12~UBeS@3sp2&lt;N4pEw7gZqKJ4D0,qium" w:id="49" /><w:bookmarkEnd w:id="49" /><w:bookmarkStart w:name="_m-47#22wJy0ux" w:id="50" /><w:bookmarkEnd w:id="50" /></w:p><w:p><w:pPr><w:shd w:val="clear" w:color="auto" w:fill="FFFFFF" /><w:spacing w:beforeAutospacing="1" w:after="0" w:afterAutospacing="1" w:line="270" w:lineRule="atLeast" /><w:rPr><w:rFonts w:ascii="Arial" w:eastAsia="Times New Roman" w:hAnsi="Arial" w:cs="Arial" /><w:color w:val="333333" /><w:kern w:val="0" /><w:sz w:val="20" /><w:szCs w:val="20" /><w14:ligatures w14:val="none" /></w:rPr></w:pPr><w:r><w:rPr><w:rFonts w:ascii="Arial" w:eastAsia="Times New Roman" w:hAnsi="Arial" w:cs="Arial" /><w:color w:val="333333" /><w:kern w:val="0" /><w:sz w:val="20" /><w:szCs w:val="20" /><w14:ligatures w14:val="none" /></w:rPr><w:t>Bring Frisbees or balls for children to play with in the large open field while you wait for a show to begin.</w:t></w:r><w:bookmarkStart w:name="_m-42#02XHYG9JBT9kpf5RZxEjyG}n{EC@IY!v" w:id="45" /><w:bookmarkEnd w:id="45" /><w:bookmarkStart w:name="_m-42#12~VGeR;3tu2;I4qJw6bZrPJ3?0-vith" w:id="46" /><w:bookmarkEnd w:id="46" /><w:bookmarkStart w:name="_m-42#22wK~0ts" w:id="47" /><w:bookmarkEnd w:id="47" /></w:p><w:p><w:pPr><w:shd w:val="clear" w:color="auto" w:fill="FFFFFF" /><w:spacing w:beforeAutospacing="1" w:after="0" w:afterAutospacing="1" w:line="270" w:lineRule="atLeast" /><w:rPr><w:rFonts w:ascii="Verdana" w:eastAsia="Times New Roman" w:hAnsi="Verdana" w:cs="Times New Roman" /><w:color w:val="444E5C" /><w:kern w:val="0" /><w:sz w:val="20" /><w:szCs w:val="20" /><w14:ligatures w14:val="none" /></w:rPr></w:pPr><w:bookmarkStart w:name="_m-3X#02XHTG9OBT4kpk5RUxEoyGxn{JC@DY!{" w:id="42" /><w:bookmarkEnd w:id="42" /><w:bookmarkStart w:name="_m-3X#12~VBeR@3tp2;N4qEw6gZrKJ3D0-qitm" w:id="43" /><w:bookmarkEnd w:id="43" /><w:bookmarkStart w:name="_m-3X#22wKy0tx" w:id="44" /><w:bookmarkEnd w:id="44" /></w:p><w:p><w:pPr><w:shd w:val="clear" w:color="auto" w:fill="FFFFFF" /><w:spacing w:beforeAutospacing="1" w:after="0" w:afterAutospacing="1" w:line="270" w:lineRule="atLeast" /><w:rPr><w:rStyle w:val="Strong" /><w:rFonts w:ascii="Arial" w:hAnsi="Arial" w:cs="Arial" /></w:rPr></w:pPr><w:r><w:rPr><w:rStyle w:val="Strong" /><w:rFonts w:ascii="Arial" w:hAnsi="Arial" w:cs="Arial" /></w:rPr><w:t>Event S</w:t></w:r><w:r><w:rPr><w:rStyle w:val="Strong" /><w:rFonts w:ascii="Arial" w:hAnsi="Arial" w:cs="Arial" /></w:rPr><w:t>chedule</w:t></w:r><w:bookmarkStart w:name="_m-3V#02XI\G8GBU&lt;koc5S]xDgyH&quot;nzBCALY~s" w:id="39" /><w:bookmarkEnd w:id="39" /><w:bookmarkStart w:name="_m-3V#12~WJeQ83ux2:F4rMw5_ZsSJ2&lt;0.yise" w:id="40" /><w:bookmarkEnd w:id="40" /><w:bookmarkStart w:name="_m-3V#22wL#0sp" w:id="41" /><w:bookmarkEnd w:id="41" /></w:p><w:p><w:pPr><w:shd w:val="clear" w:color="auto" w:fill="FFFFFF" /><w:spacing w:beforeAutospacing="1" w:after="0" w:afterAutospacing="1" w:line="270" w:lineRule="atLeast" /><w:rPr><w:rStyle w:val="Strong" /><w:rFonts w:ascii="Arial" w:hAnsi="Arial" w:cs="Arial" /></w:rPr></w:pPr><w:r><w:rPr><w:rStyle w:val="Strong" /><w:rFonts w:ascii="Arial" w:hAnsi="Arial" w:cs="Arial" /></w:rPr><w:t>Saturday (5/2</w:t></w:r><w:r><w:rPr><w:rStyle w:val="Strong" /><w:rFonts w:ascii="Arial" w:hAnsi="Arial" w:cs="Arial" /></w:rPr><w:t>8</w:t></w:r><w:r><w:rPr><w:rStyle w:val="Strong" /><w:rFonts w:ascii="Arial" w:hAnsi="Arial" w:cs="Arial" /></w:rPr><w:t>/</w:t></w:r><w:r><w:rPr><w:rStyle w:val="Strong" /><w:rFonts w:ascii="Arial" w:hAnsi="Arial" w:cs="Arial" /></w:rPr><w:t>202</w:t></w:r><w:r><w:rPr><w:rStyle w:val="Strong" /><w:rFonts w:ascii="Arial" w:hAnsi="Arial" w:cs="Arial" /></w:rPr><w:t>4</w:t></w:r><w:r><w:rPr><w:rStyle w:val="Strong" /><w:rFonts w:ascii="Arial" w:hAnsi="Arial" w:cs="Arial" /></w:rPr><w:t>)</w:t></w:r><w:bookmarkStart w:name="_m-3T#02XIZG8IBU:koe5S[xDiyH~nzDCAJY~u" w:id="36" /><w:bookmarkEnd w:id="36" /><w:bookmarkStart w:name="_m-3T#12~WHeQ:3uv2:H4rKw5aZsQJ2&gt;0.wisg" w:id="37" /><w:bookmarkEnd w:id="37" /><w:bookmarkStart w:name="_m-3T#22wL!0sr" w:id="38" /><w:bookmarkEnd w:id="38" /></w:p><w:p><w:pPr><w:shd w:val="clear" w:color="auto" w:fill="FFFFFF" /><w:spacing w:beforeAutospacing="1" w:after="0" w:afterAutospacing="1" w:line="270" w:lineRule="atLeast" /><w:rPr><w:rFonts w:ascii="Arial" w:hAnsi="Arial" w:cs="Arial" /></w:rPr></w:pPr><w:r><w:rPr><w:rFonts w:ascii="Arial" w:hAnsi="Arial" w:cs="Arial" /></w:rPr><w:t xml:space="preserve">6:00 AM </w:t></w:r><w:r><w:rPr><w:rFonts w:ascii="Arial" w:hAnsi="Arial" w:cs="Arial" /></w:rPr><w:t>Pilots Briefing</w:t></w:r><w:bookmarkStart w:name="_m-3R#02XIXG8KBU8kog5SYxDkyH|nzFCAHY~w" w:id="33" /><w:bookmarkEnd w:id="33" /><w:bookmarkStart w:name="_m-3R#12~WFeQ&lt;3ut2:J4rIw5cZsOJ2@0.uisi" w:id="34" /><w:bookmarkEnd w:id="34" /><w:bookmarkStart w:name="_m-3R#22wL}0st" w:id="35" /><w:bookmarkEnd w:id="35" /></w:p><w:p><w:pPr><w:shd w:val="clear" w:color="auto" w:fill="FFFFFF" /><w:spacing w:beforeAutospacing="1" w:after="0" w:afterAutospacing="1" w:line="270" w:lineRule="atLeast" /><w:rPr><w:rFonts w:ascii="Arial" w:hAnsi="Arial" w:cs="Arial" /></w:rPr></w:pPr><w:r><w:rPr><w:rFonts w:ascii="Arial" w:hAnsi="Arial" w:cs="Arial" /></w:rPr><w:t>6:30 AM Hare and Hound Race</w:t></w:r><w:bookmarkStart w:name="_m-3N#02XITG8OBU4kok5SUxDoyHxnzJCADY~{" w:id="30" /><w:bookmarkEnd w:id="30" /><w:bookmarkStart w:name="_m-3N#12~WBeQ@3up2:N4rEw5gZsKJ2D0.qism" w:id="31" /><w:bookmarkEnd w:id="31" /><w:bookmarkStart w:name="_m-3N#22wLy0sx" w:id="32" /><w:bookmarkEnd w:id="32" /></w:p><w:p><w:pPr><w:shd w:val="clear" w:color="auto" w:fill="FFFFFF" /><w:spacing w:beforeAutospacing="1" w:after="0" w:afterAutospacing="1" w:line="270" w:lineRule="atLeast" /><w:rPr><w:rFonts w:ascii="Arial" w:hAnsi="Arial" w:cs="Arial" /></w:rPr></w:pPr><w:r><w:rPr><w:rFonts w:ascii="Arial" w:hAnsi="Arial" w:cs="Arial" /></w:rPr><w:t>5:00 PM Pilot Briefing</w:t></w:r><w:bookmarkStart w:name="_m-3J#02XJZG7IBV:kne5T[xCiyI~nyDCBJY}u" w:id="27" /><w:bookmarkEnd w:id="27" /><w:bookmarkStart w:name="_m-3J#12~XHeP:3vv29H4sKw4aZtQJ1&gt;0/wirg" w:id="28" /><w:bookmarkEnd w:id="28" /><w:bookmarkStart w:name="_m-3J#22wM!0rr" w:id="29" /><w:bookmarkEnd w:id="29" /></w:p><w:p><w:pPr><w:shd w:val="clear" w:color="auto" w:fill="FFFFFF" /><w:spacing w:beforeAutospacing="1" w:after="0" w:afterAutospacing="1" w:line="270" w:lineRule="atLeast" /><w:rPr><w:rFonts w:ascii="Arial" w:hAnsi="Arial" w:cs="Arial" /></w:rPr></w:pPr><w:r><w:rPr><w:rFonts w:ascii="Arial" w:hAnsi="Arial" w:cs="Arial" /></w:rPr><w:t>5:30 PM Fun Flight</w:t></w:r><w:bookmarkStart w:name="_m-3H#02XJXG7KBV8kng5TYxCkyI|nyFCBHY}w" w:id="24" /><w:bookmarkEnd w:id="24" /><w:bookmarkStart w:name="_m-3H#12~XFeP&lt;3vt29J4sIw4cZtOJ1@0/uiri" w:id="25" /><w:bookmarkEnd w:id="25" /><w:bookmarkStart w:name="_m-3H#22wM}0rt" w:id="26" /><w:bookmarkEnd w:id="26" /></w:p><w:p><w:pPr><w:shd w:val="clear" w:color="auto" w:fill="FFFFFF" /><w:spacing w:beforeAutospacing="1" w:after="0" w:afterAutospacing="1" w:line="270" w:lineRule="atLeast" /><w:rPr><w:rFonts w:ascii="Arial" w:hAnsi="Arial" w:cs="Arial" /></w:rPr></w:pPr><w:r><w:rPr><w:rFonts w:ascii="Arial" w:hAnsi="Arial" w:cs="Arial" /></w:rPr><w:t>6:30 PM Tethers</w:t></w:r><w:bookmarkStart w:name="_m-3C#02XJSG7PBV3knl5TTxCpyIwnyKCBCY}|" w:id="21" /><w:bookmarkEnd w:id="21" /><w:bookmarkStart w:name="_m-3C#12~XAePA3vo29O4sDw4hZtJJ1E0/pirn" w:id="22" /><w:bookmarkEnd w:id="22" /><w:bookmarkStart w:name="_m-3C#22wMx0ry" w:id="23" /><w:bookmarkEnd w:id="23" /></w:p><w:p><w:pPr><w:shd w:val="clear" w:color="auto" w:fill="FFFFFF" /><w:spacing w:beforeAutospacing="1" w:after="0" w:afterAutospacing="1" w:line="270" w:lineRule="atLeast" /><w:rPr><w:rFonts w:ascii="Arial" w:hAnsi="Arial" w:cs="Arial" /></w:rPr></w:pPr><w:r><w:rPr><w:rFonts w:ascii="Arial" w:hAnsi="Arial" w:cs="Arial" /></w:rPr><w:t>8:15 PM Balloon Glow</w:t></w:r><w:bookmarkStart w:name="_m-3A#02XK[G6HBW;kmd5U\xBhyJ!nxCCCKY|t" w:id="18" /><w:bookmarkEnd w:id="18" /><w:bookmarkStart w:name="_m-3A#12~YIeO93ww28G4tLw3`ZuRJ0=00xiqf" w:id="19" /><w:bookmarkEnd w:id="19" /><w:bookmarkStart w:name="_m-3A#22wN&quot;0qq" w:id="20" /><w:bookmarkEnd w:id="20" /></w:p><w:p><w:pPr><w:shd w:val="clear" w:color="auto" w:fill="FFFFFF" /><w:spacing w:beforeAutospacing="1" w:after="0" w:afterAutospacing="1" w:line="270" w:lineRule="atLeast" /><w:rPr><w:rStyle w:val="Strong" /><w:rFonts w:ascii="Arial" w:hAnsi="Arial" w:cs="Arial" /></w:rPr></w:pPr><w:r><w:rPr><w:rStyle w:val="Strong" /><w:rFonts w:ascii="Arial" w:hAnsi="Arial" w:cs="Arial" /></w:rPr><w:t>Sunday (5/2</w:t></w:r><w:r><w:rPr><w:rStyle w:val="Strong" /><w:rFonts w:ascii="Arial" w:hAnsi="Arial" w:cs="Arial" /></w:rPr><w:t>9</w:t></w:r><w:r><w:rPr><w:rStyle w:val="Strong" /><w:rFonts w:ascii="Arial" w:hAnsi="Arial" w:cs="Arial" /></w:rPr><w:t>/</w:t></w:r><w:r><w:rPr><w:rStyle w:val="Strong" /><w:rFonts w:ascii="Arial" w:hAnsi="Arial" w:cs="Arial" /></w:rPr><w:t>202</w:t></w:r><w:r><w:rPr><w:rStyle w:val="Strong" /><w:rFonts w:ascii="Arial" w:hAnsi="Arial" w:cs="Arial" /></w:rPr><w:t>4</w:t></w:r><w:r><w:rPr><w:rStyle w:val="Strong" /><w:rFonts w:ascii="Arial" w:hAnsi="Arial" w:cs="Arial" /></w:rPr><w:t>)</w:t></w:r><w:bookmarkStart w:name="_m-38#02XKYG6JBW9kmf5UZxBjyJ}nxECCIY|v" w:id="15" /><w:bookmarkEnd w:id="15" /><w:bookmarkStart w:name="_m-38#12~YGeO;3wu28I4tJw3bZuPJ0?00viqh" w:id="16" /><w:bookmarkEnd w:id="16" /><w:bookmarkStart w:name="_m-38#22wN~0qs" w:id="17" /><w:bookmarkEnd w:id="17" /></w:p><w:p><w:pPr><w:shd w:val="clear" w:color="auto" w:fill="FFFFFF" /><w:spacing w:beforeAutospacing="1" w:after="0" w:afterAutospacing="1" w:line="270" w:lineRule="atLeast" /><w:rPr><w:rFonts w:ascii="Arial" w:hAnsi="Arial" w:cs="Arial" /></w:rPr></w:pPr><w:r><w:rPr><w:rFonts w:ascii="Arial" w:hAnsi="Arial" w:cs="Arial" /></w:rPr><w:t>6:00 AM Pilots Briefing</w:t></w:r><w:bookmarkStart w:name="_m-37#02XKXG6KBW8kmg5UYxBkyJ|nxFCCHY|w" w:id="12" /><w:bookmarkEnd w:id="12" /><w:bookmarkStart w:name="_m-37#12~YFeO&lt;3wt28J4tIw3cZuOJ0@00uiqi" w:id="13" /><w:bookmarkEnd w:id="13" /><w:bookmarkStart w:name="_m-37#22wN}0qt" w:id="14" /><w:bookmarkEnd w:id="14" /></w:p><w:p><w:pPr><w:shd w:val="clear" w:color="auto" w:fill="FFFFFF" /><w:spacing w:beforeAutospacing="1" w:after="0" w:afterAutospacing="1" w:line="270" w:lineRule="atLeast" /><w:rPr><w:rFonts w:ascii="Arial" w:hAnsi="Arial" w:cs="Arial" /></w:rPr></w:pPr><w:r><w:rPr><w:rFonts w:ascii="Arial" w:hAnsi="Arial" w:cs="Arial" /></w:rPr><w:t>6:30 AM Lynn Layton Key Grab</w:t></w:r><w:bookmarkStart w:name="_m-33#02XKTG6OBW4kmk5UUxBoyJxnxJCCDY|{" w:id="9" /><w:bookmarkEnd w:id="9" /><w:bookmarkStart w:name="_m-33#12~YBeO@3wp28N4tEw3gZuKJ0D00qiqm" w:id="10" /><w:bookmarkEnd w:id="10" /><w:bookmarkStart w:name="_m-33#22wNy0qx" w:id="11" /><w:bookmarkEnd w:id="11" /></w:p><w:p><w:pPr><w:shd w:val="clear" w:color="auto" w:fill="FFFFFF" /><w:spacing w:beforeAutospacing="1" w:after="0" w:afterAutospacing="1" w:line="270" w:lineRule="atLeast" /><w:rPr><w:rFonts w:ascii="Arial" w:hAnsi="Arial" w:cs="Arial" /></w:rPr></w:pPr><w:r><w:rPr><w:rFonts w:ascii="Arial" w:hAnsi="Arial" w:cs="Arial" /></w:rPr><w:t>5:00 PM Pilot Briefing</w:t></w:r><w:bookmarkStart w:name="_m-2Z#02XLZG5IBX:kle5V[xAiyK~nwDCDJY{u" w:id="6" /><w:bookmarkEnd w:id="6" /><w:bookmarkStart w:name="_m-2Z#12~ZHeN:3xv27H4uKw2aZvQJ/&gt;01wipg" w:id="7" /><w:bookmarkEnd w:id="7" /><w:bookmarkStart w:name="_m-2Z#22wO!0pr" w:id="8" /><w:bookmarkEnd w:id="8" /></w:p><w:p><w:pPr><w:shd w:val="clear" w:color="auto" w:fill="FFFFFF" /><w:spacing w:beforeAutospacing="1" w:after="0" w:afterAutospacing="1" w:line="270" w:lineRule="atLeast" /><w:rPr><w:rFonts w:ascii="Arial" w:hAnsi="Arial" w:cs="Arial" /></w:rPr></w:pPr><w:r><w:rPr><w:rFonts w:ascii="Arial" w:hAnsi="Arial" w:cs="Arial" /></w:rPr><w:t>5:30 PM Fun Flight</w:t></w:r><w:bookmarkStart w:name="_m-2U#02XLUG5NBX5klj5VVxAnyKynwICDEY{z" w:id="3" /><w:bookmarkEnd w:id="3" /><w:bookmarkStart w:name="_m-2U#12~ZCeN?3xq27M4uFw2fZvLJ/C01ripl" w:id="4" /><w:bookmarkEnd w:id="4" /><w:bookmarkStart w:name="_m-2U#22wOz0pw" w:id="5" /><w:bookmarkEnd w:id="5" /></w:p><w:p><w:pPr><w:shd w:val="clear" w:color="auto" w:fill="FFFFFF" /><w:spacing w:beforeAutospacing="1" w:after="0" w:afterAutospacing="1" w:line="270" w:lineRule="atLeast" /><w:jc w:val="center"/><w:jc w:val="right"/></w:pPr><w:r><w:rPr><w:b/><w:bCs/><w:color w:val="4472C4" w:themeColor="accent5"/><w:rFonts w:ascii="Arial" w:hAnsi="Arial" w:cs="Arial" /></w:rPr><w:t xml:space="preserve">6:30 PM </w:t></w:r><w:r><w:rPr><w:b/><w:bCs/><w:color w:val="4472C4" w:themeColor="accent5"/><w:rFonts w:ascii="Arial" w:hAnsi="Arial" w:cs="Arial" /></w:rPr><w:t>Ballumination</w:t></w:r><w:bookmarkStart w:name="_m-2S#02XLSG5PBX3kll5VTxApyKwnwKCDCY{|" w:id="0" /><w:bookmarkEnd w:id="0" /><w:bookmarkStart w:name="_m-2S#12~ZAeNA3xo27O4uDw2hZvJJ/E01pipn" w:id="1" /><w:bookmarkEnd w:id="1" /><w:bookmarkStart w:name="_m-2S#22wOx0py" w:id="2" /><w:bookmarkEnd w:id="2" /></w:p><w:sectPr><w:type w:val="continuous" /><w:pgSz w:w="12240" w:h="15840" /><w:pgMar w:top="1440" w:right="1440" w:bottom="1440" w:left="1440" w:header="720" w:footer="720" w:gutter="0" /><w:cols w:space="720" /><w:docGrid w:linePitch="360" /></w:sectPr></w:body></w:document<w:p><w:pPr><w:shd w:val="clear" w:color="auto" w:fill="FFFFFF" /><w:spacing w:before="100" w:beforeAutospacing="1" w:after="100" w:afterAutospacing="1" w:line="270" w:lineRule="atLeast" /><w:outlineLvl w:val="1" /><w:rPr><w:rFonts w:ascii="Arial" w:eastAsia="Times New Roman" w:hAnsi="Arial" w:cs="Arial" /><w:b /><w:bCs /><w:color w:val="333333" /><w:kern w:val="0" /><w:sz w:val="36" /><w:szCs w:val="36" /><w14:ligatures w14:val="none" /></w:rPr><w:sectPr><w:type w:val="continuous" /><w:pgSz w:w="12240" w:h="15840" /><w:pgMar w:top="1440" w:right="1440" w:bottom="1440" w:left="1440" w:header="720" w:footer="720" w:gutter="0" /><w:cols w:num="2" w:sep="1" w:space="720" /><w:docGrid w:linePitch="360" /></w:sectPr></w:pPr><w:bookmarkStart w:name="_m-5X#02YKVF6MCW6jmi6UWwBmzJzmxHDCFX|y" w:id="123" /><w:bookmarkEnd w:id="123" /><w:bookmarkStart w:name="_m-5X#12!YDdO&gt;4wr18L5tGv3e[uMI0B10shqk" w:id="124" /><w:bookmarkEnd w:id="124" /><w:bookmarkStart w:name="_m-5X#22xN{/qv" w:id="125" /><w:bookmarkEnd w:id="125" /></w:p><w:p><w:pPr><w:shd w:val="clear" w:color="auto" w:fill="FFFFFF" /><w:spacing w:before="100" w:beforeAutospacing="1" w:after="100" w:afterAutospacing="1" w:line="270" w:lineRule="atLeast" /><w:outlineLvl w:val="1" /><w:rPr><w:rFonts w:ascii="Arial" w:eastAsia="Times New Roman" w:hAnsi="Arial" w:cs="Arial" /><w:b /><w:bCs /><w:color w:val="333333" /><w:kern w:val="0" /><w:sz w:val="36" /><w:szCs w:val="36" /><w14:ligatures w14:val="none" /></w:rPr></w:pPr><w:r><w:rPr><w:rFonts w:ascii="Arial" w:eastAsia="Times New Roman" w:hAnsi="Arial" w:cs="Arial" /><w:b /><w:bCs /><w:color w:val="333333" /><w:kern w:val="0" /><w:sz w:val="36" /><w:szCs w:val="36" /><w14:ligatures w14:val="none" /></w:rPr><w:t>Frequently Asked Questions</w:t></w:r><w:bookmarkStart w:name="_m-5V#02YKTF6OCW4jmk6UUwBozJxmxJDCDX|{" w:id="120" /><w:bookmarkEnd w:id="120" /><w:bookmarkStart w:name="_m-5V#12!YBdO@4wp18N5tEv3g[uKI0D10qhqm" w:id="121" /><w:bookmarkEnd w:id="121" /><w:bookmarkStart w:name="_m-5V#22xNy/qx" w:id="122" /><w:bookmarkEnd w:id="122" /></w:p><w:p><w:pPr><w:shd w:val="clear" w:color="auto" w:fill="FFFFFF" /><w:spacing w:before="100" w:beforeAutospacing="1" w:after="100" w:afterAutospacing="1" w:line="270" w:lineRule="atLeast" /><w:outlineLvl w:val="3" /><w:rPr><w:rFonts w:ascii="Arial" w:eastAsia="Times New Roman" w:hAnsi="Arial" w:cs="Arial" /><w:bCs /><w:color w:val="333333" /><w:kern w:val="0" /><w:sz w:val="24" /><w:szCs w:val="24" /><w14:ligatures w14:val="none" /></w:rPr></w:pPr><w:r><w:rPr><w:rFonts w:ascii="Arial" w:eastAsia="Times New Roman" w:hAnsi="Arial" w:cs="Arial" /><w:bCs /><w:color w:val="333333" /><w:kern w:val="0" /><w:sz w:val="24" /><w:szCs w:val="24" /><w14:ligatures w14:val="none" /></w:rPr><w:t>When is the best time to see balloons?</w:t></w:r><w:bookmarkStart w:name="_m-5U#02YKSF6PCW3jml6UTwBpzJwmxKDCCX||" w:id="117" /><w:bookmarkEnd w:id="117" /><w:bookmarkStart w:name="_m-5U#12!YAdOA4wo18O5tDv3h[uJI0E10phqn" w:id="118" /><w:bookmarkEnd w:id="118" /><w:bookmarkStart w:name="_m-5U#22xNx/qy" w:id="119" /><w:bookmarkEnd w:id="119" /></w:p><w:p><w:pPr><w:shd w:val="clear" w:color="auto" w:fill="FFFFFF" /><w:spacing w:before="100" w:beforeAutospacing="1" w:after="100" w:afterAutospacing="1" w:line="270" w:lineRule="atLeast" /><w:rPr><w:rFonts w:ascii="Arial" w:eastAsia="Times New Roman" w:hAnsi="Arial" w:cs="Arial" /><w:color w:val="333333" /><w:kern w:val="0" /><w:sz w:val="20" /><w:szCs w:val="20" /><w14:ligatures w14:val="none" /></w:rPr></w:pPr><w:r><w:rPr><w:rFonts w:ascii="Arial" w:eastAsia="Times New Roman" w:hAnsi="Arial" w:cs="Arial" /><w:color w:val="333333" /><w:kern w:val="0" /><w:sz w:val="20" /><w:szCs w:val="20" /><w14:ligatures w14:val="none" /></w:rPr><w:lastRenderedPageBreak /><w:t>The best time to view balloons and get great pictures is early morning. Flights begin at approximately 6:00 a.m. each morning. It’s definitely worth getting up early to see balloons grace the early morning sky. Balloons also fly at dusk (approximately 7:00 p.m. on Friday and Saturday night</w:t></w:r><w:r><w:rPr><w:rFonts w:ascii="Arial" w:eastAsia="Times New Roman" w:hAnsi="Arial" w:cs="Arial" /><w:color w:val="333333" /><w:kern w:val="0" /><w:sz w:val="20" /><w:szCs w:val="20" /><w14:ligatures w14:val="none" /></w:rPr><w:t>)</w:t></w:r><w:r><w:rPr><w:rFonts w:ascii="Arial" w:eastAsia="Times New Roman" w:hAnsi="Arial" w:cs="Arial" /><w:color w:val="333333" /><w:kern w:val="0" /><w:sz w:val="20" /><w:szCs w:val="20" /><w14:ligatures w14:val="none" /></w:rPr><w:t>.</w:t></w:r><w:bookmarkStart w:name="_m-5Q#02YLYF5JCX9jlf6VZwAjzK}mwEDDIX{v" w:id="114" /><w:bookmarkEnd w:id="114" /><w:bookmarkStart w:name="_m-5Q#12!ZGdN;4xu17I5uJv2b[vPI/?11vhph" w:id="115" /><w:bookmarkEnd w:id="115" /><w:bookmarkStart w:name="_m-5Q#22xO~/ps" w:id="116" /><w:bookmarkEnd w:id="116" /></w:p><w:p><w:pPr><w:shd w:val="clear" w:color="auto" w:fill="FFFFFF" /><w:spacing w:beforeAutospacing="1" w:after="0" w:afterAutospacing="1" w:line="270" w:lineRule="atLeast" /><w:rPr><w:rFonts w:ascii="Arial" w:eastAsia="Times New Roman" w:hAnsi="Arial" w:cs="Arial" /><w:color w:val="333333" /><w:kern w:val="0" /><w:sz w:val="20" /><w:szCs w:val="20" /><w14:ligatures w14:val="none" /></w:rPr></w:pPr><w:r><w:rPr><w:rFonts w:ascii="Arial" w:eastAsia="Times New Roman" w:hAnsi="Arial" w:cs="Arial" /><w:color w:val="333333" /><w:kern w:val="0" /><w:sz w:val="20" /><w:szCs w:val="20" /><w14:ligatures w14:val="none" /></w:rPr><w:t>Please be aware that b</w:t></w:r><w:r><w:rPr><w:rFonts w:ascii="Arial" w:eastAsia="Times New Roman" w:hAnsi="Arial" w:cs="Arial" /><w:color w:val="333333" /><w:kern w:val="0" /><w:sz w:val="20" /><w:szCs w:val="20" /><w14:ligatures w14:val="none" /></w:rPr><w:t>allooning is extremely weather dependent. Winds must be less than 1</w:t></w:r><w:r><w:rPr><w:rFonts w:ascii="Arial" w:eastAsia="Times New Roman" w:hAnsi="Arial" w:cs="Arial" /><w:color w:val="333333" /><w:kern w:val="0" /><w:sz w:val="20" /><w:szCs w:val="20" /><w14:ligatures w14:val="none" /></w:rPr><w:t>5 mph</w:t></w:r><w:r><w:rPr><w:rFonts w:ascii="Arial" w:eastAsia="Times New Roman" w:hAnsi="Arial" w:cs="Arial" /><w:color w:val="333333" /><w:kern w:val="0" /><w:sz w:val="20" /><w:szCs w:val="20" /><w14:ligatures w14:val="none" /></w:rPr><w:t xml:space="preserve"> fo</w:t></w:r><w:r><w:rPr><w:rFonts w:ascii="Arial" w:eastAsia="Times New Roman" w:hAnsi="Arial" w:cs="Arial" /><w:color w:val="333333" /><w:kern w:val="0" /><w:sz w:val="20" /><w:szCs w:val="20" /><w14:ligatures w14:val="none" /></w:rPr><w:t>r balloons to fly. Listen to W</w:t></w:r><w:r><w:rPr><w:rFonts w:ascii="Arial" w:eastAsia="Times New Roman" w:hAnsi="Arial" w:cs="Arial" /><w:color w:val="333333" /><w:kern w:val="0" /><w:sz w:val="20" /><w:szCs w:val="20" /><w14:ligatures w14:val="none" /></w:rPr><w:t xml:space="preserve">LITE </w:t></w:r><w:r><w:rPr><w:rFonts w:ascii="Arial" w:eastAsia="Times New Roman" w:hAnsi="Arial" w:cs="Arial" /><w:color w:val="333333" /><w:kern w:val="0" /><w:sz w:val="20" /><w:szCs w:val="20" /><w14:ligatures w14:val="none" /></w:rPr><w:t>1</w:t></w:r><w:r><w:rPr><w:rFonts w:ascii="Arial" w:eastAsia="Times New Roman" w:hAnsi="Arial" w:cs="Arial" /><w:color w:val="333333" /><w:kern w:val="0" /><w:sz w:val="20" /><w:szCs w:val="20" /><w14:ligatures w14:val="none" /></w:rPr><w:t>0</w:t></w:r><w:r><w:rPr><w:rFonts w:ascii="Arial" w:eastAsia="Times New Roman" w:hAnsi="Arial" w:cs="Arial" /><w:color w:val="333333" /><w:kern w:val="0" /><w:sz w:val="20" /><w:szCs w:val="20" /><w14:ligatures w14:val="none" /></w:rPr><w:t>5</w:t></w:r><w:r><w:rPr><w:rFonts w:ascii="Arial" w:eastAsia="Times New Roman" w:hAnsi="Arial" w:cs="Arial" /><w:color w:val="333333" /><w:kern w:val="0" /><w:sz w:val="20" /><w:szCs w:val="20" /><w14:ligatures w14:val="none" /></w:rPr><w:t>0 AM or 9</w:t></w:r><w:r><w:rPr><w:rFonts w:ascii="Arial" w:eastAsia="Times New Roman" w:hAnsi="Arial" w:cs="Arial" /><w:color w:val="333333" /><w:kern w:val="0" /><w:sz w:val="20" /><w:szCs w:val="20" /><w14:ligatures w14:val="none" /></w:rPr><w:t>5</w:t></w:r><w:r><w:rPr><w:rFonts w:ascii="Arial" w:eastAsia="Times New Roman" w:hAnsi="Arial" w:cs="Arial" /><w:color w:val="333333" /><w:kern w:val="0" /><w:sz w:val="20" /><w:szCs w:val="20" /><w14:ligatures w14:val="none" /></w:rPr><w:t>.</w:t></w:r><w:r><w:rPr><w:rFonts w:ascii="Arial" w:eastAsia="Times New Roman" w:hAnsi="Arial" w:cs="Arial" /><w:color w:val="333333" /><w:kern w:val="0" /><w:sz w:val="20" /><w:szCs w:val="20" /><w14:ligatures w14:val="none" /></w:rPr><w:t>7</w:t></w:r><w:r><w:rPr><w:rFonts w:ascii="Arial" w:eastAsia="Times New Roman" w:hAnsi="Arial" w:cs="Arial" /><w:color w:val="333333" /><w:kern w:val="0" /><w:sz w:val="20" /><w:szCs w:val="20" /><w14:ligatures w14:val="none" /></w:rPr><w:t xml:space="preserve"> FM for the latest on flight information.</w:t></w:r><w:bookmarkStart w:name="_m-5O#02YLWF5LCX7jlh6VXwAlzK{mwGDDGX{x" w:id="111" /><w:bookmarkEnd w:id="111" /><w:bookmarkStart w:name="_m-5O#12!ZEdN=4xs17K5uHv2d[vNI/A11thpj" w:id="112" /><w:bookmarkEnd w:id="112" /><w:bookmarkStart w:name="_m-5O#22xO|/pu" w:id="113" /><w:bookmarkEnd w:id="113" /></w:p><w:p><w:pPr><w:shd w:val="clear" w:color="auto" w:fill="FFFFFF" /><w:spacing w:before="100" w:beforeAutospacing="1" w:after="100" w:afterAutospacing="1" w:line="270" w:lineRule="atLeast" /><w:outlineLvl w:val="3" /><w:rPr><w:rFonts w:ascii="Arial" w:eastAsia="Times New Roman" w:hAnsi="Arial" w:cs="Arial" /><w:bCs /><w:color w:val="333333" /><w:kern w:val="0" /><w:sz w:val="24" /><w:szCs w:val="24" /><w14:ligatures w14:val="none" /></w:rPr></w:pPr><w:r><w:rPr><w:rFonts w:ascii="Arial" w:eastAsia="Times New Roman" w:hAnsi="Arial" w:cs="Arial" /><w:bCs /><w:color w:val="333333" /><w:kern w:val="0" /><w:sz w:val="24" /><w:szCs w:val="24" /><w14:ligatures w14:val="none" /></w:rPr><w:t>Wh</w:t></w:r><w:r><w:rPr><w:rFonts w:ascii="Arial" w:eastAsia="Times New Roman" w:hAnsi="Arial" w:cs="Arial" /><w:bCs /><w:color w:val="333333" /><w:kern w:val="0" /><w:sz w:val="24" /><w:szCs w:val="24" /><w14:ligatures w14:val="none" /></w:rPr><w:t>ere are the balloons and pilots during the day?</w:t></w:r><w:bookmarkStart w:name="_m-5N#02YLVF5MCX6jli6VWwAmzKzmwHDDFX{y" w:id="108" /><w:bookmarkEnd w:id="108" /><w:bookmarkStart w:name="_m-5N#12!ZDdN&gt;4xr17L5uGv2e[vMI/B11shpk" w:id="109" /><w:bookmarkEnd w:id="109" /><w:bookmarkStart w:name="_m-5N#22xO{/pv" w:id="110" /><w:bookmarkEnd w:id="110" /></w:p><w:p><w:pPr><w:shd w:val="clear" w:color="auto" w:fill="FFFFFF" /><w:spacing w:before="100" w:beforeAutospacing="1" w:after="100" w:afterAutospacing="1" w:line="270" w:lineRule="atLeast" /><w:rPr><w:rFonts w:ascii="Arial" w:eastAsia="Times New Roman" w:hAnsi="Arial" w:cs="Arial" /><w:color w:val="333333" /><w:kern w:val="0" /><w:sz w:val="20" /><w:szCs w:val="20" /><w14:ligatures w14:val="none" /></w:rPr></w:pPr><w:r><w:rPr><w:rFonts w:ascii="Arial" w:eastAsia="Times New Roman" w:hAnsi="Arial" w:cs="Arial" /><w:color w:val="333333" /><w:kern w:val="0" /><w:sz w:val="20" /><w:szCs w:val="20" /><w14:ligatures w14:val="none" /></w:rPr><w:t>High canyon winds make it impossible to inflate balloons during the day. Pilots and their families enjoy the same things that you do at the park—live music, quality arts &amp; crafts, and local cuisine.</w:t></w:r><w:bookmarkStart w:name="_m-5I#02XC[G&gt;HBO;kud5M\xJhyB!n&quot;CC;KY&amp;t" w:id="105" /><w:bookmarkEnd w:id="105" /><w:bookmarkStart w:name="_m-5I#12~QIeW93ow2@G4lLw;`ZmRJ8=0(xiyf" w:id="106" /><w:bookmarkEnd w:id="106" /><w:bookmarkStart w:name="_m-5I#22wF&quot;0yq" w:id="107" /><w:bookmarkEnd w:id="107" /></w:p><w:p><w:pPr><w:shd w:val="clear" w:color="auto" w:fill="FFFFFF" /><w:spacing w:before="100" w:beforeAutospacing="1" w:after="100" w:afterAutospacing="1" w:line="270" w:lineRule="atLeast" /><w:outlineLvl w:val="3" /><w:rPr><w:rFonts w:ascii="Arial" w:eastAsia="Times New Roman" w:hAnsi="Arial" w:cs="Arial" /><w:bCs /><w:color w:val="333333" /><w:kern w:val="0" /><w:sz w:val="24" /><w:szCs w:val="24" /><w14:ligatures w14:val="none" /></w:rPr></w:pPr><w:r><w:rPr><w:rFonts w:ascii="Arial" w:eastAsia="Times New Roman" w:hAnsi="Arial" w:cs="Arial" /><w:bCs /><w:color w:val="333333" /><w:kern w:val="0" /><w:sz w:val="24" /><w:szCs w:val="24" /><w14:ligatures w14:val="none" /></w:rPr><w:t>Can I purchase a hot air balloon ride during the Festival?</w:t></w:r><w:bookmarkStart w:name="_m-5F#02XCXG&gt;KBO8kug5MYxJkyB|n&quot;FC;HY&amp;w" w:id="102" /><w:bookmarkEnd w:id="102" /><w:bookmarkStart w:name="_m-5F#12~QFeW&lt;3ot2@J4lIw;cZmOJ8@0(uiyi" w:id="103" /><w:bookmarkEnd w:id="103" /><w:bookmarkStart w:name="_m-5F#22wF}0yt" w:id="104" /><w:bookmarkEnd w:id="104" /></w:p><w:p><w:pPr><w:shd w:val="clear" w:color="auto" w:fill="FFFFFF" /><w:spacing w:beforeAutospacing="1" w:after="0" w:afterAutospacing="1" w:line="270" w:lineRule="atLeast" /><w:rPr><w:rFonts w:ascii="Arial" w:eastAsia="Times New Roman" w:hAnsi="Arial" w:cs="Arial" /><w:color w:val="333333" /><w:kern w:val="0" /><w:sz w:val="20" /><w:szCs w:val="20" /><w14:ligatures w14:val="none" /></w:rPr></w:pPr><w:r><w:rPr><w:rFonts w:ascii="Arial" w:eastAsia="Times New Roman" w:hAnsi="Arial" w:cs="Arial" /><w:color w:val="333333" /><w:kern w:val="0" /><w:sz w:val="20" /><w:szCs w:val="20" /><w14:ligatures w14:val="none" /></w:rPr><w:t>Due to the overwhelming demand for balloon rides during the fes</w:t></w:r><w:r><w:rPr><w:rFonts w:ascii="Arial" w:eastAsia="Times New Roman" w:hAnsi="Arial" w:cs="Arial" /><w:color w:val="333333" /><w:kern w:val="0" /><w:sz w:val="20" /><w:szCs w:val="20" /><w14:ligatures w14:val="none" /></w:rPr><w:t>tival, rides are not available. However, most pilots will give tether rides on Saturday and Sunday mornings.</w:t></w:r><w:r><w:rPr><w:rFonts w:ascii="Arial" w:eastAsia="Times New Roman" w:hAnsi="Arial" w:cs="Arial" /><w:color w:val="333333" /><w:kern w:val="0" /><w:sz w:val="20" /><w:szCs w:val="20" /><w14:ligatures w14:val="none" /></w:rPr><w:t xml:space="preserve"> Rides can be purchased before</w:t></w:r><w:r><w:rPr><w:rFonts w:ascii="Arial" w:eastAsia="Times New Roman" w:hAnsi="Arial" w:cs="Arial" /><w:color w:val="333333" /><w:kern w:val="0" /><w:sz w:val="20" /><w:szCs w:val="20" /><w14:ligatures w14:val="none" /></w:rPr><w:t xml:space="preserve"> or</w:t></w:r><w:r><w:rPr><w:rFonts w:ascii="Arial" w:eastAsia="Times New Roman" w:hAnsi="Arial" w:cs="Arial" /><w:color w:val="333333" /><w:kern w:val="0" /><w:sz w:val="20" /><w:szCs w:val="20" /><w14:ligatures w14:val="none" /></w:rPr><w:t xml:space="preserve"> </w:t></w:r><w:r><w:rPr><w:rFonts w:ascii="Arial" w:eastAsia="Times New Roman" w:hAnsi="Arial" w:cs="Arial" /><w:color w:val="333333" /><w:kern w:val="0" /><w:sz w:val="20" /><w:szCs w:val="20" /><w14:ligatures w14:val="none" /></w:rPr><w:t xml:space="preserve">after the festival from </w:t></w:r><w:r><w:rPr><w:rFonts w:ascii="Arial" w:eastAsia="Times New Roman" w:hAnsi="Arial" w:cs="Arial" /><w:color w:val="333333" /><w:kern w:val="0" /><w:sz w:val="20" /><w:szCs w:val="20" /><w14:ligatures w14:val="none" /></w:rPr><w:t>Sky Glide</w:t></w:r><w:r><w:rPr><w:rFonts w:ascii="Arial" w:eastAsia="Times New Roman" w:hAnsi="Arial" w:cs="Arial" /><w:color w:val="333333" /><w:kern w:val="0" /><w:sz w:val="20" /><w:szCs w:val="20" /><w14:ligatures w14:val="none" /></w:rPr><w:t xml:space="preserve"> Hot Air Balloon Company, a member of the </w:t></w:r><w:r><w:rPr><w:rFonts w:ascii="Arial" w:eastAsia="Times New Roman" w:hAnsi="Arial" w:cs="Arial" /><w:color w:val="333333" /><w:kern w:val="0" /><w:sz w:val="20" /><w:szCs w:val="20" /><w14:ligatures w14:val="none" /></w:rPr><w:t xml:space="preserve">Mount </w:t></w:r><w:r><w:rPr><w:rFonts w:ascii="Arial" w:eastAsia="Times New Roman" w:hAnsi="Arial" w:cs="Arial" /><w:color w:val="333333" /><w:kern w:val="0" /><w:sz w:val="20" /><w:szCs w:val="20" /><w14:ligatures w14:val="none" /></w:rPr><w:t>Vernon</w:t></w:r><w:r><w:rPr><w:rFonts w:ascii="Arial" w:eastAsia="Times New Roman" w:hAnsi="Arial" w:cs="Arial" /><w:color w:val="333333" /><w:kern w:val="0" /><w:sz w:val="20" /><w:szCs w:val="20" /><w14:ligatures w14:val="none" /></w:rPr><w:t xml:space="preserve"> County</w:t></w:r><w:r><w:rPr><w:rFonts w:ascii="Arial" w:eastAsia="Times New Roman" w:hAnsi="Arial" w:cs="Arial" /><w:color w:val="333333" /><w:kern w:val="0" /><w:sz w:val="20" /><w:szCs w:val="20" /><w14:ligatures w14:val="none" /></w:rPr><w:t xml:space="preserve"> Chamber of Commerce.</w:t></w:r><w:bookmarkStart w:name="_m-5E#02XCWG&gt;LBO7kuh5MXxJlyB{n&quot;GC;GY&amp;x" w:id="99" /><w:bookmarkEnd w:id="99" /><w:bookmarkStart w:name="_m-5E#12~QEeW=3os2@K4lHw;dZmNJ8A0(tiyj" w:id="100" /><w:bookmarkEnd w:id="100" /><w:bookmarkStart w:name="_m-5E#22wF|0yu" w:id="101" /><w:bookmarkEnd w:id="101" /></w:p><w:p><w:pPr><w:shd w:val="clear" w:color="auto" w:fill="FFFFFF" /><w:spacing w:before="100" w:beforeAutospacing="1" w:after="100" w:afterAutospacing="1" w:line="270" w:lineRule="atLeast" /><w:outlineLvl w:val="3" /><w:rPr><w:rFonts w:ascii="Arial" w:eastAsia="Times New Roman" w:hAnsi="Arial" w:cs="Arial" /><w:bCs /><w:color w:val="333333" /><w:kern w:val="0" /><w:sz w:val="24" /><w:szCs w:val="24" /><w14:ligatures w14:val="none" /></w:rPr></w:pPr><w:r><w:rPr><w:rFonts w:ascii="Arial" w:eastAsia="Times New Roman" w:hAnsi="Arial" w:cs="Arial" /><w:bCs /><w:color w:val="333333" /><w:kern w:val="0" /><w:sz w:val="24" /><w:szCs w:val="24" /><w14:ligatures w14:val="none" /></w:rPr><w:t>What can my children do while visiting the festival?</w:t></w:r><w:bookmarkStart w:name="_m-5C#02XCUG&gt;NBO5kuj5MVxJnyByn&quot;IC;EY&amp;z" w:id="96" /><w:bookmarkEnd w:id="96" /><w:bookmarkStart w:name="_m-5C#12~QCeW?3oq2@M4lFw;fZmLJ8C0(riyl" w:id="97" /><w:bookmarkEnd w:id="97" /><w:bookmarkStart w:name="_m-5C#22wFz0yw" w:id="98" /><w:bookmarkEnd w:id="98" /></w:p><w:p><w:pPr><w:shd w:val="clear" w:color="auto" w:fill="FFFFFF" /><w:spacing w:before="100" w:beforeAutospacing="1" w:after="100" w:afterAutospacing="1" w:line="270" w:lineRule="atLeast" /><w:rPr><w:rFonts w:ascii="Arial" w:eastAsia="Times New Roman" w:hAnsi="Arial" w:cs="Arial" /><w:color w:val="333333" /><w:kern w:val="0" /><w:sz w:val="20" /><w:szCs w:val="20" /><w14:ligatures w14:val="none" /></w:rPr></w:pPr><w:r><w:rPr><w:rFonts w:ascii="Arial" w:eastAsia="Times New Roman" w:hAnsi="Arial" w:cs="Arial" /><w:color w:val="333333" /><w:kern w:val="0" /><w:sz w:val="20" /><w:szCs w:val="20" /><w14:ligatures w14:val="none" /></w:rPr><w:t>Children</w:t></w:r><w:r><w:rPr><w:rFonts w:ascii="Arial" w:eastAsia="Times New Roman" w:hAnsi="Arial" w:cs="Arial" /><w:color w:val="333333" /><w:kern w:val="0" /><w:sz w:val="20" /><w:szCs w:val="20" /><w14:ligatures w14:val="none" /></w:rPr><w:t xml:space="preserve"> can enjoy inflatables, children’s interactive entertainment, reptile displays, and face painting</w:t></w:r><w:r><w:rPr><w:rFonts w:ascii="Arial" w:eastAsia="Times New Roman" w:hAnsi="Arial" w:cs="Arial" /><w:color w:val="333333" /><w:kern w:val="0" /><w:sz w:val="20" /><w:szCs w:val="20" /><w14:ligatures w14:val="none" /></w:rPr><w:t>,</w:t></w:r><w:r><w:rPr><w:rFonts w:ascii="Arial" w:eastAsia="Times New Roman" w:hAnsi="Arial" w:cs="Arial" /><w:color w:val="333333" /><w:kern w:val="0" /><w:sz w:val="20" /><w:szCs w:val="20" /><w14:ligatures w14:val="none" /></w:rPr><w:t xml:space="preserve"> just to name a few!</w:t></w:r><w:r><w:rPr><w:rFonts w:ascii="Arial" w:eastAsia="Times New Roman" w:hAnsi="Arial" w:cs="Arial" /><w:color w:val="333333" /><w:kern w:val="0" /><w:sz w:val="20" /><w:szCs w:val="20" /><w14:ligatures w14:val="none" /></w:rPr><w:t xml:space="preserve"> </w:t></w:r><w:r><w:rPr><w:rFonts w:ascii="Arial" w:eastAsia="Times New Roman" w:hAnsi="Arial" w:cs="Arial" /><w:color w:val="333333" /><w:kern w:val="0" /><w:sz w:val="20" /><w:szCs w:val="20" /><w14:ligatures w14:val="none" /></w:rPr><w:t xml:space="preserve"> These fun activities are located in the free,</w:t></w:r><w:r><w:rPr><w:rFonts w:ascii="Arial" w:eastAsia="Times New Roman" w:hAnsi="Arial" w:cs="Arial" /><w:color w:val="333333" /><w:kern w:val="0" /><w:sz w:val="20" /><w:szCs w:val="20" /><w14:ligatures w14:val="none" /></w:rPr><w:t xml:space="preserve"> gated Children’s Village open 1</w:t></w:r><w:r><w:rPr><w:rFonts w:ascii="Arial" w:eastAsia="Times New Roman" w:hAnsi="Arial" w:cs="Arial" /><w:color w:val="333333" /><w:kern w:val="0" /><w:sz w:val="20" /><w:szCs w:val="20" /><w14:ligatures w14:val="none" /></w:rPr><w:t xml:space="preserve"> p.m. - 8 p.m. on Friday,</w:t></w:r><w:r><w:rPr><w:rFonts w:ascii="Arial" w:eastAsia="Times New Roman" w:hAnsi="Arial" w:cs="Arial" /><w:color w:val="333333" /><w:kern w:val="0" /><w:sz w:val="20" /><w:szCs w:val="20" /><w14:ligatures w14:val="none" /></w:rPr><w:t xml:space="preserve"> and 8 a.m. - 8 p.m. on Saturday.</w:t></w:r><w:bookmarkStart w:name="_m-57#02XDZG=IBP:kte5N[xIiyC~n!DC&lt;JY%u" w:id="93" /><w:bookmarkEnd w:id="93" /><w:bookmarkStart w:name="_m-57#12~RHeV:3pv2?H4mKw:aZnQJ7&gt;0)wixg" w:id="94" /><w:bookmarkEnd w:id="94" /><w:bookmarkStart w:name="_m-57#22wG!0xr" w:id="95" /><w:bookmarkEnd w:id="95" /></w:p><w:p><w:pPr><w:shd w:val="clear" w:color="auto" w:fill="FFFFFF" /><w:spacing w:before="100" w:beforeAutospacing="1" w:after="100" w:afterAutospacing="1" w:line="270" w:lineRule="atLeast" /><w:outlineLvl w:val="3" /><w:rPr><w:rFonts w:ascii="Arial" w:eastAsia="Times New Roman" w:hAnsi="Arial" w:cs="Arial" /><w:bCs /><w:color w:val="333333" /><w:kern w:val="0" /><w:sz w:val="24" /><w:szCs w:val="24" /><w14:ligatures w14:val="none" /></w:rPr></w:pPr><w:r><w:rPr><w:rFonts w:ascii="Arial" w:eastAsia="Times New Roman" w:hAnsi="Arial" w:cs="Arial" /><w:bCs /><w:color w:val="333333" /><w:kern w:val="0" /><w:sz w:val="24" /><w:szCs w:val="24" /><w14:ligatures w14:val="none" /></w:rPr><w:t>Is smoking permitted on the festival grounds?</w:t></w:r><w:bookmarkStart w:name="_m-55#02XDXG=KBP8ktg5NYxIkyC|n!FC&lt;HY%w" w:id="90" /><w:bookmarkEnd w:id="90" /><w:bookmarkStart w:name="_m-55#12~RFeV&lt;3pt2?J4mIw:cZnOJ7@0)uixi" w:id="91" /><w:bookmarkEnd w:id="91" /><w:bookmarkStart w:name="_m-55#22wG}0xt" w:id="92" /><w:bookmarkEnd w:id="92" /></w:p><w:p><w:pPr><w:shd w:val="clear" w:color="auto" w:fill="FFFFFF" /><w:spacing w:before="100" w:beforeAutospacing="1" w:after="100" w:afterAutospacing="1" w:line="270" w:lineRule="atLeast" /><w:rPr><w:rFonts w:ascii="Arial" w:eastAsia="Times New Roman" w:hAnsi="Arial" w:cs="Arial" /><w:color w:val="333333" /><w:kern w:val="0" /><w:sz w:val="20" /><w:szCs w:val="20" /><w14:ligatures w14:val="none" /></w:rPr></w:pPr><w:r><w:rPr><w:rFonts w:ascii="Arial" w:eastAsia="Times New Roman" w:hAnsi="Arial" w:cs="Arial" /><w:color w:val="333333" /><w:kern w:val="0" /><w:sz w:val="20" /><w:szCs w:val="20" /><w14:ligatures w14:val="none" /></w:rPr><w:t>Smoking is not allowed on the festival grounds while the balloons are present. Please be courteous of other festival patrons.</w:t></w:r><w:bookmarkStart w:name="_m-53#02XDVG=MBP6kti5NWxImyCzn!HC&lt;FY%y" w:id="87" /><w:bookmarkEnd w:id="87" /><w:bookmarkStart w:name="_m-53#12~RDeV&gt;3pr2?L4mGw:eZnMJ7B0)sixk" w:id="88" /><w:bookmarkEnd w:id="88" /><w:bookmarkStart w:name="_m-53#22wG{0xv" w:id="89" /><w:bookmarkEnd w:id="89" /></w:p><w:p><w:pPr><w:shd w:val="clear" w:color="auto" w:fill="FFFFFF" /><w:spacing w:before="100" w:beforeAutospacing="1" w:after="100" w:afterAutospacing="1" w:line="270" w:lineRule="atLeast" /><w:outlineLvl w:val="3" /><w:rPr><w:rFonts w:ascii="Arial" w:eastAsia="Times New Roman" w:hAnsi="Arial" w:cs="Arial" /><w:bCs /><w:color w:val="333333" /><w:kern w:val="0" /><w:sz w:val="24" /><w:szCs w:val="24" /><w14:ligatures w14:val="none" /></w:rPr></w:pPr><w:r><w:rPr><w:rFonts w:ascii="Arial" w:eastAsia="Times New Roman" w:hAnsi="Arial" w:cs="Arial" /><w:bCs /><w:color w:val="333333" /><w:kern w:val="0" /><w:sz w:val="24" /><w:szCs w:val="24" /><w14:ligatures w14:val="none" /></w:rPr><w:t>Can I bring a cooler with beverage and food into the festival?</w:t></w:r><w:bookmarkStart w:name="_m-52#02XDUG=NBP5ktj5NVxInyCyn!IC&lt;EY%z" w:id="84" /><w:bookmarkEnd w:id="84" /><w:bookmarkStart w:name="_m-52#12~RCeV?3pq2?M4mFw:fZnLJ7C0)rixl" w:id="85" /><w:bookmarkEnd w:id="85" /><w:bookmarkStart w:name="_m-52#22wGz0xw" w:id="86" /><w:bookmarkEnd w:id="86" /></w:p><w:p><w:pPr><w:shd w:val="clear" w:color="auto" w:fill="FFFFFF" /><w:spacing w:before="100" w:beforeAutospacing="1" w:after="100" w:afterAutospacing="1" w:line="270" w:lineRule="atLeast" /><w:rPr><w:rFonts w:ascii="Arial" w:eastAsia="Times New Roman" w:hAnsi="Arial" w:cs="Arial" /><w:color w:val="333333" /><w:kern w:val="0" /><w:sz w:val="20" /><w:szCs w:val="20" /><w14:ligatures w14:val="none" /></w:rPr></w:pPr><w:r><w:rPr><w:rFonts w:ascii="Arial" w:eastAsia="Times New Roman" w:hAnsi="Arial" w:cs="Arial" /><w:color w:val="333333" /><w:kern w:val="0" /><w:sz w:val="20" /><w:szCs w:val="20" /><w14:ligatures w14:val="none" /></w:rPr><w:t>You can bring a cooler with snacks and plastic or aluminum containers. However, no glass bottles or alcohol are allowed at the festival. We do</w:t></w:r><w:r><w:rPr><w:rFonts w:ascii="Arial" w:eastAsia="Times New Roman" w:hAnsi="Arial" w:cs="Arial" /><w:color w:val="333333" /><w:kern w:val="0" /><w:sz w:val="20" /><w:szCs w:val="20" /><w14:ligatures w14:val="none" /></w:rPr><w:t xml:space="preserve"> provide an assortment of unique foods at our </w:t></w:r><w:r><w:rPr><w:rFonts w:ascii="Arial" w:eastAsia="Times New Roman" w:hAnsi="Arial" w:cs="Arial" /><w:color w:val="333333" /><w:kern w:val="0" /><w:sz w:val="20" /><w:szCs w:val="20" /><w14:ligatures w14:val="none" /></w:rPr><w:t>food vendor</w:t></w:r><w:r><w:rPr><w:rFonts w:ascii="Arial" w:eastAsia="Times New Roman" w:hAnsi="Arial" w:cs="Arial" /><w:color w:val="333333" /><w:kern w:val="0" /><w:sz w:val="20" /><w:szCs w:val="20" /><w14:ligatures w14:val="none" /></w:rPr><w:t xml:space="preserve"> stands.</w:t></w:r><w:bookmarkStart w:name="_m-4Y#02XE[G&lt;HBQ;ksd5O\xHhyD!n~CC=KY$t" w:id="81" /><w:bookmarkEnd w:id="81" /><w:bookmarkStart w:name="_m-4Y#12~SIeU93qw2&gt;G4nLw9`ZoRJ6=0*xiwf" w:id="82" /><w:bookmarkEnd w:id="82" /><w:bookmarkStart w:name="_m-4Y#22wH&quot;0wq" w:id="83" /><w:bookmarkEnd w:id="83" /></w:p><w:p><w:pPr><w:shd w:val="clear" w:color="auto" w:fill="FFFFFF" /><w:spacing w:before="100" w:beforeAutospacing="1" w:after="100" w:afterAutospacing="1" w:line="270" w:lineRule="atLeast" /><w:outlineLvl w:val="3" /><w:rPr><w:rFonts w:ascii="Arial" w:eastAsia="Times New Roman" w:hAnsi="Arial" w:cs="Arial" /><w:bCs /><w:color w:val="333333" /><w:kern w:val="0" /><w:sz w:val="24" /><w:szCs w:val="24" /><w14:ligatures w14:val="none" /></w:rPr></w:pPr><w:r><w:rPr><w:rFonts w:ascii="Arial" w:eastAsia="Times New Roman" w:hAnsi="Arial" w:cs="Arial" /><w:bCs /><w:color w:val="333333" /><w:kern w:val="0" /><w:sz w:val="24" /><w:szCs w:val="24" /><w14:ligatures w14:val="none" /></w:rPr><w:t>What are my camping, RV, or lodging options?</w:t></w:r><w:bookmarkStart w:name="_m-4W#02XEYG&lt;JBQ9ksf5OZxHjyD}n~EC=IY$v" w:id="78" /><w:bookmarkEnd w:id="78" /><w:bookmarkStart w:name="_m-4W#12~SGeU;3qu2&gt;I4nJw9bZoPJ6?0*viwh" w:id="79" /><w:bookmarkEnd w:id="79" /><w:bookmarkStart w:name="_m-4W#22wH~0ws" w:id="80" /><w:bookmarkEnd w:id="80" /></w:p><w:p><w:pPr><w:shd w:val="clear" w:color="auto" w:fill="FFFFFF" /><w:spacing w:beforeAutospacing="1" w:after="0" w:afterAutospacing="1" w:line="270" w:lineRule="atLeast" /><w:rPr><w:rFonts w:ascii="Arial" w:eastAsia="Times New Roman" w:hAnsi="Arial" w:cs="Arial" /><w:color w:val="333333" /><w:kern w:val="0" /><w:sz w:val="20" /><w:szCs w:val="20" /><w14:ligatures w14:val="none" /></w:rPr></w:pPr><w:r><w:rPr><w:rFonts w:ascii="Arial" w:eastAsia="Times New Roman" w:hAnsi="Arial" w:cs="Arial" /><w:color w:val="333333" /><w:kern w:val="0" /><w:sz w:val="20" /><w:szCs w:val="20" /><w14:ligatures w14:val="none" /></w:rPr><w:t>While you cannot camp or park an RV on the festival grounds, there are camping options nearby.</w:t></w:r><w:r><w:rPr><w:rFonts w:ascii="Arial" w:eastAsia="Times New Roman" w:hAnsi="Arial" w:cs="Arial" /><w:color w:val="333333" /><w:kern w:val="0" /><w:sz w:val="20" /><w:szCs w:val="20" /><w14:ligatures w14:val="none" /></w:rPr><w:t xml:space="preserve"> Check with the </w:t></w:r><w:r><w:rPr><w:rFonts w:ascii="Arial" w:eastAsia="Times New Roman" w:hAnsi="Arial" w:cs="Arial" /><w:color w:val="333333" /><w:kern w:val="0" /><w:sz w:val="20" /><w:szCs w:val="20" /><w14:ligatures w14:val="none" /></w:rPr><w:t>Mount Sedona</w:t></w:r><w:r><w:rPr><w:rFonts w:ascii="Arial" w:eastAsia="Times New Roman" w:hAnsi="Arial" w:cs="Arial" /><w:color w:val="333333" /><w:kern w:val="0" /><w:sz w:val="20" /><w:szCs w:val="20" /><w14:ligatures w14:val="none" /></w:rPr><w:t xml:space="preserve"> County Chamber of Commerce for a complete list of camping facilities.</w:t></w:r><w:bookmarkStart w:name="_m-4V#02XEXG&lt;KBQ8ksg5OYxHkyD|n~FC=HY$w" w:id="75" /><w:bookmarkEnd w:id="75" /><w:bookmarkStart w:name="_m-4V#12~SFeU&lt;3qt2&gt;J4nIw9cZoOJ6@0*uiwi" w:id="76" /><w:bookmarkEnd w:id="76" /><w:bookmarkStart w:name="_m-4V#22wH}0wt" w:id="77" /><w:bookmarkEnd w:id="77" /></w:p><w:p><w:pPr><w:shd w:val="clear" w:color="auto" w:fill="FFFFFF" /><w:spacing w:before="100" w:beforeAutospacing="1" w:after="100" w:afterAutospacing="1" w:line="270" w:lineRule="atLeast" /><w:outlineLvl w:val="3" /><w:rPr><w:rFonts w:ascii="Arial" w:eastAsia="Times New Roman" w:hAnsi="Arial" w:cs="Arial" /><w:bCs /><w:color w:val="333333" /><w:kern w:val="0" /><w:sz w:val="24" /><w:szCs w:val="24" /><w14:ligatures w14:val="none" /></w:rPr></w:pPr><w:r><w:rPr><w:rFonts w:ascii="Arial" w:eastAsia="Times New Roman" w:hAnsi="Arial" w:cs="Arial" /><w:bCs /><w:color w:val="333333" /><w:kern w:val="0" /><w:sz w:val="24" /><w:szCs w:val="24" /><w14:ligatures w14:val="none" /></w:rPr><w:t>How c</w:t></w:r><w:r><w:rPr><w:rFonts w:ascii="Arial" w:eastAsia="Times New Roman" w:hAnsi="Arial" w:cs="Arial" /><w:bCs /><w:color w:val="333333" /><w:kern w:val="0" /><w:sz w:val="24" /><w:szCs w:val="24" /><w14:ligatures w14:val="none" /></w:rPr><w:t xml:space="preserve">an I </w:t></w:r><w:r><w:rPr><w:rFonts w:ascii="Arial" w:eastAsia="Times New Roman" w:hAnsi="Arial" w:cs="Arial" /><w:bCs /><w:color w:val="333333" /><w:kern w:val="0" /><w:sz w:val="24" /><w:szCs w:val="24" /><w14:ligatures w14:val="none" /></w:rPr><w:t>plan for the best e</w:t></w:r><w:r><w:rPr><w:rFonts w:ascii="Arial" w:eastAsia="Times New Roman" w:hAnsi="Arial" w:cs="Arial" /><w:bCs /><w:color w:val="333333" /><w:kern w:val="0" /><w:sz w:val="24" /><w:szCs w:val="24" /><w14:ligatures w14:val="none" /></w:rPr><w:t>xperience?</w:t></w:r><w:bookmarkStart w:name="_m-4S#02XEUG&lt;NBQ5ksj5OVxHnyDyn~IC=EY$z" w:id="72" /><w:bookmarkEnd w:id="72" /><w:bookmarkStart w:name="_m-4S#12~SCeU?3qq2&gt;M4nFw9fZoLJ6C0*riwl" w:id="73" /><w:bookmarkEnd w:id="73" /><w:bookmarkStart w:name="_m-4S#22wHz0ww" w:id="74" /><w:bookmarkEnd w:id="74" /></w:p><w:p><w:pPr><w:shd w:val="clear" w:color="auto" w:fill="FFFFFF" /><w:spacing w:beforeAutospacing="1" w:after="0" w:afterAutospacing="1" w:line="270" w:lineRule="atLeast" /><w:rPr><w:rFonts w:ascii="Arial" w:eastAsia="Times New Roman" w:hAnsi="Arial" w:cs="Arial" /><w:color w:val="333333" /><w:kern w:val="0" /><w:sz w:val="20" /><w:szCs w:val="20" /><w14:ligatures w14:val="none" /></w:rPr></w:pPr><w:r><w:rPr><w:rFonts w:ascii="Arial" w:eastAsia="Times New Roman" w:hAnsi="Arial" w:cs="Arial" /><w:color w:val="333333" /><w:kern w:val="0" /><w:sz w:val="20" /><w:szCs w:val="20" /><w14:ligatures w14:val="none" /></w:rPr><w:t>Although there is no perfect formula, the follow</w:t></w:r><w:r><w:rPr><w:rFonts w:ascii="Arial" w:eastAsia="Times New Roman" w:hAnsi="Arial" w:cs="Arial" /><w:color w:val="333333" /><w:kern w:val="0" /><w:sz w:val="20" /><w:szCs w:val="20" /><w14:ligatures w14:val="none" /></w:rPr><w:t>ing</w:t></w:r><w:r><w:rPr><w:rFonts w:ascii="Arial" w:eastAsia="Times New Roman" w:hAnsi="Arial" w:cs="Arial" /><w:color w:val="333333" /><w:kern w:val="0" /><w:sz w:val="20" /><w:szCs w:val="20" /><w14:ligatures w14:val="none" /></w:rPr><w:t xml:space="preserve"> tips should </w:t></w:r><w:r><w:rPr><w:rFonts w:ascii="Arial" w:eastAsia="Times New Roman" w:hAnsi="Arial" w:cs="Arial" /><w:color w:val="333333" /><w:kern w:val="0" /><w:sz w:val="20" /><w:szCs w:val="20" /><w14:ligatures w14:val="none" /></w:rPr><w:t>e</w:t></w:r><w:r><w:rPr><w:rFonts w:ascii="Arial" w:eastAsia="Times New Roman" w:hAnsi="Arial" w:cs="Arial" /><w:color w:val="333333" /><w:kern w:val="0" /><w:sz w:val="20" /><w:szCs w:val="20" /><w14:ligatures w14:val="none" /></w:rPr><w:t>nsure that you have all the bases covered!</w:t></w:r><w:bookmarkStart w:name="_m-4Q#02XESG&lt;PBQ3ksl5OTxHpyDwn~KC=CY$|" w:id="69" /><w:bookmarkEnd w:id="69" /><w:bookmarkStart w:name="_m-4Q#12~SAeUA3qo2&gt;O4nDw9hZoJJ6E0*piwn" w:id="70" /><w:bookmarkEnd w:id="70" /><w:bookmarkStart w:name="_m-4Q#22wHx0wy" w:id="71" /><w:bookmarkEnd w:id="71" /></w:p><w:p><w:pPr><w:shd w:val="clear" w:color="auto" w:fill="FFFFFF" /><w:spacing w:beforeAutospacing="1" w:after="0" w:afterAutospacing="1" w:line="270" w:lineRule="atLeast" /><w:rPr><w:rFonts w:ascii="Arial" w:eastAsia="Times New Roman" w:hAnsi="Arial" w:cs="Arial" /><w:color w:val="333333" /><w:kern w:val="0" /><w:sz w:val="20" /><w:szCs w:val="20" /><w14:ligatures w14:val="none" /></w:rPr></w:pPr><w:r><w:rPr><w:rFonts w:ascii="Arial" w:eastAsia="Times New Roman" w:hAnsi="Arial" w:cs="Arial" /><w:color w:val="333333" /><w:kern w:val="0" /><w:sz w:val="20" /><w:szCs w:val="20" /><w14:ligatures w14:val="none" /></w:rPr><w:t>Wear good walking shoes. The park encompasses 15 acres, so hiking is a strong possibility.</w:t></w:r><w:bookmarkStart w:name="_m-4N#02XFZG;IBR:kre5P[xGiyE~n}DC&gt;JY#u" w:id="66" /><w:bookmarkEnd w:id="66" /><w:bookmarkStart w:name="_m-4N#12~THeT:3rv2=H4oKw8aZpQJ5&gt;0+wivg" w:id="67" /><w:bookmarkEnd w:id="67" /><w:bookmarkStart w:name="_m-4N#22wI!0vr" w:id="68" /><w:bookmarkEnd w:id="68" /></w:p><w:p><w:pPr><w:shd w:val="clear" w:color="auto" w:fill="FFFFFF" /><w:spacing w:beforeAutospacing="1" w:after="0" w:afterAutospacing="1" w:line="270" w:lineRule="atLeast" /><w:rPr><w:rFonts w:ascii="Arial" w:eastAsia="Times New Roman" w:hAnsi="Arial" w:cs="Arial" /><w:color w:val="333333" /><w:kern w:val="0" /><w:sz w:val="20" /><w:szCs w:val="20" /><w14:ligatures w14:val="none" /></w:rPr></w:pPr><w:r><w:rPr><w:rFonts w:ascii="Arial" w:eastAsia="Times New Roman" w:hAnsi="Arial" w:cs="Arial" /><w:color w:val="333333" /><w:kern w:val="0" /><w:sz w:val="20" /><w:szCs w:val="20" /><w14:ligatures w14:val="none" /></w:rPr><w:lastRenderedPageBreak /><w:t>Bring sunscreen. There is very little shade.</w:t></w:r><w:bookmarkStart w:name="_m-4J#02XFVG;MBR6kri5PWxGmyEzn}HC&gt;FY#y" w:id="63" /><w:bookmarkEnd w:id="63" /><w:bookmarkStart w:name="_m-4J#12~TDeT&gt;3rr2=L4oGw8eZpMJ5B0+sivk" w:id="64" /><w:bookmarkEnd w:id="64" /><w:bookmarkStart w:name="_m-4J#22wI{0vv" w:id="65" /><w:bookmarkEnd w:id="65" /></w:p><w:p><w:pPr><w:shd w:val="clear" w:color="auto" w:fill="FFFFFF" /><w:spacing w:beforeAutospacing="1" w:after="0" w:afterAutospacing="1" w:line="270" w:lineRule="atLeast" /><w:rPr><w:rFonts w:ascii="Arial" w:eastAsia="Times New Roman" w:hAnsi="Arial" w:cs="Arial" /><w:color w:val="333333" /><w:kern w:val="0" /><w:sz w:val="20" /><w:szCs w:val="20" /><w14:ligatures w14:val="none" /></w:rPr></w:pPr><w:r><w:rPr><w:rFonts w:ascii="Arial" w:eastAsia="Times New Roman" w:hAnsi="Arial" w:cs="Arial" /><w:color w:val="333333" /><w:kern w:val="0" /><w:sz w:val="20" /><w:szCs w:val="20" /><w14:ligatures w14:val="none" /></w:rPr><w:t>Get to the park early. When the balloons inflate, long lines form.</w:t></w:r><w:bookmarkStart w:name="_m-4H#02XFTG;OBR4krk5PUxGoyExn}JC&gt;DY#{" w:id="60" /><w:bookmarkEnd w:id="60" /><w:bookmarkStart w:name="_m-4H#12~TBeT@3rp2=N4oEw8gZpKJ5D0+qivm" w:id="61" /><w:bookmarkEnd w:id="61" /><w:bookmarkStart w:name="_m-4H#22wIy0vx" w:id="62" /><w:bookmarkEnd w:id="62" /></w:p><w:p><w:pPr><w:shd w:val="clear" w:color="auto" w:fill="FFFFFF" /><w:spacing w:beforeAutospacing="1" w:after="0" w:afterAutospacing="1" w:line="270" w:lineRule="atLeast" /><w:rPr><w:rFonts w:ascii="Arial" w:eastAsia="Times New Roman" w:hAnsi="Arial" w:cs="Arial" /><w:color w:val="333333" /><w:kern w:val="0" /><w:sz w:val="20" /><w:szCs w:val="20" /><w14:ligatures w14:val="none" /></w:rPr></w:pPr><w:r><w:rPr><w:rFonts w:ascii="Arial" w:eastAsia="Times New Roman" w:hAnsi="Arial" w:cs="Arial" /><w:color w:val="333333" /><w:kern w:val="0" /><w:sz w:val="20" /><w:szCs w:val="20" /><w14:ligatures w14:val="none" /></w:rPr><w:t>Wear comfortable, cool clothing. If you take tether rides, the flame does make it hot in the basket.</w:t></w:r><w:bookmarkStart w:name="_m-4E#02XG[G:HBS;kqd5Q\xFhyF!n|CC?KY&quot;t" w:id="57" /><w:bookmarkEnd w:id="57" /><w:bookmarkStart w:name="_m-4E#12~UIeS93sw2&lt;G4pLw7`ZqRJ4=0,xiuf" w:id="58" /><w:bookmarkEnd w:id="58" /><w:bookmarkStart w:name="_m-4E#22wJ&quot;0uq" w:id="59" /><w:bookmarkEnd w:id="59" /></w:p><w:p><w:pPr><w:shd w:val="clear" w:color="auto" w:fill="FFFFFF" /><w:spacing w:beforeAutospacing="1" w:after="0" w:afterAutospacing="1" w:line="270" w:lineRule="atLeast" /><w:rPr><w:rFonts w:ascii="Arial" w:eastAsia="Times New Roman" w:hAnsi="Arial" w:cs="Arial" /><w:color w:val="333333" /><w:kern w:val="0" /><w:sz w:val="20" /><w:szCs w:val="20" /><w14:ligatures w14:val="none" /></w:rPr></w:pPr><w:r><w:rPr><w:rFonts w:ascii="Arial" w:eastAsia="Times New Roman" w:hAnsi="Arial" w:cs="Arial" /><w:color w:val="333333" /><w:kern w:val="0" /><w:sz w:val="20" /><w:szCs w:val="20" /><w14:ligatures w14:val="none" /></w:rPr><w:t>Bring</w:t></w:r><w:r><w:rPr><w:rFonts w:ascii="Arial" w:eastAsia="Times New Roman" w:hAnsi="Arial" w:cs="Arial" /><w:color w:val="333333" /><w:kern w:val="0" /><w:sz w:val="20" /><w:szCs w:val="20" /><w14:ligatures w14:val="none" /></w:rPr><w:t xml:space="preserve"> a camera and tripod. The ballu</w:t></w:r><w:r><w:rPr><w:rFonts w:ascii="Arial" w:eastAsia="Times New Roman" w:hAnsi="Arial" w:cs="Arial" /><w:color w:val="333333" /><w:kern w:val="0" /><w:sz w:val="20" /><w:szCs w:val="20" /><w14:ligatures w14:val="none" /></w:rPr><w:t>mination at dusk is a beautiful photo opportunity, but the low light makes a tripod a necessity.</w:t></w:r><w:bookmarkStart w:name="_m-4B#02XGXG:KBS8kqg5QYxFkyF|n|FC?HY&quot;w" w:id="54" /><w:bookmarkEnd w:id="54" /><w:bookmarkStart w:name="_m-4B#12~UFeS&lt;3st2&lt;J4pIw7cZqOJ4@0,uiui" w:id="55" /><w:bookmarkEnd w:id="55" /><w:bookmarkStart w:name="_m-4B#22wJ}0ut" w:id="56" /><w:bookmarkEnd w:id="56" /></w:p><w:p><w:pPr><w:shd w:val="clear" w:color="auto" w:fill="FFFFFF" /><w:spacing w:beforeAutospacing="1" w:after="0" w:afterAutospacing="1" w:line="270" w:lineRule="atLeast" /><w:rPr><w:rFonts w:ascii="Arial" w:eastAsia="Times New Roman" w:hAnsi="Arial" w:cs="Arial" /><w:color w:val="333333" /><w:kern w:val="0" /><w:sz w:val="20" /><w:szCs w:val="20" /><w14:ligatures w14:val="none" /></w:rPr></w:pPr><w:r><w:rPr><w:rFonts w:ascii="Arial" w:eastAsia="Times New Roman" w:hAnsi="Arial" w:cs="Arial" /><w:color w:val="333333" /><w:kern w:val="0" /><w:sz w:val="20" /><w:szCs w:val="20" /><w14:ligatures w14:val="none" /></w:rPr><w:t>Bring lawn chairs and/or blankets.</w:t></w:r><w:bookmarkStart w:name="_m-48#02XGUG:NBS5kqj5QVxFnyFyn|IC?EY&quot;z" w:id="51" /><w:bookmarkEnd w:id="51" /><w:bookmarkStart w:name="_m-48#12~UCeS?3sq2&lt;M4pFw7fZqLJ4C0,riul" w:id="52" /><w:bookmarkEnd w:id="52" /><w:bookmarkStart w:name="_m-48#22wJz0uw" w:id="53" /><w:bookmarkEnd w:id="53" /></w:p><w:p><w:pPr><w:shd w:val="clear" w:color="auto" w:fill="FFFFFF" /><w:spacing w:beforeAutospacing="1" w:after="0" w:afterAutospacing="1" w:line="270" w:lineRule="atLeast" /><w:rPr><w:rFonts w:ascii="Arial" w:eastAsia="Times New Roman" w:hAnsi="Arial" w:cs="Arial" /><w:color w:val="333333" /><w:kern w:val="0" /><w:sz w:val="20" /><w:szCs w:val="20" /><w14:ligatures w14:val="none" /></w:rPr></w:pPr><w:r><w:rPr><w:rFonts w:ascii="Arial" w:eastAsia="Times New Roman" w:hAnsi="Arial" w:cs="Arial" /><w:color w:val="333333" /><w:kern w:val="0" /><w:sz w:val="20" /><w:szCs w:val="20" /><w14:ligatures w14:val="none" /></w:rPr><w:t>Bring, or prepare to buy, plenty of water.</w:t></w:r><w:bookmarkStart w:name="_m-47#02XGTG:OBS4kqk5QUxFoyFxn|JC?DY&quot;{" w:id="48" /><w:bookmarkEnd w:id="48" /><w:bookmarkStart w:name="_m-47#12~UBeS@3sp2&lt;N4pEw7gZqKJ4D0,qium" w:id="49" /><w:bookmarkEnd w:id="49" /><w:bookmarkStart w:name="_m-47#22wJy0ux" w:id="50" /><w:bookmarkEnd w:id="50" /></w:p><w:p><w:pPr><w:shd w:val="clear" w:color="auto" w:fill="FFFFFF" /><w:spacing w:beforeAutospacing="1" w:after="0" w:afterAutospacing="1" w:line="270" w:lineRule="atLeast" /><w:rPr><w:rFonts w:ascii="Arial" w:eastAsia="Times New Roman" w:hAnsi="Arial" w:cs="Arial" /><w:color w:val="333333" /><w:kern w:val="0" /><w:sz w:val="20" /><w:szCs w:val="20" /><w14:ligatures w14:val="none" /></w:rPr></w:pPr><w:r><w:rPr><w:rFonts w:ascii="Arial" w:eastAsia="Times New Roman" w:hAnsi="Arial" w:cs="Arial" /><w:color w:val="333333" /><w:kern w:val="0" /><w:sz w:val="20" /><w:szCs w:val="20" /><w14:ligatures w14:val="none" /></w:rPr><w:t>Bring Frisbees or balls for children to play with in the large open field while you wait for a show to begin.</w:t></w:r><w:bookmarkStart w:name="_m-42#02XHYG9JBT9kpf5RZxEjyG}n{EC@IY!v" w:id="45" /><w:bookmarkEnd w:id="45" /><w:bookmarkStart w:name="_m-42#12~VGeR;3tu2;I4qJw6bZrPJ3?0-vith" w:id="46" /><w:bookmarkEnd w:id="46" /><w:bookmarkStart w:name="_m-42#22wK~0ts" w:id="47" /><w:bookmarkEnd w:id="47" /></w:p><w:p><w:pPr><w:shd w:val="clear" w:color="auto" w:fill="FFFFFF" /><w:spacing w:beforeAutospacing="1" w:after="0" w:afterAutospacing="1" w:line="270" w:lineRule="atLeast" /><w:rPr><w:rFonts w:ascii="Verdana" w:eastAsia="Times New Roman" w:hAnsi="Verdana" w:cs="Times New Roman" /><w:color w:val="444E5C" /><w:kern w:val="0" /><w:sz w:val="20" /><w:szCs w:val="20" /><w14:ligatures w14:val="none" /></w:rPr></w:pPr><w:bookmarkStart w:name="_m-3X#02XHTG9OBT4kpk5RUxEoyGxn{JC@DY!{" w:id="42" /><w:bookmarkEnd w:id="42" /><w:bookmarkStart w:name="_m-3X#12~VBeR@3tp2;N4qEw6gZrKJ3D0-qitm" w:id="43" /><w:bookmarkEnd w:id="43" /><w:bookmarkStart w:name="_m-3X#22wKy0tx" w:id="44" /><w:bookmarkEnd w:id="44" /></w:p><w:p><w:pPr><w:shd w:val="clear" w:color="auto" w:fill="FFFFFF" /><w:spacing w:beforeAutospacing="1" w:after="0" w:afterAutospacing="1" w:line="270" w:lineRule="atLeast" /><w:rPr><w:rStyle w:val="Strong" /><w:rFonts w:ascii="Arial" w:hAnsi="Arial" w:cs="Arial" /></w:rPr></w:pPr><w:r><w:rPr><w:rStyle w:val="Strong" /><w:rFonts w:ascii="Arial" w:hAnsi="Arial" w:cs="Arial" /></w:rPr><w:t>Event S</w:t></w:r><w:r><w:rPr><w:rStyle w:val="Strong" /><w:rFonts w:ascii="Arial" w:hAnsi="Arial" w:cs="Arial" /></w:rPr><w:t>chedule</w:t></w:r><w:bookmarkStart w:name="_m-3V#02XI\G8GBU&lt;koc5S]xDgyH&quot;nzBCALY~s" w:id="39" /><w:bookmarkEnd w:id="39" /><w:bookmarkStart w:name="_m-3V#12~WJeQ83ux2:F4rMw5_ZsSJ2&lt;0.yise" w:id="40" /><w:bookmarkEnd w:id="40" /><w:bookmarkStart w:name="_m-3V#22wL#0sp" w:id="41" /><w:bookmarkEnd w:id="41" /></w:p><w:p><w:pPr><w:shd w:val="clear" w:color="auto" w:fill="FFFFFF" /><w:spacing w:beforeAutospacing="1" w:after="0" w:afterAutospacing="1" w:line="270" w:lineRule="atLeast" /><w:rPr><w:rStyle w:val="Strong" /><w:rFonts w:ascii="Arial" w:hAnsi="Arial" w:cs="Arial" /></w:rPr></w:pPr><w:r><w:rPr><w:rStyle w:val="Strong" /><w:rFonts w:ascii="Arial" w:hAnsi="Arial" w:cs="Arial" /></w:rPr><w:t>Saturday (5/2</w:t></w:r><w:r><w:rPr><w:rStyle w:val="Strong" /><w:rFonts w:ascii="Arial" w:hAnsi="Arial" w:cs="Arial" /></w:rPr><w:t>8</w:t></w:r><w:r><w:rPr><w:rStyle w:val="Strong" /><w:rFonts w:ascii="Arial" w:hAnsi="Arial" w:cs="Arial" /></w:rPr><w:t>/</w:t></w:r><w:r><w:rPr><w:rStyle w:val="Strong" /><w:rFonts w:ascii="Arial" w:hAnsi="Arial" w:cs="Arial" /></w:rPr><w:t>202</w:t></w:r><w:r><w:rPr><w:rStyle w:val="Strong" /><w:rFonts w:ascii="Arial" w:hAnsi="Arial" w:cs="Arial" /></w:rPr><w:t>4</w:t></w:r><w:r><w:rPr><w:rStyle w:val="Strong" /><w:rFonts w:ascii="Arial" w:hAnsi="Arial" w:cs="Arial" /></w:rPr><w:t>)</w:t></w:r><w:bookmarkStart w:name="_m-3T#02XIZG8IBU:koe5S[xDiyH~nzDCAJY~u" w:id="36" /><w:bookmarkEnd w:id="36" /><w:bookmarkStart w:name="_m-3T#12~WHeQ:3uv2:H4rKw5aZsQJ2&gt;0.wisg" w:id="37" /><w:bookmarkEnd w:id="37" /><w:bookmarkStart w:name="_m-3T#22wL!0sr" w:id="38" /><w:bookmarkEnd w:id="38" /></w:p><w:p><w:pPr><w:shd w:val="clear" w:color="auto" w:fill="FFFFFF" /><w:spacing w:beforeAutospacing="1" w:after="0" w:afterAutospacing="1" w:line="270" w:lineRule="atLeast" /><w:rPr><w:rFonts w:ascii="Arial" w:hAnsi="Arial" w:cs="Arial" /></w:rPr></w:pPr><w:r><w:rPr><w:rFonts w:ascii="Arial" w:hAnsi="Arial" w:cs="Arial" /></w:rPr><w:t xml:space="preserve">6:00 AM </w:t></w:r><w:r><w:rPr><w:rFonts w:ascii="Arial" w:hAnsi="Arial" w:cs="Arial" /></w:rPr><w:t>Pilots Briefing</w:t></w:r><w:bookmarkStart w:name="_m-3R#02XIXG8KBU8kog5SYxDkyH|nzFCAHY~w" w:id="33" /><w:bookmarkEnd w:id="33" /><w:bookmarkStart w:name="_m-3R#12~WFeQ&lt;3ut2:J4rIw5cZsOJ2@0.uisi" w:id="34" /><w:bookmarkEnd w:id="34" /><w:bookmarkStart w:name="_m-3R#22wL}0st" w:id="35" /><w:bookmarkEnd w:id="35" /></w:p><w:p><w:pPr><w:shd w:val="clear" w:color="auto" w:fill="FFFFFF" /><w:spacing w:beforeAutospacing="1" w:after="0" w:afterAutospacing="1" w:line="270" w:lineRule="atLeast" /><w:rPr><w:rFonts w:ascii="Arial" w:hAnsi="Arial" w:cs="Arial" /></w:rPr></w:pPr><w:r><w:rPr><w:rFonts w:ascii="Arial" w:hAnsi="Arial" w:cs="Arial" /></w:rPr><w:t>6:30 AM Hare and Hound Race</w:t></w:r><w:bookmarkStart w:name="_m-3N#02XITG8OBU4kok5SUxDoyHxnzJCADY~{" w:id="30" /><w:bookmarkEnd w:id="30" /><w:bookmarkStart w:name="_m-3N#12~WBeQ@3up2:N4rEw5gZsKJ2D0.qism" w:id="31" /><w:bookmarkEnd w:id="31" /><w:bookmarkStart w:name="_m-3N#22wLy0sx" w:id="32" /><w:bookmarkEnd w:id="32" /></w:p><w:p><w:pPr><w:shd w:val="clear" w:color="auto" w:fill="FFFFFF" /><w:spacing w:beforeAutospacing="1" w:after="0" w:afterAutospacing="1" w:line="270" w:lineRule="atLeast" /><w:rPr><w:rFonts w:ascii="Arial" w:hAnsi="Arial" w:cs="Arial" /></w:rPr></w:pPr><w:r><w:rPr><w:rFonts w:ascii="Arial" w:hAnsi="Arial" w:cs="Arial" /></w:rPr><w:t>5:00 PM Pilot Briefing</w:t></w:r><w:bookmarkStart w:name="_m-3J#02XJZG7IBV:kne5T[xCiyI~nyDCBJY}u" w:id="27" /><w:bookmarkEnd w:id="27" /><w:bookmarkStart w:name="_m-3J#12~XHeP:3vv29H4sKw4aZtQJ1&gt;0/wirg" w:id="28" /><w:bookmarkEnd w:id="28" /><w:bookmarkStart w:name="_m-3J#22wM!0rr" w:id="29" /><w:bookmarkEnd w:id="29" /></w:p><w:p><w:pPr><w:shd w:val="clear" w:color="auto" w:fill="FFFFFF" /><w:spacing w:beforeAutospacing="1" w:after="0" w:afterAutospacing="1" w:line="270" w:lineRule="atLeast" /><w:rPr><w:rFonts w:ascii="Arial" w:hAnsi="Arial" w:cs="Arial" /></w:rPr></w:pPr><w:r><w:rPr><w:rFonts w:ascii="Arial" w:hAnsi="Arial" w:cs="Arial" /></w:rPr><w:t>5:30 PM Fun Flight</w:t></w:r><w:bookmarkStart w:name="_m-3H#02XJXG7KBV8kng5TYxCkyI|nyFCBHY}w" w:id="24" /><w:bookmarkEnd w:id="24" /><w:bookmarkStart w:name="_m-3H#12~XFeP&lt;3vt29J4sIw4cZtOJ1@0/uiri" w:id="25" /><w:bookmarkEnd w:id="25" /><w:bookmarkStart w:name="_m-3H#22wM}0rt" w:id="26" /><w:bookmarkEnd w:id="26" /></w:p><w:p><w:pPr><w:shd w:val="clear" w:color="auto" w:fill="FFFFFF" /><w:spacing w:beforeAutospacing="1" w:after="0" w:afterAutospacing="1" w:line="270" w:lineRule="atLeast" /><w:rPr><w:rFonts w:ascii="Arial" w:hAnsi="Arial" w:cs="Arial" /></w:rPr></w:pPr><w:r><w:rPr><w:rFonts w:ascii="Arial" w:hAnsi="Arial" w:cs="Arial" /></w:rPr><w:t>6:30 PM Tethers</w:t></w:r><w:bookmarkStart w:name="_m-3C#02XJSG7PBV3knl5TTxCpyIwnyKCBCY}|" w:id="21" /><w:bookmarkEnd w:id="21" /><w:bookmarkStart w:name="_m-3C#12~XAePA3vo29O4sDw4hZtJJ1E0/pirn" w:id="22" /><w:bookmarkEnd w:id="22" /><w:bookmarkStart w:name="_m-3C#22wMx0ry" w:id="23" /><w:bookmarkEnd w:id="23" /></w:p><w:p><w:pPr><w:shd w:val="clear" w:color="auto" w:fill="FFFFFF" /><w:spacing w:beforeAutospacing="1" w:after="0" w:afterAutospacing="1" w:line="270" w:lineRule="atLeast" /><w:rPr><w:rFonts w:ascii="Arial" w:hAnsi="Arial" w:cs="Arial" /></w:rPr></w:pPr><w:r><w:rPr><w:rFonts w:ascii="Arial" w:hAnsi="Arial" w:cs="Arial" /></w:rPr><w:t>8:15 PM Balloon Glow</w:t></w:r><w:bookmarkStart w:name="_m-3A#02XK[G6HBW;kmd5U\xBhyJ!nxCCCKY|t" w:id="18" /><w:bookmarkEnd w:id="18" /><w:bookmarkStart w:name="_m-3A#12~YIeO93ww28G4tLw3`ZuRJ0=00xiqf" w:id="19" /><w:bookmarkEnd w:id="19" /><w:bookmarkStart w:name="_m-3A#22wN&quot;0qq" w:id="20" /><w:bookmarkEnd w:id="20" /></w:p><w:p><w:pPr><w:shd w:val="clear" w:color="auto" w:fill="FFFFFF" /><w:spacing w:beforeAutospacing="1" w:after="0" w:afterAutospacing="1" w:line="270" w:lineRule="atLeast" /><w:rPr><w:rStyle w:val="Strong" /><w:rFonts w:ascii="Arial" w:hAnsi="Arial" w:cs="Arial" /></w:rPr></w:pPr><w:r><w:rPr><w:rStyle w:val="Strong" /><w:rFonts w:ascii="Arial" w:hAnsi="Arial" w:cs="Arial" /></w:rPr><w:t>Sunday (5/2</w:t></w:r><w:r><w:rPr><w:rStyle w:val="Strong" /><w:rFonts w:ascii="Arial" w:hAnsi="Arial" w:cs="Arial" /></w:rPr><w:t>9</w:t></w:r><w:r><w:rPr><w:rStyle w:val="Strong" /><w:rFonts w:ascii="Arial" w:hAnsi="Arial" w:cs="Arial" /></w:rPr><w:t>/</w:t></w:r><w:r><w:rPr><w:rStyle w:val="Strong" /><w:rFonts w:ascii="Arial" w:hAnsi="Arial" w:cs="Arial" /></w:rPr><w:t>202</w:t></w:r><w:r><w:rPr><w:rStyle w:val="Strong" /><w:rFonts w:ascii="Arial" w:hAnsi="Arial" w:cs="Arial" /></w:rPr><w:t>4</w:t></w:r><w:r><w:rPr><w:rStyle w:val="Strong" /><w:rFonts w:ascii="Arial" w:hAnsi="Arial" w:cs="Arial" /></w:rPr><w:t>)</w:t></w:r><w:bookmarkStart w:name="_m-38#02XKYG6JBW9kmf5UZxBjyJ}nxECCIY|v" w:id="15" /><w:bookmarkEnd w:id="15" /><w:bookmarkStart w:name="_m-38#12~YGeO;3wu28I4tJw3bZuPJ0?00viqh" w:id="16" /><w:bookmarkEnd w:id="16" /><w:bookmarkStart w:name="_m-38#22wN~0qs" w:id="17" /><w:bookmarkEnd w:id="17" /></w:p><w:p><w:pPr><w:shd w:val="clear" w:color="auto" w:fill="FFFFFF" /><w:spacing w:beforeAutospacing="1" w:after="0" w:afterAutospacing="1" w:line="270" w:lineRule="atLeast" /><w:rPr><w:rFonts w:ascii="Arial" w:hAnsi="Arial" w:cs="Arial" /></w:rPr></w:pPr><w:r><w:rPr><w:rFonts w:ascii="Arial" w:hAnsi="Arial" w:cs="Arial" /></w:rPr><w:t>6:00 AM Pilots Briefing</w:t></w:r><w:bookmarkStart w:name="_m-37#02XKXG6KBW8kmg5UYxBkyJ|nxFCCHY|w" w:id="12" /><w:bookmarkEnd w:id="12" /><w:bookmarkStart w:name="_m-37#12~YFeO&lt;3wt28J4tIw3cZuOJ0@00uiqi" w:id="13" /><w:bookmarkEnd w:id="13" /><w:bookmarkStart w:name="_m-37#22wN}0qt" w:id="14" /><w:bookmarkEnd w:id="14" /></w:p><w:p><w:pPr><w:shd w:val="clear" w:color="auto" w:fill="FFFFFF" /><w:spacing w:beforeAutospacing="1" w:after="0" w:afterAutospacing="1" w:line="270" w:lineRule="atLeast" /><w:rPr><w:rFonts w:ascii="Arial" w:hAnsi="Arial" w:cs="Arial" /></w:rPr></w:pPr><w:r><w:rPr><w:rFonts w:ascii="Arial" w:hAnsi="Arial" w:cs="Arial" /></w:rPr><w:t>6:30 AM Lynn Layton Key Grab</w:t></w:r><w:bookmarkStart w:name="_m-33#02XKTG6OBW4kmk5UUxBoyJxnxJCCDY|{" w:id="9" /><w:bookmarkEnd w:id="9" /><w:bookmarkStart w:name="_m-33#12~YBeO@3wp28N4tEw3gZuKJ0D00qiqm" w:id="10" /><w:bookmarkEnd w:id="10" /><w:bookmarkStart w:name="_m-33#22wNy0qx" w:id="11" /><w:bookmarkEnd w:id="11" /></w:p><w:p><w:pPr><w:shd w:val="clear" w:color="auto" w:fill="FFFFFF" /><w:spacing w:beforeAutospacing="1" w:after="0" w:afterAutospacing="1" w:line="270" w:lineRule="atLeast" /><w:rPr><w:rFonts w:ascii="Arial" w:hAnsi="Arial" w:cs="Arial" /></w:rPr></w:pPr><w:r><w:rPr><w:rFonts w:ascii="Arial" w:hAnsi="Arial" w:cs="Arial" /></w:rPr><w:t>5:00 PM Pilot Briefing</w:t></w:r><w:bookmarkStart w:name="_m-2Z#02XLZG5IBX:kle5V[xAiyK~nwDCDJY{u" w:id="6" /><w:bookmarkEnd w:id="6" /><w:bookmarkStart w:name="_m-2Z#12~ZHeN:3xv27H4uKw2aZvQJ/&gt;01wipg" w:id="7" /><w:bookmarkEnd w:id="7" /><w:bookmarkStart w:name="_m-2Z#22wO!0pr" w:id="8" /><w:bookmarkEnd w:id="8" /></w:p><w:p><w:pPr><w:shd w:val="clear" w:color="auto" w:fill="FFFFFF" /><w:spacing w:beforeAutospacing="1" w:after="0" w:afterAutospacing="1" w:line="270" w:lineRule="atLeast" /><w:rPr><w:rFonts w:ascii="Arial" w:hAnsi="Arial" w:cs="Arial" /></w:rPr></w:pPr><w:r><w:rPr><w:rFonts w:ascii="Arial" w:hAnsi="Arial" w:cs="Arial" /></w:rPr><w:t>5:30 PM Fun Flight</w:t></w:r><w:bookmarkStart w:name="_m-2U#02XLUG5NBX5klj5VVxAnyKynwICDEY{z" w:id="3" /><w:bookmarkEnd w:id="3" /><w:bookmarkStart w:name="_m-2U#12~ZCeN?3xq27M4uFw2fZvLJ/C01ripl" w:id="4" /><w:bookmarkEnd w:id="4" /><w:bookmarkStart w:name="_m-2U#22wOz0pw" w:id="5" /><w:bookmarkEnd w:id="5" /></w:p><w:p><w:pPr><w:shd w:val="clear" w:color="auto" w:fill="FFFFFF" /><w:spacing w:beforeAutospacing="1" w:after="0" w:afterAutospacing="1" w:line="270" w:lineRule="atLeast" /><w:jc w:val="center"/><w:jc w:val="right"/></w:pPr><w:r><w:rPr><w:b/><w:bCs/><w:color w:val="4472C4" w:themeColor="accent5"/><w:rFonts w:ascii="Arial" w:hAnsi="Arial" w:cs="Arial" /></w:rPr><w:t xml:space="preserve">6:30 PM </w:t></w:r><w:r><w:rPr><w:b/><w:bCs/><w:color w:val="4472C4" w:themeColor="accent5"/><w:rFonts w:ascii="Arial" w:hAnsi="Arial" w:cs="Arial" /></w:rPr><w:t>Ballumination</w:t></w:r><w:bookmarkStart w:name="_m-2S#02XLSG5PBX3kll5VTxApyKwnwKCDCY{|" w:id="0" /><w:bookmarkEnd w:id="0" /><w:bookmarkStart w:name="_m-2S#12~ZAeNA3xo27O4uDw2hZvJJ/E01pipn" w:id="1" /><w:bookmarkEnd w:id="1" /><w:bookmarkStart w:name="_m-2S#22wOx0py" w:id="2" /><w:bookmarkEnd w:id="2" /></w:p><w:sectPr><w:type w:val="continuous" /><w:pgSz w:w="12240" w:h="15840" /><w:pgMar w:top="1440" w:right="1440" w:bottom="1440" w:left="1440" w:header="720" w:footer="720" w:gutter="0" /><w:cols w:space="720" /><w:docGrid w:linePitch="360" /></w:sectPr></w:body></w:document>
+<file path=word/document.xml><?xml version="1.0" encoding="utf-8"?>
+<w:document xmlns:wpc="http://schemas.microsoft.com/office/word/2010/wordprocessingCanvas" xmlns:cx="http://schemas.microsoft.com/office/drawing/2014/chartex" xmlns:cx1="http://schemas.microsoft.com/office/drawing/2015/9/8/chartex" xmlns:cx2="http://schemas.microsoft.com/office/drawing/2015/10/21/chartex" xmlns:cx3="http://schemas.microsoft.com/office/drawing/2016/5/9/chartex" xmlns:cx4="http://schemas.microsoft.com/office/drawing/2016/5/10/chartex" xmlns:cx5="http://schemas.microsoft.com/office/drawing/2016/5/11/chartex" xmlns:cx6="http://schemas.microsoft.com/office/drawing/2016/5/12/chartex" xmlns:cx7="http://schemas.microsoft.com/office/drawing/2016/5/13/chartex" xmlns:cx8="http://schemas.microsoft.com/office/drawing/2016/5/14/chartex" xmlns:mc="http://schemas.openxmlformats.org/markup-compatibility/2006" xmlns:aink="http://schemas.microsoft.com/office/drawing/2016/ink" xmlns:am3d="http://schemas.microsoft.com/office/drawing/2017/model3d" xmlns:o="urn:schemas-microsoft-com:office:office" xmlns:r="http://schemas.openxmlformats.org/officeDocument/2006/relationships" xmlns:m="http://schemas.openxmlformats.org/officeDocument/2006/math" xmlns:v="urn:schemas-microsoft-com:vml" xmlns:wp14="http://schemas.microsoft.com/office/word/2010/wordprocessingDrawing" xmlns:wp="http://schemas.openxmlformats.org/drawingml/2006/wordprocessingDrawing" xmlns:w10="urn:schemas-microsoft-com:office:word" xmlns:w="http://schemas.openxmlformats.org/wordprocessingml/2006/main" xmlns:w14="http://schemas.microsoft.com/office/word/2010/wordml" xmlns:w15="http://schemas.microsoft.com/office/word/2012/wordml" xmlns:w16cex="http://schemas.microsoft.com/office/word/2018/wordml/cex" xmlns:w16cid="http://schemas.microsoft.com/office/word/2016/wordml/cid" xmlns:w16="http://schemas.microsoft.com/office/word/2018/wordml" xmlns:w16se="http://schemas.microsoft.com/office/word/2015/wordml/symex" xmlns:wpg="http://schemas.microsoft.com/office/word/2010/wordprocessingGroup" xmlns:wpi="http://schemas.microsoft.com/office/word/2010/wordprocessingInk" xmlns:wne="http://schemas.microsoft.com/office/word/2006/wordml" xmlns:wps="http://schemas.microsoft.com/office/word/2010/wordprocessingShape" mc:Ignorable="w14 w15 w16se w16cid w16 w16cex wp14">
+  <w:body>
+    <w:p>
+      <w:pPr>
+        <w:shd w:val="clear" w:color="auto" w:fill="FFFFFF"/>
+        <w:spacing w:beforeAutospacing="1" w:after="0" w:afterAutospacing="1" w:line="270" w:lineRule="atLeast"/>
+        <w:rPr>
+          <w:rFonts w:ascii="Arial" w:eastAsia="Times New Roman" w:hAnsi="Arial" w:cs="Arial"/>
+          <w:color w:val="333333"/>
+          <w:kern w:val="0"/>
+          <w:sz w:val="20"/>
+          <w:szCs w:val="20"/>
+          <w14:ligatures w14:val="none"/>
+        </w:rPr>
+      </w:pPr>
+      <w:r>
+        <w:rPr>
+          <w:rFonts w:ascii="Arial" w:eastAsia="Times New Roman" w:hAnsi="Arial" w:cs="Arial"/>
+          <w:color w:val="333333"/>
+          <w:kern w:val="0"/>
+          <w:sz w:val="20"/>
+          <w:szCs w:val="20"/>
+          <w14:ligatures w14:val="none"/>
+        </w:rPr>
+        <w:t xml:space="preserve">Mount </w:t>
+      </w:r>
+      <w:r>
+        <w:rPr>
+          <w:rFonts w:ascii="Arial" w:eastAsia="Times New Roman" w:hAnsi="Arial" w:cs="Arial"/>
+          <w:color w:val="333333"/>
+          <w:kern w:val="0"/>
+          <w:sz w:val="20"/>
+          <w:szCs w:val="20"/>
+          <w14:ligatures w14:val="none"/>
+        </w:rPr>
+        <w:t>Vernon</w:t>
+      </w:r>
+      <w:r>
+        <w:rPr>
+          <w:rFonts w:ascii="Arial" w:eastAsia="Times New Roman" w:hAnsi="Arial" w:cs="Arial"/>
+          <w:color w:val="333333"/>
+          <w:kern w:val="0"/>
+          <w:sz w:val="20"/>
+          <w:szCs w:val="20"/>
+          <w14:ligatures w14:val="none"/>
+        </w:rPr>
+        <w:t xml:space="preserve"> Hot Air Balloon Festival</w:t>
+      </w:r>
+      <w:bookmarkStart w:name="_m-72#02YGWF:LCS7jqh6QXwFlzF{m|GD?GX&quot;x" w:id="159"/>
+      <w:bookmarkEnd w:id="159"/>
+      <w:bookmarkStart w:name="_m-72#12!UEdS=4ss1&lt;K5pHv7d[qNI4A1,thuj" w:id="160"/>
+      <w:bookmarkEnd w:id="160"/>
+      <w:bookmarkStart w:name="_m-72#22xJ|/uu" w:id="161"/>
+      <w:bookmarkEnd w:id="161"/>
+    </w:p>
+    <w:p>
+      <w:pPr>
+        <w:shd w:val="clear" w:color="auto" w:fill="FFFFFF"/>
+        <w:spacing w:beforeAutospacing="1" w:after="0" w:afterAutospacing="1" w:line="270" w:lineRule="atLeast"/>
+        <w:rPr>
+          <w:rFonts w:ascii="Arial" w:eastAsia="Times New Roman" w:hAnsi="Arial" w:cs="Arial"/>
+          <w:color w:val="333333"/>
+          <w:kern w:val="0"/>
+          <w:sz w:val="20"/>
+          <w:szCs w:val="20"/>
+          <w14:ligatures w14:val="none"/>
+        </w:rPr>
+      </w:pPr>
+      <w:r>
+        <w:rPr>
+          <w:rFonts w:ascii="Arial" w:eastAsia="Times New Roman" w:hAnsi="Arial" w:cs="Arial"/>
+          <w:color w:val="333333"/>
+          <w:kern w:val="0"/>
+          <w:sz w:val="20"/>
+          <w:szCs w:val="20"/>
+          <w14:ligatures w14:val="none"/>
+        </w:rPr>
+        <w:t xml:space="preserve">See the Canyon From </w:t>
+      </w:r>
+      <w:r>
+        <w:rPr>
+          <w:rFonts w:ascii="Arial" w:eastAsia="Times New Roman" w:hAnsi="Arial" w:cs="Arial"/>
+          <w:color w:val="333333"/>
+          <w:kern w:val="0"/>
+          <w:sz w:val="20"/>
+          <w:szCs w:val="20"/>
+          <w14:ligatures w14:val="none"/>
+        </w:rPr>
+        <w:t>t</w:t>
+      </w:r>
+      <w:r>
+        <w:rPr>
+          <w:rFonts w:ascii="Arial" w:eastAsia="Times New Roman" w:hAnsi="Arial" w:cs="Arial"/>
+          <w:color w:val="333333"/>
+          <w:kern w:val="0"/>
+          <w:sz w:val="20"/>
+          <w:szCs w:val="20"/>
+          <w14:ligatures w14:val="none"/>
+        </w:rPr>
+        <w:t>he Top</w:t>
+      </w:r>
+      <w:r>
+        <w:rPr>
+          <w:rFonts w:ascii="Arial" w:eastAsia="Times New Roman" w:hAnsi="Arial" w:cs="Arial"/>
+          <w:color w:val="333333"/>
+          <w:kern w:val="0"/>
+          <w:sz w:val="20"/>
+          <w:szCs w:val="20"/>
+          <w14:ligatures w14:val="none"/>
+        </w:rPr>
+        <w:t>!</w:t>
+      </w:r>
+      <w:bookmarkStart w:name="_m-71#02YGVF:MCS6jqi6QWwFmzFzm|HD?FX&quot;y" w:id="156"/>
+      <w:bookmarkEnd w:id="156"/>
+      <w:bookmarkStart w:name="_m-71#12!UDdS&gt;4sr1&lt;L5pGv7e[qMI4B1,shuk" w:id="157"/>
+      <w:bookmarkEnd w:id="157"/>
+      <w:bookmarkStart w:name="_m-71#22xJ{/uv" w:id="158"/>
+      <w:bookmarkEnd w:id="158"/>
+    </w:p>
+    <w:p>
+      <w:pPr>
+        <w:shd w:val="clear" w:color="auto" w:fill="FFFFFF"/>
+        <w:spacing w:before="100" w:beforeAutospacing="1" w:after="100" w:afterAutospacing="1" w:line="270" w:lineRule="atLeast"/>
+        <w:rPr>
+          <w:rFonts w:ascii="Arial" w:eastAsia="Times New Roman" w:hAnsi="Arial" w:cs="Arial"/>
+          <w:color w:val="333333"/>
+          <w:kern w:val="0"/>
+          <w:sz w:val="20"/>
+          <w:szCs w:val="20"/>
+          <w14:ligatures w14:val="none"/>
+        </w:rPr>
+        <w:sectPr>
+          <w:pgSz w:w="12240" w:h="15840"/>
+          <w:pgMar w:top="1440" w:right="1440" w:bottom="1440" w:left="1440" w:header="720" w:footer="720" w:gutter="0"/>
+          <w:cols w:space="720"/>
+          <w:docGrid w:linePitch="360"/>
+        </w:sectPr>
+      </w:pPr>
+      <w:bookmarkStart w:name="_m-70#02YGUF:NCS5jqj6QVwFnzFym|ID?EX&quot;z" w:id="153"/>
+      <w:bookmarkEnd w:id="153"/>
+      <w:bookmarkStart w:name="_m-70#12!UCdS?4sq1&lt;M5pFv7f[qLI4C1,rhul" w:id="154"/>
+      <w:bookmarkEnd w:id="154"/>
+      <w:bookmarkStart w:name="_m-70#22xJz/uw" w:id="155"/>
+      <w:bookmarkEnd w:id="155"/>
+    </w:p>
+    <w:p>
+      <w:pPr>
+        <w:shd w:val="clear" w:color="auto" w:fill="FFFFFF"/>
+        <w:spacing w:before="100" w:beforeAutospacing="1" w:after="100" w:afterAutospacing="1" w:line="270" w:lineRule="atLeast"/>
+        <w:rPr>
+          <w:rFonts w:ascii="Arial" w:eastAsia="Times New Roman" w:hAnsi="Arial" w:cs="Arial"/>
+          <w:color w:val="333333"/>
+          <w:kern w:val="0"/>
+          <w:sz w:val="20"/>
+          <w:szCs w:val="20"/>
+          <w14:ligatures w14:val="none"/>
+        </w:rPr>
+      </w:pPr>
+      <w:r>
+        <w:rPr>
+          <w:rFonts w:ascii="Arial" w:eastAsia="Times New Roman" w:hAnsi="Arial" w:cs="Arial"/>
+          <w:color w:val="333333"/>
+          <w:kern w:val="0"/>
+          <w:sz w:val="20"/>
+          <w:szCs w:val="20"/>
+          <w14:ligatures w14:val="none"/>
+        </w:rPr>
+        <w:t>May 2</w:t>
+      </w:r>
+      <w:r>
+        <w:rPr>
+          <w:rFonts w:ascii="Arial" w:eastAsia="Times New Roman" w:hAnsi="Arial" w:cs="Arial"/>
+          <w:color w:val="333333"/>
+          <w:kern w:val="0"/>
+          <w:sz w:val="20"/>
+          <w:szCs w:val="20"/>
+          <w14:ligatures w14:val="none"/>
+        </w:rPr>
+        <w:t>8</w:t>
+      </w:r>
+      <w:r>
+        <w:rPr>
+          <w:rFonts w:ascii="Arial" w:eastAsia="Times New Roman" w:hAnsi="Arial" w:cs="Arial"/>
+          <w:color w:val="333333"/>
+          <w:kern w:val="0"/>
+          <w:sz w:val="20"/>
+          <w:szCs w:val="20"/>
+          <w14:ligatures w14:val="none"/>
+        </w:rPr>
+        <w:t>-2</w:t>
+      </w:r>
+      <w:r>
+        <w:rPr>
+          <w:rFonts w:ascii="Arial" w:eastAsia="Times New Roman" w:hAnsi="Arial" w:cs="Arial"/>
+          <w:color w:val="333333"/>
+          <w:kern w:val="0"/>
+          <w:sz w:val="20"/>
+          <w:szCs w:val="20"/>
+          <w14:ligatures w14:val="none"/>
+        </w:rPr>
+        <w:t>9</w:t>
+      </w:r>
+      <w:r>
+        <w:rPr>
+          <w:rFonts w:ascii="Arial" w:eastAsia="Times New Roman" w:hAnsi="Arial" w:cs="Arial"/>
+          <w:color w:val="333333"/>
+          <w:kern w:val="0"/>
+          <w:sz w:val="20"/>
+          <w:szCs w:val="20"/>
+          <w14:ligatures w14:val="none"/>
+        </w:rPr>
+        <w:t>, 20</w:t>
+      </w:r>
+      <w:r>
+        <w:rPr>
+          <w:rFonts w:ascii="Arial" w:eastAsia="Times New Roman" w:hAnsi="Arial" w:cs="Arial"/>
+          <w:color w:val="333333"/>
+          <w:kern w:val="0"/>
+          <w:sz w:val="20"/>
+          <w:szCs w:val="20"/>
+          <w14:ligatures w14:val="none"/>
+        </w:rPr>
+        <w:t>2</w:t>
+      </w:r>
+      <w:r>
+        <w:rPr>
+          <w:rFonts w:ascii="Arial" w:eastAsia="Times New Roman" w:hAnsi="Arial" w:cs="Arial"/>
+          <w:color w:val="333333"/>
+          <w:kern w:val="0"/>
+          <w:sz w:val="20"/>
+          <w:szCs w:val="20"/>
+          <w14:ligatures w14:val="none"/>
+        </w:rPr>
+        <w:t>4</w:t>
+      </w:r>
+      <w:bookmarkStart w:name="_m-6V#02YHZF9ICT:jpe6R[wEizG~m{DD@JX!u" w:id="150"/>
+      <w:bookmarkEnd w:id="150"/>
+      <w:bookmarkStart w:name="_m-6V#12!VHdR:4tv1;H5qKv6a[rQI3&gt;1-whtg" w:id="151"/>
+      <w:bookmarkEnd w:id="151"/>
+      <w:bookmarkStart w:name="_m-6V#22xK!/tr" w:id="152"/>
+      <w:bookmarkEnd w:id="152"/>
+    </w:p>
+    <w:p>
+      <w:pPr>
+        <w:shd w:val="clear" w:color="auto" w:fill="FFFFFF"/>
+        <w:spacing w:before="100" w:beforeAutospacing="1" w:after="100" w:afterAutospacing="1" w:line="270" w:lineRule="atLeast"/>
+        <w:rPr>
+          <w:rFonts w:ascii="Arial" w:eastAsia="Times New Roman" w:hAnsi="Arial" w:cs="Arial"/>
+          <w:color w:val="333333"/>
+          <w:kern w:val="0"/>
+          <w:sz w:val="20"/>
+          <w:szCs w:val="20"/>
+          <w14:ligatures w14:val="none"/>
+        </w:rPr>
+      </w:pPr>
+      <w:r>
+        <w:rPr>
+          <w:rFonts w:ascii="Arial" w:eastAsia="Times New Roman" w:hAnsi="Arial" w:cs="Arial"/>
+          <w:color w:val="333333"/>
+          <w:kern w:val="0"/>
+          <w:sz w:val="20"/>
+          <w:szCs w:val="20"/>
+          <w14:ligatures w14:val="none"/>
+        </w:rPr>
+        <w:t xml:space="preserve">The </w:t>
+      </w:r>
+      <w:r>
+        <w:rPr>
+          <w:rFonts w:ascii="Arial" w:eastAsia="Times New Roman" w:hAnsi="Arial" w:cs="Arial"/>
+          <w:color w:val="333333"/>
+          <w:kern w:val="0"/>
+          <w:sz w:val="20"/>
+          <w:szCs w:val="20"/>
+          <w14:ligatures w14:val="none"/>
+        </w:rPr>
+        <w:t xml:space="preserve">Mount </w:t>
+      </w:r>
+      <w:r>
+        <w:rPr>
+          <w:rFonts w:ascii="Arial" w:eastAsia="Times New Roman" w:hAnsi="Arial" w:cs="Arial"/>
+          <w:color w:val="333333"/>
+          <w:kern w:val="0"/>
+          <w:sz w:val="20"/>
+          <w:szCs w:val="20"/>
+          <w14:ligatures w14:val="none"/>
+        </w:rPr>
+        <w:t>Vernon</w:t>
+      </w:r>
+      <w:r>
+        <w:rPr>
+          <w:rFonts w:ascii="Arial" w:eastAsia="Times New Roman" w:hAnsi="Arial" w:cs="Arial"/>
+          <w:color w:val="333333"/>
+          <w:kern w:val="0"/>
+          <w:sz w:val="20"/>
+          <w:szCs w:val="20"/>
+          <w14:ligatures w14:val="none"/>
+        </w:rPr>
+        <w:t xml:space="preserve"> Hot Air Balloon Festival, presented by </w:t>
+      </w:r>
+      <w:r>
+        <w:rPr>
+          <w:rFonts w:ascii="Arial" w:eastAsia="Times New Roman" w:hAnsi="Arial" w:cs="Arial"/>
+          <w:color w:val="333333"/>
+          <w:kern w:val="0"/>
+          <w:sz w:val="20"/>
+          <w:szCs w:val="20"/>
+          <w14:ligatures w14:val="none"/>
+        </w:rPr>
+        <w:t>Seattle</w:t>
+      </w:r>
+      <w:r>
+        <w:rPr>
+          <w:rFonts w:ascii="Arial" w:eastAsia="Times New Roman" w:hAnsi="Arial" w:cs="Arial"/>
+          <w:color w:val="333333"/>
+          <w:kern w:val="0"/>
+          <w:sz w:val="20"/>
+          <w:szCs w:val="20"/>
+          <w14:ligatures w14:val="none"/>
+        </w:rPr>
+        <w:t xml:space="preserve"> </w:t>
+      </w:r>
+      <w:r>
+        <w:rPr>
+          <w:rFonts w:ascii="Arial" w:eastAsia="Times New Roman" w:hAnsi="Arial" w:cs="Arial"/>
+          <w:color w:val="333333"/>
+          <w:kern w:val="0"/>
+          <w:sz w:val="20"/>
+          <w:szCs w:val="20"/>
+          <w14:ligatures w14:val="none"/>
+        </w:rPr>
+        <w:t xml:space="preserve">Adventure </w:t>
+      </w:r>
+      <w:r>
+        <w:rPr>
+          <w:rFonts w:ascii="Arial" w:eastAsia="Times New Roman" w:hAnsi="Arial" w:cs="Arial"/>
+          <w:color w:val="333333"/>
+          <w:kern w:val="0"/>
+          <w:sz w:val="20"/>
+          <w:szCs w:val="20"/>
+          <w14:ligatures w14:val="none"/>
+        </w:rPr>
+        <w:t>Explore</w:t>
+      </w:r>
+      <w:r>
+        <w:rPr>
+          <w:rFonts w:ascii="Arial" w:eastAsia="Times New Roman" w:hAnsi="Arial" w:cs="Arial"/>
+          <w:color w:val="333333"/>
+          <w:kern w:val="0"/>
+          <w:sz w:val="20"/>
+          <w:szCs w:val="20"/>
+          <w14:ligatures w14:val="none"/>
+        </w:rPr>
+        <w:t>rs</w:t>
+      </w:r>
+      <w:r>
+        <w:rPr>
+          <w:rFonts w:ascii="Arial" w:eastAsia="Times New Roman" w:hAnsi="Arial" w:cs="Arial"/>
+          <w:color w:val="333333"/>
+          <w:kern w:val="0"/>
+          <w:sz w:val="20"/>
+          <w:szCs w:val="20"/>
+          <w14:ligatures w14:val="none"/>
+        </w:rPr>
+        <w:t xml:space="preserve">, welcomes more than </w:t>
+      </w:r>
+      <w:r>
+        <w:rPr>
+          <w:rFonts w:ascii="Arial" w:eastAsia="Times New Roman" w:hAnsi="Arial" w:cs="Arial"/>
+          <w:color w:val="333333"/>
+          <w:kern w:val="0"/>
+          <w:sz w:val="20"/>
+          <w:szCs w:val="20"/>
+          <w14:ligatures w14:val="none"/>
+        </w:rPr>
+        <w:t>100</w:t>
+      </w:r>
+      <w:r>
+        <w:rPr>
+          <w:rFonts w:ascii="Arial" w:eastAsia="Times New Roman" w:hAnsi="Arial" w:cs="Arial"/>
+          <w:color w:val="333333"/>
+          <w:kern w:val="0"/>
+          <w:sz w:val="20"/>
+          <w:szCs w:val="20"/>
+          <w14:ligatures w14:val="none"/>
+        </w:rPr>
+        <w:t xml:space="preserve"> hot air balloonists from across the country.</w:t>
+      </w:r>
+      <w:r>
+        <w:rPr>
+          <w:rFonts w:ascii="Arial" w:eastAsia="Times New Roman" w:hAnsi="Arial" w:cs="Arial"/>
+          <w:color w:val="333333"/>
+          <w:kern w:val="0"/>
+          <w:sz w:val="20"/>
+          <w:szCs w:val="20"/>
+          <w14:ligatures w14:val="none"/>
+        </w:rPr>
+        <w:t xml:space="preserve"> One of the largest free hot-air balloon festivals in the </w:t>
+      </w:r>
+      <w:r>
+        <w:rPr>
+          <w:rFonts w:ascii="Arial" w:eastAsia="Times New Roman" w:hAnsi="Arial" w:cs="Arial"/>
+          <w:color w:val="333333"/>
+          <w:kern w:val="0"/>
+          <w:sz w:val="20"/>
+          <w:szCs w:val="20"/>
+          <w14:ligatures w14:val="none"/>
+        </w:rPr>
+        <w:t>North</w:t>
+      </w:r>
+      <w:r>
+        <w:rPr>
+          <w:rFonts w:ascii="Arial" w:eastAsia="Times New Roman" w:hAnsi="Arial" w:cs="Arial"/>
+          <w:color w:val="333333"/>
+          <w:kern w:val="0"/>
+          <w:sz w:val="20"/>
+          <w:szCs w:val="20"/>
+          <w14:ligatures w14:val="none"/>
+        </w:rPr>
+        <w:t xml:space="preserve">west, the event features hot air balloon races, a key grab, tether rides, and our always well-attended Ballumination! </w:t>
+      </w:r>
+      <w:r>
+        <w:rPr>
+          <w:rFonts w:ascii="Arial" w:eastAsia="Times New Roman" w:hAnsi="Arial" w:cs="Arial"/>
+          <w:color w:val="333333"/>
+          <w:kern w:val="0"/>
+          <w:sz w:val="20"/>
+          <w:szCs w:val="20"/>
+          <w14:ligatures w14:val="none"/>
+        </w:rPr>
+        <w:t xml:space="preserve">Tour Point Shepherd Park, enjoy a free arts and crafts show, visit the multiple </w:t>
+      </w:r>
+      <w:r>
+        <w:rPr>
+          <w:rFonts w:ascii="Arial" w:eastAsia="Times New Roman" w:hAnsi="Arial" w:cs="Arial"/>
+          <w:color w:val="333333"/>
+          <w:kern w:val="0"/>
+          <w:sz w:val="20"/>
+          <w:szCs w:val="20"/>
+          <w14:ligatures w14:val="none"/>
+        </w:rPr>
+        <w:t xml:space="preserve">farm to table </w:t>
+      </w:r>
+      <w:r>
+        <w:rPr>
+          <w:rFonts w:ascii="Arial" w:eastAsia="Times New Roman" w:hAnsi="Arial" w:cs="Arial"/>
+          <w:color w:val="333333"/>
+          <w:kern w:val="0"/>
+          <w:sz w:val="20"/>
+          <w:szCs w:val="20"/>
+          <w14:ligatures w14:val="none"/>
+        </w:rPr>
+        <w:t xml:space="preserve">food vendors, and get up close with antique cars and tractors. As the sun sets, you can settle back for musical entertainment and the always fabulous fireworks show over the canyon! </w:t>
+      </w:r>
+      <w:bookmarkStart w:name="_m-6S#02YHWF9LCT7jph6RXwElzG{m{GD@GX!x" w:id="147"/>
+      <w:bookmarkEnd w:id="147"/>
+      <w:bookmarkStart w:name="_m-6S#12!VEdR=4ts1;K5qHv6d[rNI3A1-thtj" w:id="148"/>
+      <w:bookmarkEnd w:id="148"/>
+      <w:bookmarkStart w:name="_m-6S#22xK|/tu" w:id="149"/>
+      <w:bookmarkEnd w:id="149"/>
+    </w:p>
+    <w:p>
+      <w:pPr>
+        <w:shd w:val="clear" w:color="auto" w:fill="FFFFFF"/>
+        <w:spacing w:before="100" w:beforeAutospacing="1" w:after="100" w:afterAutospacing="1" w:line="270" w:lineRule="atLeast"/>
+        <w:rPr>
+          <w:rFonts w:ascii="Arial" w:eastAsia="Times New Roman" w:hAnsi="Arial" w:cs="Arial"/>
+          <w:color w:val="333333"/>
+          <w:kern w:val="0"/>
+          <w:sz w:val="20"/>
+          <w:szCs w:val="20"/>
+          <w14:ligatures w14:val="none"/>
+        </w:rPr>
+      </w:pPr>
+      <w:r>
+        <w:rPr>
+          <w:rFonts w:ascii="Arial" w:eastAsia="Times New Roman" w:hAnsi="Arial" w:cs="Arial"/>
+          <w:color w:val="333333"/>
+          <w:kern w:val="0"/>
+          <w:sz w:val="20"/>
+          <w:szCs w:val="20"/>
+          <w14:ligatures w14:val="none"/>
+        </w:rPr>
+        <w:t xml:space="preserve">Saturday’s events feature a 6:30 hare and hound race in which balloons try to follow a hare, </w:t>
+      </w:r>
+      <w:r>
+        <w:rPr>
+          <w:rFonts w:ascii="Arial" w:eastAsia="Times New Roman" w:hAnsi="Arial" w:cs="Arial"/>
+          <w:color w:val="333333"/>
+          <w:kern w:val="0"/>
+          <w:sz w:val="20"/>
+          <w:szCs w:val="20"/>
+          <w14:ligatures w14:val="none"/>
+        </w:rPr>
+        <w:t xml:space="preserve">ultimately </w:t>
+      </w:r>
+      <w:r>
+        <w:rPr>
+          <w:rFonts w:ascii="Arial" w:eastAsia="Times New Roman" w:hAnsi="Arial" w:cs="Arial"/>
+          <w:color w:val="333333"/>
+          <w:kern w:val="0"/>
+          <w:sz w:val="20"/>
+          <w:szCs w:val="20"/>
+          <w14:ligatures w14:val="none"/>
+        </w:rPr>
+        <w:t xml:space="preserve">attempting to land on beanbags. A balloon flight flight at dusk, and a balloon glow beginning at </w:t>
+      </w:r>
+      <w:r>
+        <w:rPr>
+          <w:rFonts w:ascii="Arial" w:eastAsia="Times New Roman" w:hAnsi="Arial" w:cs="Arial"/>
+          <w:color w:val="333333"/>
+          <w:kern w:val="0"/>
+          <w:sz w:val="20"/>
+          <w:szCs w:val="20"/>
+          <w14:ligatures w14:val="none"/>
+        </w:rPr>
+        <w:t>8:00 p.m. round out the day. Get to the park by 6:30 a.m. on Sunday to watch balloons fly into the field while passengers try to grab a ring from a tall pole. Ask a balloon owner for a free tethered ride on Sunday evening. Kids will enjoy the balloon themed play area, with fairground type games including balloon pops and water balloon toss!</w:t>
+      </w:r>
+      <w:bookmarkStart w:name="_m-6P#02YHTF9OCT4jpk6RUwEozGxm{JD@DX!{" w:id="144"/>
+      <w:bookmarkEnd w:id="144"/>
+      <w:bookmarkStart w:name="_m-6P#12!VBdR@4tp1;N5qEv6g[rKI3D1-qhtm" w:id="145"/>
+      <w:bookmarkEnd w:id="145"/>
+      <w:bookmarkStart w:name="_m-6P#22xKy/tx" w:id="146"/>
+      <w:bookmarkEnd w:id="146"/>
+    </w:p>
+    <w:p>
+      <w:pPr>
+        <w:shd w:val="clear" w:color="auto" w:fill="FFFFFF"/>
+        <w:spacing w:before="100" w:beforeAutospacing="1" w:after="100" w:afterAutospacing="1" w:line="270" w:lineRule="atLeast"/>
+        <w:rPr>
+          <w:rFonts w:ascii="Arial" w:eastAsia="Times New Roman" w:hAnsi="Arial" w:cs="Arial"/>
+          <w:color w:val="333333"/>
+          <w:kern w:val="0"/>
+          <w:sz w:val="20"/>
+          <w:szCs w:val="20"/>
+          <w14:ligatures w14:val="none"/>
+        </w:rPr>
+      </w:pPr>
+      <w:r>
+        <w:rPr>
+          <w:rFonts w:ascii="Arial" w:eastAsia="Times New Roman" w:hAnsi="Arial" w:cs="Arial"/>
+          <w:color w:val="333333"/>
+          <w:kern w:val="0"/>
+          <w:sz w:val="20"/>
+          <w:szCs w:val="20"/>
+          <w14:ligatures w14:val="none"/>
+        </w:rPr>
+        <w:t xml:space="preserve">As for entertainment, you’re in luck! </w:t>
+      </w:r>
+      <w:r>
+        <w:rPr>
+          <w:rFonts w:ascii="Arial" w:eastAsia="Times New Roman" w:hAnsi="Arial" w:cs="Arial"/>
+          <w:color w:val="333333"/>
+          <w:kern w:val="0"/>
+          <w:sz w:val="20"/>
+          <w:szCs w:val="20"/>
+          <w14:ligatures w14:val="none"/>
+        </w:rPr>
+        <w:t xml:space="preserve">Spread out your blanket, grab a cold drink, and enjoy a variety of live music daily, </w:t>
+      </w:r>
+      <w:r>
+        <w:rPr>
+          <w:rFonts w:ascii="Arial" w:eastAsia="Times New Roman" w:hAnsi="Arial" w:cs="Arial"/>
+          <w:color w:val="333333"/>
+          <w:kern w:val="0"/>
+          <w:sz w:val="20"/>
+          <w:szCs w:val="20"/>
+          <w14:ligatures w14:val="none"/>
+        </w:rPr>
+        <w:t>from</w:t>
+      </w:r>
+      <w:r>
+        <w:rPr>
+          <w:rFonts w:ascii="Arial" w:eastAsia="Times New Roman" w:hAnsi="Arial" w:cs="Arial"/>
+          <w:color w:val="333333"/>
+          <w:kern w:val="0"/>
+          <w:sz w:val="20"/>
+          <w:szCs w:val="20"/>
+          <w14:ligatures w14:val="none"/>
+        </w:rPr>
+        <w:t xml:space="preserve"> country to rock and roll. With activities for the kids, shopping and entertainment for adults, and plenty of photo ops, this is a festival you won’t want to miss!</w:t>
+      </w:r>
+      <w:bookmarkStart w:name="_m-6K#02YIYF8JCU9jof6SZwDjzH}mzEDAIX~v" w:id="141"/>
+      <w:bookmarkEnd w:id="141"/>
+      <w:bookmarkStart w:name="_m-6K#12!WGdQ;4uu1:I5rJv5b[sPI2?1.vhsh" w:id="142"/>
+      <w:bookmarkEnd w:id="142"/>
+      <w:bookmarkStart w:name="_m-6K#22xL~/ss" w:id="143"/>
+      <w:bookmarkEnd w:id="143"/>
+    </w:p>
+    <w:p>
+      <w:pPr>
+        <w:shd w:val="clear" w:color="auto" w:fill="FFFFFF"/>
+        <w:spacing w:before="100" w:beforeAutospacing="1" w:after="100" w:afterAutospacing="1" w:line="270" w:lineRule="atLeast"/>
+        <w:rPr>
+          <w:rFonts w:ascii="Arial" w:eastAsia="Times New Roman" w:hAnsi="Arial" w:cs="Arial"/>
+          <w:color w:val="333333"/>
+          <w:kern w:val="0"/>
+          <w:sz w:val="20"/>
+          <w:szCs w:val="20"/>
+          <w14:ligatures w14:val="none"/>
+        </w:rPr>
+      </w:pPr>
+      <w:r>
+        <w:rPr>
+          <w:rFonts w:ascii="Arial" w:eastAsia="Times New Roman" w:hAnsi="Arial" w:cs="Arial"/>
+          <w:color w:val="333333"/>
+          <w:kern w:val="0"/>
+          <w:sz w:val="20"/>
+          <w:szCs w:val="20"/>
+          <w14:ligatures w14:val="none"/>
+        </w:rPr>
+        <w:t xml:space="preserve">This year’s music acts include EZ Star, Black Dog, Rachel Mac, and the LLC Five Star Jazz Orchestra. </w:t>
+      </w:r>
+      <w:r>
+        <w:rPr>
+          <w:rFonts w:ascii="Arial" w:eastAsia="Times New Roman" w:hAnsi="Arial" w:cs="Arial"/>
+          <w:color w:val="333333"/>
+          <w:kern w:val="0"/>
+          <w:sz w:val="20"/>
+          <w:szCs w:val="20"/>
+          <w14:ligatures w14:val="none"/>
+        </w:rPr>
+        <w:t xml:space="preserve">Plenty of others will be on hand, as well. Stroll the park, visiting each live music stage, to enjoy just about any type of musical act on your playlist. Be sure to bring </w:t>
+      </w:r>
+      <w:r>
+        <w:rPr>
+          <w:rFonts w:ascii="Arial" w:eastAsia="Times New Roman" w:hAnsi="Arial" w:cs="Arial"/>
+          <w:color w:val="333333"/>
+          <w:kern w:val="0"/>
+          <w:sz w:val="20"/>
+          <w:szCs w:val="20"/>
+          <w14:ligatures w14:val="none"/>
+        </w:rPr>
+        <w:t xml:space="preserve">your pet, </w:t>
+      </w:r>
+      <w:r>
+        <w:rPr>
+          <w:rFonts w:ascii="Arial" w:eastAsia="Times New Roman" w:hAnsi="Arial" w:cs="Arial"/>
+          <w:color w:val="333333"/>
+          <w:kern w:val="0"/>
+          <w:sz w:val="20"/>
+          <w:szCs w:val="20"/>
+          <w14:ligatures w14:val="none"/>
+        </w:rPr>
+        <w:t>a lawn chair</w:t>
+      </w:r>
+      <w:r>
+        <w:rPr>
+          <w:rFonts w:ascii="Arial" w:eastAsia="Times New Roman" w:hAnsi="Arial" w:cs="Arial"/>
+          <w:color w:val="333333"/>
+          <w:kern w:val="0"/>
+          <w:sz w:val="20"/>
+          <w:szCs w:val="20"/>
+          <w14:ligatures w14:val="none"/>
+        </w:rPr>
+        <w:t>,</w:t>
+      </w:r>
+      <w:r>
+        <w:rPr>
+          <w:rFonts w:ascii="Arial" w:eastAsia="Times New Roman" w:hAnsi="Arial" w:cs="Arial"/>
+          <w:color w:val="333333"/>
+          <w:kern w:val="0"/>
+          <w:sz w:val="20"/>
+          <w:szCs w:val="20"/>
+          <w14:ligatures w14:val="none"/>
+        </w:rPr>
+        <w:t xml:space="preserve"> and </w:t>
+      </w:r>
+      <w:r>
+        <w:rPr>
+          <w:rFonts w:ascii="Arial" w:eastAsia="Times New Roman" w:hAnsi="Arial" w:cs="Arial"/>
+          <w:color w:val="333333"/>
+          <w:kern w:val="0"/>
+          <w:sz w:val="20"/>
+          <w:szCs w:val="20"/>
+          <w14:ligatures w14:val="none"/>
+        </w:rPr>
+        <w:t xml:space="preserve">a </w:t>
+      </w:r>
+      <w:r>
+        <w:rPr>
+          <w:rFonts w:ascii="Arial" w:eastAsia="Times New Roman" w:hAnsi="Arial" w:cs="Arial"/>
+          <w:color w:val="333333"/>
+          <w:kern w:val="0"/>
+          <w:sz w:val="20"/>
+          <w:szCs w:val="20"/>
+          <w14:ligatures w14:val="none"/>
+        </w:rPr>
+        <w:t xml:space="preserve">cooler </w:t>
+      </w:r>
+      <w:r>
+        <w:rPr>
+          <w:rFonts w:ascii="Arial" w:eastAsia="Times New Roman" w:hAnsi="Arial" w:cs="Arial"/>
+          <w:color w:val="333333"/>
+          <w:kern w:val="0"/>
+          <w:sz w:val="20"/>
+          <w:szCs w:val="20"/>
+          <w14:ligatures w14:val="none"/>
+        </w:rPr>
+        <w:t xml:space="preserve">full of your favorite drinks </w:t>
+      </w:r>
+      <w:r>
+        <w:rPr>
+          <w:rFonts w:ascii="Arial" w:eastAsia="Times New Roman" w:hAnsi="Arial" w:cs="Arial"/>
+          <w:color w:val="333333"/>
+          <w:kern w:val="0"/>
+          <w:sz w:val="20"/>
+          <w:szCs w:val="20"/>
+          <w14:ligatures w14:val="none"/>
+        </w:rPr>
+        <w:t>(</w:t>
+      </w:r>
+      <w:r>
+        <w:rPr>
+          <w:rFonts w:ascii="Arial" w:eastAsia="Times New Roman" w:hAnsi="Arial" w:cs="Arial"/>
+          <w:color w:val="333333"/>
+          <w:kern w:val="0"/>
+          <w:sz w:val="20"/>
+          <w:szCs w:val="20"/>
+          <w14:ligatures w14:val="none"/>
+        </w:rPr>
+        <w:t>for safety reasons, please do not bring</w:t>
+      </w:r>
+      <w:r>
+        <w:rPr>
+          <w:rFonts w:ascii="Arial" w:eastAsia="Times New Roman" w:hAnsi="Arial" w:cs="Arial"/>
+          <w:color w:val="333333"/>
+          <w:kern w:val="0"/>
+          <w:sz w:val="20"/>
+          <w:szCs w:val="20"/>
+          <w14:ligatures w14:val="none"/>
+        </w:rPr>
+        <w:t xml:space="preserve"> glass bottles in</w:t>
+      </w:r>
+      <w:r>
+        <w:rPr>
+          <w:rFonts w:ascii="Arial" w:eastAsia="Times New Roman" w:hAnsi="Arial" w:cs="Arial"/>
+          <w:color w:val="333333"/>
+          <w:kern w:val="0"/>
+          <w:sz w:val="20"/>
+          <w:szCs w:val="20"/>
+          <w14:ligatures w14:val="none"/>
+        </w:rPr>
+        <w:t>to</w:t>
+      </w:r>
+      <w:r>
+        <w:rPr>
+          <w:rFonts w:ascii="Arial" w:eastAsia="Times New Roman" w:hAnsi="Arial" w:cs="Arial"/>
+          <w:color w:val="333333"/>
+          <w:kern w:val="0"/>
+          <w:sz w:val="20"/>
+          <w:szCs w:val="20"/>
+          <w14:ligatures w14:val="none"/>
+        </w:rPr>
+        <w:t xml:space="preserve"> the park).</w:t>
+      </w:r>
+      <w:bookmarkStart w:name="_m-6F#02YITF8OCU4jok6SUwDozHxmzJDADX~{" w:id="138"/>
+      <w:bookmarkEnd w:id="138"/>
+      <w:bookmarkStart w:name="_m-6F#12!WBdQ@4up1:N5rEv5g[sKI2D1.qhsm" w:id="139"/>
+      <w:bookmarkEnd w:id="139"/>
+      <w:bookmarkStart w:name="_m-6F#22xLy/sx" w:id="140"/>
+      <w:bookmarkEnd w:id="140"/>
+    </w:p>
+    <w:p>
+      <w:pPr>
+        <w:shd w:val="clear" w:color="auto" w:fill="FFFFFF"/>
+        <w:spacing w:before="100" w:beforeAutospacing="1" w:after="100" w:afterAutospacing="1" w:line="270" w:lineRule="atLeast"/>
+        <w:rPr>
+          <w:rFonts w:ascii="Arial" w:eastAsia="Times New Roman" w:hAnsi="Arial" w:cs="Arial"/>
+          <w:color w:val="333333"/>
+          <w:kern w:val="0"/>
+          <w:sz w:val="20"/>
+          <w:szCs w:val="20"/>
+          <w14:ligatures w14:val="none"/>
+        </w:rPr>
+      </w:pPr>
+      <w:r>
+        <w:rPr>
+          <w:rFonts w:ascii="Arial" w:eastAsia="Times New Roman" w:hAnsi="Arial" w:cs="Arial"/>
+          <w:color w:val="333333"/>
+          <w:kern w:val="0"/>
+          <w:sz w:val="20"/>
+          <w:szCs w:val="20"/>
+          <w14:ligatures w14:val="none"/>
+        </w:rPr>
+        <w:t xml:space="preserve">As for the kids, hold on to your hat! Your children can pet a baby </w:t>
+      </w:r>
+      <w:r>
+        <w:rPr>
+          <w:rFonts w:ascii="Arial" w:eastAsia="Times New Roman" w:hAnsi="Arial" w:cs="Arial"/>
+          <w:color w:val="333333"/>
+          <w:kern w:val="0"/>
+          <w:sz w:val="20"/>
+          <w:szCs w:val="20"/>
+          <w14:ligatures w14:val="none"/>
+        </w:rPr>
+        <w:t>sheep</w:t>
+      </w:r>
+      <w:r>
+        <w:rPr>
+          <w:rFonts w:ascii="Arial" w:eastAsia="Times New Roman" w:hAnsi="Arial" w:cs="Arial"/>
+          <w:color w:val="333333"/>
+          <w:kern w:val="0"/>
+          <w:sz w:val="20"/>
+          <w:szCs w:val="20"/>
+          <w14:ligatures w14:val="none"/>
+        </w:rPr>
+        <w:t xml:space="preserve">, dance like a butterfly to fun tunes, get their faces painted with balloon art, and try a little limbo. At the children’s village, they can enjoy </w:t>
+      </w:r>
+      <w:r>
+        <w:rPr>
+          <w:rFonts w:ascii="Arial" w:eastAsia="Times New Roman" w:hAnsi="Arial" w:cs="Arial"/>
+          <w:color w:val="333333"/>
+          <w:kern w:val="0"/>
+          <w:sz w:val="20"/>
+          <w:szCs w:val="20"/>
+          <w14:ligatures w14:val="none"/>
+        </w:rPr>
+        <w:t>John</w:t>
+      </w:r>
+      <w:r>
+        <w:rPr>
+          <w:rFonts w:ascii="Arial" w:eastAsia="Times New Roman" w:hAnsi="Arial" w:cs="Arial"/>
+          <w:color w:val="333333"/>
+          <w:kern w:val="0"/>
+          <w:sz w:val="20"/>
+          <w:szCs w:val="20"/>
+          <w14:ligatures w14:val="none"/>
+        </w:rPr>
+        <w:t>ny</w:t>
+      </w:r>
+      <w:r>
+        <w:rPr>
+          <w:rFonts w:ascii="Arial" w:eastAsia="Times New Roman" w:hAnsi="Arial" w:cs="Arial"/>
+          <w:color w:val="333333"/>
+          <w:kern w:val="0"/>
+          <w:sz w:val="20"/>
+          <w:szCs w:val="20"/>
+          <w14:ligatures w14:val="none"/>
+        </w:rPr>
+        <w:t xml:space="preserve"> Drake </w:t>
+      </w:r>
+      <w:r>
+        <w:rPr>
+          <w:rFonts w:ascii="Arial" w:eastAsia="Times New Roman" w:hAnsi="Arial" w:cs="Arial"/>
+          <w:color w:val="333333"/>
+          <w:kern w:val="0"/>
+          <w:sz w:val="20"/>
+          <w:szCs w:val="20"/>
+          <w14:ligatures w14:val="none"/>
+        </w:rPr>
+        <w:t>as he</w:t>
+      </w:r>
+      <w:r>
+        <w:rPr>
+          <w:rFonts w:ascii="Arial" w:eastAsia="Times New Roman" w:hAnsi="Arial" w:cs="Arial"/>
+          <w:color w:val="333333"/>
+          <w:kern w:val="0"/>
+          <w:sz w:val="20"/>
+          <w:szCs w:val="20"/>
+          <w14:ligatures w14:val="none"/>
+        </w:rPr>
+        <w:t xml:space="preserve"> perform</w:t>
+      </w:r>
+      <w:r>
+        <w:rPr>
+          <w:rFonts w:ascii="Arial" w:eastAsia="Times New Roman" w:hAnsi="Arial" w:cs="Arial"/>
+          <w:color w:val="333333"/>
+          <w:kern w:val="0"/>
+          <w:sz w:val="20"/>
+          <w:szCs w:val="20"/>
+          <w14:ligatures w14:val="none"/>
+        </w:rPr>
+        <w:t>s</w:t>
+      </w:r>
+      <w:r>
+        <w:rPr>
+          <w:rFonts w:ascii="Arial" w:eastAsia="Times New Roman" w:hAnsi="Arial" w:cs="Arial"/>
+          <w:color w:val="333333"/>
+          <w:kern w:val="0"/>
+          <w:sz w:val="20"/>
+          <w:szCs w:val="20"/>
+          <w14:ligatures w14:val="none"/>
+        </w:rPr>
+        <w:t xml:space="preserve"> his magic show</w:t>
+      </w:r>
+      <w:r>
+        <w:rPr>
+          <w:rFonts w:ascii="Arial" w:eastAsia="Times New Roman" w:hAnsi="Arial" w:cs="Arial"/>
+          <w:color w:val="333333"/>
+          <w:kern w:val="0"/>
+          <w:sz w:val="20"/>
+          <w:szCs w:val="20"/>
+          <w14:ligatures w14:val="none"/>
+        </w:rPr>
+        <w:t xml:space="preserve">. In the next booth, they can catch storytelling and puppet shows sponsored by the </w:t>
+      </w:r>
+      <w:r>
+        <w:rPr>
+          <w:rFonts w:ascii="Arial" w:eastAsia="Times New Roman" w:hAnsi="Arial" w:cs="Arial"/>
+          <w:color w:val="333333"/>
+          <w:kern w:val="0"/>
+          <w:sz w:val="20"/>
+          <w:szCs w:val="20"/>
+          <w14:ligatures w14:val="none"/>
+        </w:rPr>
+        <w:t>Lancaster County</w:t>
+      </w:r>
+      <w:r>
+        <w:rPr>
+          <w:rFonts w:ascii="Arial" w:eastAsia="Times New Roman" w:hAnsi="Arial" w:cs="Arial"/>
+          <w:color w:val="333333"/>
+          <w:kern w:val="0"/>
+          <w:sz w:val="20"/>
+          <w:szCs w:val="20"/>
+          <w14:ligatures w14:val="none"/>
+        </w:rPr>
+        <w:t xml:space="preserve"> </w:t>
+      </w:r>
+      <w:r>
+        <w:rPr>
+          <w:rFonts w:ascii="Arial" w:eastAsia="Times New Roman" w:hAnsi="Arial" w:cs="Arial"/>
+          <w:color w:val="333333"/>
+          <w:kern w:val="0"/>
+          <w:sz w:val="20"/>
+          <w:szCs w:val="20"/>
+          <w14:ligatures w14:val="none"/>
+        </w:rPr>
+        <w:t>School System</w:t>
+      </w:r>
+      <w:r>
+        <w:rPr>
+          <w:rFonts w:ascii="Arial" w:eastAsia="Times New Roman" w:hAnsi="Arial" w:cs="Arial"/>
+          <w:color w:val="333333"/>
+          <w:kern w:val="0"/>
+          <w:sz w:val="20"/>
+          <w:szCs w:val="20"/>
+          <w14:ligatures w14:val="none"/>
+        </w:rPr>
+        <w:t>.</w:t>
+      </w:r>
+      <w:bookmarkStart w:name="_m-6A#02YJYF7JCV9jnf6TZwCjzI}myEDBIX}v" w:id="135"/>
+      <w:bookmarkEnd w:id="135"/>
+      <w:bookmarkStart w:name="_m-6A#12!XGdP;4vu19I5sJv4b[tPI1?1/vhrh" w:id="136"/>
+      <w:bookmarkEnd w:id="136"/>
+      <w:bookmarkStart w:name="_m-6A#22xM~/rs" w:id="137"/>
+      <w:bookmarkEnd w:id="137"/>
+    </w:p>
+    <w:p>
+      <w:pPr>
+        <w:shd w:val="clear" w:color="auto" w:fill="FFFFFF"/>
+        <w:spacing w:before="100" w:beforeAutospacing="1" w:after="100" w:afterAutospacing="1" w:line="270" w:lineRule="atLeast"/>
+        <w:rPr>
+          <w:rFonts w:ascii="Arial" w:eastAsia="Times New Roman" w:hAnsi="Arial" w:cs="Arial"/>
+          <w:color w:val="333333"/>
+          <w:kern w:val="0"/>
+          <w:sz w:val="20"/>
+          <w:szCs w:val="20"/>
+          <w14:ligatures w14:val="none"/>
+        </w:rPr>
+      </w:pPr>
+      <w:r>
+        <w:rPr>
+          <w:rFonts w:ascii="Arial" w:eastAsia="Times New Roman" w:hAnsi="Arial" w:cs="Arial"/>
+          <w:color w:val="333333"/>
+          <w:kern w:val="0"/>
+          <w:sz w:val="20"/>
+          <w:szCs w:val="20"/>
+          <w14:ligatures w14:val="none"/>
+        </w:rPr>
+        <w:t>And don’t forget the dogs! In a special enclosure, well-behaved dogs</w:t>
+      </w:r>
+      <w:r>
+        <w:rPr>
+          <w:rFonts w:ascii="Arial" w:eastAsia="Times New Roman" w:hAnsi="Arial" w:cs="Arial"/>
+          <w:color w:val="333333"/>
+          <w:kern w:val="0"/>
+          <w:sz w:val="20"/>
+          <w:szCs w:val="20"/>
+          <w14:ligatures w14:val="none"/>
+        </w:rPr>
+        <w:t xml:space="preserve"> can participate in the Stay Connected K-9 Frisbee Toss. Dogs can splash in pools, chase toys, and dig for buried treasure. Adult supervision required, of course!</w:t>
+      </w:r>
+      <w:bookmarkStart w:name="_m-67#02YJVF7MCV6jni6TWwCmzIzmyHDBFX}y" w:id="132"/>
+      <w:bookmarkEnd w:id="132"/>
+      <w:bookmarkStart w:name="_m-67#12!XDdP&gt;4vr19L5sGv4e[tMI1B1/shrk" w:id="133"/>
+      <w:bookmarkEnd w:id="133"/>
+      <w:bookmarkStart w:name="_m-67#22xM{/rv" w:id="134"/>
+      <w:bookmarkEnd w:id="134"/>
+    </w:p>
+    <w:p>
+      <w:pPr>
+        <w:shd w:val="clear" w:color="auto" w:fill="FFFFFF"/>
+        <w:spacing w:before="100" w:beforeAutospacing="1" w:after="100" w:afterAutospacing="1" w:line="270" w:lineRule="atLeast"/>
+        <w:rPr>
+          <w:rFonts w:ascii="Arial" w:eastAsia="Times New Roman" w:hAnsi="Arial" w:cs="Arial"/>
+          <w:color w:val="333333"/>
+          <w:kern w:val="0"/>
+          <w:sz w:val="20"/>
+          <w:szCs w:val="20"/>
+          <w14:ligatures w14:val="none"/>
+        </w:rPr>
+      </w:pPr>
+      <w:r>
+        <w:rPr>
+          <w:rFonts w:ascii="Arial" w:eastAsia="Times New Roman" w:hAnsi="Arial" w:cs="Arial"/>
+          <w:color w:val="333333"/>
+          <w:kern w:val="0"/>
+          <w:sz w:val="20"/>
+          <w:szCs w:val="20"/>
+          <w14:ligatures w14:val="none"/>
+        </w:rPr>
+        <w:t>We guarantee you’ll be hungry! Grab an ice cream cone or snack on popcorn as you stroll through the vendors and hot air balloons. The barbecue cook-off is sure to be a stellar attraction, as well. With food vendors</w:t>
+      </w:r>
+      <w:r>
+        <w:rPr>
+          <w:rFonts w:ascii="Arial" w:eastAsia="Times New Roman" w:hAnsi="Arial" w:cs="Arial"/>
+          <w:color w:val="333333"/>
+          <w:kern w:val="0"/>
+          <w:sz w:val="20"/>
+          <w:szCs w:val="20"/>
+          <w14:ligatures w14:val="none"/>
+        </w:rPr>
+        <w:t>—many participated in the farm to table concept—</w:t>
+      </w:r>
+      <w:r>
+        <w:rPr>
+          <w:rFonts w:ascii="Arial" w:eastAsia="Times New Roman" w:hAnsi="Arial" w:cs="Arial"/>
+          <w:color w:val="333333"/>
+          <w:kern w:val="0"/>
+          <w:sz w:val="20"/>
+          <w:szCs w:val="20"/>
+          <w14:ligatures w14:val="none"/>
+        </w:rPr>
+        <w:t>scattered throughout the park, you’re never too far from your next meal.</w:t>
+      </w:r>
+      <w:bookmarkStart w:name="_m-64#02YJSF7PCV3jnl6TTwCpzIwmyKDBCX}|" w:id="129"/>
+      <w:bookmarkEnd w:id="129"/>
+      <w:bookmarkStart w:name="_m-64#12!XAdPA4vo19O5sDv4h[tJI1E1/phrn" w:id="130"/>
+      <w:bookmarkEnd w:id="130"/>
+      <w:bookmarkStart w:name="_m-64#22xMx/ry" w:id="131"/>
+      <w:bookmarkEnd w:id="131"/>
+    </w:p>
+    <w:p>
+      <w:pPr>
+        <w:shd w:val="clear" w:color="auto" w:fill="FFFFFF"/>
+        <w:spacing w:before="100" w:beforeAutospacing="1" w:after="100" w:afterAutospacing="1" w:line="270" w:lineRule="atLeast"/>
+        <w:rPr>
+          <w:rFonts w:ascii="Arial" w:eastAsia="Times New Roman" w:hAnsi="Arial" w:cs="Arial"/>
+          <w:color w:val="333333"/>
+          <w:kern w:val="0"/>
+          <w:sz w:val="20"/>
+          <w:szCs w:val="20"/>
+          <w14:ligatures w14:val="none"/>
+        </w:rPr>
+      </w:pPr>
+      <w:r>
+        <w:rPr>
+          <w:rFonts w:ascii="Arial" w:eastAsia="Times New Roman" w:hAnsi="Arial" w:cs="Arial"/>
+          <w:color w:val="333333"/>
+          <w:kern w:val="0"/>
+          <w:sz w:val="20"/>
+          <w:szCs w:val="20"/>
+          <w14:ligatures w14:val="none"/>
+        </w:rPr>
+        <w:t>All balloon flights and displays are weather permitting. Winds must be less than 5 mph to safely inflate balloons on the festival grounds.</w:t>
+      </w:r>
+      <w:bookmarkStart w:name="_m-60#02YKYF6JCW9jmf6UZwBjzJ}mxEDCIX|v" w:id="126"/>
+      <w:bookmarkEnd w:id="126"/>
+      <w:bookmarkStart w:name="_m-60#12!YGdO;4wu18I5tJv3b[uPI0?10vhqh" w:id="127"/>
+      <w:bookmarkEnd w:id="127"/>
+      <w:bookmarkStart w:name="_m-60#22xN~/qs" w:id="128"/>
+      <w:bookmarkEnd w:id="128"/>
+    </w:p>
+    <w:p>
+      <w:pPr>
+        <w:shd w:val="clear" w:color="auto" w:fill="FFFFFF"/>
+        <w:spacing w:before="100" w:beforeAutospacing="1" w:after="100" w:afterAutospacing="1" w:line="270" w:lineRule="atLeast"/>
+        <w:outlineLvl w:val="1"/>
+        <w:rPr>
+          <w:rFonts w:ascii="Arial" w:eastAsia="Times New Roman" w:hAnsi="Arial" w:cs="Arial"/>
+          <w:b/>
+          <w:bCs/>
+          <w:color w:val="333333"/>
+          <w:kern w:val="0"/>
+          <w:sz w:val="36"/>
+          <w:szCs w:val="36"/>
+          <w14:ligatures w14:val="none"/>
+        </w:rPr>
+        <w:sectPr>
+          <w:type w:val="continuous"/>
+          <w:pgSz w:w="12240" w:h="15840"/>
+          <w:pgMar w:top="1440" w:right="1440" w:bottom="1440" w:left="1440" w:header="720" w:footer="720" w:gutter="0"/>
+          <w:cols w:num="2" w:sep="1" w:space="720"/>
+          <w:docGrid w:linePitch="360"/>
+        </w:sectPr>
+      </w:pPr>
+      <w:bookmarkStart w:name="_m-5X#02YKVF6MCW6jmi6UWwBmzJzmxHDCFX|y" w:id="123"/>
+      <w:bookmarkEnd w:id="123"/>
+      <w:bookmarkStart w:name="_m-5X#12!YDdO&gt;4wr18L5tGv3e[uMI0B10shqk" w:id="124"/>
+      <w:bookmarkEnd w:id="124"/>
+      <w:bookmarkStart w:name="_m-5X#22xN{/qv" w:id="125"/>
+      <w:bookmarkEnd w:id="125"/>
+    </w:p>
+    <w:p>
+      <w:pPr>
+        <w:shd w:val="clear" w:color="auto" w:fill="FFFFFF"/>
+        <w:spacing w:before="100" w:beforeAutospacing="1" w:after="100" w:afterAutospacing="1" w:line="270" w:lineRule="atLeast"/>
+        <w:outlineLvl w:val="1"/>
+        <w:rPr>
+          <w:rFonts w:ascii="Arial" w:eastAsia="Times New Roman" w:hAnsi="Arial" w:cs="Arial"/>
+          <w:b/>
+          <w:bCs/>
+          <w:color w:val="333333"/>
+          <w:kern w:val="0"/>
+          <w:sz w:val="36"/>
+          <w:szCs w:val="36"/>
+          <w14:ligatures w14:val="none"/>
+        </w:rPr>
+      </w:pPr>
+      <w:r>
+        <w:rPr>
+          <w:rFonts w:ascii="Arial" w:eastAsia="Times New Roman" w:hAnsi="Arial" w:cs="Arial"/>
+          <w:b/>
+          <w:bCs/>
+          <w:color w:val="333333"/>
+          <w:kern w:val="0"/>
+          <w:sz w:val="36"/>
+          <w:szCs w:val="36"/>
+          <w14:ligatures w14:val="none"/>
+        </w:rPr>
+        <w:t>Frequently Asked Questions</w:t>
+      </w:r>
+      <w:bookmarkStart w:name="_m-5V#02YKTF6OCW4jmk6UUwBozJxmxJDCDX|{" w:id="120"/>
+      <w:bookmarkEnd w:id="120"/>
+      <w:bookmarkStart w:name="_m-5V#12!YBdO@4wp18N5tEv3g[uKI0D10qhqm" w:id="121"/>
+      <w:bookmarkEnd w:id="121"/>
+      <w:bookmarkStart w:name="_m-5V#22xNy/qx" w:id="122"/>
+      <w:bookmarkEnd w:id="122"/>
+    </w:p>
+    <w:p>
+      <w:pPr>
+        <w:shd w:val="clear" w:color="auto" w:fill="FFFFFF"/>
+        <w:spacing w:before="100" w:beforeAutospacing="1" w:after="100" w:afterAutospacing="1" w:line="270" w:lineRule="atLeast"/>
+        <w:outlineLvl w:val="3"/>
+        <w:rPr>
+          <w:rFonts w:ascii="Arial" w:eastAsia="Times New Roman" w:hAnsi="Arial" w:cs="Arial"/>
+          <w:bCs/>
+          <w:color w:val="333333"/>
+          <w:kern w:val="0"/>
+          <w:sz w:val="24"/>
+          <w:szCs w:val="24"/>
+          <w14:ligatures w14:val="none"/>
+        </w:rPr>
+      </w:pPr>
+      <w:r>
+        <w:rPr>
+          <w:rFonts w:ascii="Arial" w:eastAsia="Times New Roman" w:hAnsi="Arial" w:cs="Arial"/>
+          <w:bCs/>
+          <w:color w:val="333333"/>
+          <w:kern w:val="0"/>
+          <w:sz w:val="24"/>
+          <w:szCs w:val="24"/>
+          <w14:ligatures w14:val="none"/>
+        </w:rPr>
+        <w:t>When is the best time to see balloons?</w:t>
+      </w:r>
+      <w:bookmarkStart w:name="_m-5U#02YKSF6PCW3jml6UTwBpzJwmxKDCCX||" w:id="117"/>
+      <w:bookmarkEnd w:id="117"/>
+      <w:bookmarkStart w:name="_m-5U#12!YAdOA4wo18O5tDv3h[uJI0E10phqn" w:id="118"/>
+      <w:bookmarkEnd w:id="118"/>
+      <w:bookmarkStart w:name="_m-5U#22xNx/qy" w:id="119"/>
+      <w:bookmarkEnd w:id="119"/>
+    </w:p>
+    <w:p>
+      <w:pPr>
+        <w:shd w:val="clear" w:color="auto" w:fill="FFFFFF"/>
+        <w:spacing w:before="100" w:beforeAutospacing="1" w:after="100" w:afterAutospacing="1" w:line="270" w:lineRule="atLeast"/>
+        <w:rPr>
+          <w:rFonts w:ascii="Arial" w:eastAsia="Times New Roman" w:hAnsi="Arial" w:cs="Arial"/>
+          <w:color w:val="333333"/>
+          <w:kern w:val="0"/>
+          <w:sz w:val="20"/>
+          <w:szCs w:val="20"/>
+          <w14:ligatures w14:val="none"/>
+        </w:rPr>
+      </w:pPr>
+      <w:r>
+        <w:rPr>
+          <w:rFonts w:ascii="Arial" w:eastAsia="Times New Roman" w:hAnsi="Arial" w:cs="Arial"/>
+          <w:color w:val="333333"/>
+          <w:kern w:val="0"/>
+          <w:sz w:val="20"/>
+          <w:szCs w:val="20"/>
+          <w14:ligatures w14:val="none"/>
+        </w:rPr>
+        <w:lastRenderedPageBreak/>
+        <w:t>The best time to view balloons and get great pictures is early morning. Flights begin at approximately 6:00 a.m. each morning. It’s definitely worth getting up early to see balloons grace the early morning sky. Balloons also fly at dusk (approximately 7:00 p.m. on Friday and Saturday night</w:t>
+      </w:r>
+      <w:r>
+        <w:rPr>
+          <w:rFonts w:ascii="Arial" w:eastAsia="Times New Roman" w:hAnsi="Arial" w:cs="Arial"/>
+          <w:color w:val="333333"/>
+          <w:kern w:val="0"/>
+          <w:sz w:val="20"/>
+          <w:szCs w:val="20"/>
+          <w14:ligatures w14:val="none"/>
+        </w:rPr>
+        <w:t>)</w:t>
+      </w:r>
+      <w:r>
+        <w:rPr>
+          <w:rFonts w:ascii="Arial" w:eastAsia="Times New Roman" w:hAnsi="Arial" w:cs="Arial"/>
+          <w:color w:val="333333"/>
+          <w:kern w:val="0"/>
+          <w:sz w:val="20"/>
+          <w:szCs w:val="20"/>
+          <w14:ligatures w14:val="none"/>
+        </w:rPr>
+        <w:t>.</w:t>
+      </w:r>
+      <w:bookmarkStart w:name="_m-5Q#02YLYF5JCX9jlf6VZwAjzK}mwEDDIX{v" w:id="114"/>
+      <w:bookmarkEnd w:id="114"/>
+      <w:bookmarkStart w:name="_m-5Q#12!ZGdN;4xu17I5uJv2b[vPI/?11vhph" w:id="115"/>
+      <w:bookmarkEnd w:id="115"/>
+      <w:bookmarkStart w:name="_m-5Q#22xO~/ps" w:id="116"/>
+      <w:bookmarkEnd w:id="116"/>
+    </w:p>
+    <w:p>
+      <w:pPr>
+        <w:shd w:val="clear" w:color="auto" w:fill="FFFFFF"/>
+        <w:spacing w:beforeAutospacing="1" w:after="0" w:afterAutospacing="1" w:line="270" w:lineRule="atLeast"/>
+        <w:rPr>
+          <w:rFonts w:ascii="Arial" w:eastAsia="Times New Roman" w:hAnsi="Arial" w:cs="Arial"/>
+          <w:color w:val="333333"/>
+          <w:kern w:val="0"/>
+          <w:sz w:val="20"/>
+          <w:szCs w:val="20"/>
+          <w14:ligatures w14:val="none"/>
+        </w:rPr>
+      </w:pPr>
+      <w:r>
+        <w:rPr>
+          <w:rFonts w:ascii="Arial" w:eastAsia="Times New Roman" w:hAnsi="Arial" w:cs="Arial"/>
+          <w:color w:val="333333"/>
+          <w:kern w:val="0"/>
+          <w:sz w:val="20"/>
+          <w:szCs w:val="20"/>
+          <w14:ligatures w14:val="none"/>
+        </w:rPr>
+        <w:t>Please be aware that b</w:t>
+      </w:r>
+      <w:r>
+        <w:rPr>
+          <w:rFonts w:ascii="Arial" w:eastAsia="Times New Roman" w:hAnsi="Arial" w:cs="Arial"/>
+          <w:color w:val="333333"/>
+          <w:kern w:val="0"/>
+          <w:sz w:val="20"/>
+          <w:szCs w:val="20"/>
+          <w14:ligatures w14:val="none"/>
+        </w:rPr>
+        <w:t>allooning is extremely weather dependent. Winds must be less than 1</w:t>
+      </w:r>
+      <w:r>
+        <w:rPr>
+          <w:rFonts w:ascii="Arial" w:eastAsia="Times New Roman" w:hAnsi="Arial" w:cs="Arial"/>
+          <w:color w:val="333333"/>
+          <w:kern w:val="0"/>
+          <w:sz w:val="20"/>
+          <w:szCs w:val="20"/>
+          <w14:ligatures w14:val="none"/>
+        </w:rPr>
+        <w:t>5 mph</w:t>
+      </w:r>
+      <w:r>
+        <w:rPr>
+          <w:rFonts w:ascii="Arial" w:eastAsia="Times New Roman" w:hAnsi="Arial" w:cs="Arial"/>
+          <w:color w:val="333333"/>
+          <w:kern w:val="0"/>
+          <w:sz w:val="20"/>
+          <w:szCs w:val="20"/>
+          <w14:ligatures w14:val="none"/>
+        </w:rPr>
+        <w:t xml:space="preserve"> fo</w:t>
+      </w:r>
+      <w:r>
+        <w:rPr>
+          <w:rFonts w:ascii="Arial" w:eastAsia="Times New Roman" w:hAnsi="Arial" w:cs="Arial"/>
+          <w:color w:val="333333"/>
+          <w:kern w:val="0"/>
+          <w:sz w:val="20"/>
+          <w:szCs w:val="20"/>
+          <w14:ligatures w14:val="none"/>
+        </w:rPr>
+        <w:t>r balloons to fly. Listen to W</w:t>
+      </w:r>
+      <w:r>
+        <w:rPr>
+          <w:rFonts w:ascii="Arial" w:eastAsia="Times New Roman" w:hAnsi="Arial" w:cs="Arial"/>
+          <w:color w:val="333333"/>
+          <w:kern w:val="0"/>
+          <w:sz w:val="20"/>
+          <w:szCs w:val="20"/>
+          <w14:ligatures w14:val="none"/>
+        </w:rPr>
+        <w:t xml:space="preserve">LITE </w:t>
+      </w:r>
+      <w:r>
+        <w:rPr>
+          <w:rFonts w:ascii="Arial" w:eastAsia="Times New Roman" w:hAnsi="Arial" w:cs="Arial"/>
+          <w:color w:val="333333"/>
+          <w:kern w:val="0"/>
+          <w:sz w:val="20"/>
+          <w:szCs w:val="20"/>
+          <w14:ligatures w14:val="none"/>
+        </w:rPr>
+        <w:t>1</w:t>
+      </w:r>
+      <w:r>
+        <w:rPr>
+          <w:rFonts w:ascii="Arial" w:eastAsia="Times New Roman" w:hAnsi="Arial" w:cs="Arial"/>
+          <w:color w:val="333333"/>
+          <w:kern w:val="0"/>
+          <w:sz w:val="20"/>
+          <w:szCs w:val="20"/>
+          <w14:ligatures w14:val="none"/>
+        </w:rPr>
+        <w:t>0</w:t>
+      </w:r>
+      <w:r>
+        <w:rPr>
+          <w:rFonts w:ascii="Arial" w:eastAsia="Times New Roman" w:hAnsi="Arial" w:cs="Arial"/>
+          <w:color w:val="333333"/>
+          <w:kern w:val="0"/>
+          <w:sz w:val="20"/>
+          <w:szCs w:val="20"/>
+          <w14:ligatures w14:val="none"/>
+        </w:rPr>
+        <w:t>5</w:t>
+      </w:r>
+      <w:r>
+        <w:rPr>
+          <w:rFonts w:ascii="Arial" w:eastAsia="Times New Roman" w:hAnsi="Arial" w:cs="Arial"/>
+          <w:color w:val="333333"/>
+          <w:kern w:val="0"/>
+          <w:sz w:val="20"/>
+          <w:szCs w:val="20"/>
+          <w14:ligatures w14:val="none"/>
+        </w:rPr>
+        <w:t>0 AM or 9</w:t>
+      </w:r>
+      <w:r>
+        <w:rPr>
+          <w:rFonts w:ascii="Arial" w:eastAsia="Times New Roman" w:hAnsi="Arial" w:cs="Arial"/>
+          <w:color w:val="333333"/>
+          <w:kern w:val="0"/>
+          <w:sz w:val="20"/>
+          <w:szCs w:val="20"/>
+          <w14:ligatures w14:val="none"/>
+        </w:rPr>
+        <w:t>5</w:t>
+      </w:r>
+      <w:r>
+        <w:rPr>
+          <w:rFonts w:ascii="Arial" w:eastAsia="Times New Roman" w:hAnsi="Arial" w:cs="Arial"/>
+          <w:color w:val="333333"/>
+          <w:kern w:val="0"/>
+          <w:sz w:val="20"/>
+          <w:szCs w:val="20"/>
+          <w14:ligatures w14:val="none"/>
+        </w:rPr>
+        <w:t>.</w:t>
+      </w:r>
+      <w:r>
+        <w:rPr>
+          <w:rFonts w:ascii="Arial" w:eastAsia="Times New Roman" w:hAnsi="Arial" w:cs="Arial"/>
+          <w:color w:val="333333"/>
+          <w:kern w:val="0"/>
+          <w:sz w:val="20"/>
+          <w:szCs w:val="20"/>
+          <w14:ligatures w14:val="none"/>
+        </w:rPr>
+        <w:t>7</w:t>
+      </w:r>
+      <w:r>
+        <w:rPr>
+          <w:rFonts w:ascii="Arial" w:eastAsia="Times New Roman" w:hAnsi="Arial" w:cs="Arial"/>
+          <w:color w:val="333333"/>
+          <w:kern w:val="0"/>
+          <w:sz w:val="20"/>
+          <w:szCs w:val="20"/>
+          <w14:ligatures w14:val="none"/>
+        </w:rPr>
+        <w:t xml:space="preserve"> FM for the latest on flight information.</w:t>
+      </w:r>
+      <w:bookmarkStart w:name="_m-5O#02YLWF5LCX7jlh6VXwAlzK{mwGDDGX{x" w:id="111"/>
+      <w:bookmarkEnd w:id="111"/>
+      <w:bookmarkStart w:name="_m-5O#12!ZEdN=4xs17K5uHv2d[vNI/A11thpj" w:id="112"/>
+      <w:bookmarkEnd w:id="112"/>
+      <w:bookmarkStart w:name="_m-5O#22xO|/pu" w:id="113"/>
+      <w:bookmarkEnd w:id="113"/>
+    </w:p>
+    <w:p>
+      <w:pPr>
+        <w:shd w:val="clear" w:color="auto" w:fill="FFFFFF"/>
+        <w:spacing w:before="100" w:beforeAutospacing="1" w:after="100" w:afterAutospacing="1" w:line="270" w:lineRule="atLeast"/>
+        <w:outlineLvl w:val="3"/>
+        <w:rPr>
+          <w:rFonts w:ascii="Arial" w:eastAsia="Times New Roman" w:hAnsi="Arial" w:cs="Arial"/>
+          <w:bCs/>
+          <w:color w:val="333333"/>
+          <w:kern w:val="0"/>
+          <w:sz w:val="24"/>
+          <w:szCs w:val="24"/>
+          <w14:ligatures w14:val="none"/>
+        </w:rPr>
+      </w:pPr>
+      <w:r>
+        <w:rPr>
+          <w:rFonts w:ascii="Arial" w:eastAsia="Times New Roman" w:hAnsi="Arial" w:cs="Arial"/>
+          <w:bCs/>
+          <w:color w:val="333333"/>
+          <w:kern w:val="0"/>
+          <w:sz w:val="24"/>
+          <w:szCs w:val="24"/>
+          <w14:ligatures w14:val="none"/>
+        </w:rPr>
+        <w:t>Wh</w:t>
+      </w:r>
+      <w:r>
+        <w:rPr>
+          <w:rFonts w:ascii="Arial" w:eastAsia="Times New Roman" w:hAnsi="Arial" w:cs="Arial"/>
+          <w:bCs/>
+          <w:color w:val="333333"/>
+          <w:kern w:val="0"/>
+          <w:sz w:val="24"/>
+          <w:szCs w:val="24"/>
+          <w14:ligatures w14:val="none"/>
+        </w:rPr>
+        <w:t>ere are the balloons and pilots during the day?</w:t>
+      </w:r>
+      <w:bookmarkStart w:name="_m-5N#02YLVF5MCX6jli6VWwAmzKzmwHDDFX{y" w:id="108"/>
+      <w:bookmarkEnd w:id="108"/>
+      <w:bookmarkStart w:name="_m-5N#12!ZDdN&gt;4xr17L5uGv2e[vMI/B11shpk" w:id="109"/>
+      <w:bookmarkEnd w:id="109"/>
+      <w:bookmarkStart w:name="_m-5N#22xO{/pv" w:id="110"/>
+      <w:bookmarkEnd w:id="110"/>
+    </w:p>
+    <w:p>
+      <w:pPr>
+        <w:shd w:val="clear" w:color="auto" w:fill="FFFFFF"/>
+        <w:spacing w:before="100" w:beforeAutospacing="1" w:after="100" w:afterAutospacing="1" w:line="270" w:lineRule="atLeast"/>
+        <w:rPr>
+          <w:rFonts w:ascii="Arial" w:eastAsia="Times New Roman" w:hAnsi="Arial" w:cs="Arial"/>
+          <w:color w:val="333333"/>
+          <w:kern w:val="0"/>
+          <w:sz w:val="20"/>
+          <w:szCs w:val="20"/>
+          <w14:ligatures w14:val="none"/>
+        </w:rPr>
+      </w:pPr>
+      <w:r>
+        <w:rPr>
+          <w:rFonts w:ascii="Arial" w:eastAsia="Times New Roman" w:hAnsi="Arial" w:cs="Arial"/>
+          <w:color w:val="333333"/>
+          <w:kern w:val="0"/>
+          <w:sz w:val="20"/>
+          <w:szCs w:val="20"/>
+          <w14:ligatures w14:val="none"/>
+        </w:rPr>
+        <w:t>High canyon winds make it impossible to inflate balloons during the day. Pilots and their families enjoy the same things that you do at the park—live music, quality arts &amp; crafts, and local cuisine.</w:t>
+      </w:r>
+      <w:bookmarkStart w:name="_m-5I#02XC[G&gt;HBO;kud5M\xJhyB!n&quot;CC;KY&amp;t" w:id="105"/>
+      <w:bookmarkEnd w:id="105"/>
+      <w:bookmarkStart w:name="_m-5I#12~QIeW93ow2@G4lLw;`ZmRJ8=0(xiyf" w:id="106"/>
+      <w:bookmarkEnd w:id="106"/>
+      <w:bookmarkStart w:name="_m-5I#22wF&quot;0yq" w:id="107"/>
+      <w:bookmarkEnd w:id="107"/>
+    </w:p>
+    <w:p>
+      <w:pPr>
+        <w:shd w:val="clear" w:color="auto" w:fill="FFFFFF"/>
+        <w:spacing w:before="100" w:beforeAutospacing="1" w:after="100" w:afterAutospacing="1" w:line="270" w:lineRule="atLeast"/>
+        <w:outlineLvl w:val="3"/>
+        <w:rPr>
+          <w:rFonts w:ascii="Arial" w:eastAsia="Times New Roman" w:hAnsi="Arial" w:cs="Arial"/>
+          <w:bCs/>
+          <w:color w:val="333333"/>
+          <w:kern w:val="0"/>
+          <w:sz w:val="24"/>
+          <w:szCs w:val="24"/>
+          <w14:ligatures w14:val="none"/>
+        </w:rPr>
+      </w:pPr>
+      <w:r>
+        <w:rPr>
+          <w:rFonts w:ascii="Arial" w:eastAsia="Times New Roman" w:hAnsi="Arial" w:cs="Arial"/>
+          <w:bCs/>
+          <w:color w:val="333333"/>
+          <w:kern w:val="0"/>
+          <w:sz w:val="24"/>
+          <w:szCs w:val="24"/>
+          <w14:ligatures w14:val="none"/>
+        </w:rPr>
+        <w:t>Can I purchase a hot air balloon ride during the Festival?</w:t>
+      </w:r>
+      <w:bookmarkStart w:name="_m-5F#02XCXG&gt;KBO8kug5MYxJkyB|n&quot;FC;HY&amp;w" w:id="102"/>
+      <w:bookmarkEnd w:id="102"/>
+      <w:bookmarkStart w:name="_m-5F#12~QFeW&lt;3ot2@J4lIw;cZmOJ8@0(uiyi" w:id="103"/>
+      <w:bookmarkEnd w:id="103"/>
+      <w:bookmarkStart w:name="_m-5F#22wF}0yt" w:id="104"/>
+      <w:bookmarkEnd w:id="104"/>
+    </w:p>
+    <w:p>
+      <w:pPr>
+        <w:shd w:val="clear" w:color="auto" w:fill="FFFFFF"/>
+        <w:spacing w:beforeAutospacing="1" w:after="0" w:afterAutospacing="1" w:line="270" w:lineRule="atLeast"/>
+        <w:rPr>
+          <w:rFonts w:ascii="Arial" w:eastAsia="Times New Roman" w:hAnsi="Arial" w:cs="Arial"/>
+          <w:color w:val="333333"/>
+          <w:kern w:val="0"/>
+          <w:sz w:val="20"/>
+          <w:szCs w:val="20"/>
+          <w14:ligatures w14:val="none"/>
+        </w:rPr>
+      </w:pPr>
+      <w:r>
+        <w:rPr>
+          <w:rFonts w:ascii="Arial" w:eastAsia="Times New Roman" w:hAnsi="Arial" w:cs="Arial"/>
+          <w:color w:val="333333"/>
+          <w:kern w:val="0"/>
+          <w:sz w:val="20"/>
+          <w:szCs w:val="20"/>
+          <w14:ligatures w14:val="none"/>
+        </w:rPr>
+        <w:t>Due to the overwhelming demand for balloon rides during the fes</w:t>
+      </w:r>
+      <w:r>
+        <w:rPr>
+          <w:rFonts w:ascii="Arial" w:eastAsia="Times New Roman" w:hAnsi="Arial" w:cs="Arial"/>
+          <w:color w:val="333333"/>
+          <w:kern w:val="0"/>
+          <w:sz w:val="20"/>
+          <w:szCs w:val="20"/>
+          <w14:ligatures w14:val="none"/>
+        </w:rPr>
+        <w:t>tival, rides are not available. However, most pilots will give tether rides on Saturday and Sunday mornings.</w:t>
+      </w:r>
+      <w:r>
+        <w:rPr>
+          <w:rFonts w:ascii="Arial" w:eastAsia="Times New Roman" w:hAnsi="Arial" w:cs="Arial"/>
+          <w:color w:val="333333"/>
+          <w:kern w:val="0"/>
+          <w:sz w:val="20"/>
+          <w:szCs w:val="20"/>
+          <w14:ligatures w14:val="none"/>
+        </w:rPr>
+        <w:t xml:space="preserve"> Rides can be purchased before</w:t>
+      </w:r>
+      <w:r>
+        <w:rPr>
+          <w:rFonts w:ascii="Arial" w:eastAsia="Times New Roman" w:hAnsi="Arial" w:cs="Arial"/>
+          <w:color w:val="333333"/>
+          <w:kern w:val="0"/>
+          <w:sz w:val="20"/>
+          <w:szCs w:val="20"/>
+          <w14:ligatures w14:val="none"/>
+        </w:rPr>
+        <w:t xml:space="preserve"> or</w:t>
+      </w:r>
+      <w:r>
+        <w:rPr>
+          <w:rFonts w:ascii="Arial" w:eastAsia="Times New Roman" w:hAnsi="Arial" w:cs="Arial"/>
+          <w:color w:val="333333"/>
+          <w:kern w:val="0"/>
+          <w:sz w:val="20"/>
+          <w:szCs w:val="20"/>
+          <w14:ligatures w14:val="none"/>
+        </w:rPr>
+        <w:t xml:space="preserve"> </w:t>
+      </w:r>
+      <w:r>
+        <w:rPr>
+          <w:rFonts w:ascii="Arial" w:eastAsia="Times New Roman" w:hAnsi="Arial" w:cs="Arial"/>
+          <w:color w:val="333333"/>
+          <w:kern w:val="0"/>
+          <w:sz w:val="20"/>
+          <w:szCs w:val="20"/>
+          <w14:ligatures w14:val="none"/>
+        </w:rPr>
+        <w:t xml:space="preserve">after the festival from </w:t>
+      </w:r>
+      <w:r>
+        <w:rPr>
+          <w:rFonts w:ascii="Arial" w:eastAsia="Times New Roman" w:hAnsi="Arial" w:cs="Arial"/>
+          <w:color w:val="333333"/>
+          <w:kern w:val="0"/>
+          <w:sz w:val="20"/>
+          <w:szCs w:val="20"/>
+          <w14:ligatures w14:val="none"/>
+        </w:rPr>
+        <w:t>Sky Glide</w:t>
+      </w:r>
+      <w:r>
+        <w:rPr>
+          <w:rFonts w:ascii="Arial" w:eastAsia="Times New Roman" w:hAnsi="Arial" w:cs="Arial"/>
+          <w:color w:val="333333"/>
+          <w:kern w:val="0"/>
+          <w:sz w:val="20"/>
+          <w:szCs w:val="20"/>
+          <w14:ligatures w14:val="none"/>
+        </w:rPr>
+        <w:t xml:space="preserve"> Hot Air Balloon Company, a member of the </w:t>
+      </w:r>
+      <w:r>
+        <w:rPr>
+          <w:rFonts w:ascii="Arial" w:eastAsia="Times New Roman" w:hAnsi="Arial" w:cs="Arial"/>
+          <w:color w:val="333333"/>
+          <w:kern w:val="0"/>
+          <w:sz w:val="20"/>
+          <w:szCs w:val="20"/>
+          <w14:ligatures w14:val="none"/>
+        </w:rPr>
+        <w:t xml:space="preserve">Mount </w:t>
+      </w:r>
+      <w:r>
+        <w:rPr>
+          <w:rFonts w:ascii="Arial" w:eastAsia="Times New Roman" w:hAnsi="Arial" w:cs="Arial"/>
+          <w:color w:val="333333"/>
+          <w:kern w:val="0"/>
+          <w:sz w:val="20"/>
+          <w:szCs w:val="20"/>
+          <w14:ligatures w14:val="none"/>
+        </w:rPr>
+        <w:t>Vernon</w:t>
+      </w:r>
+      <w:r>
+        <w:rPr>
+          <w:rFonts w:ascii="Arial" w:eastAsia="Times New Roman" w:hAnsi="Arial" w:cs="Arial"/>
+          <w:color w:val="333333"/>
+          <w:kern w:val="0"/>
+          <w:sz w:val="20"/>
+          <w:szCs w:val="20"/>
+          <w14:ligatures w14:val="none"/>
+        </w:rPr>
+        <w:t xml:space="preserve"> County</w:t>
+      </w:r>
+      <w:r>
+        <w:rPr>
+          <w:rFonts w:ascii="Arial" w:eastAsia="Times New Roman" w:hAnsi="Arial" w:cs="Arial"/>
+          <w:color w:val="333333"/>
+          <w:kern w:val="0"/>
+          <w:sz w:val="20"/>
+          <w:szCs w:val="20"/>
+          <w14:ligatures w14:val="none"/>
+        </w:rPr>
+        <w:t xml:space="preserve"> Chamber of Commerce.</w:t>
+      </w:r>
+      <w:bookmarkStart w:name="_m-5E#02XCWG&gt;LBO7kuh5MXxJlyB{n&quot;GC;GY&amp;x" w:id="99"/>
+      <w:bookmarkEnd w:id="99"/>
+      <w:bookmarkStart w:name="_m-5E#12~QEeW=3os2@K4lHw;dZmNJ8A0(tiyj" w:id="100"/>
+      <w:bookmarkEnd w:id="100"/>
+      <w:bookmarkStart w:name="_m-5E#22wF|0yu" w:id="101"/>
+      <w:bookmarkEnd w:id="101"/>
+    </w:p>
+    <w:p>
+      <w:pPr>
+        <w:shd w:val="clear" w:color="auto" w:fill="FFFFFF"/>
+        <w:spacing w:before="100" w:beforeAutospacing="1" w:after="100" w:afterAutospacing="1" w:line="270" w:lineRule="atLeast"/>
+        <w:outlineLvl w:val="3"/>
+        <w:rPr>
+          <w:rFonts w:ascii="Arial" w:eastAsia="Times New Roman" w:hAnsi="Arial" w:cs="Arial"/>
+          <w:bCs/>
+          <w:color w:val="333333"/>
+          <w:kern w:val="0"/>
+          <w:sz w:val="24"/>
+          <w:szCs w:val="24"/>
+          <w14:ligatures w14:val="none"/>
+        </w:rPr>
+      </w:pPr>
+      <w:r>
+        <w:rPr>
+          <w:rFonts w:ascii="Arial" w:eastAsia="Times New Roman" w:hAnsi="Arial" w:cs="Arial"/>
+          <w:bCs/>
+          <w:color w:val="333333"/>
+          <w:kern w:val="0"/>
+          <w:sz w:val="24"/>
+          <w:szCs w:val="24"/>
+          <w14:ligatures w14:val="none"/>
+        </w:rPr>
+        <w:t>What can my children do while visiting the festival?</w:t>
+      </w:r>
+      <w:bookmarkStart w:name="_m-5C#02XCUG&gt;NBO5kuj5MVxJnyByn&quot;IC;EY&amp;z" w:id="96"/>
+      <w:bookmarkEnd w:id="96"/>
+      <w:bookmarkStart w:name="_m-5C#12~QCeW?3oq2@M4lFw;fZmLJ8C0(riyl" w:id="97"/>
+      <w:bookmarkEnd w:id="97"/>
+      <w:bookmarkStart w:name="_m-5C#22wFz0yw" w:id="98"/>
+      <w:bookmarkEnd w:id="98"/>
+    </w:p>
+    <w:p>
+      <w:pPr>
+        <w:shd w:val="clear" w:color="auto" w:fill="FFFFFF"/>
+        <w:spacing w:before="100" w:beforeAutospacing="1" w:after="100" w:afterAutospacing="1" w:line="270" w:lineRule="atLeast"/>
+        <w:rPr>
+          <w:rFonts w:ascii="Arial" w:eastAsia="Times New Roman" w:hAnsi="Arial" w:cs="Arial"/>
+          <w:color w:val="333333"/>
+          <w:kern w:val="0"/>
+          <w:sz w:val="20"/>
+          <w:szCs w:val="20"/>
+          <w14:ligatures w14:val="none"/>
+        </w:rPr>
+      </w:pPr>
+      <w:r>
+        <w:rPr>
+          <w:rFonts w:ascii="Arial" w:eastAsia="Times New Roman" w:hAnsi="Arial" w:cs="Arial"/>
+          <w:color w:val="333333"/>
+          <w:kern w:val="0"/>
+          <w:sz w:val="20"/>
+          <w:szCs w:val="20"/>
+          <w14:ligatures w14:val="none"/>
+        </w:rPr>
+        <w:t>Children</w:t>
+      </w:r>
+      <w:r>
+        <w:rPr>
+          <w:rFonts w:ascii="Arial" w:eastAsia="Times New Roman" w:hAnsi="Arial" w:cs="Arial"/>
+          <w:color w:val="333333"/>
+          <w:kern w:val="0"/>
+          <w:sz w:val="20"/>
+          <w:szCs w:val="20"/>
+          <w14:ligatures w14:val="none"/>
+        </w:rPr>
+        <w:t xml:space="preserve"> can enjoy inflatables, children’s interactive entertainment, reptile displays, and face painting</w:t>
+      </w:r>
+      <w:r>
+        <w:rPr>
+          <w:rFonts w:ascii="Arial" w:eastAsia="Times New Roman" w:hAnsi="Arial" w:cs="Arial"/>
+          <w:color w:val="333333"/>
+          <w:kern w:val="0"/>
+          <w:sz w:val="20"/>
+          <w:szCs w:val="20"/>
+          <w14:ligatures w14:val="none"/>
+        </w:rPr>
+        <w:t>,</w:t>
+      </w:r>
+      <w:r>
+        <w:rPr>
+          <w:rFonts w:ascii="Arial" w:eastAsia="Times New Roman" w:hAnsi="Arial" w:cs="Arial"/>
+          <w:color w:val="333333"/>
+          <w:kern w:val="0"/>
+          <w:sz w:val="20"/>
+          <w:szCs w:val="20"/>
+          <w14:ligatures w14:val="none"/>
+        </w:rPr>
+        <w:t xml:space="preserve"> just to name a few!</w:t>
+      </w:r>
+      <w:r>
+        <w:rPr>
+          <w:rFonts w:ascii="Arial" w:eastAsia="Times New Roman" w:hAnsi="Arial" w:cs="Arial"/>
+          <w:color w:val="333333"/>
+          <w:kern w:val="0"/>
+          <w:sz w:val="20"/>
+          <w:szCs w:val="20"/>
+          <w14:ligatures w14:val="none"/>
+        </w:rPr>
+        <w:t xml:space="preserve"> </w:t>
+      </w:r>
+      <w:r>
+        <w:rPr>
+          <w:rFonts w:ascii="Arial" w:eastAsia="Times New Roman" w:hAnsi="Arial" w:cs="Arial"/>
+          <w:color w:val="333333"/>
+          <w:kern w:val="0"/>
+          <w:sz w:val="20"/>
+          <w:szCs w:val="20"/>
+          <w14:ligatures w14:val="none"/>
+        </w:rPr>
+        <w:t xml:space="preserve"> These fun activities are located in the free,</w:t>
+      </w:r>
+      <w:r>
+        <w:rPr>
+          <w:rFonts w:ascii="Arial" w:eastAsia="Times New Roman" w:hAnsi="Arial" w:cs="Arial"/>
+          <w:color w:val="333333"/>
+          <w:kern w:val="0"/>
+          <w:sz w:val="20"/>
+          <w:szCs w:val="20"/>
+          <w14:ligatures w14:val="none"/>
+        </w:rPr>
+        <w:t xml:space="preserve"> gated Children’s Village open 1</w:t>
+      </w:r>
+      <w:r>
+        <w:rPr>
+          <w:rFonts w:ascii="Arial" w:eastAsia="Times New Roman" w:hAnsi="Arial" w:cs="Arial"/>
+          <w:color w:val="333333"/>
+          <w:kern w:val="0"/>
+          <w:sz w:val="20"/>
+          <w:szCs w:val="20"/>
+          <w14:ligatures w14:val="none"/>
+        </w:rPr>
+        <w:t xml:space="preserve"> p.m. - 8 p.m. on Friday,</w:t>
+      </w:r>
+      <w:r>
+        <w:rPr>
+          <w:rFonts w:ascii="Arial" w:eastAsia="Times New Roman" w:hAnsi="Arial" w:cs="Arial"/>
+          <w:color w:val="333333"/>
+          <w:kern w:val="0"/>
+          <w:sz w:val="20"/>
+          <w:szCs w:val="20"/>
+          <w14:ligatures w14:val="none"/>
+        </w:rPr>
+        <w:t xml:space="preserve"> and 8 a.m. - 8 p.m. on Saturday.</w:t>
+      </w:r>
+      <w:bookmarkStart w:name="_m-57#02XDZG=IBP:kte5N[xIiyC~n!DC&lt;JY%u" w:id="93"/>
+      <w:bookmarkEnd w:id="93"/>
+      <w:bookmarkStart w:name="_m-57#12~RHeV:3pv2?H4mKw:aZnQJ7&gt;0)wixg" w:id="94"/>
+      <w:bookmarkEnd w:id="94"/>
+      <w:bookmarkStart w:name="_m-57#22wG!0xr" w:id="95"/>
+      <w:bookmarkEnd w:id="95"/>
+    </w:p>
+    <w:p>
+      <w:pPr>
+        <w:shd w:val="clear" w:color="auto" w:fill="FFFFFF"/>
+        <w:spacing w:before="100" w:beforeAutospacing="1" w:after="100" w:afterAutospacing="1" w:line="270" w:lineRule="atLeast"/>
+        <w:outlineLvl w:val="3"/>
+        <w:rPr>
+          <w:rFonts w:ascii="Arial" w:eastAsia="Times New Roman" w:hAnsi="Arial" w:cs="Arial"/>
+          <w:bCs/>
+          <w:color w:val="333333"/>
+          <w:kern w:val="0"/>
+          <w:sz w:val="24"/>
+          <w:szCs w:val="24"/>
+          <w14:ligatures w14:val="none"/>
+        </w:rPr>
+      </w:pPr>
+      <w:r>
+        <w:rPr>
+          <w:rFonts w:ascii="Arial" w:eastAsia="Times New Roman" w:hAnsi="Arial" w:cs="Arial"/>
+          <w:bCs/>
+          <w:color w:val="333333"/>
+          <w:kern w:val="0"/>
+          <w:sz w:val="24"/>
+          <w:szCs w:val="24"/>
+          <w14:ligatures w14:val="none"/>
+        </w:rPr>
+        <w:t>Is smoking permitted on the festival grounds?</w:t>
+      </w:r>
+      <w:bookmarkStart w:name="_m-55#02XDXG=KBP8ktg5NYxIkyC|n!FC&lt;HY%w" w:id="90"/>
+      <w:bookmarkEnd w:id="90"/>
+      <w:bookmarkStart w:name="_m-55#12~RFeV&lt;3pt2?J4mIw:cZnOJ7@0)uixi" w:id="91"/>
+      <w:bookmarkEnd w:id="91"/>
+      <w:bookmarkStart w:name="_m-55#22wG}0xt" w:id="92"/>
+      <w:bookmarkEnd w:id="92"/>
+    </w:p>
+    <w:p>
+      <w:pPr>
+        <w:shd w:val="clear" w:color="auto" w:fill="FFFFFF"/>
+        <w:spacing w:before="100" w:beforeAutospacing="1" w:after="100" w:afterAutospacing="1" w:line="270" w:lineRule="atLeast"/>
+        <w:rPr>
+          <w:rFonts w:ascii="Arial" w:eastAsia="Times New Roman" w:hAnsi="Arial" w:cs="Arial"/>
+          <w:color w:val="333333"/>
+          <w:kern w:val="0"/>
+          <w:sz w:val="20"/>
+          <w:szCs w:val="20"/>
+          <w14:ligatures w14:val="none"/>
+        </w:rPr>
+      </w:pPr>
+      <w:r>
+        <w:rPr>
+          <w:rFonts w:ascii="Arial" w:eastAsia="Times New Roman" w:hAnsi="Arial" w:cs="Arial"/>
+          <w:color w:val="333333"/>
+          <w:kern w:val="0"/>
+          <w:sz w:val="20"/>
+          <w:szCs w:val="20"/>
+          <w14:ligatures w14:val="none"/>
+        </w:rPr>
+        <w:t>Smoking is not allowed on the festival grounds while the balloons are present. Please be courteous of other festival patrons.</w:t>
+      </w:r>
+      <w:bookmarkStart w:name="_m-53#02XDVG=MBP6kti5NWxImyCzn!HC&lt;FY%y" w:id="87"/>
+      <w:bookmarkEnd w:id="87"/>
+      <w:bookmarkStart w:name="_m-53#12~RDeV&gt;3pr2?L4mGw:eZnMJ7B0)sixk" w:id="88"/>
+      <w:bookmarkEnd w:id="88"/>
+      <w:bookmarkStart w:name="_m-53#22wG{0xv" w:id="89"/>
+      <w:bookmarkEnd w:id="89"/>
+    </w:p>
+    <w:p>
+      <w:pPr>
+        <w:shd w:val="clear" w:color="auto" w:fill="FFFFFF"/>
+        <w:spacing w:before="100" w:beforeAutospacing="1" w:after="100" w:afterAutospacing="1" w:line="270" w:lineRule="atLeast"/>
+        <w:outlineLvl w:val="3"/>
+        <w:rPr>
+          <w:rFonts w:ascii="Arial" w:eastAsia="Times New Roman" w:hAnsi="Arial" w:cs="Arial"/>
+          <w:bCs/>
+          <w:color w:val="333333"/>
+          <w:kern w:val="0"/>
+          <w:sz w:val="24"/>
+          <w:szCs w:val="24"/>
+          <w14:ligatures w14:val="none"/>
+        </w:rPr>
+      </w:pPr>
+      <w:r>
+        <w:rPr>
+          <w:rFonts w:ascii="Arial" w:eastAsia="Times New Roman" w:hAnsi="Arial" w:cs="Arial"/>
+          <w:bCs/>
+          <w:color w:val="333333"/>
+          <w:kern w:val="0"/>
+          <w:sz w:val="24"/>
+          <w:szCs w:val="24"/>
+          <w14:ligatures w14:val="none"/>
+        </w:rPr>
+        <w:t>Can I bring a cooler with beverage and food into the festival?</w:t>
+      </w:r>
+      <w:bookmarkStart w:name="_m-52#02XDUG=NBP5ktj5NVxInyCyn!IC&lt;EY%z" w:id="84"/>
+      <w:bookmarkEnd w:id="84"/>
+      <w:bookmarkStart w:name="_m-52#12~RCeV?3pq2?M4mFw:fZnLJ7C0)rixl" w:id="85"/>
+      <w:bookmarkEnd w:id="85"/>
+      <w:bookmarkStart w:name="_m-52#22wGz0xw" w:id="86"/>
+      <w:bookmarkEnd w:id="86"/>
+    </w:p>
+    <w:p>
+      <w:pPr>
+        <w:shd w:val="clear" w:color="auto" w:fill="FFFFFF"/>
+        <w:spacing w:before="100" w:beforeAutospacing="1" w:after="100" w:afterAutospacing="1" w:line="270" w:lineRule="atLeast"/>
+        <w:rPr>
+          <w:rFonts w:ascii="Arial" w:eastAsia="Times New Roman" w:hAnsi="Arial" w:cs="Arial"/>
+          <w:color w:val="333333"/>
+          <w:kern w:val="0"/>
+          <w:sz w:val="20"/>
+          <w:szCs w:val="20"/>
+          <w14:ligatures w14:val="none"/>
+        </w:rPr>
+      </w:pPr>
+      <w:r>
+        <w:rPr>
+          <w:rFonts w:ascii="Arial" w:eastAsia="Times New Roman" w:hAnsi="Arial" w:cs="Arial"/>
+          <w:color w:val="333333"/>
+          <w:kern w:val="0"/>
+          <w:sz w:val="20"/>
+          <w:szCs w:val="20"/>
+          <w14:ligatures w14:val="none"/>
+        </w:rPr>
+        <w:t>You can bring a cooler with snacks and plastic or aluminum containers. However, no glass bottles or alcohol are allowed at the festival. We do</w:t>
+      </w:r>
+      <w:r>
+        <w:rPr>
+          <w:rFonts w:ascii="Arial" w:eastAsia="Times New Roman" w:hAnsi="Arial" w:cs="Arial"/>
+          <w:color w:val="333333"/>
+          <w:kern w:val="0"/>
+          <w:sz w:val="20"/>
+          <w:szCs w:val="20"/>
+          <w14:ligatures w14:val="none"/>
+        </w:rPr>
+        <w:t xml:space="preserve"> provide an assortment of unique foods at our </w:t>
+      </w:r>
+      <w:r>
+        <w:rPr>
+          <w:rFonts w:ascii="Arial" w:eastAsia="Times New Roman" w:hAnsi="Arial" w:cs="Arial"/>
+          <w:color w:val="333333"/>
+          <w:kern w:val="0"/>
+          <w:sz w:val="20"/>
+          <w:szCs w:val="20"/>
+          <w14:ligatures w14:val="none"/>
+        </w:rPr>
+        <w:t>food vendor</w:t>
+      </w:r>
+      <w:r>
+        <w:rPr>
+          <w:rFonts w:ascii="Arial" w:eastAsia="Times New Roman" w:hAnsi="Arial" w:cs="Arial"/>
+          <w:color w:val="333333"/>
+          <w:kern w:val="0"/>
+          <w:sz w:val="20"/>
+          <w:szCs w:val="20"/>
+          <w14:ligatures w14:val="none"/>
+        </w:rPr>
+        <w:t xml:space="preserve"> stands.</w:t>
+      </w:r>
+      <w:bookmarkStart w:name="_m-4Y#02XE[G&lt;HBQ;ksd5O\xHhyD!n~CC=KY$t" w:id="81"/>
+      <w:bookmarkEnd w:id="81"/>
+      <w:bookmarkStart w:name="_m-4Y#12~SIeU93qw2&gt;G4nLw9`ZoRJ6=0*xiwf" w:id="82"/>
+      <w:bookmarkEnd w:id="82"/>
+      <w:bookmarkStart w:name="_m-4Y#22wH&quot;0wq" w:id="83"/>
+      <w:bookmarkEnd w:id="83"/>
+    </w:p>
+    <w:p>
+      <w:pPr>
+        <w:shd w:val="clear" w:color="auto" w:fill="FFFFFF"/>
+        <w:spacing w:before="100" w:beforeAutospacing="1" w:after="100" w:afterAutospacing="1" w:line="270" w:lineRule="atLeast"/>
+        <w:outlineLvl w:val="3"/>
+        <w:rPr>
+          <w:rFonts w:ascii="Arial" w:eastAsia="Times New Roman" w:hAnsi="Arial" w:cs="Arial"/>
+          <w:bCs/>
+          <w:color w:val="333333"/>
+          <w:kern w:val="0"/>
+          <w:sz w:val="24"/>
+          <w:szCs w:val="24"/>
+          <w14:ligatures w14:val="none"/>
+        </w:rPr>
+      </w:pPr>
+      <w:r>
+        <w:rPr>
+          <w:rFonts w:ascii="Arial" w:eastAsia="Times New Roman" w:hAnsi="Arial" w:cs="Arial"/>
+          <w:bCs/>
+          <w:color w:val="333333"/>
+          <w:kern w:val="0"/>
+          <w:sz w:val="24"/>
+          <w:szCs w:val="24"/>
+          <w14:ligatures w14:val="none"/>
+        </w:rPr>
+        <w:t>What are my camping, RV, or lodging options?</w:t>
+      </w:r>
+      <w:bookmarkStart w:name="_m-4W#02XEYG&lt;JBQ9ksf5OZxHjyD}n~EC=IY$v" w:id="78"/>
+      <w:bookmarkEnd w:id="78"/>
+      <w:bookmarkStart w:name="_m-4W#12~SGeU;3qu2&gt;I4nJw9bZoPJ6?0*viwh" w:id="79"/>
+      <w:bookmarkEnd w:id="79"/>
+      <w:bookmarkStart w:name="_m-4W#22wH~0ws" w:id="80"/>
+      <w:bookmarkEnd w:id="80"/>
+    </w:p>
+    <w:p>
+      <w:pPr>
+        <w:shd w:val="clear" w:color="auto" w:fill="FFFFFF"/>
+        <w:spacing w:beforeAutospacing="1" w:after="0" w:afterAutospacing="1" w:line="270" w:lineRule="atLeast"/>
+        <w:rPr>
+          <w:rFonts w:ascii="Arial" w:eastAsia="Times New Roman" w:hAnsi="Arial" w:cs="Arial"/>
+          <w:color w:val="333333"/>
+          <w:kern w:val="0"/>
+          <w:sz w:val="20"/>
+          <w:szCs w:val="20"/>
+          <w14:ligatures w14:val="none"/>
+        </w:rPr>
+      </w:pPr>
+      <w:r>
+        <w:rPr>
+          <w:rFonts w:ascii="Arial" w:eastAsia="Times New Roman" w:hAnsi="Arial" w:cs="Arial"/>
+          <w:color w:val="333333"/>
+          <w:kern w:val="0"/>
+          <w:sz w:val="20"/>
+          <w:szCs w:val="20"/>
+          <w14:ligatures w14:val="none"/>
+        </w:rPr>
+        <w:t>While you cannot camp or park an RV on the festival grounds, there are camping options nearby.</w:t>
+      </w:r>
+      <w:r>
+        <w:rPr>
+          <w:rFonts w:ascii="Arial" w:eastAsia="Times New Roman" w:hAnsi="Arial" w:cs="Arial"/>
+          <w:color w:val="333333"/>
+          <w:kern w:val="0"/>
+          <w:sz w:val="20"/>
+          <w:szCs w:val="20"/>
+          <w14:ligatures w14:val="none"/>
+        </w:rPr>
+        <w:t xml:space="preserve"> Check with the </w:t>
+      </w:r>
+      <w:r>
+        <w:rPr>
+          <w:rFonts w:ascii="Arial" w:eastAsia="Times New Roman" w:hAnsi="Arial" w:cs="Arial"/>
+          <w:color w:val="333333"/>
+          <w:kern w:val="0"/>
+          <w:sz w:val="20"/>
+          <w:szCs w:val="20"/>
+          <w14:ligatures w14:val="none"/>
+        </w:rPr>
+        <w:t>Mount Sedona</w:t>
+      </w:r>
+      <w:r>
+        <w:rPr>
+          <w:rFonts w:ascii="Arial" w:eastAsia="Times New Roman" w:hAnsi="Arial" w:cs="Arial"/>
+          <w:color w:val="333333"/>
+          <w:kern w:val="0"/>
+          <w:sz w:val="20"/>
+          <w:szCs w:val="20"/>
+          <w14:ligatures w14:val="none"/>
+        </w:rPr>
+        <w:t xml:space="preserve"> County Chamber of Commerce for a complete list of camping facilities.</w:t>
+      </w:r>
+      <w:bookmarkStart w:name="_m-4V#02XEXG&lt;KBQ8ksg5OYxHkyD|n~FC=HY$w" w:id="75"/>
+      <w:bookmarkEnd w:id="75"/>
+      <w:bookmarkStart w:name="_m-4V#12~SFeU&lt;3qt2&gt;J4nIw9cZoOJ6@0*uiwi" w:id="76"/>
+      <w:bookmarkEnd w:id="76"/>
+      <w:bookmarkStart w:name="_m-4V#22wH}0wt" w:id="77"/>
+      <w:bookmarkEnd w:id="77"/>
+    </w:p>
+    <w:p>
+      <w:pPr>
+        <w:shd w:val="clear" w:color="auto" w:fill="FFFFFF"/>
+        <w:spacing w:before="100" w:beforeAutospacing="1" w:after="100" w:afterAutospacing="1" w:line="270" w:lineRule="atLeast"/>
+        <w:outlineLvl w:val="3"/>
+        <w:rPr>
+          <w:rFonts w:ascii="Arial" w:eastAsia="Times New Roman" w:hAnsi="Arial" w:cs="Arial"/>
+          <w:bCs/>
+          <w:color w:val="333333"/>
+          <w:kern w:val="0"/>
+          <w:sz w:val="24"/>
+          <w:szCs w:val="24"/>
+          <w14:ligatures w14:val="none"/>
+        </w:rPr>
+      </w:pPr>
+      <w:r>
+        <w:rPr>
+          <w:rFonts w:ascii="Arial" w:eastAsia="Times New Roman" w:hAnsi="Arial" w:cs="Arial"/>
+          <w:bCs/>
+          <w:color w:val="333333"/>
+          <w:kern w:val="0"/>
+          <w:sz w:val="24"/>
+          <w:szCs w:val="24"/>
+          <w14:ligatures w14:val="none"/>
+        </w:rPr>
+        <w:t>How c</w:t>
+      </w:r>
+      <w:r>
+        <w:rPr>
+          <w:rFonts w:ascii="Arial" w:eastAsia="Times New Roman" w:hAnsi="Arial" w:cs="Arial"/>
+          <w:bCs/>
+          <w:color w:val="333333"/>
+          <w:kern w:val="0"/>
+          <w:sz w:val="24"/>
+          <w:szCs w:val="24"/>
+          <w14:ligatures w14:val="none"/>
+        </w:rPr>
+        <w:t xml:space="preserve">an I </w:t>
+      </w:r>
+      <w:r>
+        <w:rPr>
+          <w:rFonts w:ascii="Arial" w:eastAsia="Times New Roman" w:hAnsi="Arial" w:cs="Arial"/>
+          <w:bCs/>
+          <w:color w:val="333333"/>
+          <w:kern w:val="0"/>
+          <w:sz w:val="24"/>
+          <w:szCs w:val="24"/>
+          <w14:ligatures w14:val="none"/>
+        </w:rPr>
+        <w:t>plan for the best e</w:t>
+      </w:r>
+      <w:r>
+        <w:rPr>
+          <w:rFonts w:ascii="Arial" w:eastAsia="Times New Roman" w:hAnsi="Arial" w:cs="Arial"/>
+          <w:bCs/>
+          <w:color w:val="333333"/>
+          <w:kern w:val="0"/>
+          <w:sz w:val="24"/>
+          <w:szCs w:val="24"/>
+          <w14:ligatures w14:val="none"/>
+        </w:rPr>
+        <w:t>xperience?</w:t>
+      </w:r>
+      <w:bookmarkStart w:name="_m-4S#02XEUG&lt;NBQ5ksj5OVxHnyDyn~IC=EY$z" w:id="72"/>
+      <w:bookmarkEnd w:id="72"/>
+      <w:bookmarkStart w:name="_m-4S#12~SCeU?3qq2&gt;M4nFw9fZoLJ6C0*riwl" w:id="73"/>
+      <w:bookmarkEnd w:id="73"/>
+      <w:bookmarkStart w:name="_m-4S#22wHz0ww" w:id="74"/>
+      <w:bookmarkEnd w:id="74"/>
+    </w:p>
+    <w:p>
+      <w:pPr>
+        <w:shd w:val="clear" w:color="auto" w:fill="FFFFFF"/>
+        <w:spacing w:beforeAutospacing="1" w:after="0" w:afterAutospacing="1" w:line="270" w:lineRule="atLeast"/>
+        <w:rPr>
+          <w:rFonts w:ascii="Arial" w:eastAsia="Times New Roman" w:hAnsi="Arial" w:cs="Arial"/>
+          <w:color w:val="333333"/>
+          <w:kern w:val="0"/>
+          <w:sz w:val="20"/>
+          <w:szCs w:val="20"/>
+          <w14:ligatures w14:val="none"/>
+        </w:rPr>
+      </w:pPr>
+      <w:r>
+        <w:rPr>
+          <w:rFonts w:ascii="Arial" w:eastAsia="Times New Roman" w:hAnsi="Arial" w:cs="Arial"/>
+          <w:color w:val="333333"/>
+          <w:kern w:val="0"/>
+          <w:sz w:val="20"/>
+          <w:szCs w:val="20"/>
+          <w14:ligatures w14:val="none"/>
+        </w:rPr>
+        <w:t>Although there is no perfect formula, the follow</w:t>
+      </w:r>
+      <w:r>
+        <w:rPr>
+          <w:rFonts w:ascii="Arial" w:eastAsia="Times New Roman" w:hAnsi="Arial" w:cs="Arial"/>
+          <w:color w:val="333333"/>
+          <w:kern w:val="0"/>
+          <w:sz w:val="20"/>
+          <w:szCs w:val="20"/>
+          <w14:ligatures w14:val="none"/>
+        </w:rPr>
+        <w:t>ing</w:t>
+      </w:r>
+      <w:r>
+        <w:rPr>
+          <w:rFonts w:ascii="Arial" w:eastAsia="Times New Roman" w:hAnsi="Arial" w:cs="Arial"/>
+          <w:color w:val="333333"/>
+          <w:kern w:val="0"/>
+          <w:sz w:val="20"/>
+          <w:szCs w:val="20"/>
+          <w14:ligatures w14:val="none"/>
+        </w:rPr>
+        <w:t xml:space="preserve"> tips should </w:t>
+      </w:r>
+      <w:r>
+        <w:rPr>
+          <w:rFonts w:ascii="Arial" w:eastAsia="Times New Roman" w:hAnsi="Arial" w:cs="Arial"/>
+          <w:color w:val="333333"/>
+          <w:kern w:val="0"/>
+          <w:sz w:val="20"/>
+          <w:szCs w:val="20"/>
+          <w14:ligatures w14:val="none"/>
+        </w:rPr>
+        <w:t>e</w:t>
+      </w:r>
+      <w:r>
+        <w:rPr>
+          <w:rFonts w:ascii="Arial" w:eastAsia="Times New Roman" w:hAnsi="Arial" w:cs="Arial"/>
+          <w:color w:val="333333"/>
+          <w:kern w:val="0"/>
+          <w:sz w:val="20"/>
+          <w:szCs w:val="20"/>
+          <w14:ligatures w14:val="none"/>
+        </w:rPr>
+        <w:t>nsure that you have all the bases covered!</w:t>
+      </w:r>
+      <w:bookmarkStart w:name="_m-4Q#02XESG&lt;PBQ3ksl5OTxHpyDwn~KC=CY$|" w:id="69"/>
+      <w:bookmarkEnd w:id="69"/>
+      <w:bookmarkStart w:name="_m-4Q#12~SAeUA3qo2&gt;O4nDw9hZoJJ6E0*piwn" w:id="70"/>
+      <w:bookmarkEnd w:id="70"/>
+      <w:bookmarkStart w:name="_m-4Q#22wHx0wy" w:id="71"/>
+      <w:bookmarkEnd w:id="71"/>
+    </w:p>
+    <w:p>
+      <w:pPr>
+        <w:shd w:val="clear" w:color="auto" w:fill="FFFFFF"/>
+        <w:spacing w:beforeAutospacing="1" w:after="0" w:afterAutospacing="1" w:line="270" w:lineRule="atLeast"/>
+        <w:rPr>
+          <w:rFonts w:ascii="Arial" w:eastAsia="Times New Roman" w:hAnsi="Arial" w:cs="Arial"/>
+          <w:color w:val="333333"/>
+          <w:kern w:val="0"/>
+          <w:sz w:val="20"/>
+          <w:szCs w:val="20"/>
+          <w14:ligatures w14:val="none"/>
+        </w:rPr>
+      </w:pPr>
+      <w:r>
+        <w:rPr>
+          <w:rFonts w:ascii="Arial" w:eastAsia="Times New Roman" w:hAnsi="Arial" w:cs="Arial"/>
+          <w:color w:val="333333"/>
+          <w:kern w:val="0"/>
+          <w:sz w:val="20"/>
+          <w:szCs w:val="20"/>
+          <w14:ligatures w14:val="none"/>
+        </w:rPr>
+        <w:t>Wear good walking shoes. The park encompasses 15 acres, so hiking is a strong possibility.</w:t>
+      </w:r>
+      <w:bookmarkStart w:name="_m-4N#02XFZG;IBR:kre5P[xGiyE~n}DC&gt;JY#u" w:id="66"/>
+      <w:bookmarkEnd w:id="66"/>
+      <w:bookmarkStart w:name="_m-4N#12~THeT:3rv2=H4oKw8aZpQJ5&gt;0+wivg" w:id="67"/>
+      <w:bookmarkEnd w:id="67"/>
+      <w:bookmarkStart w:name="_m-4N#22wI!0vr" w:id="68"/>
+      <w:bookmarkEnd w:id="68"/>
+    </w:p>
+    <w:p>
+      <w:pPr>
+        <w:shd w:val="clear" w:color="auto" w:fill="FFFFFF"/>
+        <w:spacing w:beforeAutospacing="1" w:after="0" w:afterAutospacing="1" w:line="270" w:lineRule="atLeast"/>
+        <w:rPr>
+          <w:rFonts w:ascii="Arial" w:eastAsia="Times New Roman" w:hAnsi="Arial" w:cs="Arial"/>
+          <w:color w:val="333333"/>
+          <w:kern w:val="0"/>
+          <w:sz w:val="20"/>
+          <w:szCs w:val="20"/>
+          <w14:ligatures w14:val="none"/>
+        </w:rPr>
+      </w:pPr>
+      <w:r>
+        <w:rPr>
+          <w:rFonts w:ascii="Arial" w:eastAsia="Times New Roman" w:hAnsi="Arial" w:cs="Arial"/>
+          <w:color w:val="333333"/>
+          <w:kern w:val="0"/>
+          <w:sz w:val="20"/>
+          <w:szCs w:val="20"/>
+          <w14:ligatures w14:val="none"/>
+        </w:rPr>
+        <w:lastRenderedPageBreak/>
+        <w:t>Bring sunscreen. There is very little shade.</w:t>
+      </w:r>
+      <w:bookmarkStart w:name="_m-4J#02XFVG;MBR6kri5PWxGmyEzn}HC&gt;FY#y" w:id="63"/>
+      <w:bookmarkEnd w:id="63"/>
+      <w:bookmarkStart w:name="_m-4J#12~TDeT&gt;3rr2=L4oGw8eZpMJ5B0+sivk" w:id="64"/>
+      <w:bookmarkEnd w:id="64"/>
+      <w:bookmarkStart w:name="_m-4J#22wI{0vv" w:id="65"/>
+      <w:bookmarkEnd w:id="65"/>
+    </w:p>
+    <w:p>
+      <w:pPr>
+        <w:shd w:val="clear" w:color="auto" w:fill="FFFFFF"/>
+        <w:spacing w:beforeAutospacing="1" w:after="0" w:afterAutospacing="1" w:line="270" w:lineRule="atLeast"/>
+        <w:rPr>
+          <w:rFonts w:ascii="Arial" w:eastAsia="Times New Roman" w:hAnsi="Arial" w:cs="Arial"/>
+          <w:color w:val="333333"/>
+          <w:kern w:val="0"/>
+          <w:sz w:val="20"/>
+          <w:szCs w:val="20"/>
+          <w14:ligatures w14:val="none"/>
+        </w:rPr>
+      </w:pPr>
+      <w:r>
+        <w:rPr>
+          <w:rFonts w:ascii="Arial" w:eastAsia="Times New Roman" w:hAnsi="Arial" w:cs="Arial"/>
+          <w:color w:val="333333"/>
+          <w:kern w:val="0"/>
+          <w:sz w:val="20"/>
+          <w:szCs w:val="20"/>
+          <w14:ligatures w14:val="none"/>
+        </w:rPr>
+        <w:t>Get to the park early. When the balloons inflate, long lines form.</w:t>
+      </w:r>
+      <w:bookmarkStart w:name="_m-4H#02XFTG;OBR4krk5PUxGoyExn}JC&gt;DY#{" w:id="60"/>
+      <w:bookmarkEnd w:id="60"/>
+      <w:bookmarkStart w:name="_m-4H#12~TBeT@3rp2=N4oEw8gZpKJ5D0+qivm" w:id="61"/>
+      <w:bookmarkEnd w:id="61"/>
+      <w:bookmarkStart w:name="_m-4H#22wIy0vx" w:id="62"/>
+      <w:bookmarkEnd w:id="62"/>
+    </w:p>
+    <w:p>
+      <w:pPr>
+        <w:shd w:val="clear" w:color="auto" w:fill="FFFFFF"/>
+        <w:spacing w:beforeAutospacing="1" w:after="0" w:afterAutospacing="1" w:line="270" w:lineRule="atLeast"/>
+        <w:rPr>
+          <w:rFonts w:ascii="Arial" w:eastAsia="Times New Roman" w:hAnsi="Arial" w:cs="Arial"/>
+          <w:color w:val="333333"/>
+          <w:kern w:val="0"/>
+          <w:sz w:val="20"/>
+          <w:szCs w:val="20"/>
+          <w14:ligatures w14:val="none"/>
+        </w:rPr>
+      </w:pPr>
+      <w:r>
+        <w:rPr>
+          <w:rFonts w:ascii="Arial" w:eastAsia="Times New Roman" w:hAnsi="Arial" w:cs="Arial"/>
+          <w:color w:val="333333"/>
+          <w:kern w:val="0"/>
+          <w:sz w:val="20"/>
+          <w:szCs w:val="20"/>
+          <w14:ligatures w14:val="none"/>
+        </w:rPr>
+        <w:t>Wear comfortable, cool clothing. If you take tether rides, the flame does make it hot in the basket.</w:t>
+      </w:r>
+      <w:bookmarkStart w:name="_m-4E#02XG[G:HBS;kqd5Q\xFhyF!n|CC?KY&quot;t" w:id="57"/>
+      <w:bookmarkEnd w:id="57"/>
+      <w:bookmarkStart w:name="_m-4E#12~UIeS93sw2&lt;G4pLw7`ZqRJ4=0,xiuf" w:id="58"/>
+      <w:bookmarkEnd w:id="58"/>
+      <w:bookmarkStart w:name="_m-4E#22wJ&quot;0uq" w:id="59"/>
+      <w:bookmarkEnd w:id="59"/>
+    </w:p>
+    <w:p>
+      <w:pPr>
+        <w:shd w:val="clear" w:color="auto" w:fill="FFFFFF"/>
+        <w:spacing w:beforeAutospacing="1" w:after="0" w:afterAutospacing="1" w:line="270" w:lineRule="atLeast"/>
+        <w:rPr>
+          <w:rFonts w:ascii="Arial" w:eastAsia="Times New Roman" w:hAnsi="Arial" w:cs="Arial"/>
+          <w:color w:val="333333"/>
+          <w:kern w:val="0"/>
+          <w:sz w:val="20"/>
+          <w:szCs w:val="20"/>
+          <w14:ligatures w14:val="none"/>
+        </w:rPr>
+      </w:pPr>
+      <w:r>
+        <w:rPr>
+          <w:rFonts w:ascii="Arial" w:eastAsia="Times New Roman" w:hAnsi="Arial" w:cs="Arial"/>
+          <w:color w:val="333333"/>
+          <w:kern w:val="0"/>
+          <w:sz w:val="20"/>
+          <w:szCs w:val="20"/>
+          <w14:ligatures w14:val="none"/>
+        </w:rPr>
+        <w:t>Bring</w:t>
+      </w:r>
+      <w:r>
+        <w:rPr>
+          <w:rFonts w:ascii="Arial" w:eastAsia="Times New Roman" w:hAnsi="Arial" w:cs="Arial"/>
+          <w:color w:val="333333"/>
+          <w:kern w:val="0"/>
+          <w:sz w:val="20"/>
+          <w:szCs w:val="20"/>
+          <w14:ligatures w14:val="none"/>
+        </w:rPr>
+        <w:t xml:space="preserve"> a camera and tripod. The ballu</w:t>
+      </w:r>
+      <w:r>
+        <w:rPr>
+          <w:rFonts w:ascii="Arial" w:eastAsia="Times New Roman" w:hAnsi="Arial" w:cs="Arial"/>
+          <w:color w:val="333333"/>
+          <w:kern w:val="0"/>
+          <w:sz w:val="20"/>
+          <w:szCs w:val="20"/>
+          <w14:ligatures w14:val="none"/>
+        </w:rPr>
+        <w:t>mination at dusk is a beautiful photo opportunity, but the low light makes a tripod a necessity.</w:t>
+      </w:r>
+      <w:bookmarkStart w:name="_m-4B#02XGXG:KBS8kqg5QYxFkyF|n|FC?HY&quot;w" w:id="54"/>
+      <w:bookmarkEnd w:id="54"/>
+      <w:bookmarkStart w:name="_m-4B#12~UFeS&lt;3st2&lt;J4pIw7cZqOJ4@0,uiui" w:id="55"/>
+      <w:bookmarkEnd w:id="55"/>
+      <w:bookmarkStart w:name="_m-4B#22wJ}0ut" w:id="56"/>
+      <w:bookmarkEnd w:id="56"/>
+    </w:p>
+    <w:p>
+      <w:pPr>
+        <w:shd w:val="clear" w:color="auto" w:fill="FFFFFF"/>
+        <w:spacing w:beforeAutospacing="1" w:after="0" w:afterAutospacing="1" w:line="270" w:lineRule="atLeast"/>
+        <w:rPr>
+          <w:rFonts w:ascii="Arial" w:eastAsia="Times New Roman" w:hAnsi="Arial" w:cs="Arial"/>
+          <w:color w:val="333333"/>
+          <w:kern w:val="0"/>
+          <w:sz w:val="20"/>
+          <w:szCs w:val="20"/>
+          <w14:ligatures w14:val="none"/>
+        </w:rPr>
+      </w:pPr>
+      <w:r>
+        <w:rPr>
+          <w:rFonts w:ascii="Arial" w:eastAsia="Times New Roman" w:hAnsi="Arial" w:cs="Arial"/>
+          <w:color w:val="333333"/>
+          <w:kern w:val="0"/>
+          <w:sz w:val="20"/>
+          <w:szCs w:val="20"/>
+          <w14:ligatures w14:val="none"/>
+        </w:rPr>
+        <w:t>Bring lawn chairs and/or blankets.</w:t>
+      </w:r>
+      <w:bookmarkStart w:name="_m-48#02XGUG:NBS5kqj5QVxFnyFyn|IC?EY&quot;z" w:id="51"/>
+      <w:bookmarkEnd w:id="51"/>
+      <w:bookmarkStart w:name="_m-48#12~UCeS?3sq2&lt;M4pFw7fZqLJ4C0,riul" w:id="52"/>
+      <w:bookmarkEnd w:id="52"/>
+      <w:bookmarkStart w:name="_m-48#22wJz0uw" w:id="53"/>
+      <w:bookmarkEnd w:id="53"/>
+    </w:p>
+    <w:p>
+      <w:pPr>
+        <w:shd w:val="clear" w:color="auto" w:fill="FFFFFF"/>
+        <w:spacing w:beforeAutospacing="1" w:after="0" w:afterAutospacing="1" w:line="270" w:lineRule="atLeast"/>
+        <w:rPr>
+          <w:rFonts w:ascii="Arial" w:eastAsia="Times New Roman" w:hAnsi="Arial" w:cs="Arial"/>
+          <w:color w:val="333333"/>
+          <w:kern w:val="0"/>
+          <w:sz w:val="20"/>
+          <w:szCs w:val="20"/>
+          <w14:ligatures w14:val="none"/>
+        </w:rPr>
+      </w:pPr>
+      <w:r>
+        <w:rPr>
+          <w:rFonts w:ascii="Arial" w:eastAsia="Times New Roman" w:hAnsi="Arial" w:cs="Arial"/>
+          <w:color w:val="333333"/>
+          <w:kern w:val="0"/>
+          <w:sz w:val="20"/>
+          <w:szCs w:val="20"/>
+          <w14:ligatures w14:val="none"/>
+        </w:rPr>
+        <w:t>Bring, or prepare to buy, plenty of water.</w:t>
+      </w:r>
+      <w:bookmarkStart w:name="_m-47#02XGTG:OBS4kqk5QUxFoyFxn|JC?DY&quot;{" w:id="48"/>
+      <w:bookmarkEnd w:id="48"/>
+      <w:bookmarkStart w:name="_m-47#12~UBeS@3sp2&lt;N4pEw7gZqKJ4D0,qium" w:id="49"/>
+      <w:bookmarkEnd w:id="49"/>
+      <w:bookmarkStart w:name="_m-47#22wJy0ux" w:id="50"/>
+      <w:bookmarkEnd w:id="50"/>
+    </w:p>
+    <w:p>
+      <w:pPr>
+        <w:shd w:val="clear" w:color="auto" w:fill="FFFFFF"/>
+        <w:spacing w:beforeAutospacing="1" w:after="0" w:afterAutospacing="1" w:line="270" w:lineRule="atLeast"/>
+        <w:rPr>
+          <w:rFonts w:ascii="Arial" w:eastAsia="Times New Roman" w:hAnsi="Arial" w:cs="Arial"/>
+          <w:color w:val="333333"/>
+          <w:kern w:val="0"/>
+          <w:sz w:val="20"/>
+          <w:szCs w:val="20"/>
+          <w14:ligatures w14:val="none"/>
+        </w:rPr>
+      </w:pPr>
+      <w:r>
+        <w:rPr>
+          <w:rFonts w:ascii="Arial" w:eastAsia="Times New Roman" w:hAnsi="Arial" w:cs="Arial"/>
+          <w:color w:val="333333"/>
+          <w:kern w:val="0"/>
+          <w:sz w:val="20"/>
+          <w:szCs w:val="20"/>
+          <w14:ligatures w14:val="none"/>
+        </w:rPr>
+        <w:t>Bring Frisbees or balls for children to play with in the large open field while you wait for a show to begin.</w:t>
+      </w:r>
+      <w:bookmarkStart w:name="_m-42#02XHYG9JBT9kpf5RZxEjyG}n{EC@IY!v" w:id="45"/>
+      <w:bookmarkEnd w:id="45"/>
+      <w:bookmarkStart w:name="_m-42#12~VGeR;3tu2;I4qJw6bZrPJ3?0-vith" w:id="46"/>
+      <w:bookmarkEnd w:id="46"/>
+      <w:bookmarkStart w:name="_m-42#22wK~0ts" w:id="47"/>
+      <w:bookmarkEnd w:id="47"/>
+    </w:p>
+    <w:p>
+      <w:pPr>
+        <w:shd w:val="clear" w:color="auto" w:fill="FFFFFF"/>
+        <w:spacing w:beforeAutospacing="1" w:after="0" w:afterAutospacing="1" w:line="270" w:lineRule="atLeast"/>
+        <w:rPr>
+          <w:rFonts w:ascii="Verdana" w:eastAsia="Times New Roman" w:hAnsi="Verdana" w:cs="Times New Roman"/>
+          <w:color w:val="444E5C"/>
+          <w:kern w:val="0"/>
+          <w:sz w:val="20"/>
+          <w:szCs w:val="20"/>
+          <w14:ligatures w14:val="none"/>
+        </w:rPr>
+      </w:pPr>
+      <w:bookmarkStart w:name="_m-3X#02XHTG9OBT4kpk5RUxEoyGxn{JC@DY!{" w:id="42"/>
+      <w:bookmarkEnd w:id="42"/>
+      <w:bookmarkStart w:name="_m-3X#12~VBeR@3tp2;N4qEw6gZrKJ3D0-qitm" w:id="43"/>
+      <w:bookmarkEnd w:id="43"/>
+      <w:bookmarkStart w:name="_m-3X#22wKy0tx" w:id="44"/>
+      <w:bookmarkEnd w:id="44"/>
+    </w:p>
+    <w:p>
+      <w:pPr>
+        <w:shd w:val="clear" w:color="auto" w:fill="FFFFFF"/>
+        <w:spacing w:beforeAutospacing="1" w:after="0" w:afterAutospacing="1" w:line="270" w:lineRule="atLeast"/>
+        <w:rPr>
+          <w:rStyle w:val="Strong"/>
+          <w:rFonts w:ascii="Arial" w:hAnsi="Arial" w:cs="Arial"/>
+        </w:rPr>
+      </w:pPr>
+      <w:r>
+        <w:rPr>
+          <w:rStyle w:val="Strong"/>
+          <w:rFonts w:ascii="Arial" w:hAnsi="Arial" w:cs="Arial"/>
+        </w:rPr>
+        <w:t>Event S</w:t>
+      </w:r>
+      <w:r>
+        <w:rPr>
+          <w:rStyle w:val="Strong"/>
+          <w:rFonts w:ascii="Arial" w:hAnsi="Arial" w:cs="Arial"/>
+        </w:rPr>
+        <w:t>chedule</w:t>
+      </w:r>
+      <w:bookmarkStart w:name="_m-3V#02XI\G8GBU&lt;koc5S]xDgyH&quot;nzBCALY~s" w:id="39"/>
+      <w:bookmarkEnd w:id="39"/>
+      <w:bookmarkStart w:name="_m-3V#12~WJeQ83ux2:F4rMw5_ZsSJ2&lt;0.yise" w:id="40"/>
+      <w:bookmarkEnd w:id="40"/>
+      <w:bookmarkStart w:name="_m-3V#22wL#0sp" w:id="41"/>
+      <w:bookmarkEnd w:id="41"/>
+    </w:p>
+    <w:p>
+      <w:pPr>
+        <w:shd w:val="clear" w:color="auto" w:fill="FFFFFF"/>
+        <w:spacing w:beforeAutospacing="1" w:after="0" w:afterAutospacing="1" w:line="270" w:lineRule="atLeast"/>
+        <w:rPr>
+          <w:rStyle w:val="Strong"/>
+          <w:rFonts w:ascii="Arial" w:hAnsi="Arial" w:cs="Arial"/>
+        </w:rPr>
+      </w:pPr>
+      <w:r>
+        <w:rPr>
+          <w:rStyle w:val="Strong"/>
+          <w:rFonts w:ascii="Arial" w:hAnsi="Arial" w:cs="Arial"/>
+        </w:rPr>
+        <w:t>Saturday (5/2</w:t>
+      </w:r>
+      <w:r>
+        <w:rPr>
+          <w:rStyle w:val="Strong"/>
+          <w:rFonts w:ascii="Arial" w:hAnsi="Arial" w:cs="Arial"/>
+        </w:rPr>
+        <w:t>8</w:t>
+      </w:r>
+      <w:r>
+        <w:rPr>
+          <w:rStyle w:val="Strong"/>
+          <w:rFonts w:ascii="Arial" w:hAnsi="Arial" w:cs="Arial"/>
+        </w:rPr>
+        <w:t>/</w:t>
+      </w:r>
+      <w:r>
+        <w:rPr>
+          <w:rStyle w:val="Strong"/>
+          <w:rFonts w:ascii="Arial" w:hAnsi="Arial" w:cs="Arial"/>
+        </w:rPr>
+        <w:t>202</w:t>
+      </w:r>
+      <w:r>
+        <w:rPr>
+          <w:rStyle w:val="Strong"/>
+          <w:rFonts w:ascii="Arial" w:hAnsi="Arial" w:cs="Arial"/>
+        </w:rPr>
+        <w:t>4</w:t>
+      </w:r>
+      <w:r>
+        <w:rPr>
+          <w:rStyle w:val="Strong"/>
+          <w:rFonts w:ascii="Arial" w:hAnsi="Arial" w:cs="Arial"/>
+        </w:rPr>
+        <w:t>)</w:t>
+      </w:r>
+      <w:bookmarkStart w:name="_m-3T#02XIZG8IBU:koe5S[xDiyH~nzDCAJY~u" w:id="36"/>
+      <w:bookmarkEnd w:id="36"/>
+      <w:bookmarkStart w:name="_m-3T#12~WHeQ:3uv2:H4rKw5aZsQJ2&gt;0.wisg" w:id="37"/>
+      <w:bookmarkEnd w:id="37"/>
+      <w:bookmarkStart w:name="_m-3T#22wL!0sr" w:id="38"/>
+      <w:bookmarkEnd w:id="38"/>
+    </w:p>
+    <w:p>
+      <w:pPr>
+        <w:shd w:val="clear" w:color="auto" w:fill="FFFFFF"/>
+        <w:spacing w:beforeAutospacing="1" w:after="0" w:afterAutospacing="1" w:line="270" w:lineRule="atLeast"/>
+        <w:rPr>
+          <w:rFonts w:ascii="Arial" w:hAnsi="Arial" w:cs="Arial"/>
+        </w:rPr>
+      </w:pPr>
+      <w:r>
+        <w:rPr>
+          <w:rFonts w:ascii="Arial" w:hAnsi="Arial" w:cs="Arial"/>
+        </w:rPr>
+        <w:t xml:space="preserve">6:00 AM </w:t>
+      </w:r>
+      <w:r>
+        <w:rPr>
+          <w:rFonts w:ascii="Arial" w:hAnsi="Arial" w:cs="Arial"/>
+        </w:rPr>
+        <w:t>Pilots Briefing</w:t>
+      </w:r>
+      <w:bookmarkStart w:name="_m-3R#02XIXG8KBU8kog5SYxDkyH|nzFCAHY~w" w:id="33"/>
+      <w:bookmarkEnd w:id="33"/>
+      <w:bookmarkStart w:name="_m-3R#12~WFeQ&lt;3ut2:J4rIw5cZsOJ2@0.uisi" w:id="34"/>
+      <w:bookmarkEnd w:id="34"/>
+      <w:bookmarkStart w:name="_m-3R#22wL}0st" w:id="35"/>
+      <w:bookmarkEnd w:id="35"/>
+    </w:p>
+    <w:p>
+      <w:pPr>
+        <w:shd w:val="clear" w:color="auto" w:fill="FFFFFF"/>
+        <w:spacing w:beforeAutospacing="1" w:after="0" w:afterAutospacing="1" w:line="270" w:lineRule="atLeast"/>
+        <w:rPr>
+          <w:rFonts w:ascii="Arial" w:hAnsi="Arial" w:cs="Arial"/>
+        </w:rPr>
+      </w:pPr>
+      <w:r>
+        <w:rPr>
+          <w:rFonts w:ascii="Arial" w:hAnsi="Arial" w:cs="Arial"/>
+        </w:rPr>
+        <w:t>6:30 AM Hare and Hound Race</w:t>
+      </w:r>
+      <w:bookmarkStart w:name="_m-3N#02XITG8OBU4kok5SUxDoyHxnzJCADY~{" w:id="30"/>
+      <w:bookmarkEnd w:id="30"/>
+      <w:bookmarkStart w:name="_m-3N#12~WBeQ@3up2:N4rEw5gZsKJ2D0.qism" w:id="31"/>
+      <w:bookmarkEnd w:id="31"/>
+      <w:bookmarkStart w:name="_m-3N#22wLy0sx" w:id="32"/>
+      <w:bookmarkEnd w:id="32"/>
+    </w:p>
+    <w:p>
+      <w:pPr>
+        <w:shd w:val="clear" w:color="auto" w:fill="FFFFFF"/>
+        <w:spacing w:beforeAutospacing="1" w:after="0" w:afterAutospacing="1" w:line="270" w:lineRule="atLeast"/>
+        <w:rPr>
+          <w:rFonts w:ascii="Arial" w:hAnsi="Arial" w:cs="Arial"/>
+        </w:rPr>
+      </w:pPr>
+      <w:r>
+        <w:rPr>
+          <w:rFonts w:ascii="Arial" w:hAnsi="Arial" w:cs="Arial"/>
+        </w:rPr>
+        <w:t>5:00 PM Pilot Briefing</w:t>
+      </w:r>
+      <w:bookmarkStart w:name="_m-3J#02XJZG7IBV:kne5T[xCiyI~nyDCBJY}u" w:id="27"/>
+      <w:bookmarkEnd w:id="27"/>
+      <w:bookmarkStart w:name="_m-3J#12~XHeP:3vv29H4sKw4aZtQJ1&gt;0/wirg" w:id="28"/>
+      <w:bookmarkEnd w:id="28"/>
+      <w:bookmarkStart w:name="_m-3J#22wM!0rr" w:id="29"/>
+      <w:bookmarkEnd w:id="29"/>
+    </w:p>
+    <w:p>
+      <w:pPr>
+        <w:shd w:val="clear" w:color="auto" w:fill="FFFFFF"/>
+        <w:spacing w:beforeAutospacing="1" w:after="0" w:afterAutospacing="1" w:line="270" w:lineRule="atLeast"/>
+        <w:rPr>
+          <w:rFonts w:ascii="Arial" w:hAnsi="Arial" w:cs="Arial"/>
+        </w:rPr>
+      </w:pPr>
+      <w:r>
+        <w:rPr>
+          <w:rFonts w:ascii="Arial" w:hAnsi="Arial" w:cs="Arial"/>
+        </w:rPr>
+        <w:t>5:30 PM Fun Flight</w:t>
+      </w:r>
+      <w:bookmarkStart w:name="_m-3H#02XJXG7KBV8kng5TYxCkyI|nyFCBHY}w" w:id="24"/>
+      <w:bookmarkEnd w:id="24"/>
+      <w:bookmarkStart w:name="_m-3H#12~XFeP&lt;3vt29J4sIw4cZtOJ1@0/uiri" w:id="25"/>
+      <w:bookmarkEnd w:id="25"/>
+      <w:bookmarkStart w:name="_m-3H#22wM}0rt" w:id="26"/>
+      <w:bookmarkEnd w:id="26"/>
+    </w:p>
+    <w:p>
+      <w:pPr>
+        <w:shd w:val="clear" w:color="auto" w:fill="FFFFFF"/>
+        <w:spacing w:beforeAutospacing="1" w:after="0" w:afterAutospacing="1" w:line="270" w:lineRule="atLeast"/>
+        <w:rPr>
+          <w:rFonts w:ascii="Arial" w:hAnsi="Arial" w:cs="Arial"/>
+        </w:rPr>
+      </w:pPr>
+      <w:r>
+        <w:rPr>
+          <w:rFonts w:ascii="Arial" w:hAnsi="Arial" w:cs="Arial"/>
+        </w:rPr>
+        <w:t>6:30 PM Tethers</w:t>
+      </w:r>
+      <w:bookmarkStart w:name="_m-3C#02XJSG7PBV3knl5TTxCpyIwnyKCBCY}|" w:id="21"/>
+      <w:bookmarkEnd w:id="21"/>
+      <w:bookmarkStart w:name="_m-3C#12~XAePA3vo29O4sDw4hZtJJ1E0/pirn" w:id="22"/>
+      <w:bookmarkEnd w:id="22"/>
+      <w:bookmarkStart w:name="_m-3C#22wMx0ry" w:id="23"/>
+      <w:bookmarkEnd w:id="23"/>
+    </w:p>
+    <w:p>
+      <w:pPr>
+        <w:shd w:val="clear" w:color="auto" w:fill="FFFFFF"/>
+        <w:spacing w:beforeAutospacing="1" w:after="0" w:afterAutospacing="1" w:line="270" w:lineRule="atLeast"/>
+        <w:rPr>
+          <w:rFonts w:ascii="Arial" w:hAnsi="Arial" w:cs="Arial"/>
+        </w:rPr>
+      </w:pPr>
+      <w:r>
+        <w:rPr>
+          <w:rFonts w:ascii="Arial" w:hAnsi="Arial" w:cs="Arial"/>
+        </w:rPr>
+        <w:t>8:15 PM Balloon Glow</w:t>
+      </w:r>
+      <w:bookmarkStart w:name="_m-3A#02XK[G6HBW;kmd5U\xBhyJ!nxCCCKY|t" w:id="18"/>
+      <w:bookmarkEnd w:id="18"/>
+      <w:bookmarkStart w:name="_m-3A#12~YIeO93ww28G4tLw3`ZuRJ0=00xiqf" w:id="19"/>
+      <w:bookmarkEnd w:id="19"/>
+      <w:bookmarkStart w:name="_m-3A#22wN&quot;0qq" w:id="20"/>
+      <w:bookmarkEnd w:id="20"/>
+    </w:p>
+    <w:p>
+      <w:pPr>
+        <w:shd w:val="clear" w:color="auto" w:fill="FFFFFF"/>
+        <w:spacing w:beforeAutospacing="1" w:after="0" w:afterAutospacing="1" w:line="270" w:lineRule="atLeast"/>
+        <w:rPr>
+          <w:rStyle w:val="Strong"/>
+          <w:rFonts w:ascii="Arial" w:hAnsi="Arial" w:cs="Arial"/>
+        </w:rPr>
+      </w:pPr>
+      <w:r>
+        <w:rPr>
+          <w:rStyle w:val="Strong"/>
+          <w:rFonts w:ascii="Arial" w:hAnsi="Arial" w:cs="Arial"/>
+        </w:rPr>
+        <w:t>Sunday (5/2</w:t>
+      </w:r>
+      <w:r>
+        <w:rPr>
+          <w:rStyle w:val="Strong"/>
+          <w:rFonts w:ascii="Arial" w:hAnsi="Arial" w:cs="Arial"/>
+        </w:rPr>
+        <w:t>9</w:t>
+      </w:r>
+      <w:r>
+        <w:rPr>
+          <w:rStyle w:val="Strong"/>
+          <w:rFonts w:ascii="Arial" w:hAnsi="Arial" w:cs="Arial"/>
+        </w:rPr>
+        <w:t>/</w:t>
+      </w:r>
+      <w:r>
+        <w:rPr>
+          <w:rStyle w:val="Strong"/>
+          <w:rFonts w:ascii="Arial" w:hAnsi="Arial" w:cs="Arial"/>
+        </w:rPr>
+        <w:t>202</w:t>
+      </w:r>
+      <w:r>
+        <w:rPr>
+          <w:rStyle w:val="Strong"/>
+          <w:rFonts w:ascii="Arial" w:hAnsi="Arial" w:cs="Arial"/>
+        </w:rPr>
+        <w:t>4</w:t>
+      </w:r>
+      <w:r>
+        <w:rPr>
+          <w:rStyle w:val="Strong"/>
+          <w:rFonts w:ascii="Arial" w:hAnsi="Arial" w:cs="Arial"/>
+        </w:rPr>
+        <w:t>)</w:t>
+      </w:r>
+      <w:bookmarkStart w:name="_m-38#02XKYG6JBW9kmf5UZxBjyJ}nxECCIY|v" w:id="15"/>
+      <w:bookmarkEnd w:id="15"/>
+      <w:bookmarkStart w:name="_m-38#12~YGeO;3wu28I4tJw3bZuPJ0?00viqh" w:id="16"/>
+      <w:bookmarkEnd w:id="16"/>
+      <w:bookmarkStart w:name="_m-38#22wN~0qs" w:id="17"/>
+      <w:bookmarkEnd w:id="17"/>
+    </w:p>
+    <w:p>
+      <w:pPr>
+        <w:shd w:val="clear" w:color="auto" w:fill="FFFFFF"/>
+        <w:spacing w:beforeAutospacing="1" w:after="0" w:afterAutospacing="1" w:line="270" w:lineRule="atLeast"/>
+        <w:rPr>
+          <w:rFonts w:ascii="Arial" w:hAnsi="Arial" w:cs="Arial"/>
+        </w:rPr>
+      </w:pPr>
+      <w:r>
+        <w:rPr>
+          <w:rFonts w:ascii="Arial" w:hAnsi="Arial" w:cs="Arial"/>
+        </w:rPr>
+        <w:t>6:00 AM Pilots Briefing</w:t>
+      </w:r>
+      <w:bookmarkStart w:name="_m-37#02XKXG6KBW8kmg5UYxBkyJ|nxFCCHY|w" w:id="12"/>
+      <w:bookmarkEnd w:id="12"/>
+      <w:bookmarkStart w:name="_m-37#12~YFeO&lt;3wt28J4tIw3cZuOJ0@00uiqi" w:id="13"/>
+      <w:bookmarkEnd w:id="13"/>
+      <w:bookmarkStart w:name="_m-37#22wN}0qt" w:id="14"/>
+      <w:bookmarkEnd w:id="14"/>
+    </w:p>
+    <w:p>
+      <w:pPr>
+        <w:shd w:val="clear" w:color="auto" w:fill="FFFFFF"/>
+        <w:spacing w:beforeAutospacing="1" w:after="0" w:afterAutospacing="1" w:line="270" w:lineRule="atLeast"/>
+        <w:rPr>
+          <w:rFonts w:ascii="Arial" w:hAnsi="Arial" w:cs="Arial"/>
+        </w:rPr>
+      </w:pPr>
+      <w:r>
+        <w:rPr>
+          <w:rFonts w:ascii="Arial" w:hAnsi="Arial" w:cs="Arial"/>
+        </w:rPr>
+        <w:t>6:30 AM Lynn Layton Key Grab</w:t>
+      </w:r>
+      <w:bookmarkStart w:name="_m-33#02XKTG6OBW4kmk5UUxBoyJxnxJCCDY|{" w:id="9"/>
+      <w:bookmarkEnd w:id="9"/>
+      <w:bookmarkStart w:name="_m-33#12~YBeO@3wp28N4tEw3gZuKJ0D00qiqm" w:id="10"/>
+      <w:bookmarkEnd w:id="10"/>
+      <w:bookmarkStart w:name="_m-33#22wNy0qx" w:id="11"/>
+      <w:bookmarkEnd w:id="11"/>
+    </w:p>
+    <w:p>
+      <w:pPr>
+        <w:shd w:val="clear" w:color="auto" w:fill="FFFFFF"/>
+        <w:spacing w:beforeAutospacing="1" w:after="0" w:afterAutospacing="1" w:line="270" w:lineRule="atLeast"/>
+        <w:rPr>
+          <w:rFonts w:ascii="Arial" w:hAnsi="Arial" w:cs="Arial"/>
+        </w:rPr>
+      </w:pPr>
+      <w:r>
+        <w:rPr>
+          <w:rFonts w:ascii="Arial" w:hAnsi="Arial" w:cs="Arial"/>
+        </w:rPr>
+        <w:t>5:00 PM Pilot Briefing</w:t>
+      </w:r>
+      <w:bookmarkStart w:name="_m-2Z#02XLZG5IBX:kle5V[xAiyK~nwDCDJY{u" w:id="6"/>
+      <w:bookmarkEnd w:id="6"/>
+      <w:bookmarkStart w:name="_m-2Z#12~ZHeN:3xv27H4uKw2aZvQJ/&gt;01wipg" w:id="7"/>
+      <w:bookmarkEnd w:id="7"/>
+      <w:bookmarkStart w:name="_m-2Z#22wO!0pr" w:id="8"/>
+      <w:bookmarkEnd w:id="8"/>
+    </w:p>
+    <w:p>
+      <w:pPr>
+        <w:shd w:val="clear" w:color="auto" w:fill="FFFFFF"/>
+        <w:spacing w:beforeAutospacing="1" w:after="0" w:afterAutospacing="1" w:line="270" w:lineRule="atLeast"/>
+        <w:rPr>
+          <w:rFonts w:ascii="Arial" w:hAnsi="Arial" w:cs="Arial"/>
+        </w:rPr>
+      </w:pPr>
+      <w:r>
+        <w:rPr>
+          <w:rFonts w:ascii="Arial" w:hAnsi="Arial" w:cs="Arial"/>
+        </w:rPr>
+        <w:t>5:30 PM Fun Flight</w:t>
+      </w:r>
+      <w:bookmarkStart w:name="_m-2U#02XLUG5NBX5klj5VVxAnyKynwICDEY{z" w:id="3"/>
+      <w:bookmarkEnd w:id="3"/>
+      <w:bookmarkStart w:name="_m-2U#12~ZCeN?3xq27M4uFw2fZvLJ/C01ripl" w:id="4"/>
+      <w:bookmarkEnd w:id="4"/>
+      <w:bookmarkStart w:name="_m-2U#22wOz0pw" w:id="5"/>
+      <w:bookmarkEnd w:id="5"/>
+    </w:p>
+    <w:p>
+      <w:pPr>
+        <w:shd w:val="clear" w:color="auto" w:fill="FFFFFF"/>
+        <w:spacing w:beforeAutospacing="1" w:after="0" w:afterAutospacing="1" w:line="270" w:lineRule="atLeast"/>
+      </w:pPr>
+      <w:r>
+        <w:rPr>
+          <w:rFonts w:ascii="Arial" w:hAnsi="Arial" w:cs="Arial"/>
+        </w:rPr>
+        <w:t xml:space="preserve">6:30 PM </w:t>
+      </w:r>
+      <w:r>
+        <w:rPr>
+          <w:rFonts w:ascii="Arial" w:hAnsi="Arial" w:cs="Arial"/>
+        </w:rPr>
+        <w:t>Ballumination</w:t>
+      </w:r>
+      <w:bookmarkStart w:name="_m-2S#02XLSG5PBX3kll5VTxApyKwnwKCDCY{|" w:id="0"/>
+      <w:bookmarkEnd w:id="0"/>
+      <w:bookmarkStart w:name="_m-2S#12~ZAeNA3xo27O4uDw2hZvJJ/E01pipn" w:id="1"/>
+      <w:bookmarkEnd w:id="1"/>
+      <w:bookmarkStart w:name="_m-2S#22wOx0py" w:id="2"/>
+      <w:bookmarkEnd w:id="2"/>
+    </w:p>
+    <w:sectPr>
+      <w:type w:val="continuous"/>
+      <w:pgSz w:w="12240" w:h="15840"/>
+      <w:pgMar w:top="1440" w:right="1440" w:bottom="1440" w:left="1440" w:header="720" w:footer="720" w:gutter="0"/>
+      <w:cols w:space="720"/>
+      <w:docGrid w:linePitch="360"/>
+    </w:sectPr>
+  </w:body>
+</w:document>
 </file>
 
 <file path=word/styles.xml><?xml version="1.0" encoding="utf-8"?>

</xml_diff>